<commit_message>
build(thesis): rebuild dissertation DOCX with corrected 50-economy Hình 4.x
Rebuilt dist/luan_an_ctu/LUAN_AN_FULL_vi.docx (full thesis) and the standalone
chuong_4_ket_qua_vi.docx via build_dissertation_docx.sh so they embed the
corrected ICRV-gradient figure (declining I≈79%→V≈35%, SIDS FIP). Embedded figure
md5-verified against thesis/figures/fig_4_x_ip_curves_icrv_gradient.png. Chapter
text already carries the canonical 50-economy / 88,869-firm numbers.
</commit_message>
<xml_diff>
--- a/dist/luan_an_ctu/LUAN_AN_FULL_vi.docx
+++ b/dist/luan_an_ctu/LUAN_AN_FULL_vi.docx
@@ -31249,7 +31249,7 @@
       <w:r>
         <w:drawing>
           <wp:inline>
-            <wp:extent cx="5753100" cy="3849196"/>
+            <wp:extent cx="5753100" cy="3285070"/>
             <wp:effectExtent b="0" l="0" r="0" t="0"/>
             <wp:docPr descr="Hình 4.1. Họ đường cong I–P phụ thuộc chế độ thể chế ICRV" title="" id="151" name="Picture"/>
             <a:graphic>
@@ -31270,7 +31270,7 @@
                   <pic:spPr bwMode="auto">
                     <a:xfrm>
                       <a:off x="0" y="0"/>
-                      <a:ext cx="5753100" cy="3849196"/>
+                      <a:ext cx="5753100" cy="3285070"/>
                     </a:xfrm>
                     <a:prstGeom prst="rect">
                       <a:avLst/>

</xml_diff>

<commit_message>
docs(methods): make §3.3.4 TCI thin/full mapping explicit + study-by-study
Upgraded the §3.3.4 thin/full note to a precise mapping: TCI_thin = z-std(b8 quality
cert, e6 foreign tech) used by P3/P4/P7/P8; TCI_full = z-std(b8, e6, h1 product
innovation, h8 R&D) used by P5. Verified corpus-wide that no TCI/NLCN definition
references non-technological item codes (b4/b7a/b5/b6a) — the P5 transcription
error is fully resolved and the thesis is now internally consistent on TCI.
Added a reconciliation note that some companion-paper TCI descriptions still need
aligning with this framework and the actual estimation code (author task).
DOCX + LaTeX rebuilt; no estimated values changed.
</commit_message>
<xml_diff>
--- a/dist/luan_an_ctu/LUAN_AN_FULL_vi.docx
+++ b/dist/luan_an_ctu/LUAN_AN_FULL_vi.docx
@@ -6763,70 +6763,65 @@
           <w:bCs/>
           <w:b/>
         </w:rPr>
-        <w:t xml:space="preserve">Biến thể đo lường (thin/full)</w:t>
-      </w:r>
-      <w:r>
-        <w:t xml:space="preserve">: do bộ công cụ WBES thay đổi qua ba thế hệ bảng hỏi (PICS3, Standardized, BREADY), TCI được vận hành hóa theo hai biến thể tùy tính khả dụng của các mục theo từng sóng: một biến thể</w:t>
-      </w:r>
-      <w:r>
-        <w:t xml:space="preserve"> </w:t>
-      </w:r>
+        <w:t xml:space="preserve">Biến thể đo lường (thin/full).</w:t>
+      </w:r>
+      <w:r>
+        <w:t xml:space="preserve"> </w:t>
+      </w:r>
+      <w:r>
+        <w:t xml:space="preserve">Do bộ công cụ WBES thay đổi qua ba thế hệ bảng hỏi (PICS3, Standardized, BREADY) khiến không phải mọi mục đều khả dụng ở mọi sóng, TCI được vận hành hóa thống nhất theo hai biến thể của cùng một composite formative:</w:t>
+      </w:r>
+    </w:p>
+    <w:p>
+      <w:pPr>
+        <w:numPr>
+          <w:ilvl w:val="0"/>
+          <w:numId w:val="1006"/>
+        </w:numPr>
+        <w:pStyle w:val="Compact"/>
+      </w:pPr>
       <w:r>
         <w:rPr>
           <w:bCs/>
           <w:b/>
         </w:rPr>
-        <w:t xml:space="preserve">“</w:t>
-      </w:r>
+        <w:t xml:space="preserve">TCI_thin</w:t>
+      </w:r>
+      <w:r>
+        <w:t xml:space="preserve"> </w:t>
+      </w:r>
+      <w:r>
+        <w:t xml:space="preserve">= z-std của trung bình hai mục cốt lõi: chứng chỉ chất lượng quốc tế (b8) và cấp phép công nghệ nước ngoài (e6). Dùng trong các nghiên cứu Việt Nam (P3), Singapore (P4), đa quốc gia (P7) và Pacific SIDS (P8).</w:t>
+      </w:r>
+    </w:p>
+    <w:p>
+      <w:pPr>
+        <w:numPr>
+          <w:ilvl w:val="0"/>
+          <w:numId w:val="1006"/>
+        </w:numPr>
+        <w:pStyle w:val="Compact"/>
+      </w:pPr>
       <w:r>
         <w:rPr>
           <w:bCs/>
           <w:b/>
         </w:rPr>
-        <w:t xml:space="preserve">thin</w:t>
-      </w:r>
-      <w:r>
-        <w:rPr>
-          <w:bCs/>
-          <w:b/>
-        </w:rPr>
-        <w:t xml:space="preserve">”</w:t>
-      </w:r>
-      <w:r>
-        <w:t xml:space="preserve"> </w:t>
-      </w:r>
-      <w:r>
-        <w:t xml:space="preserve">gồm hai mục cốt lõi (chứng chỉ chất lượng b8 và một mục năng lực bổ sung) và một biến thể</w:t>
-      </w:r>
-      <w:r>
-        <w:t xml:space="preserve"> </w:t>
-      </w:r>
-      <w:r>
-        <w:rPr>
-          <w:bCs/>
-          <w:b/>
-        </w:rPr>
-        <w:t xml:space="preserve">“</w:t>
-      </w:r>
-      <w:r>
-        <w:rPr>
-          <w:bCs/>
-          <w:b/>
-        </w:rPr>
-        <w:t xml:space="preserve">full</w:t>
-      </w:r>
-      <w:r>
-        <w:rPr>
-          <w:bCs/>
-          <w:b/>
-        </w:rPr>
-        <w:t xml:space="preserve">”</w:t>
-      </w:r>
-      <w:r>
-        <w:t xml:space="preserve"> </w:t>
-      </w:r>
-      <w:r>
-        <w:t xml:space="preserve">gồm ba đến bốn mục (bổ sung đổi mới sản phẩm h1 và/hoặc chi R&amp;D h8). Bộ mục chính xác của mỗi nghiên cứu thành phần được nêu rõ trong bảng định nghĩa biến của nghiên cứu đó (§3.4.5) và trong Phụ lục A; khác biệt về bộ mục giữa các nghiên cứu phản ánh ràng buộc đo lường khách quan của bộ dữ liệu, không phải lựa chọn tùy ý. Vì các mục là chỉ báo nhị phân của cùng một construct formative (năng lực công nghệ), hai biến thể có tương quan cao và cho kết luận điều tiết nhất quán về dấu; phần độ vững (§3.5.1) kiểm tra độ nhạy của kết quả với lựa chọn biến thể.</w:t>
+        <w:t xml:space="preserve">TCI_full</w:t>
+      </w:r>
+      <w:r>
+        <w:t xml:space="preserve"> </w:t>
+      </w:r>
+      <w:r>
+        <w:t xml:space="preserve">= z-std của trung bình bốn mục: b8, e6, đổi mới sản phẩm (h1), và chi R&amp;D (h8). Dùng trong nghiên cứu Trung Quốc (P5), nơi cả hai sóng 2012 và 2024 đều có đủ module đổi mới.</w:t>
+      </w:r>
+    </w:p>
+    <w:p>
+      <w:pPr>
+        <w:pStyle w:val="FirstParagraph"/>
+      </w:pPr>
+      <w:r>
+        <w:t xml:space="preserve">Bộ mục chính xác của mỗi nghiên cứu thành phần được nêu lại trong bảng định nghĩa biến của nghiên cứu đó (§3.4.5) và Phụ lục A; khác biệt giữa thin và full phản ánh ràng buộc khả dụng dữ liệu khách quan, không phải lựa chọn tùy ý. Vì các mục là chỉ báo nhị phân của cùng một construct formative (năng lực công nghệ), hai biến thể tương quan cao và cho kết luận điều tiết nhất quán về dấu; phần độ vững (§3.5.1) kiểm tra độ nhạy của kết quả với lựa chọn biến thể. (Lưu ý đối chiếu: phần mô tả TCI trong một số bản thảo bài báo đồng hành cần được rà soát để đồng nhất bộ mục với khung này và với mã ước lượng thực tế.)</w:t>
       </w:r>
     </w:p>
     <w:p>
@@ -9389,7 +9384,7 @@
       <w:pPr>
         <w:numPr>
           <w:ilvl w:val="0"/>
-          <w:numId w:val="1006"/>
+          <w:numId w:val="1007"/>
         </w:numPr>
         <w:pStyle w:val="Compact"/>
       </w:pPr>
@@ -9411,7 +9406,7 @@
       <w:pPr>
         <w:numPr>
           <w:ilvl w:val="0"/>
-          <w:numId w:val="1006"/>
+          <w:numId w:val="1007"/>
         </w:numPr>
         <w:pStyle w:val="Compact"/>
       </w:pPr>
@@ -9433,7 +9428,7 @@
       <w:pPr>
         <w:numPr>
           <w:ilvl w:val="0"/>
-          <w:numId w:val="1006"/>
+          <w:numId w:val="1007"/>
         </w:numPr>
         <w:pStyle w:val="Compact"/>
       </w:pPr>
@@ -9455,7 +9450,7 @@
       <w:pPr>
         <w:numPr>
           <w:ilvl w:val="0"/>
-          <w:numId w:val="1006"/>
+          <w:numId w:val="1007"/>
         </w:numPr>
         <w:pStyle w:val="Compact"/>
       </w:pPr>
@@ -9477,7 +9472,7 @@
       <w:pPr>
         <w:numPr>
           <w:ilvl w:val="0"/>
-          <w:numId w:val="1006"/>
+          <w:numId w:val="1007"/>
         </w:numPr>
         <w:pStyle w:val="Compact"/>
       </w:pPr>
@@ -9499,7 +9494,7 @@
       <w:pPr>
         <w:numPr>
           <w:ilvl w:val="0"/>
-          <w:numId w:val="1006"/>
+          <w:numId w:val="1007"/>
         </w:numPr>
         <w:pStyle w:val="Compact"/>
       </w:pPr>
@@ -9518,7 +9513,7 @@
       <w:pPr>
         <w:numPr>
           <w:ilvl w:val="0"/>
-          <w:numId w:val="1006"/>
+          <w:numId w:val="1007"/>
         </w:numPr>
         <w:pStyle w:val="Compact"/>
       </w:pPr>
@@ -13315,7 +13310,7 @@
       <w:pPr>
         <w:numPr>
           <w:ilvl w:val="0"/>
-          <w:numId w:val="1007"/>
+          <w:numId w:val="1008"/>
         </w:numPr>
         <w:pStyle w:val="Compact"/>
       </w:pPr>
@@ -13337,7 +13332,7 @@
       <w:pPr>
         <w:numPr>
           <w:ilvl w:val="0"/>
-          <w:numId w:val="1007"/>
+          <w:numId w:val="1008"/>
         </w:numPr>
         <w:pStyle w:val="Compact"/>
       </w:pPr>
@@ -13359,7 +13354,7 @@
       <w:pPr>
         <w:numPr>
           <w:ilvl w:val="0"/>
-          <w:numId w:val="1007"/>
+          <w:numId w:val="1008"/>
         </w:numPr>
         <w:pStyle w:val="Compact"/>
       </w:pPr>
@@ -13381,7 +13376,7 @@
       <w:pPr>
         <w:numPr>
           <w:ilvl w:val="0"/>
-          <w:numId w:val="1007"/>
+          <w:numId w:val="1008"/>
         </w:numPr>
         <w:pStyle w:val="Compact"/>
       </w:pPr>
@@ -13403,7 +13398,7 @@
       <w:pPr>
         <w:numPr>
           <w:ilvl w:val="0"/>
-          <w:numId w:val="1007"/>
+          <w:numId w:val="1008"/>
         </w:numPr>
         <w:pStyle w:val="Compact"/>
       </w:pPr>
@@ -13438,7 +13433,7 @@
       <w:pPr>
         <w:numPr>
           <w:ilvl w:val="0"/>
-          <w:numId w:val="1007"/>
+          <w:numId w:val="1008"/>
         </w:numPr>
         <w:pStyle w:val="Compact"/>
       </w:pPr>
@@ -13483,7 +13478,7 @@
       <w:pPr>
         <w:numPr>
           <w:ilvl w:val="0"/>
-          <w:numId w:val="1007"/>
+          <w:numId w:val="1008"/>
         </w:numPr>
         <w:pStyle w:val="Compact"/>
       </w:pPr>
@@ -13502,7 +13497,7 @@
       <w:pPr>
         <w:numPr>
           <w:ilvl w:val="0"/>
-          <w:numId w:val="1007"/>
+          <w:numId w:val="1008"/>
         </w:numPr>
         <w:pStyle w:val="Compact"/>
       </w:pPr>
@@ -14282,7 +14277,7 @@
       <w:pPr>
         <w:numPr>
           <w:ilvl w:val="0"/>
-          <w:numId w:val="1008"/>
+          <w:numId w:val="1009"/>
         </w:numPr>
         <w:pStyle w:val="Compact"/>
       </w:pPr>
@@ -14304,7 +14299,7 @@
       <w:pPr>
         <w:numPr>
           <w:ilvl w:val="0"/>
-          <w:numId w:val="1008"/>
+          <w:numId w:val="1009"/>
         </w:numPr>
         <w:pStyle w:val="Compact"/>
       </w:pPr>
@@ -14326,7 +14321,7 @@
       <w:pPr>
         <w:numPr>
           <w:ilvl w:val="0"/>
-          <w:numId w:val="1008"/>
+          <w:numId w:val="1009"/>
         </w:numPr>
         <w:pStyle w:val="Compact"/>
       </w:pPr>
@@ -14348,7 +14343,7 @@
       <w:pPr>
         <w:numPr>
           <w:ilvl w:val="0"/>
-          <w:numId w:val="1008"/>
+          <w:numId w:val="1009"/>
         </w:numPr>
         <w:pStyle w:val="Compact"/>
       </w:pPr>
@@ -14370,7 +14365,7 @@
       <w:pPr>
         <w:numPr>
           <w:ilvl w:val="0"/>
-          <w:numId w:val="1008"/>
+          <w:numId w:val="1009"/>
         </w:numPr>
         <w:pStyle w:val="Compact"/>
       </w:pPr>
@@ -14415,7 +14410,7 @@
       <w:pPr>
         <w:numPr>
           <w:ilvl w:val="0"/>
-          <w:numId w:val="1008"/>
+          <w:numId w:val="1009"/>
         </w:numPr>
         <w:pStyle w:val="Compact"/>
       </w:pPr>
@@ -15305,7 +15300,7 @@
       <w:pPr>
         <w:numPr>
           <w:ilvl w:val="0"/>
-          <w:numId w:val="1009"/>
+          <w:numId w:val="1010"/>
         </w:numPr>
         <w:pStyle w:val="Compact"/>
       </w:pPr>
@@ -15324,7 +15319,7 @@
       <w:pPr>
         <w:numPr>
           <w:ilvl w:val="0"/>
-          <w:numId w:val="1009"/>
+          <w:numId w:val="1010"/>
         </w:numPr>
         <w:pStyle w:val="Compact"/>
       </w:pPr>
@@ -15343,7 +15338,7 @@
       <w:pPr>
         <w:numPr>
           <w:ilvl w:val="0"/>
-          <w:numId w:val="1009"/>
+          <w:numId w:val="1010"/>
         </w:numPr>
         <w:pStyle w:val="Compact"/>
       </w:pPr>
@@ -15362,7 +15357,7 @@
       <w:pPr>
         <w:numPr>
           <w:ilvl w:val="0"/>
-          <w:numId w:val="1009"/>
+          <w:numId w:val="1010"/>
         </w:numPr>
         <w:pStyle w:val="Compact"/>
       </w:pPr>
@@ -15381,7 +15376,7 @@
       <w:pPr>
         <w:numPr>
           <w:ilvl w:val="0"/>
-          <w:numId w:val="1009"/>
+          <w:numId w:val="1010"/>
         </w:numPr>
         <w:pStyle w:val="Compact"/>
       </w:pPr>
@@ -15400,7 +15395,7 @@
       <w:pPr>
         <w:numPr>
           <w:ilvl w:val="0"/>
-          <w:numId w:val="1009"/>
+          <w:numId w:val="1010"/>
         </w:numPr>
         <w:pStyle w:val="Compact"/>
       </w:pPr>
@@ -15419,7 +15414,7 @@
       <w:pPr>
         <w:numPr>
           <w:ilvl w:val="0"/>
-          <w:numId w:val="1009"/>
+          <w:numId w:val="1010"/>
         </w:numPr>
         <w:pStyle w:val="Compact"/>
       </w:pPr>
@@ -15438,7 +15433,7 @@
       <w:pPr>
         <w:numPr>
           <w:ilvl w:val="0"/>
-          <w:numId w:val="1009"/>
+          <w:numId w:val="1010"/>
         </w:numPr>
         <w:pStyle w:val="Compact"/>
       </w:pPr>
@@ -15457,7 +15452,7 @@
       <w:pPr>
         <w:numPr>
           <w:ilvl w:val="0"/>
-          <w:numId w:val="1009"/>
+          <w:numId w:val="1010"/>
         </w:numPr>
         <w:pStyle w:val="Compact"/>
       </w:pPr>
@@ -15476,7 +15471,7 @@
       <w:pPr>
         <w:numPr>
           <w:ilvl w:val="0"/>
-          <w:numId w:val="1009"/>
+          <w:numId w:val="1010"/>
         </w:numPr>
         <w:pStyle w:val="Compact"/>
       </w:pPr>
@@ -15495,7 +15490,7 @@
       <w:pPr>
         <w:numPr>
           <w:ilvl w:val="0"/>
-          <w:numId w:val="1009"/>
+          <w:numId w:val="1010"/>
         </w:numPr>
         <w:pStyle w:val="Compact"/>
       </w:pPr>
@@ -15514,7 +15509,7 @@
       <w:pPr>
         <w:numPr>
           <w:ilvl w:val="0"/>
-          <w:numId w:val="1009"/>
+          <w:numId w:val="1010"/>
         </w:numPr>
         <w:pStyle w:val="Compact"/>
       </w:pPr>
@@ -23544,7 +23539,7 @@
       <w:pPr>
         <w:numPr>
           <w:ilvl w:val="0"/>
-          <w:numId w:val="1010"/>
+          <w:numId w:val="1011"/>
         </w:numPr>
         <w:pStyle w:val="Compact"/>
       </w:pPr>
@@ -23589,70 +23584,12 @@
       <w:pPr>
         <w:numPr>
           <w:ilvl w:val="0"/>
-          <w:numId w:val="1010"/>
+          <w:numId w:val="1011"/>
         </w:numPr>
         <w:pStyle w:val="Compact"/>
       </w:pPr>
       <w:r>
         <w:t xml:space="preserve">Biến độc lập: thay FSTS bằng export status (binary), foreign sales count.</w:t>
-      </w:r>
-    </w:p>
-    <w:p>
-      <w:pPr>
-        <w:numPr>
-          <w:ilvl w:val="0"/>
-          <w:numId w:val="1010"/>
-        </w:numPr>
-        <w:pStyle w:val="Compact"/>
-      </w:pPr>
-      <w:r>
-        <w:t xml:space="preserve">Biến biến điều tiết: thay DAI_thin bằng DAI_rich (cho subset 2024+).</w:t>
-      </w:r>
-    </w:p>
-    <w:bookmarkEnd w:id="114"/>
-    <w:bookmarkStart w:id="115" w:name="mẫu-phụ"/>
-    <w:p>
-      <w:pPr>
-        <w:pStyle w:val="Heading3"/>
-      </w:pPr>
-      <w:r>
-        <w:t xml:space="preserve">3.5.2 Mẫu phụ</w:t>
-      </w:r>
-    </w:p>
-    <w:p>
-      <w:pPr>
-        <w:pStyle w:val="FirstParagraph"/>
-      </w:pPr>
-      <w:r>
-        <w:t xml:space="preserve">Loại trừ micro firms (&lt;5 lao động); chỉ giữ SMEs; chỉ giữ manufacturing; chỉ giữ exporters (FSTS &gt; 0); subgroup theo 6 sub-regime ICRV.</w:t>
-      </w:r>
-    </w:p>
-    <w:bookmarkEnd w:id="115"/>
-    <w:bookmarkStart w:id="116" w:name="outliers"/>
-    <w:p>
-      <w:pPr>
-        <w:pStyle w:val="Heading3"/>
-      </w:pPr>
-      <w:r>
-        <w:t xml:space="preserve">3.5.3 Outliers</w:t>
-      </w:r>
-    </w:p>
-    <w:p>
-      <w:pPr>
-        <w:pStyle w:val="FirstParagraph"/>
-      </w:pPr>
-      <w:r>
-        <w:t xml:space="preserve">Winsorization 1% và 5% đối với labor productivity và employment, áp dụng trong từng country-year.</w:t>
-      </w:r>
-    </w:p>
-    <w:bookmarkEnd w:id="116"/>
-    <w:bookmarkStart w:id="117" w:name="multicollinearity-và-heteroscedasticity"/>
-    <w:p>
-      <w:pPr>
-        <w:pStyle w:val="Heading3"/>
-      </w:pPr>
-      <w:r>
-        <w:t xml:space="preserve">3.5.4 Multicollinearity và heteroscedasticity</w:t>
       </w:r>
     </w:p>
     <w:p>
@@ -23664,29 +23601,53 @@
         <w:pStyle w:val="Compact"/>
       </w:pPr>
       <w:r>
-        <w:t xml:space="preserve">VIF cho tất cả mô hình; ngưỡng VIF &lt; 5 (Hair et al., 2019).</w:t>
-      </w:r>
-    </w:p>
-    <w:p>
-      <w:pPr>
-        <w:numPr>
-          <w:ilvl w:val="0"/>
-          <w:numId w:val="1011"/>
-        </w:numPr>
-        <w:pStyle w:val="Compact"/>
-      </w:pPr>
-      <w:r>
-        <w:t xml:space="preserve">Breusch–Pagan test (Breusch &amp; Pagan, 1979).</w:t>
-      </w:r>
-    </w:p>
-    <w:bookmarkEnd w:id="117"/>
-    <w:bookmarkStart w:id="118" w:name="sensitivity-analysis-cho-meta-analysis"/>
+        <w:t xml:space="preserve">Biến biến điều tiết: thay DAI_thin bằng DAI_rich (cho subset 2024+).</w:t>
+      </w:r>
+    </w:p>
+    <w:bookmarkEnd w:id="114"/>
+    <w:bookmarkStart w:id="115" w:name="mẫu-phụ"/>
     <w:p>
       <w:pPr>
         <w:pStyle w:val="Heading3"/>
       </w:pPr>
       <w:r>
-        <w:t xml:space="preserve">3.5.5 Sensitivity analysis cho meta-analysis</w:t>
+        <w:t xml:space="preserve">3.5.2 Mẫu phụ</w:t>
+      </w:r>
+    </w:p>
+    <w:p>
+      <w:pPr>
+        <w:pStyle w:val="FirstParagraph"/>
+      </w:pPr>
+      <w:r>
+        <w:t xml:space="preserve">Loại trừ micro firms (&lt;5 lao động); chỉ giữ SMEs; chỉ giữ manufacturing; chỉ giữ exporters (FSTS &gt; 0); subgroup theo 6 sub-regime ICRV.</w:t>
+      </w:r>
+    </w:p>
+    <w:bookmarkEnd w:id="115"/>
+    <w:bookmarkStart w:id="116" w:name="outliers"/>
+    <w:p>
+      <w:pPr>
+        <w:pStyle w:val="Heading3"/>
+      </w:pPr>
+      <w:r>
+        <w:t xml:space="preserve">3.5.3 Outliers</w:t>
+      </w:r>
+    </w:p>
+    <w:p>
+      <w:pPr>
+        <w:pStyle w:val="FirstParagraph"/>
+      </w:pPr>
+      <w:r>
+        <w:t xml:space="preserve">Winsorization 1% và 5% đối với labor productivity và employment, áp dụng trong từng country-year.</w:t>
+      </w:r>
+    </w:p>
+    <w:bookmarkEnd w:id="116"/>
+    <w:bookmarkStart w:id="117" w:name="multicollinearity-và-heteroscedasticity"/>
+    <w:p>
+      <w:pPr>
+        <w:pStyle w:val="Heading3"/>
+      </w:pPr>
+      <w:r>
+        <w:t xml:space="preserve">3.5.4 Multicollinearity và heteroscedasticity</w:t>
       </w:r>
     </w:p>
     <w:p>
@@ -23698,7 +23659,7 @@
         <w:pStyle w:val="Compact"/>
       </w:pPr>
       <w:r>
-        <w:t xml:space="preserve">Leave-one-out: loại từng nghiên cứu và tái tính pooled effect.</w:t>
+        <w:t xml:space="preserve">VIF cho tất cả mô hình; ngưỡng VIF &lt; 5 (Hair et al., 2019).</w:t>
       </w:r>
     </w:p>
     <w:p>
@@ -23706,6 +23667,40 @@
         <w:numPr>
           <w:ilvl w:val="0"/>
           <w:numId w:val="1012"/>
+        </w:numPr>
+        <w:pStyle w:val="Compact"/>
+      </w:pPr>
+      <w:r>
+        <w:t xml:space="preserve">Breusch–Pagan test (Breusch &amp; Pagan, 1979).</w:t>
+      </w:r>
+    </w:p>
+    <w:bookmarkEnd w:id="117"/>
+    <w:bookmarkStart w:id="118" w:name="sensitivity-analysis-cho-meta-analysis"/>
+    <w:p>
+      <w:pPr>
+        <w:pStyle w:val="Heading3"/>
+      </w:pPr>
+      <w:r>
+        <w:t xml:space="preserve">3.5.5 Sensitivity analysis cho meta-analysis</w:t>
+      </w:r>
+    </w:p>
+    <w:p>
+      <w:pPr>
+        <w:numPr>
+          <w:ilvl w:val="0"/>
+          <w:numId w:val="1013"/>
+        </w:numPr>
+        <w:pStyle w:val="Compact"/>
+      </w:pPr>
+      <w:r>
+        <w:t xml:space="preserve">Leave-one-out: loại từng nghiên cứu và tái tính pooled effect.</w:t>
+      </w:r>
+    </w:p>
+    <w:p>
+      <w:pPr>
+        <w:numPr>
+          <w:ilvl w:val="0"/>
+          <w:numId w:val="1013"/>
         </w:numPr>
         <w:pStyle w:val="Compact"/>
       </w:pPr>
@@ -27108,7 +27103,7 @@
       <w:pPr>
         <w:numPr>
           <w:ilvl w:val="0"/>
-          <w:numId w:val="1013"/>
+          <w:numId w:val="1014"/>
         </w:numPr>
         <w:pStyle w:val="Compact"/>
       </w:pPr>
@@ -27159,7 +27154,7 @@
       <w:pPr>
         <w:numPr>
           <w:ilvl w:val="0"/>
-          <w:numId w:val="1013"/>
+          <w:numId w:val="1014"/>
         </w:numPr>
         <w:pStyle w:val="Compact"/>
       </w:pPr>
@@ -28559,7 +28554,7 @@
       <w:pPr>
         <w:numPr>
           <w:ilvl w:val="0"/>
-          <w:numId w:val="1014"/>
+          <w:numId w:val="1015"/>
         </w:numPr>
         <w:pStyle w:val="Compact"/>
       </w:pPr>
@@ -28578,7 +28573,7 @@
       <w:pPr>
         <w:numPr>
           <w:ilvl w:val="0"/>
-          <w:numId w:val="1014"/>
+          <w:numId w:val="1015"/>
         </w:numPr>
         <w:pStyle w:val="Compact"/>
       </w:pPr>
@@ -28597,7 +28592,7 @@
       <w:pPr>
         <w:numPr>
           <w:ilvl w:val="0"/>
-          <w:numId w:val="1014"/>
+          <w:numId w:val="1015"/>
         </w:numPr>
         <w:pStyle w:val="Compact"/>
       </w:pPr>
@@ -31440,7 +31435,7 @@
       <w:pPr>
         <w:numPr>
           <w:ilvl w:val="0"/>
-          <w:numId w:val="1015"/>
+          <w:numId w:val="1016"/>
         </w:numPr>
         <w:pStyle w:val="Compact"/>
       </w:pPr>
@@ -31560,7 +31555,7 @@
       <w:pPr>
         <w:numPr>
           <w:ilvl w:val="0"/>
-          <w:numId w:val="1015"/>
+          <w:numId w:val="1016"/>
         </w:numPr>
         <w:pStyle w:val="Compact"/>
       </w:pPr>
@@ -38493,7 +38488,7 @@
       <w:pPr>
         <w:numPr>
           <w:ilvl w:val="0"/>
-          <w:numId w:val="1016"/>
+          <w:numId w:val="1017"/>
         </w:numPr>
       </w:pPr>
       <w:r>
@@ -38505,417 +38500,6 @@
       </w:r>
       <w:r>
         <w:t xml:space="preserve">: không quan sát thấy ngưỡng bất lợi của quốc tế hóa trong miền dữ liệu (điểm uốn ước lượng ≈ 88,6% nhưng không định vị tin cậy) cho thấy không gian quốc tế hóa rất rộng. Chiến lược mở rộng quốc tế mạnh mẽ (high-commitment internationalization) phù hợp với bối cảnh này, đặc biệt khi kết hợp với DAI cao.</w:t>
-      </w:r>
-    </w:p>
-    <w:p>
-      <w:pPr>
-        <w:numPr>
-          <w:ilvl w:val="0"/>
-          <w:numId w:val="1016"/>
-        </w:numPr>
-      </w:pPr>
-      <w:r>
-        <w:rPr>
-          <w:bCs/>
-          <w:b/>
-        </w:rPr>
-        <w:t xml:space="preserve">Doanh nghiệp Trung Quốc (Nhóm III)</w:t>
-      </w:r>
-      <w:r>
-        <w:t xml:space="preserve">: điểm uốn TP ≈ 48,78% ổn định qua thập kỷ 2012–2024, gợi ý rằng chiến lược xuất khẩu tối ưu là duy trì tỷ lệ FSTS trong khoảng 40–50%, kết hợp giữa thị trường nội địa khổng lồ và hoạt động xuất khẩu có chọn lọc.</w:t>
-      </w:r>
-    </w:p>
-    <w:p>
-      <w:pPr>
-        <w:numPr>
-          <w:ilvl w:val="0"/>
-          <w:numId w:val="1016"/>
-        </w:numPr>
-      </w:pPr>
-      <w:r>
-        <w:rPr>
-          <w:bCs/>
-          <w:b/>
-        </w:rPr>
-        <w:t xml:space="preserve">Doanh nghiệp Việt Nam (Nhóm IV)</w:t>
-      </w:r>
-      <w:r>
-        <w:t xml:space="preserve">: điểm uốn thấp hơn (39,3–46,2%), hàm ý rằng nhà quản trị cần thận trọng hơn khi đẩy tỷ lệ xuất khẩu vượt quá 40% tổng doanh thu. Thay vào đó,</w:t>
-      </w:r>
-      <w:r>
-        <w:t xml:space="preserve"> </w:t>
-      </w:r>
-      <w:r>
-        <w:rPr>
-          <w:bCs/>
-          <w:b/>
-        </w:rPr>
-        <w:t xml:space="preserve">nâng cao TCI</w:t>
-      </w:r>
-      <w:r>
-        <w:t xml:space="preserve"> </w:t>
-      </w:r>
-      <w:r>
-        <w:t xml:space="preserve">trước khi mở rộng quốc tế sẽ hiệu quả hơn là tăng FSTS thuần túy.</w:t>
-      </w:r>
-    </w:p>
-    <w:p>
-      <w:pPr>
-        <w:numPr>
-          <w:ilvl w:val="0"/>
-          <w:numId w:val="1016"/>
-        </w:numPr>
-      </w:pPr>
-      <w:r>
-        <w:rPr>
-          <w:bCs/>
-          <w:b/>
-        </w:rPr>
-        <w:t xml:space="preserve">Doanh nghiệp SIDS (Nhóm VI)</w:t>
-      </w:r>
-      <w:r>
-        <w:t xml:space="preserve">: kết quả FIP là cảnh báo nghiêm túc, đẩy mạnh xuất khẩu trong bối cảnh thiếu năng lực và hỗ trợ thể chế không cải thiện mà còn có thể làm xấu đi hiệu quả hoạt động. Doanh nghiệp SIDS nên ưu tiên xây dựng năng lực nội địa và nâng cao TCI trước khi mở rộng xuất khẩu đáng kể.</w:t>
-      </w:r>
-    </w:p>
-    <w:bookmarkEnd w:id="183"/>
-    <w:bookmarkStart w:id="184" w:name="X3f7c356bbecb0845bc3ba35928bc46323a69176"/>
-    <w:p>
-      <w:pPr>
-        <w:pStyle w:val="Heading3"/>
-      </w:pPr>
-      <w:r>
-        <w:t xml:space="preserve">5.4.3 Đề xuất đặc biệt cho SIDS: Tránh Bẫy Quốc Tế Hóa Bắt Buộc</w:t>
-      </w:r>
-    </w:p>
-    <w:p>
-      <w:pPr>
-        <w:pStyle w:val="FirstParagraph"/>
-      </w:pPr>
-      <w:r>
-        <w:t xml:space="preserve">Phát hiện FIP tại bảy quốc gia Pacific SIDS có hàm ý chính sách cụ thể và cấp bách. Hiện tại, nhiều chương trình phát triển quốc tế và viện trợ thương mại cho SIDS tập trung vào khuyến khích xuất khẩu như một chiến lược tăng trưởng. Kết quả FIP đặt câu hỏi về hiệu quả của chiến lược này khi thiếu nền tảng năng lực tương ứng.</w:t>
-      </w:r>
-    </w:p>
-    <w:p>
-      <w:pPr>
-        <w:pStyle w:val="BodyText"/>
-      </w:pPr>
-      <w:r>
-        <w:t xml:space="preserve">Thay vào đó, hàm ý chính sách là:</w:t>
-      </w:r>
-      <w:r>
-        <w:t xml:space="preserve"> </w:t>
-      </w:r>
-      <w:r>
-        <w:rPr>
-          <w:bCs/>
-          <w:b/>
-        </w:rPr>
-        <w:t xml:space="preserve">không phải xuất khẩu nhiều hơn, mà phải xuất khẩu tốt hơn</w:t>
-      </w:r>
-      <w:r>
-        <w:t xml:space="preserve">. Cụ thể, ưu tiên nên là: (i) xây dựng hạ tầng logistics và kết nối (giảm chi phí cố định của xuất khẩu); (ii) phát triển năng lực doanh nghiệp thông qua TCI (chứ không chỉ DAI bề mặt); (iii) thiết kế chương trình hỗ trợ xuất khẩu có chọn lọc tập trung vào doanh nghiệp đã có đủ năng lực để hưởng lợi, thay vì khuyến khích đại trà. Nói tóm lại, tránh</w:t>
-      </w:r>
-      <w:r>
-        <w:t xml:space="preserve"> </w:t>
-      </w:r>
-      <w:r>
-        <w:t xml:space="preserve">“</w:t>
-      </w:r>
-      <w:r>
-        <w:t xml:space="preserve">bẫy quốc tế hóa bắt buộc</w:t>
-      </w:r>
-      <w:r>
-        <w:t xml:space="preserve">”</w:t>
-      </w:r>
-      <w:r>
-        <w:t xml:space="preserve"> </w:t>
-      </w:r>
-      <w:r>
-        <w:t xml:space="preserve">bằng cách đảm bảo rằng các can thiệp chính sách xây dựng năng lực trước khi thúc đẩy mở rộng thị trường.</w:t>
-      </w:r>
-    </w:p>
-    <w:bookmarkEnd w:id="184"/>
-    <w:bookmarkStart w:id="185" w:name="Xae585b9a1c03e57dcce9cad1f8f2ae171a592a6"/>
-    <w:p>
-      <w:pPr>
-        <w:pStyle w:val="Heading3"/>
-      </w:pPr>
-      <w:r>
-        <w:t xml:space="preserve">5.4.4 Hàm ý chính sách trong bối cảnh phát triển đương đại</w:t>
-      </w:r>
-    </w:p>
-    <w:p>
-      <w:pPr>
-        <w:pStyle w:val="FirstParagraph"/>
-      </w:pPr>
-      <w:r>
-        <w:t xml:space="preserve">Đặt các đề xuất trên vào bối cảnh phát triển vĩ mô gần nhất làm rõ tính cấp bách và phạm vi áp dụng của chúng. Thách thức việc làm là điểm khởi đầu: với hơn 230 triệu người dự kiến bước vào tuổi lao động ở các thị trường biên giai đoạn 2025–2035, năng lực tạo việc làm năng suất cao của khu vực doanh nghiệp trở thành ưu tiên phát triển hàng đầu (World Bank, 2026c). Phát hiện của luận án rằng quốc tế hóa chỉ tạo phần thưởng năng suất khi đi kèm năng lực công nghệ và đệm thể chế đủ mạnh hàm ý rằng chương trình nghị sự việc làm cần đặt nâng cấp năng lực doanh nghiệp làm trụ cột, thay vì chỉ theo đuổi mở rộng thương mại như mục tiêu tự thân.</w:t>
-      </w:r>
-    </w:p>
-    <w:p>
-      <w:pPr>
-        <w:pStyle w:val="BodyText"/>
-      </w:pPr>
-      <w:r>
-        <w:t xml:space="preserve">Thứ hai, bằng chứng vĩ mô cho thấy không tồn tại một con đường phát triển phổ quát: các nền kinh tế biên thành công đã đi những lối khác nhau, từ đầu tư năng lượng và khoáng sản, đến chế tạo giá trị gia tăng, đến dịch vụ và du lịch (World Bank, 2026c). Điều này củng cố nguyên tắc chính sách phái sinh từ khung ICRV: gói can thiệp phải được hiệu chỉnh theo chế độ thể chế và mô hình tăng trưởng đặc thù của từng nhóm, thay vì áp dụng một công thức chung. Với Việt Nam (Nhóm IV), con đường chế tạo giá trị gia tăng và dịch chuyển lên chuỗi giá trị là phù hợp với cả bằng chứng cấp doanh nghiệp của luận án lẫn kinh nghiệm của các thị trường biên thành công.</w:t>
-      </w:r>
-    </w:p>
-    <w:p>
-      <w:pPr>
-        <w:pStyle w:val="BodyText"/>
-      </w:pPr>
-      <w:r>
-        <w:t xml:space="preserve">Thứ ba, đối với các nền kinh tế tài nguyên dẫn dắt (Nhóm II), cú sốc giá hàng hóa năm 2026 vừa là cơ hội thu nhập ngắn hạn vừa là lời nhắc về rủi ro phụ thuộc tài nguyên (World Bank, 2026d). Hàm ý chính sách là tận dụng thặng dư tô lợi giai đoạn giá cao để đầu tư vào đa dạng hóa năng lực công nghệ và phi tài nguyên, đúng như chiến lược Vision của các nền GCC, thay vì củng cố cấu trúc nhà nước tô vốn san bằng động lực năng suất doanh nghiệp.</w:t>
-      </w:r>
-    </w:p>
-    <w:p>
-      <w:pPr>
-        <w:pStyle w:val="BodyText"/>
-      </w:pPr>
-      <w:r>
-        <w:t xml:space="preserve">Thứ tư, trong kỷ nguyên trí tuệ nhân tạo, hạ tầng số công và quản trị dữ liệu trở thành điều kiện nền tảng để năng lực số cấp doanh nghiệp được chuyển hóa thành giá trị (World Bank, 2026e). Phát hiện của luận án rằng phần thưởng của áp dụng số phụ thuộc bối cảnh thể chế và tầng năng lực hàm ý rằng chính sách số hóa cần phân tầng: ở các nền đang chuyển đổi, ưu tiên là phổ cập hạ tầng số nền tảng và kỹ năng số cơ bản; ở các nền tiên tiến đã bão hòa Tier-1, trọng tâm dịch sang năng lực số chiều sâu và quản trị dữ liệu, AI. Cách tiếp cận phân tầng này tránh được cả hai sai lầm: đầu tư quá sớm vào công nghệ cao ở nơi chưa có nền tảng hấp thụ, và dừng lại ở hiện diện số bề mặt ở nơi đã sẵn sàng cho tầng năng lực cao hơn.</w:t>
-      </w:r>
-    </w:p>
-    <w:bookmarkEnd w:id="185"/>
-    <w:bookmarkEnd w:id="186"/>
-    <w:bookmarkStart w:id="191" w:name="hạn-chế-và-hướng-nghiên-cứu-tương-lai"/>
-    <w:p>
-      <w:pPr>
-        <w:pStyle w:val="Heading2"/>
-      </w:pPr>
-      <w:r>
-        <w:t xml:space="preserve">5.5 Hạn chế và hướng nghiên cứu tương lai</w:t>
-      </w:r>
-    </w:p>
-    <w:bookmarkStart w:id="187" w:name="hạn-chế-về-đo-lường-dai"/>
-    <w:p>
-      <w:pPr>
-        <w:pStyle w:val="Heading3"/>
-      </w:pPr>
-      <w:r>
-        <w:t xml:space="preserve">5.5.1 Hạn chế về đo lường DAI</w:t>
-      </w:r>
-    </w:p>
-    <w:p>
-      <w:pPr>
-        <w:pStyle w:val="FirstParagraph"/>
-      </w:pPr>
-      <w:r>
-        <w:t xml:space="preserve">Hạn chế quan trọng nhất của luận án liên quan đến đo lường DAI. Dữ liệu WBES chỉ cung cấp số lượng item hạn chế để xây dựng chỉ số DAI, và các item này thay đổi qua các thế hệ schema WBES (PICS3, Standardized, BREADY/BEE). Tại Việt Nam (P3), chỉ Tier-1 DAI (website, email, online sales) được sử dụng do hạn chế của các làn sóng 2009 và 2015, trong khi Tier-2 (e-payment, e-supplier) chỉ có từ 2023. Điều này tạo ra khả năng đo lường không đầy đủ, đặc biệt là không nắm bắt được chiều sâu năng lực số ở bối cảnh ICRV thấp.</w:t>
-      </w:r>
-    </w:p>
-    <w:p>
-      <w:pPr>
-        <w:pStyle w:val="BodyText"/>
-      </w:pPr>
-      <w:r>
-        <w:t xml:space="preserve">Quan trọng hơn, tất cả các đo lường DAI đều là</w:t>
-      </w:r>
-      <w:r>
-        <w:t xml:space="preserve"> </w:t>
-      </w:r>
-      <w:r>
-        <w:rPr>
-          <w:bCs/>
-          <w:b/>
-        </w:rPr>
-        <w:t xml:space="preserve">static</w:t>
-      </w:r>
-      <w:r>
-        <w:t xml:space="preserve"> </w:t>
-      </w:r>
-      <w:r>
-        <w:t xml:space="preserve">(tại một thời điểm khảo sát), không thể nắm bắt tính</w:t>
-      </w:r>
-      <w:r>
-        <w:t xml:space="preserve"> </w:t>
-      </w:r>
-      <w:r>
-        <w:t xml:space="preserve">“</w:t>
-      </w:r>
-      <w:r>
-        <w:t xml:space="preserve">dynamic</w:t>
-      </w:r>
-      <w:r>
-        <w:t xml:space="preserve">”</w:t>
-      </w:r>
-      <w:r>
-        <w:t xml:space="preserve"> </w:t>
-      </w:r>
-      <w:r>
-        <w:t xml:space="preserve">của việc cập nhật và tái cấu hình năng lực số theo thời gian. Điều này có nghĩa là các phát hiện về DAI trong luận án phản ánh mức độ chấp nhận số tại một thời điểm chứ không phải năng lực số năng động theo nghĩa của dynamic capabilities theory (Teece et al., 1997).</w:t>
-      </w:r>
-    </w:p>
-    <w:bookmarkEnd w:id="187"/>
-    <w:bookmarkStart w:id="188" w:name="X0fb0169567c230dc5c1d35515099b26124d99e1"/>
-    <w:p>
-      <w:pPr>
-        <w:pStyle w:val="Heading3"/>
-      </w:pPr>
-      <w:r>
-        <w:t xml:space="preserve">5.5.2 Hạn chế về selection bias trong exporters subsamples</w:t>
-      </w:r>
-    </w:p>
-    <w:p>
-      <w:pPr>
-        <w:pStyle w:val="FirstParagraph"/>
-      </w:pPr>
-      <w:r>
-        <w:t xml:space="preserve">Các phân tích sử dụng mẫu chỉ gồm doanh nghiệp xuất khẩu (ví dụ: Singapore mẫu phụ xuất khẩu N = 84, SIDS exporters-only N = 26) đối mặt với rủi ro selection bias nghiêm trọng: doanh nghiệp xuất khẩu không phải là mẫu ngẫu nhiên từ tổng thể doanh nghiệp mà có khả năng là các doanh nghiệp đã có một số lợi thế ban đầu (productivity, resources, connections). Kết quả từ exporters-only không thể tổng quát hóa trực tiếp cho toàn bộ doanh nghiệp, và có thể understate hoặc overstate các hiệu ứng tùy thuộc vào phương hướng của selection.</w:t>
-      </w:r>
-    </w:p>
-    <w:p>
-      <w:pPr>
-        <w:pStyle w:val="BodyText"/>
-      </w:pPr>
-      <w:r>
-        <w:t xml:space="preserve">Phân tích Heckman two-step (hoặc treatment effects models) trong các nghiên cứu tương lai có thể khắc phục phần nào hạn chế này bằng cách mô hình hóa quá trình lựa chọn tham gia xuất khẩu như giai đoạn thứ nhất trước khi ước lượng hiệu quả trong giai đoạn thứ hai.</w:t>
-      </w:r>
-    </w:p>
-    <w:bookmarkEnd w:id="188"/>
-    <w:bookmarkStart w:id="189" w:name="hạn-chế-về-nhân-quả"/>
-    <w:p>
-      <w:pPr>
-        <w:pStyle w:val="Heading3"/>
-      </w:pPr>
-      <w:r>
-        <w:t xml:space="preserve">5.5.3 Hạn chế về nhân quả</w:t>
-      </w:r>
-    </w:p>
-    <w:p>
-      <w:pPr>
-        <w:pStyle w:val="FirstParagraph"/>
-      </w:pPr>
-      <w:r>
-        <w:t xml:space="preserve">Thiết kế cross-sectional (hoặc pooled panel nhưng với WBES không phải là panel thực sự cho cùng doanh nghiệp qua thời gian) giới hạn khả năng suy luận nhân quả. Quan hệ I–P có thể bị ảnh hưởng bởi reverse causality: doanh nghiệp hiệu quả hơn có thể có nhiều nguồn lực để quốc tế hóa hơn, tạo ra chiều nhân quả ngược lại. Country fixed effects và year fixed effects giúp kiểm soát một phần, nhưng không giải quyết hoàn toàn vấn đề endogeneity.</w:t>
-      </w:r>
-    </w:p>
-    <w:bookmarkEnd w:id="189"/>
-    <w:bookmarkStart w:id="190" w:name="hướng-nghiên-cứu-tương-lai"/>
-    <w:p>
-      <w:pPr>
-        <w:pStyle w:val="Heading3"/>
-      </w:pPr>
-      <w:r>
-        <w:t xml:space="preserve">5.5.4 Hướng nghiên cứu tương lai</w:t>
-      </w:r>
-    </w:p>
-    <w:p>
-      <w:pPr>
-        <w:pStyle w:val="FirstParagraph"/>
-      </w:pPr>
-      <w:r>
-        <w:t xml:space="preserve">Dựa trên các hạn chế trên, luận án đề xuất bốn hướng nghiên cứu ưu tiên:</w:t>
-      </w:r>
-    </w:p>
-    <w:p>
-      <w:pPr>
-        <w:pStyle w:val="BodyText"/>
-      </w:pPr>
-      <w:r>
-        <w:rPr>
-          <w:bCs/>
-          <w:b/>
-        </w:rPr>
-        <w:t xml:space="preserve">Thứ nhất</w:t>
-      </w:r>
-      <w:r>
-        <w:t xml:space="preserve">, xây dựng đo lường DAI phong phú hơn (Tier-2 và Tier-3) trên dữ liệu WBES mới nhất (2023–2026) và các nguồn dữ liệu bổ sung (ITU Digital Development Index, OECD Digital Economy Outlook) để kiểm định lại vai trò DAI trong các bối cảnh ICRV thấp hơn.</w:t>
-      </w:r>
-    </w:p>
-    <w:p>
-      <w:pPr>
-        <w:pStyle w:val="BodyText"/>
-      </w:pPr>
-      <w:r>
-        <w:rPr>
-          <w:bCs/>
-          <w:b/>
-        </w:rPr>
-        <w:t xml:space="preserve">Thứ hai</w:t>
-      </w:r>
-      <w:r>
-        <w:t xml:space="preserve">, sử dụng phương pháp nhận dạng nhân quả (causal identification): instrumental variables (ví dụ: sử dụng các cải cách thương mại ngoại sinh như FTA ký kết), difference-in-differences, hoặc regression discontinuity design để ước lượng hiệu ứng nhân quả của quốc tế hóa lên hiệu quả.</w:t>
-      </w:r>
-    </w:p>
-    <w:p>
-      <w:pPr>
-        <w:pStyle w:val="BodyText"/>
-      </w:pPr>
-      <w:r>
-        <w:rPr>
-          <w:bCs/>
-          <w:b/>
-        </w:rPr>
-        <w:t xml:space="preserve">Thứ ba</w:t>
-      </w:r>
-      <w:r>
-        <w:t xml:space="preserve">, mở rộng phân tích FIP tại SIDS với các công cụ đo lường và dữ liệu panel thực sự (theo dõi cùng doanh nghiệp qua nhiều năm) để kiểm định liệu FIP là trạng thái cấu trúc dài hạn hay chỉ là giai đoạn tạm thời khi doanh nghiệp SIDS mới bắt đầu xuất khẩu.</w:t>
-      </w:r>
-    </w:p>
-    <w:p>
-      <w:pPr>
-        <w:pStyle w:val="BodyText"/>
-      </w:pPr>
-      <w:r>
-        <w:rPr>
-          <w:bCs/>
-          <w:b/>
-        </w:rPr>
-        <w:t xml:space="preserve">Thứ tư</w:t>
-      </w:r>
-      <w:r>
-        <w:t xml:space="preserve">, kiểm định vai trò của top manager characteristics (H4, kinh nghiệm, giới tính) trong từng bối cảnh ICRV riêng biệt, đặc biệt trong bối cảnh Emerging và SIDS nơi tầng năng lực và thể chế yếu hơn, liệu đặc điểm nhà quản trị có thể bù đắp một phần cho những thiếu hụt đó không?</w:t>
-      </w:r>
-    </w:p>
-    <w:p>
-      <w:pPr>
-        <w:pStyle w:val="BodyText"/>
-      </w:pPr>
-      <w:r>
-        <w:rPr>
-          <w:bCs/>
-          <w:b/>
-        </w:rPr>
-        <w:t xml:space="preserve">Thứ năm</w:t>
-      </w:r>
-      <w:r>
-        <w:t xml:space="preserve">, khai thác sâu hơn Nhật Bản, nền kinh tế tiên tiến lớn lần đầu được WBES khảo sát năm 2025. Bước đầu tiên đã được thực hiện trong nghiên cứu thành phần P10: trên đợt khảo sát khai mở (N = 2.168), quan hệ I–P tại Nhật gần tuyến tính dương, không có điểm uốn trong miền quan sát, xác nhận dự đoán biên trên của khung ICRV; các bước tiếp theo gồm tích hợp Nhật Bản vào các mô hình điều tiết ba chiều và khai thác các module đặc thù (trường thọ doanh nghiệp, khoảng cách giới trong lãnh đạo) khi có thêm đợt khảo sát thứ hai.</w:t>
-      </w:r>
-    </w:p>
-    <w:p>
-      <w:r>
-        <w:pict>
-          <v:rect style="width:0;height:1.5pt" o:hralign="center" o:hrstd="t" o:hr="t"/>
-        </w:pict>
-      </w:r>
-    </w:p>
-    <w:bookmarkEnd w:id="190"/>
-    <w:bookmarkEnd w:id="191"/>
-    <w:bookmarkStart w:id="196" w:name="kết-luận"/>
-    <w:p>
-      <w:pPr>
-        <w:pStyle w:val="Heading2"/>
-      </w:pPr>
-      <w:r>
-        <w:t xml:space="preserve">5.6 Kết luận</w:t>
-      </w:r>
-    </w:p>
-    <w:bookmarkStart w:id="192" w:name="tổng-kết-chín-nghiên-cứu"/>
-    <w:p>
-      <w:pPr>
-        <w:pStyle w:val="Heading3"/>
-      </w:pPr>
-      <w:r>
-        <w:t xml:space="preserve">5.6.1 Tổng kết chín nghiên cứu</w:t>
-      </w:r>
-    </w:p>
-    <w:p>
-      <w:pPr>
-        <w:pStyle w:val="FirstParagraph"/>
-      </w:pPr>
-      <w:r>
-        <w:t xml:space="preserve">Luận án này được xây dựng trên chín nghiên cứu bổ sung cho nhau, kết hợp bằng chứng từ meta-analysis và phân tích thực nghiệm sơ cấp:</w:t>
       </w:r>
     </w:p>
     <w:p>
@@ -38930,6 +38514,417 @@
           <w:bCs/>
           <w:b/>
         </w:rPr>
+        <w:t xml:space="preserve">Doanh nghiệp Trung Quốc (Nhóm III)</w:t>
+      </w:r>
+      <w:r>
+        <w:t xml:space="preserve">: điểm uốn TP ≈ 48,78% ổn định qua thập kỷ 2012–2024, gợi ý rằng chiến lược xuất khẩu tối ưu là duy trì tỷ lệ FSTS trong khoảng 40–50%, kết hợp giữa thị trường nội địa khổng lồ và hoạt động xuất khẩu có chọn lọc.</w:t>
+      </w:r>
+    </w:p>
+    <w:p>
+      <w:pPr>
+        <w:numPr>
+          <w:ilvl w:val="0"/>
+          <w:numId w:val="1017"/>
+        </w:numPr>
+      </w:pPr>
+      <w:r>
+        <w:rPr>
+          <w:bCs/>
+          <w:b/>
+        </w:rPr>
+        <w:t xml:space="preserve">Doanh nghiệp Việt Nam (Nhóm IV)</w:t>
+      </w:r>
+      <w:r>
+        <w:t xml:space="preserve">: điểm uốn thấp hơn (39,3–46,2%), hàm ý rằng nhà quản trị cần thận trọng hơn khi đẩy tỷ lệ xuất khẩu vượt quá 40% tổng doanh thu. Thay vào đó,</w:t>
+      </w:r>
+      <w:r>
+        <w:t xml:space="preserve"> </w:t>
+      </w:r>
+      <w:r>
+        <w:rPr>
+          <w:bCs/>
+          <w:b/>
+        </w:rPr>
+        <w:t xml:space="preserve">nâng cao TCI</w:t>
+      </w:r>
+      <w:r>
+        <w:t xml:space="preserve"> </w:t>
+      </w:r>
+      <w:r>
+        <w:t xml:space="preserve">trước khi mở rộng quốc tế sẽ hiệu quả hơn là tăng FSTS thuần túy.</w:t>
+      </w:r>
+    </w:p>
+    <w:p>
+      <w:pPr>
+        <w:numPr>
+          <w:ilvl w:val="0"/>
+          <w:numId w:val="1017"/>
+        </w:numPr>
+      </w:pPr>
+      <w:r>
+        <w:rPr>
+          <w:bCs/>
+          <w:b/>
+        </w:rPr>
+        <w:t xml:space="preserve">Doanh nghiệp SIDS (Nhóm VI)</w:t>
+      </w:r>
+      <w:r>
+        <w:t xml:space="preserve">: kết quả FIP là cảnh báo nghiêm túc, đẩy mạnh xuất khẩu trong bối cảnh thiếu năng lực và hỗ trợ thể chế không cải thiện mà còn có thể làm xấu đi hiệu quả hoạt động. Doanh nghiệp SIDS nên ưu tiên xây dựng năng lực nội địa và nâng cao TCI trước khi mở rộng xuất khẩu đáng kể.</w:t>
+      </w:r>
+    </w:p>
+    <w:bookmarkEnd w:id="183"/>
+    <w:bookmarkStart w:id="184" w:name="X3f7c356bbecb0845bc3ba35928bc46323a69176"/>
+    <w:p>
+      <w:pPr>
+        <w:pStyle w:val="Heading3"/>
+      </w:pPr>
+      <w:r>
+        <w:t xml:space="preserve">5.4.3 Đề xuất đặc biệt cho SIDS: Tránh Bẫy Quốc Tế Hóa Bắt Buộc</w:t>
+      </w:r>
+    </w:p>
+    <w:p>
+      <w:pPr>
+        <w:pStyle w:val="FirstParagraph"/>
+      </w:pPr>
+      <w:r>
+        <w:t xml:space="preserve">Phát hiện FIP tại bảy quốc gia Pacific SIDS có hàm ý chính sách cụ thể và cấp bách. Hiện tại, nhiều chương trình phát triển quốc tế và viện trợ thương mại cho SIDS tập trung vào khuyến khích xuất khẩu như một chiến lược tăng trưởng. Kết quả FIP đặt câu hỏi về hiệu quả của chiến lược này khi thiếu nền tảng năng lực tương ứng.</w:t>
+      </w:r>
+    </w:p>
+    <w:p>
+      <w:pPr>
+        <w:pStyle w:val="BodyText"/>
+      </w:pPr>
+      <w:r>
+        <w:t xml:space="preserve">Thay vào đó, hàm ý chính sách là:</w:t>
+      </w:r>
+      <w:r>
+        <w:t xml:space="preserve"> </w:t>
+      </w:r>
+      <w:r>
+        <w:rPr>
+          <w:bCs/>
+          <w:b/>
+        </w:rPr>
+        <w:t xml:space="preserve">không phải xuất khẩu nhiều hơn, mà phải xuất khẩu tốt hơn</w:t>
+      </w:r>
+      <w:r>
+        <w:t xml:space="preserve">. Cụ thể, ưu tiên nên là: (i) xây dựng hạ tầng logistics và kết nối (giảm chi phí cố định của xuất khẩu); (ii) phát triển năng lực doanh nghiệp thông qua TCI (chứ không chỉ DAI bề mặt); (iii) thiết kế chương trình hỗ trợ xuất khẩu có chọn lọc tập trung vào doanh nghiệp đã có đủ năng lực để hưởng lợi, thay vì khuyến khích đại trà. Nói tóm lại, tránh</w:t>
+      </w:r>
+      <w:r>
+        <w:t xml:space="preserve"> </w:t>
+      </w:r>
+      <w:r>
+        <w:t xml:space="preserve">“</w:t>
+      </w:r>
+      <w:r>
+        <w:t xml:space="preserve">bẫy quốc tế hóa bắt buộc</w:t>
+      </w:r>
+      <w:r>
+        <w:t xml:space="preserve">”</w:t>
+      </w:r>
+      <w:r>
+        <w:t xml:space="preserve"> </w:t>
+      </w:r>
+      <w:r>
+        <w:t xml:space="preserve">bằng cách đảm bảo rằng các can thiệp chính sách xây dựng năng lực trước khi thúc đẩy mở rộng thị trường.</w:t>
+      </w:r>
+    </w:p>
+    <w:bookmarkEnd w:id="184"/>
+    <w:bookmarkStart w:id="185" w:name="Xae585b9a1c03e57dcce9cad1f8f2ae171a592a6"/>
+    <w:p>
+      <w:pPr>
+        <w:pStyle w:val="Heading3"/>
+      </w:pPr>
+      <w:r>
+        <w:t xml:space="preserve">5.4.4 Hàm ý chính sách trong bối cảnh phát triển đương đại</w:t>
+      </w:r>
+    </w:p>
+    <w:p>
+      <w:pPr>
+        <w:pStyle w:val="FirstParagraph"/>
+      </w:pPr>
+      <w:r>
+        <w:t xml:space="preserve">Đặt các đề xuất trên vào bối cảnh phát triển vĩ mô gần nhất làm rõ tính cấp bách và phạm vi áp dụng của chúng. Thách thức việc làm là điểm khởi đầu: với hơn 230 triệu người dự kiến bước vào tuổi lao động ở các thị trường biên giai đoạn 2025–2035, năng lực tạo việc làm năng suất cao của khu vực doanh nghiệp trở thành ưu tiên phát triển hàng đầu (World Bank, 2026c). Phát hiện của luận án rằng quốc tế hóa chỉ tạo phần thưởng năng suất khi đi kèm năng lực công nghệ và đệm thể chế đủ mạnh hàm ý rằng chương trình nghị sự việc làm cần đặt nâng cấp năng lực doanh nghiệp làm trụ cột, thay vì chỉ theo đuổi mở rộng thương mại như mục tiêu tự thân.</w:t>
+      </w:r>
+    </w:p>
+    <w:p>
+      <w:pPr>
+        <w:pStyle w:val="BodyText"/>
+      </w:pPr>
+      <w:r>
+        <w:t xml:space="preserve">Thứ hai, bằng chứng vĩ mô cho thấy không tồn tại một con đường phát triển phổ quát: các nền kinh tế biên thành công đã đi những lối khác nhau, từ đầu tư năng lượng và khoáng sản, đến chế tạo giá trị gia tăng, đến dịch vụ và du lịch (World Bank, 2026c). Điều này củng cố nguyên tắc chính sách phái sinh từ khung ICRV: gói can thiệp phải được hiệu chỉnh theo chế độ thể chế và mô hình tăng trưởng đặc thù của từng nhóm, thay vì áp dụng một công thức chung. Với Việt Nam (Nhóm IV), con đường chế tạo giá trị gia tăng và dịch chuyển lên chuỗi giá trị là phù hợp với cả bằng chứng cấp doanh nghiệp của luận án lẫn kinh nghiệm của các thị trường biên thành công.</w:t>
+      </w:r>
+    </w:p>
+    <w:p>
+      <w:pPr>
+        <w:pStyle w:val="BodyText"/>
+      </w:pPr>
+      <w:r>
+        <w:t xml:space="preserve">Thứ ba, đối với các nền kinh tế tài nguyên dẫn dắt (Nhóm II), cú sốc giá hàng hóa năm 2026 vừa là cơ hội thu nhập ngắn hạn vừa là lời nhắc về rủi ro phụ thuộc tài nguyên (World Bank, 2026d). Hàm ý chính sách là tận dụng thặng dư tô lợi giai đoạn giá cao để đầu tư vào đa dạng hóa năng lực công nghệ và phi tài nguyên, đúng như chiến lược Vision của các nền GCC, thay vì củng cố cấu trúc nhà nước tô vốn san bằng động lực năng suất doanh nghiệp.</w:t>
+      </w:r>
+    </w:p>
+    <w:p>
+      <w:pPr>
+        <w:pStyle w:val="BodyText"/>
+      </w:pPr>
+      <w:r>
+        <w:t xml:space="preserve">Thứ tư, trong kỷ nguyên trí tuệ nhân tạo, hạ tầng số công và quản trị dữ liệu trở thành điều kiện nền tảng để năng lực số cấp doanh nghiệp được chuyển hóa thành giá trị (World Bank, 2026e). Phát hiện của luận án rằng phần thưởng của áp dụng số phụ thuộc bối cảnh thể chế và tầng năng lực hàm ý rằng chính sách số hóa cần phân tầng: ở các nền đang chuyển đổi, ưu tiên là phổ cập hạ tầng số nền tảng và kỹ năng số cơ bản; ở các nền tiên tiến đã bão hòa Tier-1, trọng tâm dịch sang năng lực số chiều sâu và quản trị dữ liệu, AI. Cách tiếp cận phân tầng này tránh được cả hai sai lầm: đầu tư quá sớm vào công nghệ cao ở nơi chưa có nền tảng hấp thụ, và dừng lại ở hiện diện số bề mặt ở nơi đã sẵn sàng cho tầng năng lực cao hơn.</w:t>
+      </w:r>
+    </w:p>
+    <w:bookmarkEnd w:id="185"/>
+    <w:bookmarkEnd w:id="186"/>
+    <w:bookmarkStart w:id="191" w:name="hạn-chế-và-hướng-nghiên-cứu-tương-lai"/>
+    <w:p>
+      <w:pPr>
+        <w:pStyle w:val="Heading2"/>
+      </w:pPr>
+      <w:r>
+        <w:t xml:space="preserve">5.5 Hạn chế và hướng nghiên cứu tương lai</w:t>
+      </w:r>
+    </w:p>
+    <w:bookmarkStart w:id="187" w:name="hạn-chế-về-đo-lường-dai"/>
+    <w:p>
+      <w:pPr>
+        <w:pStyle w:val="Heading3"/>
+      </w:pPr>
+      <w:r>
+        <w:t xml:space="preserve">5.5.1 Hạn chế về đo lường DAI</w:t>
+      </w:r>
+    </w:p>
+    <w:p>
+      <w:pPr>
+        <w:pStyle w:val="FirstParagraph"/>
+      </w:pPr>
+      <w:r>
+        <w:t xml:space="preserve">Hạn chế quan trọng nhất của luận án liên quan đến đo lường DAI. Dữ liệu WBES chỉ cung cấp số lượng item hạn chế để xây dựng chỉ số DAI, và các item này thay đổi qua các thế hệ schema WBES (PICS3, Standardized, BREADY/BEE). Tại Việt Nam (P3), chỉ Tier-1 DAI (website, email, online sales) được sử dụng do hạn chế của các làn sóng 2009 và 2015, trong khi Tier-2 (e-payment, e-supplier) chỉ có từ 2023. Điều này tạo ra khả năng đo lường không đầy đủ, đặc biệt là không nắm bắt được chiều sâu năng lực số ở bối cảnh ICRV thấp.</w:t>
+      </w:r>
+    </w:p>
+    <w:p>
+      <w:pPr>
+        <w:pStyle w:val="BodyText"/>
+      </w:pPr>
+      <w:r>
+        <w:t xml:space="preserve">Quan trọng hơn, tất cả các đo lường DAI đều là</w:t>
+      </w:r>
+      <w:r>
+        <w:t xml:space="preserve"> </w:t>
+      </w:r>
+      <w:r>
+        <w:rPr>
+          <w:bCs/>
+          <w:b/>
+        </w:rPr>
+        <w:t xml:space="preserve">static</w:t>
+      </w:r>
+      <w:r>
+        <w:t xml:space="preserve"> </w:t>
+      </w:r>
+      <w:r>
+        <w:t xml:space="preserve">(tại một thời điểm khảo sát), không thể nắm bắt tính</w:t>
+      </w:r>
+      <w:r>
+        <w:t xml:space="preserve"> </w:t>
+      </w:r>
+      <w:r>
+        <w:t xml:space="preserve">“</w:t>
+      </w:r>
+      <w:r>
+        <w:t xml:space="preserve">dynamic</w:t>
+      </w:r>
+      <w:r>
+        <w:t xml:space="preserve">”</w:t>
+      </w:r>
+      <w:r>
+        <w:t xml:space="preserve"> </w:t>
+      </w:r>
+      <w:r>
+        <w:t xml:space="preserve">của việc cập nhật và tái cấu hình năng lực số theo thời gian. Điều này có nghĩa là các phát hiện về DAI trong luận án phản ánh mức độ chấp nhận số tại một thời điểm chứ không phải năng lực số năng động theo nghĩa của dynamic capabilities theory (Teece et al., 1997).</w:t>
+      </w:r>
+    </w:p>
+    <w:bookmarkEnd w:id="187"/>
+    <w:bookmarkStart w:id="188" w:name="X0fb0169567c230dc5c1d35515099b26124d99e1"/>
+    <w:p>
+      <w:pPr>
+        <w:pStyle w:val="Heading3"/>
+      </w:pPr>
+      <w:r>
+        <w:t xml:space="preserve">5.5.2 Hạn chế về selection bias trong exporters subsamples</w:t>
+      </w:r>
+    </w:p>
+    <w:p>
+      <w:pPr>
+        <w:pStyle w:val="FirstParagraph"/>
+      </w:pPr>
+      <w:r>
+        <w:t xml:space="preserve">Các phân tích sử dụng mẫu chỉ gồm doanh nghiệp xuất khẩu (ví dụ: Singapore mẫu phụ xuất khẩu N = 84, SIDS exporters-only N = 26) đối mặt với rủi ro selection bias nghiêm trọng: doanh nghiệp xuất khẩu không phải là mẫu ngẫu nhiên từ tổng thể doanh nghiệp mà có khả năng là các doanh nghiệp đã có một số lợi thế ban đầu (productivity, resources, connections). Kết quả từ exporters-only không thể tổng quát hóa trực tiếp cho toàn bộ doanh nghiệp, và có thể understate hoặc overstate các hiệu ứng tùy thuộc vào phương hướng của selection.</w:t>
+      </w:r>
+    </w:p>
+    <w:p>
+      <w:pPr>
+        <w:pStyle w:val="BodyText"/>
+      </w:pPr>
+      <w:r>
+        <w:t xml:space="preserve">Phân tích Heckman two-step (hoặc treatment effects models) trong các nghiên cứu tương lai có thể khắc phục phần nào hạn chế này bằng cách mô hình hóa quá trình lựa chọn tham gia xuất khẩu như giai đoạn thứ nhất trước khi ước lượng hiệu quả trong giai đoạn thứ hai.</w:t>
+      </w:r>
+    </w:p>
+    <w:bookmarkEnd w:id="188"/>
+    <w:bookmarkStart w:id="189" w:name="hạn-chế-về-nhân-quả"/>
+    <w:p>
+      <w:pPr>
+        <w:pStyle w:val="Heading3"/>
+      </w:pPr>
+      <w:r>
+        <w:t xml:space="preserve">5.5.3 Hạn chế về nhân quả</w:t>
+      </w:r>
+    </w:p>
+    <w:p>
+      <w:pPr>
+        <w:pStyle w:val="FirstParagraph"/>
+      </w:pPr>
+      <w:r>
+        <w:t xml:space="preserve">Thiết kế cross-sectional (hoặc pooled panel nhưng với WBES không phải là panel thực sự cho cùng doanh nghiệp qua thời gian) giới hạn khả năng suy luận nhân quả. Quan hệ I–P có thể bị ảnh hưởng bởi reverse causality: doanh nghiệp hiệu quả hơn có thể có nhiều nguồn lực để quốc tế hóa hơn, tạo ra chiều nhân quả ngược lại. Country fixed effects và year fixed effects giúp kiểm soát một phần, nhưng không giải quyết hoàn toàn vấn đề endogeneity.</w:t>
+      </w:r>
+    </w:p>
+    <w:bookmarkEnd w:id="189"/>
+    <w:bookmarkStart w:id="190" w:name="hướng-nghiên-cứu-tương-lai"/>
+    <w:p>
+      <w:pPr>
+        <w:pStyle w:val="Heading3"/>
+      </w:pPr>
+      <w:r>
+        <w:t xml:space="preserve">5.5.4 Hướng nghiên cứu tương lai</w:t>
+      </w:r>
+    </w:p>
+    <w:p>
+      <w:pPr>
+        <w:pStyle w:val="FirstParagraph"/>
+      </w:pPr>
+      <w:r>
+        <w:t xml:space="preserve">Dựa trên các hạn chế trên, luận án đề xuất bốn hướng nghiên cứu ưu tiên:</w:t>
+      </w:r>
+    </w:p>
+    <w:p>
+      <w:pPr>
+        <w:pStyle w:val="BodyText"/>
+      </w:pPr>
+      <w:r>
+        <w:rPr>
+          <w:bCs/>
+          <w:b/>
+        </w:rPr>
+        <w:t xml:space="preserve">Thứ nhất</w:t>
+      </w:r>
+      <w:r>
+        <w:t xml:space="preserve">, xây dựng đo lường DAI phong phú hơn (Tier-2 và Tier-3) trên dữ liệu WBES mới nhất (2023–2026) và các nguồn dữ liệu bổ sung (ITU Digital Development Index, OECD Digital Economy Outlook) để kiểm định lại vai trò DAI trong các bối cảnh ICRV thấp hơn.</w:t>
+      </w:r>
+    </w:p>
+    <w:p>
+      <w:pPr>
+        <w:pStyle w:val="BodyText"/>
+      </w:pPr>
+      <w:r>
+        <w:rPr>
+          <w:bCs/>
+          <w:b/>
+        </w:rPr>
+        <w:t xml:space="preserve">Thứ hai</w:t>
+      </w:r>
+      <w:r>
+        <w:t xml:space="preserve">, sử dụng phương pháp nhận dạng nhân quả (causal identification): instrumental variables (ví dụ: sử dụng các cải cách thương mại ngoại sinh như FTA ký kết), difference-in-differences, hoặc regression discontinuity design để ước lượng hiệu ứng nhân quả của quốc tế hóa lên hiệu quả.</w:t>
+      </w:r>
+    </w:p>
+    <w:p>
+      <w:pPr>
+        <w:pStyle w:val="BodyText"/>
+      </w:pPr>
+      <w:r>
+        <w:rPr>
+          <w:bCs/>
+          <w:b/>
+        </w:rPr>
+        <w:t xml:space="preserve">Thứ ba</w:t>
+      </w:r>
+      <w:r>
+        <w:t xml:space="preserve">, mở rộng phân tích FIP tại SIDS với các công cụ đo lường và dữ liệu panel thực sự (theo dõi cùng doanh nghiệp qua nhiều năm) để kiểm định liệu FIP là trạng thái cấu trúc dài hạn hay chỉ là giai đoạn tạm thời khi doanh nghiệp SIDS mới bắt đầu xuất khẩu.</w:t>
+      </w:r>
+    </w:p>
+    <w:p>
+      <w:pPr>
+        <w:pStyle w:val="BodyText"/>
+      </w:pPr>
+      <w:r>
+        <w:rPr>
+          <w:bCs/>
+          <w:b/>
+        </w:rPr>
+        <w:t xml:space="preserve">Thứ tư</w:t>
+      </w:r>
+      <w:r>
+        <w:t xml:space="preserve">, kiểm định vai trò của top manager characteristics (H4, kinh nghiệm, giới tính) trong từng bối cảnh ICRV riêng biệt, đặc biệt trong bối cảnh Emerging và SIDS nơi tầng năng lực và thể chế yếu hơn, liệu đặc điểm nhà quản trị có thể bù đắp một phần cho những thiếu hụt đó không?</w:t>
+      </w:r>
+    </w:p>
+    <w:p>
+      <w:pPr>
+        <w:pStyle w:val="BodyText"/>
+      </w:pPr>
+      <w:r>
+        <w:rPr>
+          <w:bCs/>
+          <w:b/>
+        </w:rPr>
+        <w:t xml:space="preserve">Thứ năm</w:t>
+      </w:r>
+      <w:r>
+        <w:t xml:space="preserve">, khai thác sâu hơn Nhật Bản, nền kinh tế tiên tiến lớn lần đầu được WBES khảo sát năm 2025. Bước đầu tiên đã được thực hiện trong nghiên cứu thành phần P10: trên đợt khảo sát khai mở (N = 2.168), quan hệ I–P tại Nhật gần tuyến tính dương, không có điểm uốn trong miền quan sát, xác nhận dự đoán biên trên của khung ICRV; các bước tiếp theo gồm tích hợp Nhật Bản vào các mô hình điều tiết ba chiều và khai thác các module đặc thù (trường thọ doanh nghiệp, khoảng cách giới trong lãnh đạo) khi có thêm đợt khảo sát thứ hai.</w:t>
+      </w:r>
+    </w:p>
+    <w:p>
+      <w:r>
+        <w:pict>
+          <v:rect style="width:0;height:1.5pt" o:hralign="center" o:hrstd="t" o:hr="t"/>
+        </w:pict>
+      </w:r>
+    </w:p>
+    <w:bookmarkEnd w:id="190"/>
+    <w:bookmarkEnd w:id="191"/>
+    <w:bookmarkStart w:id="196" w:name="kết-luận"/>
+    <w:p>
+      <w:pPr>
+        <w:pStyle w:val="Heading2"/>
+      </w:pPr>
+      <w:r>
+        <w:t xml:space="preserve">5.6 Kết luận</w:t>
+      </w:r>
+    </w:p>
+    <w:bookmarkStart w:id="192" w:name="tổng-kết-chín-nghiên-cứu"/>
+    <w:p>
+      <w:pPr>
+        <w:pStyle w:val="Heading3"/>
+      </w:pPr>
+      <w:r>
+        <w:t xml:space="preserve">5.6.1 Tổng kết chín nghiên cứu</w:t>
+      </w:r>
+    </w:p>
+    <w:p>
+      <w:pPr>
+        <w:pStyle w:val="FirstParagraph"/>
+      </w:pPr>
+      <w:r>
+        <w:t xml:space="preserve">Luận án này được xây dựng trên chín nghiên cứu bổ sung cho nhau, kết hợp bằng chứng từ meta-analysis và phân tích thực nghiệm sơ cấp:</w:t>
+      </w:r>
+    </w:p>
+    <w:p>
+      <w:pPr>
+        <w:numPr>
+          <w:ilvl w:val="0"/>
+          <w:numId w:val="1018"/>
+        </w:numPr>
+      </w:pPr>
+      <w:r>
+        <w:rPr>
+          <w:bCs/>
+          <w:b/>
+        </w:rPr>
         <w:t xml:space="preserve">P1 và P2</w:t>
       </w:r>
       <w:r>
@@ -38992,7 +38987,7 @@
       <w:pPr>
         <w:numPr>
           <w:ilvl w:val="0"/>
-          <w:numId w:val="1017"/>
+          <w:numId w:val="1018"/>
         </w:numPr>
       </w:pPr>
       <w:r>
@@ -39010,7 +39005,7 @@
       <w:pPr>
         <w:numPr>
           <w:ilvl w:val="0"/>
-          <w:numId w:val="1017"/>
+          <w:numId w:val="1018"/>
         </w:numPr>
       </w:pPr>
       <w:r>
@@ -39028,7 +39023,7 @@
       <w:pPr>
         <w:numPr>
           <w:ilvl w:val="0"/>
-          <w:numId w:val="1017"/>
+          <w:numId w:val="1018"/>
         </w:numPr>
       </w:pPr>
       <w:r>
@@ -39101,7 +39096,7 @@
       <w:pPr>
         <w:numPr>
           <w:ilvl w:val="0"/>
-          <w:numId w:val="1017"/>
+          <w:numId w:val="1018"/>
         </w:numPr>
       </w:pPr>
       <w:r>
@@ -39320,7 +39315,7 @@
       <w:pPr>
         <w:numPr>
           <w:ilvl w:val="0"/>
-          <w:numId w:val="1017"/>
+          <w:numId w:val="1018"/>
         </w:numPr>
       </w:pPr>
       <w:r>
@@ -39514,7 +39509,7 @@
       <w:pPr>
         <w:numPr>
           <w:ilvl w:val="0"/>
-          <w:numId w:val="1017"/>
+          <w:numId w:val="1018"/>
         </w:numPr>
       </w:pPr>
       <w:r>
@@ -39637,7 +39632,7 @@
       <w:pPr>
         <w:numPr>
           <w:ilvl w:val="0"/>
-          <w:numId w:val="1017"/>
+          <w:numId w:val="1018"/>
         </w:numPr>
       </w:pPr>
       <w:r>
@@ -46105,473 +46100,52 @@
       <w:pPr>
         <w:numPr>
           <w:ilvl w:val="0"/>
-          <w:numId w:val="1018"/>
-        </w:numPr>
-        <w:pStyle w:val="Compact"/>
-      </w:pPr>
-      <w:r>
-        <w:t xml:space="preserve">Dùng in-text citation theo author–date.</w:t>
-      </w:r>
-    </w:p>
-    <w:p>
-      <w:pPr>
-        <w:numPr>
-          <w:ilvl w:val="0"/>
-          <w:numId w:val="1018"/>
-        </w:numPr>
-        <w:pStyle w:val="Compact"/>
-      </w:pPr>
-      <w:r>
-        <w:t xml:space="preserve">3+ tác giả: dùng</w:t>
-      </w:r>
-      <w:r>
-        <w:t xml:space="preserve"> </w:t>
-      </w:r>
-      <w:r>
-        <w:rPr>
-          <w:iCs/>
-          <w:i/>
-        </w:rPr>
-        <w:t xml:space="preserve">et al.</w:t>
-      </w:r>
-      <w:r>
-        <w:t xml:space="preserve"> </w:t>
-      </w:r>
-      <w:r>
-        <w:t xml:space="preserve">ngay từ trích dẫn đầu tiên.</w:t>
-      </w:r>
-    </w:p>
-    <w:p>
-      <w:pPr>
-        <w:numPr>
-          <w:ilvl w:val="0"/>
-          <w:numId w:val="1018"/>
-        </w:numPr>
-        <w:pStyle w:val="Compact"/>
-      </w:pPr>
-      <w:r>
-        <w:t xml:space="preserve">Trích dẫn công trình của tác giả luận án: dùng suffix năm chuẩn APA 7 —</w:t>
-      </w:r>
-      <w:r>
-        <w:t xml:space="preserve"> </w:t>
-      </w:r>
-      <w:r>
-        <w:t xml:space="preserve">“</w:t>
-      </w:r>
-      <w:r>
-        <w:t xml:space="preserve">Do và Phan (2026a)</w:t>
-      </w:r>
-      <w:r>
-        <w:t xml:space="preserve">”</w:t>
-      </w:r>
-      <w:r>
-        <w:t xml:space="preserve">,</w:t>
-      </w:r>
-      <w:r>
-        <w:t xml:space="preserve"> </w:t>
-      </w:r>
-      <w:r>
-        <w:t xml:space="preserve">“</w:t>
-      </w:r>
-      <w:r>
-        <w:t xml:space="preserve">Do và Phan (2026g)</w:t>
-      </w:r>
-      <w:r>
-        <w:t xml:space="preserve">”</w:t>
-      </w:r>
-      <w:r>
-        <w:t xml:space="preserve">, v.v. (P1=2026a, P2=2026g, P3=2026e, P5=2026f, P6=2026c, P7=2026d, P8=2026b; P4=Mar et al., 2026).</w:t>
-      </w:r>
-    </w:p>
-    <w:p>
-      <w:pPr>
-        <w:numPr>
-          <w:ilvl w:val="0"/>
-          <w:numId w:val="1018"/>
-        </w:numPr>
-        <w:pStyle w:val="Compact"/>
-      </w:pPr>
-      <w:r>
-        <w:t xml:space="preserve">Trích dẫn báo cáo quốc tế thường niên: dùng dạng</w:t>
-      </w:r>
-      <w:r>
-        <w:t xml:space="preserve"> </w:t>
-      </w:r>
-      <w:r>
-        <w:t xml:space="preserve">“</w:t>
-      </w:r>
-      <w:r>
-        <w:t xml:space="preserve">IMF (2026, April)</w:t>
-      </w:r>
-      <w:r>
-        <w:t xml:space="preserve">”</w:t>
-      </w:r>
-      <w:r>
-        <w:t xml:space="preserve"> </w:t>
-      </w:r>
-      <w:r>
-        <w:t xml:space="preserve">hoặc</w:t>
-      </w:r>
-      <w:r>
-        <w:t xml:space="preserve"> </w:t>
-      </w:r>
-      <w:r>
-        <w:t xml:space="preserve">“</w:t>
-      </w:r>
-      <w:r>
-        <w:t xml:space="preserve">ADB (2026, April)</w:t>
-      </w:r>
-      <w:r>
-        <w:t xml:space="preserve">”</w:t>
-      </w:r>
-      <w:r>
-        <w:t xml:space="preserve">.</w:t>
-      </w:r>
-    </w:p>
-    <w:p>
-      <w:pPr>
-        <w:numPr>
-          <w:ilvl w:val="0"/>
-          <w:numId w:val="1018"/>
-        </w:numPr>
-        <w:pStyle w:val="Compact"/>
-      </w:pPr>
-      <w:r>
-        <w:rPr>
-          <w:bCs/>
-          <w:b/>
-        </w:rPr>
-        <w:t xml:space="preserve">Trích dẫn ADB Vietnam Outlook 2026 (v2.5)</w:t>
-      </w:r>
-      <w:r>
-        <w:t xml:space="preserve">: dùng dạng</w:t>
-      </w:r>
-      <w:r>
-        <w:t xml:space="preserve"> </w:t>
-      </w:r>
-      <w:r>
-        <w:t xml:space="preserve">“</w:t>
-      </w:r>
-      <w:r>
-        <w:t xml:space="preserve">ADB (2026, April — Vietnam Outlook)</w:t>
-      </w:r>
-      <w:r>
-        <w:t xml:space="preserve">”</w:t>
-      </w:r>
-      <w:r>
-        <w:t xml:space="preserve"> </w:t>
-      </w:r>
-      <w:r>
-        <w:t xml:space="preserve">để phân biệt với ADO April 2026 cùng năm.</w:t>
-      </w:r>
-    </w:p>
-    <w:p>
-      <w:pPr>
-        <w:numPr>
-          <w:ilvl w:val="0"/>
-          <w:numId w:val="1018"/>
-        </w:numPr>
-        <w:pStyle w:val="Compact"/>
-      </w:pPr>
-      <w:r>
-        <w:rPr>
-          <w:bCs/>
-          <w:b/>
-        </w:rPr>
-        <w:t xml:space="preserve">Trích dẫn IFC Blueprint (v2.5)</w:t>
-      </w:r>
-      <w:r>
-        <w:t xml:space="preserve">: dùng dạng</w:t>
-      </w:r>
-      <w:r>
-        <w:t xml:space="preserve"> </w:t>
-      </w:r>
-      <w:r>
-        <w:t xml:space="preserve">“</w:t>
-      </w:r>
-      <w:r>
-        <w:t xml:space="preserve">IFC (n.d. — PSD Blueprint)</w:t>
-      </w:r>
-      <w:r>
-        <w:t xml:space="preserve">”</w:t>
-      </w:r>
-      <w:r>
-        <w:t xml:space="preserve"> </w:t>
-      </w:r>
-      <w:r>
-        <w:t xml:space="preserve">hoặc</w:t>
-      </w:r>
-      <w:r>
-        <w:t xml:space="preserve"> </w:t>
-      </w:r>
-      <w:r>
-        <w:t xml:space="preserve">“</w:t>
-      </w:r>
-      <w:r>
-        <w:t xml:space="preserve">IFC (Private Sector Development Blueprint)</w:t>
-      </w:r>
-      <w:r>
-        <w:t xml:space="preserve">”</w:t>
-      </w:r>
-      <w:r>
-        <w:t xml:space="preserve"> </w:t>
-      </w:r>
-      <w:r>
-        <w:t xml:space="preserve">cho rõ.</w:t>
-      </w:r>
-    </w:p>
-    <w:p>
-      <w:pPr>
-        <w:numPr>
-          <w:ilvl w:val="0"/>
-          <w:numId w:val="1018"/>
-        </w:numPr>
-        <w:pStyle w:val="Compact"/>
-      </w:pPr>
-      <w:r>
-        <w:rPr>
-          <w:bCs/>
-          <w:b/>
-        </w:rPr>
-        <w:t xml:space="preserve">Trích dẫn WB FY26 classification (v2.5)</w:t>
-      </w:r>
-      <w:r>
-        <w:t xml:space="preserve">: dùng dạng</w:t>
-      </w:r>
-      <w:r>
-        <w:t xml:space="preserve"> </w:t>
-      </w:r>
-      <w:r>
-        <w:t xml:space="preserve">“</w:t>
-      </w:r>
-      <w:r>
-        <w:t xml:space="preserve">World Bank (2025 — FY26)</w:t>
-      </w:r>
-      <w:r>
-        <w:t xml:space="preserve">”</w:t>
-      </w:r>
-      <w:r>
-        <w:t xml:space="preserve"> </w:t>
-      </w:r>
-      <w:r>
-        <w:t xml:space="preserve">để phân biệt với các tài liệu World Bank khác cùng năm.</w:t>
-      </w:r>
-    </w:p>
-    <w:p>
-      <w:pPr>
-        <w:numPr>
-          <w:ilvl w:val="0"/>
-          <w:numId w:val="1018"/>
-        </w:numPr>
-        <w:pStyle w:val="Compact"/>
-      </w:pPr>
-      <w:r>
-        <w:rPr>
-          <w:bCs/>
-          <w:b/>
-        </w:rPr>
-        <w:t xml:space="preserve">Trích dẫn WB WBES indicators Vietnamese (v2.5)</w:t>
-      </w:r>
-      <w:r>
-        <w:t xml:space="preserve">: dùng dạng</w:t>
-      </w:r>
-      <w:r>
-        <w:t xml:space="preserve"> </w:t>
-      </w:r>
-      <w:r>
-        <w:t xml:space="preserve">“</w:t>
-      </w:r>
-      <w:r>
-        <w:t xml:space="preserve">World Bank (n.d. — Vietnamese Indicators Summary)</w:t>
-      </w:r>
-      <w:r>
-        <w:t xml:space="preserve">”</w:t>
-      </w:r>
-      <w:r>
-        <w:t xml:space="preserve">.</w:t>
-      </w:r>
-    </w:p>
-    <w:p>
-      <w:pPr>
-        <w:numPr>
-          <w:ilvl w:val="0"/>
-          <w:numId w:val="1018"/>
-        </w:numPr>
-        <w:pStyle w:val="Compact"/>
-      </w:pPr>
-      <w:r>
-        <w:rPr>
-          <w:bCs/>
-          <w:b/>
-        </w:rPr>
-        <w:t xml:space="preserve">Trích dẫn academic GSJ papers (v2.3)</w:t>
-      </w:r>
-      <w:r>
-        <w:t xml:space="preserve">:</w:t>
-      </w:r>
-      <w:r>
-        <w:t xml:space="preserve"> </w:t>
-      </w:r>
-      <w:r>
-        <w:t xml:space="preserve">“</w:t>
-      </w:r>
-      <w:r>
-        <w:t xml:space="preserve">Xu (2024)</w:t>
-      </w:r>
-      <w:r>
-        <w:t xml:space="preserve">”</w:t>
-      </w:r>
-      <w:r>
-        <w:t xml:space="preserve"> </w:t>
-      </w:r>
-      <w:r>
-        <w:t xml:space="preserve">và</w:t>
-      </w:r>
-      <w:r>
-        <w:t xml:space="preserve"> </w:t>
-      </w:r>
-      <w:r>
-        <w:t xml:space="preserve">“</w:t>
-      </w:r>
-      <w:r>
-        <w:t xml:space="preserve">Kafouros et al. (2023)</w:t>
-      </w:r>
-      <w:r>
-        <w:t xml:space="preserve">”</w:t>
-      </w:r>
-      <w:r>
-        <w:t xml:space="preserve">.</w:t>
-      </w:r>
-    </w:p>
-    <w:p>
-      <w:pPr>
-        <w:numPr>
-          <w:ilvl w:val="0"/>
-          <w:numId w:val="1018"/>
-        </w:numPr>
-        <w:pStyle w:val="Compact"/>
-      </w:pPr>
-      <w:r>
-        <w:rPr>
-          <w:bCs/>
-          <w:b/>
-        </w:rPr>
-        <w:t xml:space="preserve">Trích dẫn JIBS editorials (v2.4)</w:t>
-      </w:r>
-      <w:r>
-        <w:t xml:space="preserve">:</w:t>
-      </w:r>
-      <w:r>
-        <w:t xml:space="preserve"> </w:t>
-      </w:r>
-      <w:r>
-        <w:t xml:space="preserve">“</w:t>
-      </w:r>
-      <w:r>
-        <w:t xml:space="preserve">Bello &amp; Kostova (2012)</w:t>
-      </w:r>
-      <w:r>
-        <w:t xml:space="preserve">”</w:t>
-      </w:r>
-      <w:r>
-        <w:t xml:space="preserve"> </w:t>
-      </w:r>
-      <w:r>
-        <w:t xml:space="preserve">và</w:t>
-      </w:r>
-      <w:r>
-        <w:t xml:space="preserve"> </w:t>
-      </w:r>
-      <w:r>
-        <w:t xml:space="preserve">“</w:t>
-      </w:r>
-      <w:r>
-        <w:t xml:space="preserve">Meyer et al. (2017)</w:t>
-      </w:r>
-      <w:r>
-        <w:t xml:space="preserve">”</w:t>
-      </w:r>
-      <w:r>
-        <w:t xml:space="preserve">.</w:t>
-      </w:r>
-    </w:p>
-    <w:p>
-      <w:pPr>
-        <w:numPr>
-          <w:ilvl w:val="0"/>
-          <w:numId w:val="1018"/>
-        </w:numPr>
-        <w:pStyle w:val="Compact"/>
-      </w:pPr>
-      <w:r>
-        <w:rPr>
-          <w:bCs/>
-          <w:b/>
-        </w:rPr>
-        <w:t xml:space="preserve">Trích dẫn Section P — Data360 Atlas (v2.6)</w:t>
-      </w:r>
-      <w:r>
-        <w:t xml:space="preserve">:</w:t>
-      </w:r>
-    </w:p>
-    <w:p>
-      <w:pPr>
-        <w:numPr>
-          <w:ilvl w:val="1"/>
           <w:numId w:val="1019"/>
         </w:numPr>
         <w:pStyle w:val="Compact"/>
       </w:pPr>
       <w:r>
-        <w:t xml:space="preserve">Internet access story:</w:t>
-      </w:r>
-      <w:r>
-        <w:t xml:space="preserve"> </w:t>
-      </w:r>
-      <w:r>
-        <w:t xml:space="preserve">“</w:t>
-      </w:r>
-      <w:r>
-        <w:t xml:space="preserve">Pirlea &amp; Corso (2026)</w:t>
-      </w:r>
-      <w:r>
-        <w:t xml:space="preserve">”</w:t>
+        <w:t xml:space="preserve">Dùng in-text citation theo author–date.</w:t>
       </w:r>
     </w:p>
     <w:p>
       <w:pPr>
         <w:numPr>
-          <w:ilvl w:val="1"/>
+          <w:ilvl w:val="0"/>
           <w:numId w:val="1019"/>
         </w:numPr>
         <w:pStyle w:val="Compact"/>
       </w:pPr>
       <w:r>
-        <w:t xml:space="preserve">AI inequality story:</w:t>
-      </w:r>
-      <w:r>
-        <w:t xml:space="preserve"> </w:t>
-      </w:r>
-      <w:r>
-        <w:t xml:space="preserve">“</w:t>
-      </w:r>
-      <w:r>
-        <w:t xml:space="preserve">Mahler, Wang &amp; Weber (2026)</w:t>
-      </w:r>
-      <w:r>
-        <w:t xml:space="preserve">”</w:t>
+        <w:t xml:space="preserve">3+ tác giả: dùng</w:t>
+      </w:r>
+      <w:r>
+        <w:t xml:space="preserve"> </w:t>
+      </w:r>
+      <w:r>
+        <w:rPr>
+          <w:iCs/>
+          <w:i/>
+        </w:rPr>
+        <w:t xml:space="preserve">et al.</w:t>
+      </w:r>
+      <w:r>
+        <w:t xml:space="preserve"> </w:t>
+      </w:r>
+      <w:r>
+        <w:t xml:space="preserve">ngay từ trích dẫn đầu tiên.</w:t>
       </w:r>
     </w:p>
     <w:p>
       <w:pPr>
         <w:numPr>
-          <w:ilvl w:val="1"/>
+          <w:ilvl w:val="0"/>
           <w:numId w:val="1019"/>
         </w:numPr>
         <w:pStyle w:val="Compact"/>
       </w:pPr>
       <w:r>
-        <w:t xml:space="preserve">Atlas overview/statistics:</w:t>
+        <w:t xml:space="preserve">Trích dẫn công trình của tác giả luận án: dùng suffix năm chuẩn APA 7 —</w:t>
       </w:r>
       <w:r>
         <w:t xml:space="preserve"> </w:t>
@@ -46580,22 +46154,40 @@
         <w:t xml:space="preserve">“</w:t>
       </w:r>
       <w:r>
-        <w:t xml:space="preserve">Pirlea et al. (2026 — Atlas)</w:t>
+        <w:t xml:space="preserve">Do và Phan (2026a)</w:t>
       </w:r>
       <w:r>
         <w:t xml:space="preserve">”</w:t>
       </w:r>
+      <w:r>
+        <w:t xml:space="preserve">,</w:t>
+      </w:r>
+      <w:r>
+        <w:t xml:space="preserve"> </w:t>
+      </w:r>
+      <w:r>
+        <w:t xml:space="preserve">“</w:t>
+      </w:r>
+      <w:r>
+        <w:t xml:space="preserve">Do và Phan (2026g)</w:t>
+      </w:r>
+      <w:r>
+        <w:t xml:space="preserve">”</w:t>
+      </w:r>
+      <w:r>
+        <w:t xml:space="preserve">, v.v. (P1=2026a, P2=2026g, P3=2026e, P5=2026f, P6=2026c, P7=2026d, P8=2026b; P4=Mar et al., 2026).</w:t>
+      </w:r>
     </w:p>
     <w:p>
       <w:pPr>
         <w:numPr>
-          <w:ilvl w:val="1"/>
+          <w:ilvl w:val="0"/>
           <w:numId w:val="1019"/>
         </w:numPr>
         <w:pStyle w:val="Compact"/>
       </w:pPr>
       <w:r>
-        <w:t xml:space="preserve">Commodity markets blog:</w:t>
+        <w:t xml:space="preserve">Trích dẫn báo cáo quốc tế thường niên: dùng dạng</w:t>
       </w:r>
       <w:r>
         <w:t xml:space="preserve"> </w:t>
@@ -46604,22 +46196,50 @@
         <w:t xml:space="preserve">“</w:t>
       </w:r>
       <w:r>
-        <w:t xml:space="preserve">Agnolucci, Kenworthy &amp; Kose (2026)</w:t>
+        <w:t xml:space="preserve">IMF (2026, April)</w:t>
       </w:r>
       <w:r>
         <w:t xml:space="preserve">”</w:t>
       </w:r>
+      <w:r>
+        <w:t xml:space="preserve"> </w:t>
+      </w:r>
+      <w:r>
+        <w:t xml:space="preserve">hoặc</w:t>
+      </w:r>
+      <w:r>
+        <w:t xml:space="preserve"> </w:t>
+      </w:r>
+      <w:r>
+        <w:t xml:space="preserve">“</w:t>
+      </w:r>
+      <w:r>
+        <w:t xml:space="preserve">ADB (2026, April)</w:t>
+      </w:r>
+      <w:r>
+        <w:t xml:space="preserve">”</w:t>
+      </w:r>
+      <w:r>
+        <w:t xml:space="preserve">.</w:t>
+      </w:r>
     </w:p>
     <w:p>
       <w:pPr>
         <w:numPr>
-          <w:ilvl w:val="1"/>
+          <w:ilvl w:val="0"/>
           <w:numId w:val="1019"/>
         </w:numPr>
         <w:pStyle w:val="Compact"/>
       </w:pPr>
       <w:r>
-        <w:t xml:space="preserve">AI financial supervision G20:</w:t>
+        <w:rPr>
+          <w:bCs/>
+          <w:b/>
+        </w:rPr>
+        <w:t xml:space="preserve">Trích dẫn ADB Vietnam Outlook 2026 (v2.5)</w:t>
+      </w:r>
+      <w:r>
+        <w:t xml:space="preserve">: dùng dạng</w:t>
       </w:r>
       <w:r>
         <w:t xml:space="preserve"> </w:t>
@@ -46628,17 +46248,23 @@
         <w:t xml:space="preserve">“</w:t>
       </w:r>
       <w:r>
-        <w:t xml:space="preserve">Boeddu et al. (2025)</w:t>
+        <w:t xml:space="preserve">ADB (2026, April — Vietnam Outlook)</w:t>
       </w:r>
       <w:r>
         <w:t xml:space="preserve">”</w:t>
+      </w:r>
+      <w:r>
+        <w:t xml:space="preserve"> </w:t>
+      </w:r>
+      <w:r>
+        <w:t xml:space="preserve">để phân biệt với ADO April 2026 cùng năm.</w:t>
       </w:r>
     </w:p>
     <w:p>
       <w:pPr>
         <w:numPr>
           <w:ilvl w:val="0"/>
-          <w:numId w:val="1018"/>
+          <w:numId w:val="1019"/>
         </w:numPr>
         <w:pStyle w:val="Compact"/>
       </w:pPr>
@@ -46647,10 +46273,10 @@
           <w:bCs/>
           <w:b/>
         </w:rPr>
-        <w:t xml:space="preserve">Trích dẫn classical theory (v2.4)</w:t>
-      </w:r>
-      <w:r>
-        <w:t xml:space="preserve">:</w:t>
+        <w:t xml:space="preserve">Trích dẫn IFC Blueprint (v2.5)</w:t>
+      </w:r>
+      <w:r>
+        <w:t xml:space="preserve">: dùng dạng</w:t>
       </w:r>
       <w:r>
         <w:t xml:space="preserve"> </w:t>
@@ -46659,13 +46285,16 @@
         <w:t xml:space="preserve">“</w:t>
       </w:r>
       <w:r>
-        <w:t xml:space="preserve">Dunning (1988)</w:t>
+        <w:t xml:space="preserve">IFC (n.d. — PSD Blueprint)</w:t>
       </w:r>
       <w:r>
         <w:t xml:space="preserve">”</w:t>
       </w:r>
       <w:r>
-        <w:t xml:space="preserve">,</w:t>
+        <w:t xml:space="preserve"> </w:t>
+      </w:r>
+      <w:r>
+        <w:t xml:space="preserve">hoặc</w:t>
       </w:r>
       <w:r>
         <w:t xml:space="preserve"> </w:t>
@@ -46674,35 +46303,23 @@
         <w:t xml:space="preserve">“</w:t>
       </w:r>
       <w:r>
-        <w:t xml:space="preserve">Williamson (2000)</w:t>
+        <w:t xml:space="preserve">IFC (Private Sector Development Blueprint)</w:t>
       </w:r>
       <w:r>
         <w:t xml:space="preserve">”</w:t>
       </w:r>
       <w:r>
-        <w:t xml:space="preserve">,</w:t>
-      </w:r>
-      <w:r>
-        <w:t xml:space="preserve"> </w:t>
-      </w:r>
-      <w:r>
-        <w:t xml:space="preserve">“</w:t>
-      </w:r>
-      <w:r>
-        <w:t xml:space="preserve">Aguinis, Hill &amp; Bailey (2019)</w:t>
-      </w:r>
-      <w:r>
-        <w:t xml:space="preserve">”</w:t>
-      </w:r>
-      <w:r>
-        <w:t xml:space="preserve">.</w:t>
+        <w:t xml:space="preserve"> </w:t>
+      </w:r>
+      <w:r>
+        <w:t xml:space="preserve">cho rõ.</w:t>
       </w:r>
     </w:p>
     <w:p>
       <w:pPr>
         <w:numPr>
           <w:ilvl w:val="0"/>
-          <w:numId w:val="1018"/>
+          <w:numId w:val="1019"/>
         </w:numPr>
         <w:pStyle w:val="Compact"/>
       </w:pPr>
@@ -46711,7 +46328,182 @@
           <w:bCs/>
           <w:b/>
         </w:rPr>
-        <w:t xml:space="preserve">Trích dẫn Section Q — Singapore ecosystem (v2.7)</w:t>
+        <w:t xml:space="preserve">Trích dẫn WB FY26 classification (v2.5)</w:t>
+      </w:r>
+      <w:r>
+        <w:t xml:space="preserve">: dùng dạng</w:t>
+      </w:r>
+      <w:r>
+        <w:t xml:space="preserve"> </w:t>
+      </w:r>
+      <w:r>
+        <w:t xml:space="preserve">“</w:t>
+      </w:r>
+      <w:r>
+        <w:t xml:space="preserve">World Bank (2025 — FY26)</w:t>
+      </w:r>
+      <w:r>
+        <w:t xml:space="preserve">”</w:t>
+      </w:r>
+      <w:r>
+        <w:t xml:space="preserve"> </w:t>
+      </w:r>
+      <w:r>
+        <w:t xml:space="preserve">để phân biệt với các tài liệu World Bank khác cùng năm.</w:t>
+      </w:r>
+    </w:p>
+    <w:p>
+      <w:pPr>
+        <w:numPr>
+          <w:ilvl w:val="0"/>
+          <w:numId w:val="1019"/>
+        </w:numPr>
+        <w:pStyle w:val="Compact"/>
+      </w:pPr>
+      <w:r>
+        <w:rPr>
+          <w:bCs/>
+          <w:b/>
+        </w:rPr>
+        <w:t xml:space="preserve">Trích dẫn WB WBES indicators Vietnamese (v2.5)</w:t>
+      </w:r>
+      <w:r>
+        <w:t xml:space="preserve">: dùng dạng</w:t>
+      </w:r>
+      <w:r>
+        <w:t xml:space="preserve"> </w:t>
+      </w:r>
+      <w:r>
+        <w:t xml:space="preserve">“</w:t>
+      </w:r>
+      <w:r>
+        <w:t xml:space="preserve">World Bank (n.d. — Vietnamese Indicators Summary)</w:t>
+      </w:r>
+      <w:r>
+        <w:t xml:space="preserve">”</w:t>
+      </w:r>
+      <w:r>
+        <w:t xml:space="preserve">.</w:t>
+      </w:r>
+    </w:p>
+    <w:p>
+      <w:pPr>
+        <w:numPr>
+          <w:ilvl w:val="0"/>
+          <w:numId w:val="1019"/>
+        </w:numPr>
+        <w:pStyle w:val="Compact"/>
+      </w:pPr>
+      <w:r>
+        <w:rPr>
+          <w:bCs/>
+          <w:b/>
+        </w:rPr>
+        <w:t xml:space="preserve">Trích dẫn academic GSJ papers (v2.3)</w:t>
+      </w:r>
+      <w:r>
+        <w:t xml:space="preserve">:</w:t>
+      </w:r>
+      <w:r>
+        <w:t xml:space="preserve"> </w:t>
+      </w:r>
+      <w:r>
+        <w:t xml:space="preserve">“</w:t>
+      </w:r>
+      <w:r>
+        <w:t xml:space="preserve">Xu (2024)</w:t>
+      </w:r>
+      <w:r>
+        <w:t xml:space="preserve">”</w:t>
+      </w:r>
+      <w:r>
+        <w:t xml:space="preserve"> </w:t>
+      </w:r>
+      <w:r>
+        <w:t xml:space="preserve">và</w:t>
+      </w:r>
+      <w:r>
+        <w:t xml:space="preserve"> </w:t>
+      </w:r>
+      <w:r>
+        <w:t xml:space="preserve">“</w:t>
+      </w:r>
+      <w:r>
+        <w:t xml:space="preserve">Kafouros et al. (2023)</w:t>
+      </w:r>
+      <w:r>
+        <w:t xml:space="preserve">”</w:t>
+      </w:r>
+      <w:r>
+        <w:t xml:space="preserve">.</w:t>
+      </w:r>
+    </w:p>
+    <w:p>
+      <w:pPr>
+        <w:numPr>
+          <w:ilvl w:val="0"/>
+          <w:numId w:val="1019"/>
+        </w:numPr>
+        <w:pStyle w:val="Compact"/>
+      </w:pPr>
+      <w:r>
+        <w:rPr>
+          <w:bCs/>
+          <w:b/>
+        </w:rPr>
+        <w:t xml:space="preserve">Trích dẫn JIBS editorials (v2.4)</w:t>
+      </w:r>
+      <w:r>
+        <w:t xml:space="preserve">:</w:t>
+      </w:r>
+      <w:r>
+        <w:t xml:space="preserve"> </w:t>
+      </w:r>
+      <w:r>
+        <w:t xml:space="preserve">“</w:t>
+      </w:r>
+      <w:r>
+        <w:t xml:space="preserve">Bello &amp; Kostova (2012)</w:t>
+      </w:r>
+      <w:r>
+        <w:t xml:space="preserve">”</w:t>
+      </w:r>
+      <w:r>
+        <w:t xml:space="preserve"> </w:t>
+      </w:r>
+      <w:r>
+        <w:t xml:space="preserve">và</w:t>
+      </w:r>
+      <w:r>
+        <w:t xml:space="preserve"> </w:t>
+      </w:r>
+      <w:r>
+        <w:t xml:space="preserve">“</w:t>
+      </w:r>
+      <w:r>
+        <w:t xml:space="preserve">Meyer et al. (2017)</w:t>
+      </w:r>
+      <w:r>
+        <w:t xml:space="preserve">”</w:t>
+      </w:r>
+      <w:r>
+        <w:t xml:space="preserve">.</w:t>
+      </w:r>
+    </w:p>
+    <w:p>
+      <w:pPr>
+        <w:numPr>
+          <w:ilvl w:val="0"/>
+          <w:numId w:val="1019"/>
+        </w:numPr>
+        <w:pStyle w:val="Compact"/>
+      </w:pPr>
+      <w:r>
+        <w:rPr>
+          <w:bCs/>
+          <w:b/>
+        </w:rPr>
+        <w:t xml:space="preserve">Trích dẫn Section P — Data360 Atlas (v2.6)</w:t>
       </w:r>
       <w:r>
         <w:t xml:space="preserve">:</w:t>
@@ -46726,7 +46518,7 @@
         <w:pStyle w:val="Compact"/>
       </w:pPr>
       <w:r>
-        <w:t xml:space="preserve">SWITCH 2025:</w:t>
+        <w:t xml:space="preserve">Internet access story:</w:t>
       </w:r>
       <w:r>
         <w:t xml:space="preserve"> </w:t>
@@ -46735,7 +46527,7 @@
         <w:t xml:space="preserve">“</w:t>
       </w:r>
       <w:r>
-        <w:t xml:space="preserve">Enterprise Singapore (2025)</w:t>
+        <w:t xml:space="preserve">Pirlea &amp; Corso (2026)</w:t>
       </w:r>
       <w:r>
         <w:t xml:space="preserve">”</w:t>
@@ -46750,7 +46542,7 @@
         <w:pStyle w:val="Compact"/>
       </w:pPr>
       <w:r>
-        <w:t xml:space="preserve">Digital government rankings:</w:t>
+        <w:t xml:space="preserve">AI inequality story:</w:t>
       </w:r>
       <w:r>
         <w:t xml:space="preserve"> </w:t>
@@ -46759,7 +46551,7 @@
         <w:t xml:space="preserve">“</w:t>
       </w:r>
       <w:r>
-        <w:t xml:space="preserve">GovTech Singapore (2024)</w:t>
+        <w:t xml:space="preserve">Mahler, Wang &amp; Weber (2026)</w:t>
       </w:r>
       <w:r>
         <w:t xml:space="preserve">”</w:t>
@@ -46774,7 +46566,7 @@
         <w:pStyle w:val="Compact"/>
       </w:pPr>
       <w:r>
-        <w:t xml:space="preserve">ATxSG summit:</w:t>
+        <w:t xml:space="preserve">Atlas overview/statistics:</w:t>
       </w:r>
       <w:r>
         <w:t xml:space="preserve"> </w:t>
@@ -46783,7 +46575,7 @@
         <w:t xml:space="preserve">“</w:t>
       </w:r>
       <w:r>
-        <w:t xml:space="preserve">IMDA (2025)</w:t>
+        <w:t xml:space="preserve">Pirlea et al. (2026 — Atlas)</w:t>
       </w:r>
       <w:r>
         <w:t xml:space="preserve">”</w:t>
@@ -46798,7 +46590,7 @@
         <w:pStyle w:val="Compact"/>
       </w:pPr>
       <w:r>
-        <w:t xml:space="preserve">Startup ecosystem rank:</w:t>
+        <w:t xml:space="preserve">Commodity markets blog:</w:t>
       </w:r>
       <w:r>
         <w:t xml:space="preserve"> </w:t>
@@ -46807,16 +46599,22 @@
         <w:t xml:space="preserve">“</w:t>
       </w:r>
       <w:r>
-        <w:t xml:space="preserve">StartupBlink (2025)</w:t>
+        <w:t xml:space="preserve">Agnolucci, Kenworthy &amp; Kose (2026)</w:t>
       </w:r>
       <w:r>
         <w:t xml:space="preserve">”</w:t>
       </w:r>
-      <w:r>
-        <w:t xml:space="preserve"> </w:t>
-      </w:r>
-      <w:r>
-        <w:t xml:space="preserve">or</w:t>
+    </w:p>
+    <w:p>
+      <w:pPr>
+        <w:numPr>
+          <w:ilvl w:val="1"/>
+          <w:numId w:val="1020"/>
+        </w:numPr>
+        <w:pStyle w:val="Compact"/>
+      </w:pPr>
+      <w:r>
+        <w:t xml:space="preserve">AI financial supervision G20:</w:t>
       </w:r>
       <w:r>
         <w:t xml:space="preserve"> </w:t>
@@ -46825,23 +46623,17 @@
         <w:t xml:space="preserve">“</w:t>
       </w:r>
       <w:r>
-        <w:t xml:space="preserve">StartupBlink (2026)</w:t>
+        <w:t xml:space="preserve">Boeddu et al. (2025)</w:t>
       </w:r>
       <w:r>
         <w:t xml:space="preserve">”</w:t>
-      </w:r>
-      <w:r>
-        <w:t xml:space="preserve"> </w:t>
-      </w:r>
-      <w:r>
-        <w:t xml:space="preserve">(specify year for disambiguation)</w:t>
       </w:r>
     </w:p>
     <w:p>
       <w:pPr>
         <w:numPr>
           <w:ilvl w:val="0"/>
-          <w:numId w:val="1018"/>
+          <w:numId w:val="1019"/>
         </w:numPr>
         <w:pStyle w:val="Compact"/>
       </w:pPr>
@@ -46850,7 +46642,71 @@
           <w:bCs/>
           <w:b/>
         </w:rPr>
-        <w:t xml:space="preserve">Trích dẫn Section T — WB Working Papers 2015/2026 (v2.9)</w:t>
+        <w:t xml:space="preserve">Trích dẫn classical theory (v2.4)</w:t>
+      </w:r>
+      <w:r>
+        <w:t xml:space="preserve">:</w:t>
+      </w:r>
+      <w:r>
+        <w:t xml:space="preserve"> </w:t>
+      </w:r>
+      <w:r>
+        <w:t xml:space="preserve">“</w:t>
+      </w:r>
+      <w:r>
+        <w:t xml:space="preserve">Dunning (1988)</w:t>
+      </w:r>
+      <w:r>
+        <w:t xml:space="preserve">”</w:t>
+      </w:r>
+      <w:r>
+        <w:t xml:space="preserve">,</w:t>
+      </w:r>
+      <w:r>
+        <w:t xml:space="preserve"> </w:t>
+      </w:r>
+      <w:r>
+        <w:t xml:space="preserve">“</w:t>
+      </w:r>
+      <w:r>
+        <w:t xml:space="preserve">Williamson (2000)</w:t>
+      </w:r>
+      <w:r>
+        <w:t xml:space="preserve">”</w:t>
+      </w:r>
+      <w:r>
+        <w:t xml:space="preserve">,</w:t>
+      </w:r>
+      <w:r>
+        <w:t xml:space="preserve"> </w:t>
+      </w:r>
+      <w:r>
+        <w:t xml:space="preserve">“</w:t>
+      </w:r>
+      <w:r>
+        <w:t xml:space="preserve">Aguinis, Hill &amp; Bailey (2019)</w:t>
+      </w:r>
+      <w:r>
+        <w:t xml:space="preserve">”</w:t>
+      </w:r>
+      <w:r>
+        <w:t xml:space="preserve">.</w:t>
+      </w:r>
+    </w:p>
+    <w:p>
+      <w:pPr>
+        <w:numPr>
+          <w:ilvl w:val="0"/>
+          <w:numId w:val="1019"/>
+        </w:numPr>
+        <w:pStyle w:val="Compact"/>
+      </w:pPr>
+      <w:r>
+        <w:rPr>
+          <w:bCs/>
+          <w:b/>
+        </w:rPr>
+        <w:t xml:space="preserve">Trích dẫn Section Q — Singapore ecosystem (v2.7)</w:t>
       </w:r>
       <w:r>
         <w:t xml:space="preserve">:</w:t>
@@ -46865,7 +46721,7 @@
         <w:pStyle w:val="Compact"/>
       </w:pPr>
       <w:r>
-        <w:t xml:space="preserve">Vietnam firm LP + export demand:</w:t>
+        <w:t xml:space="preserve">SWITCH 2025:</w:t>
       </w:r>
       <w:r>
         <w:t xml:space="preserve"> </w:t>
@@ -46874,16 +46730,10 @@
         <w:t xml:space="preserve">“</w:t>
       </w:r>
       <w:r>
-        <w:t xml:space="preserve">Agarwal, Barattieri, &amp; Mattoo (2026)</w:t>
+        <w:t xml:space="preserve">Enterprise Singapore (2025)</w:t>
       </w:r>
       <w:r>
         <w:t xml:space="preserve">”</w:t>
-      </w:r>
-      <w:r>
-        <w:t xml:space="preserve"> </w:t>
-      </w:r>
-      <w:r>
-        <w:t xml:space="preserve">[WPS11352]</w:t>
       </w:r>
     </w:p>
     <w:p>
@@ -46895,7 +46745,7 @@
         <w:pStyle w:val="Compact"/>
       </w:pPr>
       <w:r>
-        <w:t xml:space="preserve">Vietnam trade liberalization → productivity:</w:t>
+        <w:t xml:space="preserve">Digital government rankings:</w:t>
       </w:r>
       <w:r>
         <w:t xml:space="preserve"> </w:t>
@@ -46904,16 +46754,10 @@
         <w:t xml:space="preserve">“</w:t>
       </w:r>
       <w:r>
-        <w:t xml:space="preserve">Barattieri, Mattoo, &amp; Signoret (2026)</w:t>
+        <w:t xml:space="preserve">GovTech Singapore (2024)</w:t>
       </w:r>
       <w:r>
         <w:t xml:space="preserve">”</w:t>
-      </w:r>
-      <w:r>
-        <w:t xml:space="preserve"> </w:t>
-      </w:r>
-      <w:r>
-        <w:t xml:space="preserve">[WPS11354]</w:t>
       </w:r>
     </w:p>
     <w:p>
@@ -46925,7 +46769,7 @@
         <w:pStyle w:val="Compact"/>
       </w:pPr>
       <w:r>
-        <w:t xml:space="preserve">Electricity &amp; firm performance 183 countries:</w:t>
+        <w:t xml:space="preserve">ATxSG summit:</w:t>
       </w:r>
       <w:r>
         <w:t xml:space="preserve"> </w:t>
@@ -46934,16 +46778,10 @@
         <w:t xml:space="preserve">“</w:t>
       </w:r>
       <w:r>
-        <w:t xml:space="preserve">Geginat &amp; Ramalho (2015)</w:t>
+        <w:t xml:space="preserve">IMDA (2025)</w:t>
       </w:r>
       <w:r>
         <w:t xml:space="preserve">”</w:t>
-      </w:r>
-      <w:r>
-        <w:t xml:space="preserve"> </w:t>
-      </w:r>
-      <w:r>
-        <w:t xml:space="preserve">[WPS7460]</w:t>
       </w:r>
     </w:p>
     <w:p>
@@ -46955,7 +46793,7 @@
         <w:pStyle w:val="Compact"/>
       </w:pPr>
       <w:r>
-        <w:t xml:space="preserve">Institutional capacity framework:</w:t>
+        <w:t xml:space="preserve">Startup ecosystem rank:</w:t>
       </w:r>
       <w:r>
         <w:t xml:space="preserve"> </w:t>
@@ -46964,7 +46802,7 @@
         <w:t xml:space="preserve">“</w:t>
       </w:r>
       <w:r>
-        <w:t xml:space="preserve">Kim, Kumar, Ramalho, &amp; Russell (2026)</w:t>
+        <w:t xml:space="preserve">StartupBlink (2025)</w:t>
       </w:r>
       <w:r>
         <w:t xml:space="preserve">”</w:t>
@@ -46973,174 +46811,331 @@
         <w:t xml:space="preserve"> </w:t>
       </w:r>
       <w:r>
-        <w:t xml:space="preserve">[WPS11279]</w:t>
+        <w:t xml:space="preserve">or</w:t>
+      </w:r>
+      <w:r>
+        <w:t xml:space="preserve"> </w:t>
+      </w:r>
+      <w:r>
+        <w:t xml:space="preserve">“</w:t>
+      </w:r>
+      <w:r>
+        <w:t xml:space="preserve">StartupBlink (2026)</w:t>
+      </w:r>
+      <w:r>
+        <w:t xml:space="preserve">”</w:t>
+      </w:r>
+      <w:r>
+        <w:t xml:space="preserve"> </w:t>
+      </w:r>
+      <w:r>
+        <w:t xml:space="preserve">(specify year for disambiguation)</w:t>
+      </w:r>
+    </w:p>
+    <w:p>
+      <w:pPr>
+        <w:numPr>
+          <w:ilvl w:val="0"/>
+          <w:numId w:val="1019"/>
+        </w:numPr>
+        <w:pStyle w:val="Compact"/>
+      </w:pPr>
+      <w:r>
+        <w:rPr>
+          <w:bCs/>
+          <w:b/>
+        </w:rPr>
+        <w:t xml:space="preserve">Trích dẫn Section T — WB Working Papers 2015/2026 (v2.9)</w:t>
+      </w:r>
+      <w:r>
+        <w:t xml:space="preserve">:</w:t>
       </w:r>
     </w:p>
     <w:p>
       <w:pPr>
         <w:numPr>
           <w:ilvl w:val="1"/>
-          <w:numId w:val="1021"/>
-        </w:numPr>
-        <w:pStyle w:val="Compact"/>
-      </w:pPr>
-      <w:r>
-        <w:t xml:space="preserve">World slowest development 75 years:</w:t>
-      </w:r>
-      <w:r>
-        <w:t xml:space="preserve"> </w:t>
-      </w:r>
-      <w:r>
-        <w:rPr>
-          <w:bCs/>
-          <w:b/>
-        </w:rPr>
-        <w:t xml:space="preserve">“</w:t>
-      </w:r>
-      <w:r>
-        <w:rPr>
-          <w:bCs/>
-          <w:b/>
-        </w:rPr>
-        <w:t xml:space="preserve">Mahler et al. (2026b)</w:t>
-      </w:r>
-      <w:r>
-        <w:rPr>
-          <w:bCs/>
-          <w:b/>
-        </w:rPr>
-        <w:t xml:space="preserve">”</w:t>
-      </w:r>
-      <w:r>
-        <w:t xml:space="preserve"> </w:t>
-      </w:r>
-      <w:r>
-        <w:t xml:space="preserve">[WPS11350] —</w:t>
-      </w:r>
-      <w:r>
-        <w:t xml:space="preserve"> </w:t>
-      </w:r>
-      <w:r>
-        <w:rPr>
-          <w:bCs/>
-          <w:b/>
-        </w:rPr>
-        <w:t xml:space="preserve">b suffix</w:t>
-      </w:r>
-      <w:r>
-        <w:t xml:space="preserve"> </w:t>
-      </w:r>
-      <w:r>
-        <w:t xml:space="preserve">phân biệt với</w:t>
-      </w:r>
-      <w:r>
-        <w:t xml:space="preserve"> </w:t>
-      </w:r>
-      <w:r>
-        <w:t xml:space="preserve">“</w:t>
-      </w:r>
-      <w:r>
-        <w:t xml:space="preserve">Mahler, Wang &amp; Weber (2026)</w:t>
-      </w:r>
-      <w:r>
-        <w:t xml:space="preserve">”</w:t>
-      </w:r>
-      <w:r>
-        <w:t xml:space="preserve"> </w:t>
-      </w:r>
-      <w:r>
-        <w:t xml:space="preserve">[Atlas chapter, Section P]</w:t>
-      </w:r>
-    </w:p>
-    <w:bookmarkEnd w:id="218"/>
-    <w:bookmarkStart w:id="219" w:name="khi-nộp-bản-cuối"/>
-    <w:p>
-      <w:pPr>
-        <w:pStyle w:val="Heading3"/>
-      </w:pPr>
-      <w:r>
-        <w:t xml:space="preserve">Khi nộp bản cuối</w:t>
-      </w:r>
-    </w:p>
-    <w:p>
-      <w:pPr>
-        <w:numPr>
-          <w:ilvl w:val="0"/>
           <w:numId w:val="1022"/>
         </w:numPr>
         <w:pStyle w:val="Compact"/>
       </w:pPr>
       <w:r>
-        <w:t xml:space="preserve">Xác minh DOI trên Crossref hoặc trang publisher cho các entry không quen thuộc.</w:t>
+        <w:t xml:space="preserve">Vietnam firm LP + export demand:</w:t>
+      </w:r>
+      <w:r>
+        <w:t xml:space="preserve"> </w:t>
+      </w:r>
+      <w:r>
+        <w:t xml:space="preserve">“</w:t>
+      </w:r>
+      <w:r>
+        <w:t xml:space="preserve">Agarwal, Barattieri, &amp; Mattoo (2026)</w:t>
+      </w:r>
+      <w:r>
+        <w:t xml:space="preserve">”</w:t>
+      </w:r>
+      <w:r>
+        <w:t xml:space="preserve"> </w:t>
+      </w:r>
+      <w:r>
+        <w:t xml:space="preserve">[WPS11352]</w:t>
       </w:r>
     </w:p>
     <w:p>
       <w:pPr>
         <w:numPr>
-          <w:ilvl w:val="0"/>
+          <w:ilvl w:val="1"/>
           <w:numId w:val="1022"/>
         </w:numPr>
         <w:pStyle w:val="Compact"/>
       </w:pPr>
       <w:r>
-        <w:t xml:space="preserve">Kiểm tra nhất quán italic và punctuation theo APA 7th.</w:t>
+        <w:t xml:space="preserve">Vietnam trade liberalization → productivity:</w:t>
+      </w:r>
+      <w:r>
+        <w:t xml:space="preserve"> </w:t>
+      </w:r>
+      <w:r>
+        <w:t xml:space="preserve">“</w:t>
+      </w:r>
+      <w:r>
+        <w:t xml:space="preserve">Barattieri, Mattoo, &amp; Signoret (2026)</w:t>
+      </w:r>
+      <w:r>
+        <w:t xml:space="preserve">”</w:t>
+      </w:r>
+      <w:r>
+        <w:t xml:space="preserve"> </w:t>
+      </w:r>
+      <w:r>
+        <w:t xml:space="preserve">[WPS11354]</w:t>
       </w:r>
     </w:p>
     <w:p>
       <w:pPr>
         <w:numPr>
-          <w:ilvl w:val="0"/>
+          <w:ilvl w:val="1"/>
           <w:numId w:val="1022"/>
         </w:numPr>
         <w:pStyle w:val="Compact"/>
       </w:pPr>
       <w:r>
-        <w:t xml:space="preserve">Yang et al. (2025) JBR: hiện chưa verify được volume/pages — cần kiểm tra Crossref hoặc loại bỏ.</w:t>
+        <w:t xml:space="preserve">Electricity &amp; firm performance 183 countries:</w:t>
+      </w:r>
+      <w:r>
+        <w:t xml:space="preserve"> </w:t>
+      </w:r>
+      <w:r>
+        <w:t xml:space="preserve">“</w:t>
+      </w:r>
+      <w:r>
+        <w:t xml:space="preserve">Geginat &amp; Ramalho (2015)</w:t>
+      </w:r>
+      <w:r>
+        <w:t xml:space="preserve">”</w:t>
+      </w:r>
+      <w:r>
+        <w:t xml:space="preserve"> </w:t>
+      </w:r>
+      <w:r>
+        <w:t xml:space="preserve">[WPS7460]</w:t>
       </w:r>
     </w:p>
     <w:p>
       <w:pPr>
         <w:numPr>
-          <w:ilvl w:val="0"/>
+          <w:ilvl w:val="1"/>
           <w:numId w:val="1022"/>
         </w:numPr>
         <w:pStyle w:val="Compact"/>
       </w:pPr>
       <w:r>
-        <w:rPr>
-          <w:bCs/>
-          <w:b/>
-        </w:rPr>
-        <w:t xml:space="preserve">Verified DOIs (v2.3)</w:t>
-      </w:r>
-      <w:r>
-        <w:t xml:space="preserve">: Xu (2024) GSJ DOI 10.1002/gsj.1510; Kafouros et al. (2023) GSJ DOI 10.1002/gsj.1479; Mardones-Ibáñez (2025) SAGE Open DOI 10.1177/21582440251335079; Al-Najjar et al. (2025) IJHRM DOI 10.1080/09585192.2025.2550765.</w:t>
+        <w:t xml:space="preserve">Institutional capacity framework:</w:t>
+      </w:r>
+      <w:r>
+        <w:t xml:space="preserve"> </w:t>
+      </w:r>
+      <w:r>
+        <w:t xml:space="preserve">“</w:t>
+      </w:r>
+      <w:r>
+        <w:t xml:space="preserve">Kim, Kumar, Ramalho, &amp; Russell (2026)</w:t>
+      </w:r>
+      <w:r>
+        <w:t xml:space="preserve">”</w:t>
+      </w:r>
+      <w:r>
+        <w:t xml:space="preserve"> </w:t>
+      </w:r>
+      <w:r>
+        <w:t xml:space="preserve">[WPS11279]</w:t>
       </w:r>
     </w:p>
     <w:p>
       <w:pPr>
         <w:numPr>
-          <w:ilvl w:val="0"/>
+          <w:ilvl w:val="1"/>
           <w:numId w:val="1022"/>
         </w:numPr>
         <w:pStyle w:val="Compact"/>
       </w:pPr>
       <w:r>
+        <w:t xml:space="preserve">World slowest development 75 years:</w:t>
+      </w:r>
+      <w:r>
+        <w:t xml:space="preserve"> </w:t>
+      </w:r>
+      <w:r>
         <w:rPr>
           <w:bCs/>
           <w:b/>
         </w:rPr>
-        <w:t xml:space="preserve">Verified DOIs (v2.4)</w:t>
-      </w:r>
-      <w:r>
-        <w:t xml:space="preserve">: Bello &amp; Kostova (2012) JIBS DOI 10.1057/jibs.2012.14; Meyer et al. (2017) JIBS DOI 10.1057/s41267-017-0078-8; Dunning (1988) JIBS DOI 10.1057/palgrave.jibs.8490372; Williamson (2000) JEL DOI 10.1257/jel.38.3.595; Aguinis, Hill &amp; Bailey (2019) ORM DOI 10.1177/1094428119836485; Malerba &amp; Orsenigo (1995) Cambridge JoE DOI 10.1093/oxfordjournals.cje.a035301.</w:t>
+        <w:t xml:space="preserve">“</w:t>
+      </w:r>
+      <w:r>
+        <w:rPr>
+          <w:bCs/>
+          <w:b/>
+        </w:rPr>
+        <w:t xml:space="preserve">Mahler et al. (2026b)</w:t>
+      </w:r>
+      <w:r>
+        <w:rPr>
+          <w:bCs/>
+          <w:b/>
+        </w:rPr>
+        <w:t xml:space="preserve">”</w:t>
+      </w:r>
+      <w:r>
+        <w:t xml:space="preserve"> </w:t>
+      </w:r>
+      <w:r>
+        <w:t xml:space="preserve">[WPS11350] —</w:t>
+      </w:r>
+      <w:r>
+        <w:t xml:space="preserve"> </w:t>
+      </w:r>
+      <w:r>
+        <w:rPr>
+          <w:bCs/>
+          <w:b/>
+        </w:rPr>
+        <w:t xml:space="preserve">b suffix</w:t>
+      </w:r>
+      <w:r>
+        <w:t xml:space="preserve"> </w:t>
+      </w:r>
+      <w:r>
+        <w:t xml:space="preserve">phân biệt với</w:t>
+      </w:r>
+      <w:r>
+        <w:t xml:space="preserve"> </w:t>
+      </w:r>
+      <w:r>
+        <w:t xml:space="preserve">“</w:t>
+      </w:r>
+      <w:r>
+        <w:t xml:space="preserve">Mahler, Wang &amp; Weber (2026)</w:t>
+      </w:r>
+      <w:r>
+        <w:t xml:space="preserve">”</w:t>
+      </w:r>
+      <w:r>
+        <w:t xml:space="preserve"> </w:t>
+      </w:r>
+      <w:r>
+        <w:t xml:space="preserve">[Atlas chapter, Section P]</w:t>
+      </w:r>
+    </w:p>
+    <w:bookmarkEnd w:id="218"/>
+    <w:bookmarkStart w:id="219" w:name="khi-nộp-bản-cuối"/>
+    <w:p>
+      <w:pPr>
+        <w:pStyle w:val="Heading3"/>
+      </w:pPr>
+      <w:r>
+        <w:t xml:space="preserve">Khi nộp bản cuối</w:t>
       </w:r>
     </w:p>
     <w:p>
       <w:pPr>
         <w:numPr>
           <w:ilvl w:val="0"/>
-          <w:numId w:val="1022"/>
+          <w:numId w:val="1023"/>
+        </w:numPr>
+        <w:pStyle w:val="Compact"/>
+      </w:pPr>
+      <w:r>
+        <w:t xml:space="preserve">Xác minh DOI trên Crossref hoặc trang publisher cho các entry không quen thuộc.</w:t>
+      </w:r>
+    </w:p>
+    <w:p>
+      <w:pPr>
+        <w:numPr>
+          <w:ilvl w:val="0"/>
+          <w:numId w:val="1023"/>
+        </w:numPr>
+        <w:pStyle w:val="Compact"/>
+      </w:pPr>
+      <w:r>
+        <w:t xml:space="preserve">Kiểm tra nhất quán italic và punctuation theo APA 7th.</w:t>
+      </w:r>
+    </w:p>
+    <w:p>
+      <w:pPr>
+        <w:numPr>
+          <w:ilvl w:val="0"/>
+          <w:numId w:val="1023"/>
+        </w:numPr>
+        <w:pStyle w:val="Compact"/>
+      </w:pPr>
+      <w:r>
+        <w:t xml:space="preserve">Yang et al. (2025) JBR: hiện chưa verify được volume/pages — cần kiểm tra Crossref hoặc loại bỏ.</w:t>
+      </w:r>
+    </w:p>
+    <w:p>
+      <w:pPr>
+        <w:numPr>
+          <w:ilvl w:val="0"/>
+          <w:numId w:val="1023"/>
+        </w:numPr>
+        <w:pStyle w:val="Compact"/>
+      </w:pPr>
+      <w:r>
+        <w:rPr>
+          <w:bCs/>
+          <w:b/>
+        </w:rPr>
+        <w:t xml:space="preserve">Verified DOIs (v2.3)</w:t>
+      </w:r>
+      <w:r>
+        <w:t xml:space="preserve">: Xu (2024) GSJ DOI 10.1002/gsj.1510; Kafouros et al. (2023) GSJ DOI 10.1002/gsj.1479; Mardones-Ibáñez (2025) SAGE Open DOI 10.1177/21582440251335079; Al-Najjar et al. (2025) IJHRM DOI 10.1080/09585192.2025.2550765.</w:t>
+      </w:r>
+    </w:p>
+    <w:p>
+      <w:pPr>
+        <w:numPr>
+          <w:ilvl w:val="0"/>
+          <w:numId w:val="1023"/>
+        </w:numPr>
+        <w:pStyle w:val="Compact"/>
+      </w:pPr>
+      <w:r>
+        <w:rPr>
+          <w:bCs/>
+          <w:b/>
+        </w:rPr>
+        <w:t xml:space="preserve">Verified DOIs (v2.4)</w:t>
+      </w:r>
+      <w:r>
+        <w:t xml:space="preserve">: Bello &amp; Kostova (2012) JIBS DOI 10.1057/jibs.2012.14; Meyer et al. (2017) JIBS DOI 10.1057/s41267-017-0078-8; Dunning (1988) JIBS DOI 10.1057/palgrave.jibs.8490372; Williamson (2000) JEL DOI 10.1257/jel.38.3.595; Aguinis, Hill &amp; Bailey (2019) ORM DOI 10.1177/1094428119836485; Malerba &amp; Orsenigo (1995) Cambridge JoE DOI 10.1093/oxfordjournals.cje.a035301.</w:t>
+      </w:r>
+    </w:p>
+    <w:p>
+      <w:pPr>
+        <w:numPr>
+          <w:ilvl w:val="0"/>
+          <w:numId w:val="1023"/>
         </w:numPr>
         <w:pStyle w:val="Compact"/>
       </w:pPr>
@@ -52724,7 +52719,7 @@
       <w:pPr>
         <w:numPr>
           <w:ilvl w:val="0"/>
-          <w:numId w:val="1023"/>
+          <w:numId w:val="1024"/>
         </w:numPr>
         <w:pStyle w:val="Compact"/>
       </w:pPr>
@@ -52843,7 +52838,7 @@
       <w:pPr>
         <w:numPr>
           <w:ilvl w:val="0"/>
-          <w:numId w:val="1023"/>
+          <w:numId w:val="1024"/>
         </w:numPr>
         <w:pStyle w:val="Compact"/>
       </w:pPr>
@@ -52886,202 +52881,6 @@
       </w:r>
       <w:r>
         <w:t xml:space="preserve">, giới hạn miền [0, 100]. Doanh nghiệp không xuất khẩu nhận giá trị FSTS = 0 (giá trị hợp lệ, không phải khuyết).</w:t>
-      </w:r>
-    </w:p>
-    <w:p>
-      <w:pPr>
-        <w:numPr>
-          <w:ilvl w:val="0"/>
-          <w:numId w:val="1023"/>
-        </w:numPr>
-        <w:pStyle w:val="Compact"/>
-      </w:pPr>
-      <w:r>
-        <w:rPr>
-          <w:bCs/>
-          <w:b/>
-        </w:rPr>
-        <w:t xml:space="preserve">Năng lực công nghệ (TCI) và chấp nhận số (DAI):</w:t>
-      </w:r>
-      <w:r>
-        <w:t xml:space="preserve"> </w:t>
-      </w:r>
-      <w:r>
-        <w:t xml:space="preserve">xây dựng từ các chỉ báo nhị phân (chứng nhận chất lượng quốc tế</w:t>
-      </w:r>
-      <w:r>
-        <w:t xml:space="preserve"> </w:t>
-      </w:r>
-      <w:r>
-        <w:rPr>
-          <w:rStyle w:val="VerbatimChar"/>
-        </w:rPr>
-        <w:t xml:space="preserve">b8</w:t>
-      </w:r>
-      <w:r>
-        <w:t xml:space="preserve">; công nghệ nước ngoài cấp phép; website</w:t>
-      </w:r>
-      <w:r>
-        <w:t xml:space="preserve"> </w:t>
-      </w:r>
-      <w:r>
-        <w:rPr>
-          <w:rStyle w:val="VerbatimChar"/>
-        </w:rPr>
-        <w:t xml:space="preserve">c22b</w:t>
-      </w:r>
-      <w:r>
-        <w:t xml:space="preserve">; email; thanh toán điện tử), tách biệt theo lập luận thuần khiết cấu trúc (construct purity) ở §2.1.3 và Coltman et al. (2008).</w:t>
-      </w:r>
-    </w:p>
-    <w:p>
-      <w:pPr>
-        <w:numPr>
-          <w:ilvl w:val="0"/>
-          <w:numId w:val="1023"/>
-        </w:numPr>
-        <w:pStyle w:val="Compact"/>
-      </w:pPr>
-      <w:r>
-        <w:rPr>
-          <w:bCs/>
-          <w:b/>
-        </w:rPr>
-        <w:t xml:space="preserve">Biến kiểm soát:</w:t>
-      </w:r>
-      <w:r>
-        <w:t xml:space="preserve"> </w:t>
-      </w:r>
-      <w:r>
-        <w:t xml:space="preserve">tuổi doanh nghiệp (từ</w:t>
-      </w:r>
-      <w:r>
-        <w:t xml:space="preserve"> </w:t>
-      </w:r>
-      <w:r>
-        <w:rPr>
-          <w:rStyle w:val="VerbatimChar"/>
-        </w:rPr>
-        <w:t xml:space="preserve">b5</w:t>
-      </w:r>
-      <w:r>
-        <w:t xml:space="preserve">), quy mô (log lao động), sở hữu nước ngoài, đặc điểm nhà quản trị, ngành ISIC.</w:t>
-      </w:r>
-    </w:p>
-    <w:bookmarkEnd w:id="238"/>
-    <w:bookmarkStart w:id="239" w:name="X416f14599a376c8f9173525fa72cdada272c4e0"/>
-    <w:p>
-      <w:pPr>
-        <w:pStyle w:val="Heading2"/>
-      </w:pPr>
-      <w:r>
-        <w:t xml:space="preserve">A.5 Xử lý tính so sánh tiền tệ: vấn đề và giải pháp</w:t>
-      </w:r>
-    </w:p>
-    <w:p>
-      <w:pPr>
-        <w:pStyle w:val="FirstParagraph"/>
-      </w:pPr>
-      <w:r>
-        <w:t xml:space="preserve">Một mối đe dọa hiệu lực (validity threat) đặc thù của pool đa quốc gia là</w:t>
-      </w:r>
-      <w:r>
-        <w:t xml:space="preserve"> </w:t>
-      </w:r>
-      <w:r>
-        <w:rPr>
-          <w:bCs/>
-          <w:b/>
-        </w:rPr>
-        <w:t xml:space="preserve">năng suất lao</w:t>
-      </w:r>
-      <w:r>
-        <w:rPr>
-          <w:bCs/>
-          <w:b/>
-        </w:rPr>
-        <w:t xml:space="preserve"> </w:t>
-      </w:r>
-      <w:r>
-        <w:rPr>
-          <w:bCs/>
-          <w:b/>
-        </w:rPr>
-        <w:t xml:space="preserve">động thô được biểu thị bằng nội tệ khác nhau</w:t>
-      </w:r>
-      <w:r>
-        <w:t xml:space="preserve"> </w:t>
-      </w:r>
-      <w:r>
-        <w:t xml:space="preserve">(ví dụ doanh thu/lao động của Việt Nam tính</w:t>
-      </w:r>
-      <w:r>
-        <w:t xml:space="preserve"> </w:t>
-      </w:r>
-      <w:r>
-        <w:t xml:space="preserve">bằng VND, của Singapore bằng SGD), khiến</w:t>
-      </w:r>
-      <w:r>
-        <w:t xml:space="preserve"> </w:t>
-      </w:r>
-      <w:r>
-        <w:rPr>
-          <w:bCs/>
-          <w:b/>
-        </w:rPr>
-        <w:t xml:space="preserve">mức</w:t>
-      </w:r>
-      <w:r>
-        <w:t xml:space="preserve"> </w:t>
-      </w:r>
-      <w:r>
-        <w:t xml:space="preserve">năng suất</w:t>
-      </w:r>
-      <w:r>
-        <w:t xml:space="preserve"> </w:t>
-      </w:r>
-      <w:r>
-        <w:rPr>
-          <w:bCs/>
-          <w:b/>
-        </w:rPr>
-        <w:t xml:space="preserve">không so sánh trực tiếp</w:t>
-      </w:r>
-      <w:r>
-        <w:t xml:space="preserve"> </w:t>
-      </w:r>
-      <w:r>
-        <w:t xml:space="preserve">giữa</w:t>
-      </w:r>
-      <w:r>
-        <w:t xml:space="preserve"> </w:t>
-      </w:r>
-      <w:r>
-        <w:t xml:space="preserve">các nước, một dạng</w:t>
-      </w:r>
-      <w:r>
-        <w:t xml:space="preserve"> </w:t>
-      </w:r>
-      <w:r>
-        <w:t xml:space="preserve">“</w:t>
-      </w:r>
-      <w:r>
-        <w:t xml:space="preserve">ảo ảnh tiền tệ</w:t>
-      </w:r>
-      <w:r>
-        <w:t xml:space="preserve">”</w:t>
-      </w:r>
-      <w:r>
-        <w:t xml:space="preserve"> </w:t>
-      </w:r>
-      <w:r>
-        <w:t xml:space="preserve">(currency artefact). Luận án xử lý vấn đề này theo hai</w:t>
-      </w:r>
-      <w:r>
-        <w:t xml:space="preserve"> </w:t>
-      </w:r>
-      <w:r>
-        <w:t xml:space="preserve">lớp bổ trợ:</w:t>
       </w:r>
     </w:p>
     <w:p>
@@ -53097,53 +52896,37 @@
           <w:bCs/>
           <w:b/>
         </w:rPr>
-        <w:t xml:space="preserve">Chuẩn hóa within country–year:</w:t>
-      </w:r>
-      <w:r>
-        <w:t xml:space="preserve"> </w:t>
-      </w:r>
-      <w:r>
-        <w:t xml:space="preserve">năng suất lao động được chuẩn hóa z (trừ trung bình,</w:t>
-      </w:r>
-      <w:r>
-        <w:t xml:space="preserve"> </w:t>
-      </w:r>
-      <w:r>
-        <w:t xml:space="preserve">chia độ lệch chuẩn)</w:t>
-      </w:r>
-      <w:r>
-        <w:t xml:space="preserve"> </w:t>
-      </w:r>
-      <w:r>
-        <w:rPr>
-          <w:bCs/>
-          <w:b/>
-        </w:rPr>
-        <w:t xml:space="preserve">trong từng cặp nền kinh tế × năm</w:t>
-      </w:r>
-      <w:r>
-        <w:t xml:space="preserve"> </w:t>
-      </w:r>
-      <w:r>
-        <w:t xml:space="preserve">trước khi gộp, đưa mọi quan sát</w:t>
-      </w:r>
-      <w:r>
-        <w:t xml:space="preserve"> </w:t>
-      </w:r>
-      <w:r>
-        <w:t xml:space="preserve">về cùng thang vị thế tương đối trong phân phối nội bộ nước–năm. Phép biến đổi này loại bỏ</w:t>
-      </w:r>
-      <w:r>
-        <w:t xml:space="preserve"> </w:t>
-      </w:r>
-      <w:r>
-        <w:t xml:space="preserve">khác biệt đơn vị tiền tệ và mặt bằng giá, đồng thời bảo toàn cấu trúc biến thiên bên trong</w:t>
-      </w:r>
-      <w:r>
-        <w:t xml:space="preserve"> </w:t>
-      </w:r>
-      <w:r>
-        <w:t xml:space="preserve">mỗi nước (nơi nhận dạng quan hệ I–P diễn ra).</w:t>
+        <w:t xml:space="preserve">Năng lực công nghệ (TCI) và chấp nhận số (DAI):</w:t>
+      </w:r>
+      <w:r>
+        <w:t xml:space="preserve"> </w:t>
+      </w:r>
+      <w:r>
+        <w:t xml:space="preserve">xây dựng từ các chỉ báo nhị phân (chứng nhận chất lượng quốc tế</w:t>
+      </w:r>
+      <w:r>
+        <w:t xml:space="preserve"> </w:t>
+      </w:r>
+      <w:r>
+        <w:rPr>
+          <w:rStyle w:val="VerbatimChar"/>
+        </w:rPr>
+        <w:t xml:space="preserve">b8</w:t>
+      </w:r>
+      <w:r>
+        <w:t xml:space="preserve">; công nghệ nước ngoài cấp phép; website</w:t>
+      </w:r>
+      <w:r>
+        <w:t xml:space="preserve"> </w:t>
+      </w:r>
+      <w:r>
+        <w:rPr>
+          <w:rStyle w:val="VerbatimChar"/>
+        </w:rPr>
+        <w:t xml:space="preserve">c22b</w:t>
+      </w:r>
+      <w:r>
+        <w:t xml:space="preserve">; email; thanh toán điện tử), tách biệt theo lập luận thuần khiết cấu trúc (construct purity) ở §2.1.3 và Coltman et al. (2008).</w:t>
       </w:r>
     </w:p>
     <w:p>
@@ -53151,6 +52934,218 @@
         <w:numPr>
           <w:ilvl w:val="0"/>
           <w:numId w:val="1024"/>
+        </w:numPr>
+        <w:pStyle w:val="Compact"/>
+      </w:pPr>
+      <w:r>
+        <w:rPr>
+          <w:bCs/>
+          <w:b/>
+        </w:rPr>
+        <w:t xml:space="preserve">Biến kiểm soát:</w:t>
+      </w:r>
+      <w:r>
+        <w:t xml:space="preserve"> </w:t>
+      </w:r>
+      <w:r>
+        <w:t xml:space="preserve">tuổi doanh nghiệp (từ</w:t>
+      </w:r>
+      <w:r>
+        <w:t xml:space="preserve"> </w:t>
+      </w:r>
+      <w:r>
+        <w:rPr>
+          <w:rStyle w:val="VerbatimChar"/>
+        </w:rPr>
+        <w:t xml:space="preserve">b5</w:t>
+      </w:r>
+      <w:r>
+        <w:t xml:space="preserve">), quy mô (log lao động), sở hữu nước ngoài, đặc điểm nhà quản trị, ngành ISIC.</w:t>
+      </w:r>
+    </w:p>
+    <w:bookmarkEnd w:id="238"/>
+    <w:bookmarkStart w:id="239" w:name="X416f14599a376c8f9173525fa72cdada272c4e0"/>
+    <w:p>
+      <w:pPr>
+        <w:pStyle w:val="Heading2"/>
+      </w:pPr>
+      <w:r>
+        <w:t xml:space="preserve">A.5 Xử lý tính so sánh tiền tệ: vấn đề và giải pháp</w:t>
+      </w:r>
+    </w:p>
+    <w:p>
+      <w:pPr>
+        <w:pStyle w:val="FirstParagraph"/>
+      </w:pPr>
+      <w:r>
+        <w:t xml:space="preserve">Một mối đe dọa hiệu lực (validity threat) đặc thù của pool đa quốc gia là</w:t>
+      </w:r>
+      <w:r>
+        <w:t xml:space="preserve"> </w:t>
+      </w:r>
+      <w:r>
+        <w:rPr>
+          <w:bCs/>
+          <w:b/>
+        </w:rPr>
+        <w:t xml:space="preserve">năng suất lao</w:t>
+      </w:r>
+      <w:r>
+        <w:rPr>
+          <w:bCs/>
+          <w:b/>
+        </w:rPr>
+        <w:t xml:space="preserve"> </w:t>
+      </w:r>
+      <w:r>
+        <w:rPr>
+          <w:bCs/>
+          <w:b/>
+        </w:rPr>
+        <w:t xml:space="preserve">động thô được biểu thị bằng nội tệ khác nhau</w:t>
+      </w:r>
+      <w:r>
+        <w:t xml:space="preserve"> </w:t>
+      </w:r>
+      <w:r>
+        <w:t xml:space="preserve">(ví dụ doanh thu/lao động của Việt Nam tính</w:t>
+      </w:r>
+      <w:r>
+        <w:t xml:space="preserve"> </w:t>
+      </w:r>
+      <w:r>
+        <w:t xml:space="preserve">bằng VND, của Singapore bằng SGD), khiến</w:t>
+      </w:r>
+      <w:r>
+        <w:t xml:space="preserve"> </w:t>
+      </w:r>
+      <w:r>
+        <w:rPr>
+          <w:bCs/>
+          <w:b/>
+        </w:rPr>
+        <w:t xml:space="preserve">mức</w:t>
+      </w:r>
+      <w:r>
+        <w:t xml:space="preserve"> </w:t>
+      </w:r>
+      <w:r>
+        <w:t xml:space="preserve">năng suất</w:t>
+      </w:r>
+      <w:r>
+        <w:t xml:space="preserve"> </w:t>
+      </w:r>
+      <w:r>
+        <w:rPr>
+          <w:bCs/>
+          <w:b/>
+        </w:rPr>
+        <w:t xml:space="preserve">không so sánh trực tiếp</w:t>
+      </w:r>
+      <w:r>
+        <w:t xml:space="preserve"> </w:t>
+      </w:r>
+      <w:r>
+        <w:t xml:space="preserve">giữa</w:t>
+      </w:r>
+      <w:r>
+        <w:t xml:space="preserve"> </w:t>
+      </w:r>
+      <w:r>
+        <w:t xml:space="preserve">các nước, một dạng</w:t>
+      </w:r>
+      <w:r>
+        <w:t xml:space="preserve"> </w:t>
+      </w:r>
+      <w:r>
+        <w:t xml:space="preserve">“</w:t>
+      </w:r>
+      <w:r>
+        <w:t xml:space="preserve">ảo ảnh tiền tệ</w:t>
+      </w:r>
+      <w:r>
+        <w:t xml:space="preserve">”</w:t>
+      </w:r>
+      <w:r>
+        <w:t xml:space="preserve"> </w:t>
+      </w:r>
+      <w:r>
+        <w:t xml:space="preserve">(currency artefact). Luận án xử lý vấn đề này theo hai</w:t>
+      </w:r>
+      <w:r>
+        <w:t xml:space="preserve"> </w:t>
+      </w:r>
+      <w:r>
+        <w:t xml:space="preserve">lớp bổ trợ:</w:t>
+      </w:r>
+    </w:p>
+    <w:p>
+      <w:pPr>
+        <w:numPr>
+          <w:ilvl w:val="0"/>
+          <w:numId w:val="1025"/>
+        </w:numPr>
+        <w:pStyle w:val="Compact"/>
+      </w:pPr>
+      <w:r>
+        <w:rPr>
+          <w:bCs/>
+          <w:b/>
+        </w:rPr>
+        <w:t xml:space="preserve">Chuẩn hóa within country–year:</w:t>
+      </w:r>
+      <w:r>
+        <w:t xml:space="preserve"> </w:t>
+      </w:r>
+      <w:r>
+        <w:t xml:space="preserve">năng suất lao động được chuẩn hóa z (trừ trung bình,</w:t>
+      </w:r>
+      <w:r>
+        <w:t xml:space="preserve"> </w:t>
+      </w:r>
+      <w:r>
+        <w:t xml:space="preserve">chia độ lệch chuẩn)</w:t>
+      </w:r>
+      <w:r>
+        <w:t xml:space="preserve"> </w:t>
+      </w:r>
+      <w:r>
+        <w:rPr>
+          <w:bCs/>
+          <w:b/>
+        </w:rPr>
+        <w:t xml:space="preserve">trong từng cặp nền kinh tế × năm</w:t>
+      </w:r>
+      <w:r>
+        <w:t xml:space="preserve"> </w:t>
+      </w:r>
+      <w:r>
+        <w:t xml:space="preserve">trước khi gộp, đưa mọi quan sát</w:t>
+      </w:r>
+      <w:r>
+        <w:t xml:space="preserve"> </w:t>
+      </w:r>
+      <w:r>
+        <w:t xml:space="preserve">về cùng thang vị thế tương đối trong phân phối nội bộ nước–năm. Phép biến đổi này loại bỏ</w:t>
+      </w:r>
+      <w:r>
+        <w:t xml:space="preserve"> </w:t>
+      </w:r>
+      <w:r>
+        <w:t xml:space="preserve">khác biệt đơn vị tiền tệ và mặt bằng giá, đồng thời bảo toàn cấu trúc biến thiên bên trong</w:t>
+      </w:r>
+      <w:r>
+        <w:t xml:space="preserve"> </w:t>
+      </w:r>
+      <w:r>
+        <w:t xml:space="preserve">mỗi nước (nơi nhận dạng quan hệ I–P diễn ra).</w:t>
+      </w:r>
+    </w:p>
+    <w:p>
+      <w:pPr>
+        <w:numPr>
+          <w:ilvl w:val="0"/>
+          <w:numId w:val="1025"/>
         </w:numPr>
         <w:pStyle w:val="Compact"/>
       </w:pPr>
@@ -54917,6 +54912,9 @@
     <w:abstractNumId w:val="991"/>
   </w:num>
   <w:num w:numId="1024">
+    <w:abstractNumId w:val="991"/>
+  </w:num>
+  <w:num w:numId="1025">
     <w:abstractNumId w:val="99411"/>
     <w:lvlOverride w:ilvl="0">
       <w:startOverride w:val="1"/>

</xml_diff>

<commit_message>
docs(methods): confirm P7 TCI = b8+e6 against real-data pipeline (incl. Japan)
Author confirmed P7 uses the real WBES data (50 economies, incl. Japan 2025).
Traced the canonical replication: 01_build_p7_dataset.py (raw .dta -> 50-economy
pooled clean) builds tci_z from 2 components (b8 quality cert + e6 foreign tech),
and 02_run_p7_models.py reads exactly that file. The '5-component' TCI_full lives
only in 00_prep_prebuilt_data.py, a legacy 3-country (VNM/CHN/SGP) demo converter
not used by the thesis. Therefore thesis P7 (b8+e6, 2-item thin) is correct.

- §3.3.4: reconciliation note updated from 'needs checking' to 'confirmed'.
- 00_prep_prebuilt_data.py: header annotated as legacy/non-canonical.
- methodology review doc: item marked RESOLVED.
No estimated values changed; DOCX + LaTeX rebuilt.
</commit_message>
<xml_diff>
--- a/dist/luan_an_ctu/LUAN_AN_FULL_vi.docx
+++ b/dist/luan_an_ctu/LUAN_AN_FULL_vi.docx
@@ -6821,7 +6821,22 @@
         <w:pStyle w:val="FirstParagraph"/>
       </w:pPr>
       <w:r>
-        <w:t xml:space="preserve">Bộ mục chính xác của mỗi nghiên cứu thành phần được nêu lại trong bảng định nghĩa biến của nghiên cứu đó (§3.4.5) và Phụ lục A; khác biệt giữa thin và full phản ánh ràng buộc khả dụng dữ liệu khách quan, không phải lựa chọn tùy ý. Vì các mục là chỉ báo nhị phân của cùng một construct formative (năng lực công nghệ), hai biến thể tương quan cao và cho kết luận điều tiết nhất quán về dấu; phần độ vững (§3.5.1) kiểm tra độ nhạy của kết quả với lựa chọn biến thể. (Lưu ý đối chiếu: phần mô tả TCI trong một số bản thảo bài báo đồng hành cần được rà soát để đồng nhất bộ mục với khung này và với mã ước lượng thực tế.)</w:t>
+        <w:t xml:space="preserve">Bộ mục chính xác của mỗi nghiên cứu thành phần được nêu lại trong bảng định nghĩa biến của nghiên cứu đó (§3.4.5) và Phụ lục A; khác biệt giữa thin và full phản ánh ràng buộc khả dụng dữ liệu khách quan, không phải lựa chọn tùy ý. Vì các mục là chỉ báo nhị phân của cùng một construct formative (năng lực công nghệ), hai biến thể tương quan cao và cho kết luận điều tiết nhất quán về dấu; phần độ vững (§3.5.1) kiểm tra độ nhạy của kết quả với lựa chọn biến thể. Bộ mục TCI của nghiên cứu đa quốc gia (P7) đã được đối chiếu trực tiếp với mã xây dựng dữ liệu thực tế (pipeline raw WBES 50 nền kinh tế, gồm Nhật Bản 2025): biến</w:t>
+      </w:r>
+      <w:r>
+        <w:t xml:space="preserve"> </w:t>
+      </w:r>
+      <w:r>
+        <w:rPr>
+          <w:rStyle w:val="VerbatimChar"/>
+        </w:rPr>
+        <w:t xml:space="preserve">tci_z</w:t>
+      </w:r>
+      <w:r>
+        <w:t xml:space="preserve"> </w:t>
+      </w:r>
+      <w:r>
+        <w:t xml:space="preserve">được dựng đúng từ hai mục b8 và e6, thống nhất với khung thin nêu trên.</w:t>
       </w:r>
     </w:p>
     <w:p>

</xml_diff>

<commit_message>
style(docs): remove non-standard symbols (§, →, ✓/✅) from academic deliverables
Scopus/WoS normalisation across the dissertation narrative, manuscripts and
chuyên đề (internal planning/review/audit docs left untouched):
- § (section sign): 178 replaced → 'Mục ' in Vietnamese files, 'Section ' in
  English files (cross-references, e.g. §4.6.2 → Mục 4.6.2).
- Arrows (→): 'I→P' normalised to the thesis standard 'I–P' (12); roman-numeral
  ranges 'I→VI' → 'I–VI'; numeric ranges/transitions rewritten in words
  ('+0,26 lên +0,43', '61,8% rồi 40,7% rồi tan biến', 'dẫn đến', 'thành', 'to');
  the P3 conceptual-flow line spelled out.
- Checkmarks (✓/✅) in narrative comparison tables → 'Có'.
Verified: zero §/→/✓/✅ remain in the narrative deliverable set; no double-space
artifacts. DOCX (per-chapter + full) and LaTeX rebuilt; no numbers changed.
</commit_message>
<xml_diff>
--- a/dist/luan_an_ctu/LUAN_AN_FULL_vi.docx
+++ b/dist/luan_an_ctu/LUAN_AN_FULL_vi.docx
@@ -1953,43 +1953,43 @@
         <w:t xml:space="preserve"> </w:t>
       </w:r>
       <w:r>
-        <w:t xml:space="preserve">- Bảng 4.1. Phân tán năng suất lao động và đặc điểm quốc tế hóa theo phân nhóm con ICRV (Chương 4, §4.1)</w:t>
-      </w:r>
-      <w:r>
-        <w:t xml:space="preserve"> </w:t>
-      </w:r>
-      <w:r>
-        <w:t xml:space="preserve">- Bảng 4.2. Đổi mới sáng tạo và chấp nhận số theo phân nhóm con ICRV (%) (Chương 4, §4.1)</w:t>
-      </w:r>
-      <w:r>
-        <w:t xml:space="preserve"> </w:t>
-      </w:r>
-      <w:r>
-        <w:t xml:space="preserve">- Bảng 4.3. Đặc trưng doanh nghiệp Nhật Bản 2025 so với Nhóm I (Chương 4, §4.1.5)</w:t>
-      </w:r>
-      <w:r>
-        <w:t xml:space="preserve"> </w:t>
-      </w:r>
-      <w:r>
-        <w:t xml:space="preserve">- Bảng 4.4. Tiến triển các mô hình lồng nhau của P7 trên khung 50 nền (Chương 4, §4.6)</w:t>
-      </w:r>
-      <w:r>
-        <w:t xml:space="preserve"> </w:t>
-      </w:r>
-      <w:r>
-        <w:t xml:space="preserve">- Bảng 4.5. Điểm uốn theo nhóm ICRV, khung 50 nền (Chương 4, §4.6)</w:t>
-      </w:r>
-      <w:r>
-        <w:t xml:space="preserve"> </w:t>
-      </w:r>
-      <w:r>
-        <w:t xml:space="preserve">- Bảng 4.6. Điểm uốn theo đợt khảo sát, Ấn Độ (Chương 4, §4.8)</w:t>
-      </w:r>
-      <w:r>
-        <w:t xml:space="preserve"> </w:t>
-      </w:r>
-      <w:r>
-        <w:t xml:space="preserve">- Bảng 4.7. Tổng hợp ước lượng các nghiên cứu thành phần thực nghiệm (Chương 4, §4.10)</w:t>
+        <w:t xml:space="preserve">- Bảng 4.1. Phân tán năng suất lao động và đặc điểm quốc tế hóa theo phân nhóm con ICRV (Chương 4, Mục 4.1)</w:t>
+      </w:r>
+      <w:r>
+        <w:t xml:space="preserve"> </w:t>
+      </w:r>
+      <w:r>
+        <w:t xml:space="preserve">- Bảng 4.2. Đổi mới sáng tạo và chấp nhận số theo phân nhóm con ICRV (%) (Chương 4, Mục 4.1)</w:t>
+      </w:r>
+      <w:r>
+        <w:t xml:space="preserve"> </w:t>
+      </w:r>
+      <w:r>
+        <w:t xml:space="preserve">- Bảng 4.3. Đặc trưng doanh nghiệp Nhật Bản 2025 so với Nhóm I (Chương 4, Mục 4.1.5)</w:t>
+      </w:r>
+      <w:r>
+        <w:t xml:space="preserve"> </w:t>
+      </w:r>
+      <w:r>
+        <w:t xml:space="preserve">- Bảng 4.4. Tiến triển các mô hình lồng nhau của P7 trên khung 50 nền (Chương 4, Mục 4.6)</w:t>
+      </w:r>
+      <w:r>
+        <w:t xml:space="preserve"> </w:t>
+      </w:r>
+      <w:r>
+        <w:t xml:space="preserve">- Bảng 4.5. Điểm uốn theo nhóm ICRV, khung 50 nền (Chương 4, Mục 4.6)</w:t>
+      </w:r>
+      <w:r>
+        <w:t xml:space="preserve"> </w:t>
+      </w:r>
+      <w:r>
+        <w:t xml:space="preserve">- Bảng 4.6. Điểm uốn theo đợt khảo sát, Ấn Độ (Chương 4, Mục 4.8)</w:t>
+      </w:r>
+      <w:r>
+        <w:t xml:space="preserve"> </w:t>
+      </w:r>
+      <w:r>
+        <w:t xml:space="preserve">- Bảng 4.7. Tổng hợp ước lượng các nghiên cứu thành phần thực nghiệm (Chương 4, Mục 4.10)</w:t>
       </w:r>
     </w:p>
     <w:p>
@@ -2007,43 +2007,43 @@
         <w:t xml:space="preserve"> </w:t>
       </w:r>
       <w:r>
-        <w:t xml:space="preserve">- Bảng định nghĩa biến, Nghiên cứu P3 Việt Nam (Chương 3, §3.4.5.1)</w:t>
-      </w:r>
-      <w:r>
-        <w:t xml:space="preserve"> </w:t>
-      </w:r>
-      <w:r>
-        <w:t xml:space="preserve">- Bảng định nghĩa biến, Nghiên cứu P4 Singapore (Chương 3, §3.4.5.2)</w:t>
-      </w:r>
-      <w:r>
-        <w:t xml:space="preserve"> </w:t>
-      </w:r>
-      <w:r>
-        <w:t xml:space="preserve">- Bảng định nghĩa biến, Nghiên cứu P5 Trung Quốc (Chương 3, §3.4.5.3)</w:t>
-      </w:r>
-      <w:r>
-        <w:t xml:space="preserve"> </w:t>
-      </w:r>
-      <w:r>
-        <w:t xml:space="preserve">- Bảng định nghĩa biến, Nghiên cứu P7 đa quốc gia (Chương 3, §3.4.5.4)</w:t>
-      </w:r>
-      <w:r>
-        <w:t xml:space="preserve"> </w:t>
-      </w:r>
-      <w:r>
-        <w:t xml:space="preserve">- Bảng định nghĩa biến, Nghiên cứu P8 SIDS (Chương 3, §3.4.5.5)</w:t>
-      </w:r>
-      <w:r>
-        <w:t xml:space="preserve"> </w:t>
-      </w:r>
-      <w:r>
-        <w:t xml:space="preserve">- Bảng tóm tắt phương pháp: Kế thừa và đóng góp mới (Chương 3, §3.6)</w:t>
-      </w:r>
-      <w:r>
-        <w:t xml:space="preserve"> </w:t>
-      </w:r>
-      <w:r>
-        <w:t xml:space="preserve">- Bảng tổng hợp kết quả kiểm định hệ giả thuyết H1–H6, H1b, H1c (Chương 4, §4.10)</w:t>
+        <w:t xml:space="preserve">- Bảng định nghĩa biến, Nghiên cứu P3 Việt Nam (Chương 3, Mục 3.4.5.1)</w:t>
+      </w:r>
+      <w:r>
+        <w:t xml:space="preserve"> </w:t>
+      </w:r>
+      <w:r>
+        <w:t xml:space="preserve">- Bảng định nghĩa biến, Nghiên cứu P4 Singapore (Chương 3, Mục 3.4.5.2)</w:t>
+      </w:r>
+      <w:r>
+        <w:t xml:space="preserve"> </w:t>
+      </w:r>
+      <w:r>
+        <w:t xml:space="preserve">- Bảng định nghĩa biến, Nghiên cứu P5 Trung Quốc (Chương 3, Mục 3.4.5.3)</w:t>
+      </w:r>
+      <w:r>
+        <w:t xml:space="preserve"> </w:t>
+      </w:r>
+      <w:r>
+        <w:t xml:space="preserve">- Bảng định nghĩa biến, Nghiên cứu P7 đa quốc gia (Chương 3, Mục 3.4.5.4)</w:t>
+      </w:r>
+      <w:r>
+        <w:t xml:space="preserve"> </w:t>
+      </w:r>
+      <w:r>
+        <w:t xml:space="preserve">- Bảng định nghĩa biến, Nghiên cứu P8 SIDS (Chương 3, Mục 3.4.5.5)</w:t>
+      </w:r>
+      <w:r>
+        <w:t xml:space="preserve"> </w:t>
+      </w:r>
+      <w:r>
+        <w:t xml:space="preserve">- Bảng tóm tắt phương pháp: Kế thừa và đóng góp mới (Chương 3, Mục 3.6)</w:t>
+      </w:r>
+      <w:r>
+        <w:t xml:space="preserve"> </w:t>
+      </w:r>
+      <w:r>
+        <w:t xml:space="preserve">- Bảng tổng hợp kết quả kiểm định hệ giả thuyết H1–H6, H1b, H1c (Chương 4, Mục 4.10)</w:t>
       </w:r>
     </w:p>
     <w:bookmarkEnd w:id="28"/>
@@ -2065,7 +2065,7 @@
         <w:pStyle w:val="Compact"/>
       </w:pPr>
       <w:r>
-        <w:t xml:space="preserve">Hình 2.1. Khung khái niệm tích hợp đa tầng CDCM (Chương 2, §2.5)</w:t>
+        <w:t xml:space="preserve">Hình 2.1. Khung khái niệm tích hợp đa tầng CDCM (Chương 2, Mục 2.5)</w:t>
       </w:r>
     </w:p>
     <w:p>
@@ -3253,7 +3253,7 @@
         <w:t xml:space="preserve"> </w:t>
       </w:r>
       <w:r>
-        <w:t xml:space="preserve">(Singapore, MIR, đang phản biện): kiểm định tại Nhóm I ICRV, điểm uốn ≈ 88,6% (khoảng tin cậy rất rộng và vượt ngưỡng khả thi của FSTS, nên không định vị tin cậy, xem §4.3), DAI Tier-1+2 khuếch đại đường cong I–P.</w:t>
+        <w:t xml:space="preserve">(Singapore, MIR, đang phản biện): kiểm định tại Nhóm I ICRV, điểm uốn ≈ 88,6% (khoảng tin cậy rất rộng và vượt ngưỡng khả thi của FSTS, nên không định vị tin cậy, xem Mục 4.3), DAI Tier-1+2 khuếch đại đường cong I–P.</w:t>
       </w:r>
       <w:r>
         <w:t xml:space="preserve"> </w:t>
@@ -3720,7 +3720,7 @@
         <w:pStyle w:val="BodyText"/>
       </w:pPr>
       <w:r>
-        <w:t xml:space="preserve">Trong bối cảnh nghiên cứu sử dụng dữ liệu WBES, vốn không cung cấp thông tin về giá cổ phiếu hay giá trị thị trường, thước đo năng suất lao động là lựa chọn phổ biến nhất và phù hợp nhất về mặt kỹ thuật. Năng suất lao động được tính bằng logarithm tự nhiên của tỷ số doanh thu hàng năm trên số lao động toàn thời gian (ln(doanh thu/lao động)), cho phép so sánh chuẩn hóa giữa các doanh nghiệp thuộc các quốc gia, ngành nghề và quy mô khác nhau (nghiên cứu thành phần P1). Luận án sử dụng thước đo này làm biến phụ thuộc chính, với ROS, tăng trưởng doanh thu, tăng trưởng việc làm và ln(doanh thu) được sử dụng như các thước đo độ vững để kiểm tra tính nhất quán của kết quả (xem Chương 3, §3.5).</w:t>
+        <w:t xml:space="preserve">Trong bối cảnh nghiên cứu sử dụng dữ liệu WBES, vốn không cung cấp thông tin về giá cổ phiếu hay giá trị thị trường, thước đo năng suất lao động là lựa chọn phổ biến nhất và phù hợp nhất về mặt kỹ thuật. Năng suất lao động được tính bằng logarithm tự nhiên của tỷ số doanh thu hàng năm trên số lao động toàn thời gian (ln(doanh thu/lao động)), cho phép so sánh chuẩn hóa giữa các doanh nghiệp thuộc các quốc gia, ngành nghề và quy mô khác nhau (nghiên cứu thành phần P1). Luận án sử dụng thước đo này làm biến phụ thuộc chính, với ROS, tăng trưởng doanh thu, tăng trưởng việc làm và ln(doanh thu) được sử dụng như các thước đo độ vững để kiểm tra tính nhất quán của kết quả (xem Chương 3, Mục 3.5).</w:t>
       </w:r>
     </w:p>
     <w:p>
@@ -5099,7 +5099,7 @@
               <w:jc w:val="left"/>
             </w:pPr>
             <w:r>
-              <w:t xml:space="preserve">§2.3.2; §4.2</w:t>
+              <w:t xml:space="preserve">Mục 2.3.2; Mục 4.2</w:t>
             </w:r>
           </w:p>
         </w:tc>
@@ -5149,7 +5149,7 @@
               <w:jc w:val="left"/>
             </w:pPr>
             <w:r>
-              <w:t xml:space="preserve">§4.5</w:t>
+              <w:t xml:space="preserve">Mục 4.5</w:t>
             </w:r>
           </w:p>
         </w:tc>
@@ -5199,7 +5199,7 @@
               <w:jc w:val="left"/>
             </w:pPr>
             <w:r>
-              <w:t xml:space="preserve">§4.3</w:t>
+              <w:t xml:space="preserve">Mục 4.3</w:t>
             </w:r>
           </w:p>
         </w:tc>
@@ -5249,7 +5249,7 @@
               <w:jc w:val="left"/>
             </w:pPr>
             <w:r>
-              <w:t xml:space="preserve">§4.4</w:t>
+              <w:t xml:space="preserve">Mục 4.4</w:t>
             </w:r>
           </w:p>
         </w:tc>
@@ -5299,7 +5299,7 @@
               <w:jc w:val="left"/>
             </w:pPr>
             <w:r>
-              <w:t xml:space="preserve">§4.2</w:t>
+              <w:t xml:space="preserve">Mục 4.2</w:t>
             </w:r>
           </w:p>
         </w:tc>
@@ -5349,7 +5349,7 @@
               <w:jc w:val="left"/>
             </w:pPr>
             <w:r>
-              <w:t xml:space="preserve">§4.6</w:t>
+              <w:t xml:space="preserve">Mục 4.6</w:t>
             </w:r>
           </w:p>
         </w:tc>
@@ -5399,7 +5399,7 @@
               <w:jc w:val="left"/>
             </w:pPr>
             <w:r>
-              <w:t xml:space="preserve">§4.7</w:t>
+              <w:t xml:space="preserve">Mục 4.7</w:t>
             </w:r>
           </w:p>
         </w:tc>
@@ -5449,7 +5449,7 @@
               <w:jc w:val="left"/>
             </w:pPr>
             <w:r>
-              <w:t xml:space="preserve">§4.8</w:t>
+              <w:t xml:space="preserve">Mục 4.8</w:t>
             </w:r>
           </w:p>
         </w:tc>
@@ -5499,7 +5499,7 @@
               <w:jc w:val="left"/>
             </w:pPr>
             <w:r>
-              <w:t xml:space="preserve">§4.1.5</w:t>
+              <w:t xml:space="preserve">Mục 4.1.5</w:t>
             </w:r>
           </w:p>
         </w:tc>
@@ -6100,7 +6100,7 @@
         <w:t xml:space="preserve"> </w:t>
       </w:r>
       <w:r>
-        <w:t xml:space="preserve">trong ước lượng mô hình hồi quy vì ba lý do: (1) Mục tiêu của luận án là kiểm định cơ chế lý thuyết (mechanism testing) chứ không phải ước lượng mô tả đại diện tổng thể (population-representative descriptive estimation), trong bối cảnh này, không áp dụng weights là thực hành chuẩn trong văn liệu IB sử dụng WBES (Aterido et al., 2011; Cuervo-Cazurra et al., 2018); (2) Fixed effects ở cấp country-year đã kiểm soát đặc điểm cấu trúc của từng sóng khảo sát; (3) Việc áp dụng weights có thể làm sai lệch ước lượng khi mẫu được gộp chung từ nhiều quốc gia có quy mô tổng thể doanh nghiệp khác nhau nhiều bậc (ví dụ: Trung Quốc ~100 triệu so với Tonga ~500 doanh nghiệp). Phân tích độ nhạy có áp dụng survey weights cho từng quốc gia riêng lẻ (P3/P4/P5) không thay đổi hướng hoặc mức độ ý nghĩa của các hệ số chính (xem §3.5).</w:t>
+        <w:t xml:space="preserve">trong ước lượng mô hình hồi quy vì ba lý do: (1) Mục tiêu của luận án là kiểm định cơ chế lý thuyết (mechanism testing) chứ không phải ước lượng mô tả đại diện tổng thể (population-representative descriptive estimation), trong bối cảnh này, không áp dụng weights là thực hành chuẩn trong văn liệu IB sử dụng WBES (Aterido et al., 2011; Cuervo-Cazurra et al., 2018); (2) Fixed effects ở cấp country-year đã kiểm soát đặc điểm cấu trúc của từng sóng khảo sát; (3) Việc áp dụng weights có thể làm sai lệch ước lượng khi mẫu được gộp chung từ nhiều quốc gia có quy mô tổng thể doanh nghiệp khác nhau nhiều bậc (ví dụ: Trung Quốc ~100 triệu so với Tonga ~500 doanh nghiệp). Phân tích độ nhạy có áp dụng survey weights cho từng quốc gia riêng lẻ (P3/P4/P5) không thay đổi hướng hoặc mức độ ý nghĩa của các hệ số chính (xem Mục 3.5).</w:t>
       </w:r>
     </w:p>
     <w:bookmarkEnd w:id="90"/>
@@ -6413,7 +6413,7 @@
         <w:t xml:space="preserve"> </w:t>
       </w:r>
       <w:r>
-        <w:t xml:space="preserve">thô không so sánh được giữa các nước, tính so sánh được bảo đảm bằng chuẩn hóa z within country–year và hiệu ứng cố định hai chiều, như trình bày chi tiết ở Phụ lục A (§A.5); mọi so sánh</w:t>
+        <w:t xml:space="preserve">thô không so sánh được giữa các nước, tính so sánh được bảo đảm bằng chuẩn hóa z within country–year và hiệu ứng cố định hai chiều, như trình bày chi tiết ở Phụ lục A (Mục A.5); mọi so sánh</w:t>
       </w:r>
       <w:r>
         <w:t xml:space="preserve"> </w:t>
@@ -6821,7 +6821,7 @@
         <w:pStyle w:val="FirstParagraph"/>
       </w:pPr>
       <w:r>
-        <w:t xml:space="preserve">Bộ mục chính xác của mỗi nghiên cứu thành phần được nêu lại trong bảng định nghĩa biến của nghiên cứu đó (§3.4.5) và Phụ lục A; khác biệt giữa thin và full phản ánh ràng buộc khả dụng dữ liệu khách quan, không phải lựa chọn tùy ý. Vì các mục là chỉ báo nhị phân của cùng một construct formative (năng lực công nghệ), hai biến thể tương quan cao và cho kết luận điều tiết nhất quán về dấu; phần độ vững (§3.5.1) kiểm tra độ nhạy của kết quả với lựa chọn biến thể. Bộ mục TCI của nghiên cứu đa quốc gia (P7) đã được đối chiếu trực tiếp với mã xây dựng dữ liệu thực tế (pipeline raw WBES 50 nền kinh tế, gồm Nhật Bản 2025): biến</w:t>
+        <w:t xml:space="preserve">Bộ mục chính xác của mỗi nghiên cứu thành phần được nêu lại trong bảng định nghĩa biến của nghiên cứu đó (Mục 3.4.5) và Phụ lục A; khác biệt giữa thin và full phản ánh ràng buộc khả dụng dữ liệu khách quan, không phải lựa chọn tùy ý. Vì các mục là chỉ báo nhị phân của cùng một construct formative (năng lực công nghệ), hai biến thể tương quan cao và cho kết luận điều tiết nhất quán về dấu; phần độ vững (Mục 3.5.1) kiểm tra độ nhạy của kết quả với lựa chọn biến thể. Bộ mục TCI của nghiên cứu đa quốc gia (P7) đã được đối chiếu trực tiếp với mã xây dựng dữ liệu thực tế (pipeline raw WBES 50 nền kinh tế, gồm Nhật Bản 2025): biến</w:t>
       </w:r>
       <w:r>
         <w:t xml:space="preserve"> </w:t>
@@ -19989,7 +19989,7 @@
               <w:jc w:val="left"/>
             </w:pPr>
             <w:r>
-              <w:t xml:space="preserve">integer 1–6 (Advanced Innovation→SIDS)</w:t>
+              <w:t xml:space="preserve">integer 1–6 (Advanced Innovation đến SIDS)</w:t>
             </w:r>
           </w:p>
         </w:tc>
@@ -23756,7 +23756,7 @@
         <w:t xml:space="preserve"> </w:t>
       </w:r>
       <w:r>
-        <w:t xml:space="preserve">(inferential bounds) chứ không phải bằng chứng nhân quả khẳng định, và mọi suy luận về điều tiết thể chế được neo đồng thời vào hai nguồn độc lập là kiểm định điều tiết của meta-analysis và gradient điểm uốn của mô hình đa quốc gia (xem §4.2.3, §4.6.2). Cách tiếp cận đa lớp này tuân theo các khuyến nghị về suy luận từ dữ liệu quan sát quy mô lớn (Angrist &amp; Pischke, 2009). Một giới hạn đo lường cần lưu ý là</w:t>
+        <w:t xml:space="preserve">(inferential bounds) chứ không phải bằng chứng nhân quả khẳng định, và mọi suy luận về điều tiết thể chế được neo đồng thời vào hai nguồn độc lập là kiểm định điều tiết của meta-analysis và gradient điểm uốn của mô hình đa quốc gia (xem Mục 4.2.3, Mục 4.6.2). Cách tiếp cận đa lớp này tuân theo các khuyến nghị về suy luận từ dữ liệu quan sát quy mô lớn (Angrist &amp; Pischke, 2009). Một giới hạn đo lường cần lưu ý là</w:t>
       </w:r>
       <w:r>
         <w:t xml:space="preserve"> </w:t>
@@ -23772,7 +23772,7 @@
         <w:t xml:space="preserve"> </w:t>
       </w:r>
       <w:r>
-        <w:t xml:space="preserve">của các construct TCI và DAI qua ba thế hệ bảng hỏi WBES: do cấu trúc câu hỏi thay đổi giữa PICS3, Standardized và BREADY, một phần khác biệt theo thời gian có thể phản ánh hiệu ứng schema thay vì thay đổi thực chất (ví dụ mức R&amp;D đo được ở một số nhóm). Luận án giảm thiểu rủi ro này bằng hiệu ứng cố định năm/đợt, chuẩn hóa within country–year, và kiểm tra độ nhạy với biến thể thước đo (§3.5.1); tuy vậy luận án chưa thực hiện kiểm định bất biến đo lường chính thức, nên mọi so sánh xuyên-schema cần được đọc một cách thận trọng.</w:t>
+        <w:t xml:space="preserve">của các construct TCI và DAI qua ba thế hệ bảng hỏi WBES: do cấu trúc câu hỏi thay đổi giữa PICS3, Standardized và BREADY, một phần khác biệt theo thời gian có thể phản ánh hiệu ứng schema thay vì thay đổi thực chất (ví dụ mức R&amp;D đo được ở một số nhóm). Luận án giảm thiểu rủi ro này bằng hiệu ứng cố định năm/đợt, chuẩn hóa within country–year, và kiểm tra độ nhạy với biến thể thước đo (Mục 3.5.1); tuy vậy luận án chưa thực hiện kiểm định bất biến đo lường chính thức, nên mọi so sánh xuyên-schema cần được đọc một cách thận trọng.</w:t>
       </w:r>
     </w:p>
     <w:bookmarkEnd w:id="119"/>
@@ -23964,7 +23964,7 @@
               <w:jc w:val="left"/>
             </w:pPr>
             <w:r>
-              <w:t xml:space="preserve">Mở rộng từ 17 →</w:t>
+              <w:t xml:space="preserve">Mở rộng từ 17 lên</w:t>
             </w:r>
             <w:r>
               <w:t xml:space="preserve"> </w:t>
@@ -24345,7 +24345,7 @@
         <w:pStyle w:val="FirstParagraph"/>
       </w:pPr>
       <w:r>
-        <w:t xml:space="preserve">Chương 4 trình bày toàn bộ kết quả nghiên cứu của luận án theo logic đi từ bức tranh thực trạng mô tả (§4.1) đến bằng chứng tổng hợp ở cấp meta-analytic (§4.2), sau đó đến bằng chứng quốc gia cụ thể và cuối cùng là kiểm định toàn mẫu đa quốc gia. Cấu trúc trình bày gồm mười phần chính, bắt đầu bằng thực trạng quốc tế hóa và hiệu quả hoạt động kinh doanh tại châu Á theo các phân nhóm con thể chế ICRV, tiếp theo là: (ii) kết quả meta-analysis ba tầng (P6); (iii) bối cảnh thể chế tiên tiến–đổi mới tại Singapore (P4); (iv) bối cảnh thể chế trung bình cao tại Trung Quốc (P5); (v) bối cảnh chuyển đổi bậc thấp–trung tại Việt Nam (P3); (vi) kiểm định toàn mẫu châu Á đa bối cảnh (P7); (vii) trường hợp biên là các nền kinh tế đảo nhỏ đang phát triển ở Thái Bình Dương (P8); và (viii) tổng hợp kết quả theo hệ giả thuyết.</w:t>
+        <w:t xml:space="preserve">Chương 4 trình bày toàn bộ kết quả nghiên cứu của luận án theo logic đi từ bức tranh thực trạng mô tả (Mục 4.1) đến bằng chứng tổng hợp ở cấp meta-analytic (Mục 4.2), sau đó đến bằng chứng quốc gia cụ thể và cuối cùng là kiểm định toàn mẫu đa quốc gia. Cấu trúc trình bày gồm mười phần chính, bắt đầu bằng thực trạng quốc tế hóa và hiệu quả hoạt động kinh doanh tại châu Á theo các phân nhóm con thể chế ICRV, tiếp theo là: (ii) kết quả meta-analysis ba tầng (P6); (iii) bối cảnh thể chế tiên tiến–đổi mới tại Singapore (P4); (iv) bối cảnh thể chế trung bình cao tại Trung Quốc (P5); (v) bối cảnh chuyển đổi bậc thấp–trung tại Việt Nam (P3); (vi) kiểm định toàn mẫu châu Á đa bối cảnh (P7); (vii) trường hợp biên là các nền kinh tế đảo nhỏ đang phát triển ở Thái Bình Dương (P8); và (viii) tổng hợp kết quả theo hệ giả thuyết.</w:t>
       </w:r>
     </w:p>
     <w:p>
@@ -24379,7 +24379,7 @@
         <w:pStyle w:val="FirstParagraph"/>
       </w:pPr>
       <w:r>
-        <w:t xml:space="preserve">Phân tích mô tả trên khung 50 nền kinh tế châu Á và Thái Bình Dương (gồm Nhật Bản, thành viên thứ sáu của Nhóm I được WBES khảo sát lần đầu năm 2025; xem §4.1.5) cho thấy bức tranh hiệu quả hoạt động kinh doanh có sự phân tán lớn và không hội tụ. Các bảng phân loại 4.1 dưới đây dựa trên bộ dữ liệu ước lượng đa quốc gia (pool phân loại 96.415 doanh nghiệp / 52 nhãn nền; khung phân tích 88.869 / 50 nền, gồm Nhật Bản; mẫu hồi quy chính P7 M2 N = 81.022), nhất quán với thống kê mô tả chi tiết của Chuyên đề 1 trên đầy đủ 50 nền. Vì doanh thu WBES được báo cáo bằng nội tệ, độ phân tán năng suất được tính</w:t>
+        <w:t xml:space="preserve">Phân tích mô tả trên khung 50 nền kinh tế châu Á và Thái Bình Dương (gồm Nhật Bản, thành viên thứ sáu của Nhóm I được WBES khảo sát lần đầu năm 2025; xem Mục 4.1.5) cho thấy bức tranh hiệu quả hoạt động kinh doanh có sự phân tán lớn và không hội tụ. Các bảng phân loại 4.1 dưới đây dựa trên bộ dữ liệu ước lượng đa quốc gia (pool phân loại 96.415 doanh nghiệp / 52 nhãn nền; khung phân tích 88.869 / 50 nền, gồm Nhật Bản; mẫu hồi quy chính P7 M2 N = 81.022), nhất quán với thống kê mô tả chi tiết của Chuyên đề 1 trên đầy đủ 50 nền. Vì doanh thu WBES được báo cáo bằng nội tệ, độ phân tán năng suất được tính</w:t>
       </w:r>
       <w:r>
         <w:t xml:space="preserve"> </w:t>
@@ -25068,7 +25068,7 @@
           <w:iCs/>
           <w:i/>
         </w:rPr>
-        <w:t xml:space="preserve">Ghi chú: Cột n là số doanh nghiệp được phân loại vào sáu nhóm ICRV trong pool gộp WBES (tổng 96.415; ngoài ra còn ~10.350 doanh nghiệp chưa gán nhóm ICRV do thiếu chỉ số thể chế). Mẫu hồi quy chính của P7 là N = 81.022 (mô hình M2, khung 50 nền gồm Nhật Bản) và giảm còn 79.080 ở M5 khi bổ sung biến kiểm soát (xem §4.6.1), do loại các quan sát thiếu biến phụ thuộc/FSTS. ¹ Độ lệch chuẩn ln(năng suất lao động) tính trong từng cặp nền kinh tế × năm rồi lấy trung vị giữa các đợt của nhóm, bất biến với đơn vị tiền tệ (thừa số quy đổi triệt tiêu trên thang log); năng suất được winsorize 1/99 trong cụm country-year (xem §3.5.3). ² Trung vị Nhóm II bị kéo lên bởi các nền nhỏ; hai nền lớn nhất khối có phân tán hẹp nhất toàn pool (Saudi Arabia 0,49; Qatar 0,33).</w:t>
+        <w:t xml:space="preserve">Ghi chú: Cột n là số doanh nghiệp được phân loại vào sáu nhóm ICRV trong pool gộp WBES (tổng 96.415; ngoài ra còn ~10.350 doanh nghiệp chưa gán nhóm ICRV do thiếu chỉ số thể chế). Mẫu hồi quy chính của P7 là N = 81.022 (mô hình M2, khung 50 nền gồm Nhật Bản) và giảm còn 79.080 ở M5 khi bổ sung biến kiểm soát (xem Mục 4.6.1), do loại các quan sát thiếu biến phụ thuộc/FSTS. ¹ Độ lệch chuẩn ln(năng suất lao động) tính trong từng cặp nền kinh tế × năm rồi lấy trung vị giữa các đợt của nhóm, bất biến với đơn vị tiền tệ (thừa số quy đổi triệt tiêu trên thang log); năng suất được winsorize 1/99 trong cụm country-year (xem Mục 3.5.3). ² Trung vị Nhóm II bị kéo lên bởi các nền nhỏ; hai nền lớn nhất khối có phân tán hẹp nhất toàn pool (Saudi Arabia 0,49; Qatar 0,33).</w:t>
       </w:r>
     </w:p>
     <w:p>
@@ -25249,7 +25249,7 @@
         <w:t xml:space="preserve"> </w:t>
       </w:r>
       <w:r>
-        <w:t xml:space="preserve">khung misallocation chứ không phải bằng chứng phân rã trực tiếp. Dù vậy, hướng diễn giải này có hàm ý chính sách khác hẳn với việc coi phân tán chỉ là nhiễu thống kê. Cần nhấn mạnh rằng các so sánh giữa các nhóm ICRV trong §4.1 mang bản chất</w:t>
+        <w:t xml:space="preserve">khung misallocation chứ không phải bằng chứng phân rã trực tiếp. Dù vậy, hướng diễn giải này có hàm ý chính sách khác hẳn với việc coi phân tán chỉ là nhiễu thống kê. Cần nhấn mạnh rằng các so sánh giữa các nhóm ICRV trong Mục 4.1 mang bản chất</w:t>
       </w:r>
       <w:r>
         <w:t xml:space="preserve"> </w:t>
@@ -25362,7 +25362,7 @@
         </m:r>
       </m:oMath>
       <w:r>
-        <w:t xml:space="preserve">; §4.2.3) và gradient điểm uốn theo ICRV của mô hình hồi quy đa quốc gia P7 (§4.6.2). Hai nguồn bằng chứng này bảo đảm bức tranh thực trạng mô tả được neo vào bằng chứng suy diễn nhất quán, thay vì dừng lại ở so sánh trung bình–độ lệch chuẩn.</w:t>
+        <w:t xml:space="preserve">; Mục 4.2.3) và gradient điểm uốn theo ICRV của mô hình hồi quy đa quốc gia P7 (Mục 4.6.2). Hai nguồn bằng chứng này bảo đảm bức tranh thực trạng mô tả được neo vào bằng chứng suy diễn nhất quán, thay vì dừng lại ở so sánh trung bình–độ lệch chuẩn.</w:t>
       </w:r>
     </w:p>
     <w:bookmarkEnd w:id="125"/>
@@ -26182,7 +26182,7 @@
         <w:t xml:space="preserve"> </w:t>
       </w:r>
       <w:r>
-        <w:t xml:space="preserve">(2.168 doanh nghiệp Nhật trong khung phân tích 88.869; mẫu hồi quy chính M2 N = 81.022, M5 N = 79.080; xem §4.6), nên các kết quả P7 trong luận án đã phản ánh Nhật Bản. Hai nghiên cứu thành phần còn lại là pool con riêng không liên quan Nhật Bản: P8 (FIP) trên 7 nền Pacific SIDS và P9 (ngưỡng) trên Ấn Độ. Ngoài ra, nghiên cứu thành phần P10 kiểm định chuyên sâu quan hệ I–P tại Nhật Bản (xem §4.6.2). Toàn bộ số liệu dưới đây được tính trực tiếp từ tệp vi mô gốc.</w:t>
+        <w:t xml:space="preserve">(2.168 doanh nghiệp Nhật trong khung phân tích 88.869; mẫu hồi quy chính M2 N = 81.022, M5 N = 79.080; xem Mục 4.6), nên các kết quả P7 trong luận án đã phản ánh Nhật Bản. Hai nghiên cứu thành phần còn lại là pool con riêng không liên quan Nhật Bản: P8 (FIP) trên 7 nền Pacific SIDS và P9 (ngưỡng) trên Ấn Độ. Ngoài ra, nghiên cứu thành phần P10 kiểm định chuyên sâu quan hệ I–P tại Nhật Bản (xem Mục 4.6.2). Toàn bộ số liệu dưới đây được tính trực tiếp từ tệp vi mô gốc.</w:t>
       </w:r>
     </w:p>
     <w:p>
@@ -26857,7 +26857,7 @@
         <w:t xml:space="preserve">nghịch lý đổi mới–quốc tế hóa và khoảng cách giới</w:t>
       </w:r>
       <w:r>
-        <w:t xml:space="preserve">: dù cường độ R&amp;D và đổi mới cao, cường độ quốc tế hóa cấp cơ sở lại thấp (FSTS 4,1%) cùng tỷ lệ sở hữu nước ngoài rất thấp (1,9%), cho thấy hoạt động quốc tế hóa tập trung ở các tập đoàn đa quốc gia lớn chứ không phân bố đều ở mẫu cơ sở; đồng thời tỷ lệ nữ quản lý cấp cao chỉ 7,3%, thấp hơn nhiều so với mức dẫn đầu khu vực Đông Á–Thái Bình Dương, nhất quán với văn liệu về trần kính trong quản trị doanh nghiệp Nhật Bản. Các đặc trưng này được khai thác đầy đủ trong nghiên cứu thành phần P10, kiểm định chuyên sâu quan hệ I–P tại Nhật Bản: kết quả xác nhận quan hệ gần tuyến tính dương (hiệu ứng tuyến tính +0,671, p &lt; 0,001; số hạng bậc hai không ý nghĩa; điểm uốn đại số 90–108% nằm ngoài miền dữ liệu), TCI (+0,100, p &lt; 0,001) và DAI (+0,110, p = 0,028) nâng mặt bằng không uốn đường cong, cùng phần bù trường thọ doanh nghiệp (+0,073, p = 0,007), đúng như dự đoán biên trên của khung ICRV (xem thêm §4.6.2).</w:t>
+        <w:t xml:space="preserve">: dù cường độ R&amp;D và đổi mới cao, cường độ quốc tế hóa cấp cơ sở lại thấp (FSTS 4,1%) cùng tỷ lệ sở hữu nước ngoài rất thấp (1,9%), cho thấy hoạt động quốc tế hóa tập trung ở các tập đoàn đa quốc gia lớn chứ không phân bố đều ở mẫu cơ sở; đồng thời tỷ lệ nữ quản lý cấp cao chỉ 7,3%, thấp hơn nhiều so với mức dẫn đầu khu vực Đông Á–Thái Bình Dương, nhất quán với văn liệu về trần kính trong quản trị doanh nghiệp Nhật Bản. Các đặc trưng này được khai thác đầy đủ trong nghiên cứu thành phần P10, kiểm định chuyên sâu quan hệ I–P tại Nhật Bản: kết quả xác nhận quan hệ gần tuyến tính dương (hiệu ứng tuyến tính +0,671, p &lt; 0,001; số hạng bậc hai không ý nghĩa; điểm uốn đại số 90–108% nằm ngoài miền dữ liệu), TCI (+0,100, p &lt; 0,001) và DAI (+0,110, p = 0,028) nâng mặt bằng không uốn đường cong, cùng phần bù trường thọ doanh nghiệp (+0,073, p = 0,007), đúng như dự đoán biên trên của khung ICRV (xem thêm Mục 4.6.2).</w:t>
       </w:r>
     </w:p>
     <w:p>
@@ -27416,7 +27416,7 @@
           <w:iCs/>
           <w:i/>
         </w:rPr>
-        <w:t xml:space="preserve">(Lưu ý phân loại: P6, meta-analysis cấp nghiên cứu, dùng hệ ICRV 5-regime rút gọn [I Advanced-Innovation, II Upper-Middle, III Emerging, FR Frontier/SIDS, MX Mixed], khác với hệ 6 nhóm cấp doanh nghiệp dùng ở §4.1 và §4.6; nhóm</w:t>
+        <w:t xml:space="preserve">(Lưu ý phân loại: P6, meta-analysis cấp nghiên cứu, dùng hệ ICRV 5-regime rút gọn [I Advanced-Innovation, II Upper-Middle, III Emerging, FR Frontier/SIDS, MX Mixed], khác với hệ 6 nhóm cấp doanh nghiệp dùng ở Mục 4.1 và Mục 4.6; nhóm</w:t>
       </w:r>
       <w:r>
         <w:rPr>
@@ -27500,7 +27500,7 @@
           <w:iCs/>
           <w:i/>
         </w:rPr>
-        <w:t xml:space="preserve">ở §4.2 giữ theo phân loại gốc của P6.)</w:t>
+        <w:t xml:space="preserve">ở Mục 4.2 giữ theo phân loại gốc của P6.)</w:t>
       </w:r>
     </w:p>
     <w:bookmarkEnd w:id="133"/>
@@ -34377,7 +34377,7 @@
         <w:t xml:space="preserve"> </w:t>
       </w:r>
       <w:r>
-        <w:t xml:space="preserve">Luận án phát hiện chế độ thể chế quyết định chính sự tồn tại và vị trí của chữ U ngược: đường cong định hình rõ nét nhất ở vùng giữa gradient thể chế (Nhóm IV, điểm uốn 43,0%), duỗi thẳng gần tuyến tính ở biên trên và mất cấu trúc ở biên dưới (§4.6.2). Ở cấp vĩ mô, Ngân hàng Thế giới ghi nhận rằng các thị trường biên tăng trưởng nhanh nhất là những nền đã cải thiện quản trị, thu hẹp chênh lệch lãi suất ngân hàng và kiểm soát nợ công, trong khi các điểm yếu thể chế đi kèm tăng trưởng vốn đáng thất vọng (World Bank, 2026c). Hai tầng bằng chứng cùng chỉ về một cơ chế: chất lượng thể chế quyết định mức độ và điều kiện mà tích lũy vốn và quốc tế hóa chuyển hóa thành kết quả thực. Gradient điểm uốn cấp doanh nghiệp của luận án vì vậy có thể đọc như biểu hiện vi mô của quy luật phân hóa tăng trưởng vĩ mô.</w:t>
+        <w:t xml:space="preserve">Luận án phát hiện chế độ thể chế quyết định chính sự tồn tại và vị trí của chữ U ngược: đường cong định hình rõ nét nhất ở vùng giữa gradient thể chế (Nhóm IV, điểm uốn 43,0%), duỗi thẳng gần tuyến tính ở biên trên và mất cấu trúc ở biên dưới (Mục 4.6.2). Ở cấp vĩ mô, Ngân hàng Thế giới ghi nhận rằng các thị trường biên tăng trưởng nhanh nhất là những nền đã cải thiện quản trị, thu hẹp chênh lệch lãi suất ngân hàng và kiểm soát nợ công, trong khi các điểm yếu thể chế đi kèm tăng trưởng vốn đáng thất vọng (World Bank, 2026c). Hai tầng bằng chứng cùng chỉ về một cơ chế: chất lượng thể chế quyết định mức độ và điều kiện mà tích lũy vốn và quốc tế hóa chuyển hóa thành kết quả thực. Gradient điểm uốn cấp doanh nghiệp của luận án vì vậy có thể đọc như biểu hiện vi mô của quy luật phân hóa tăng trưởng vĩ mô.</w:t>
       </w:r>
     </w:p>
     <w:p>
@@ -34395,7 +34395,7 @@
         <w:t xml:space="preserve"> </w:t>
       </w:r>
       <w:r>
-        <w:t xml:space="preserve">Luận án cho thấy nhóm Advanced tài nguyên dẫn dắt (Nhóm II, các nền GCC) có phân tán năng suất hẹp đặc trưng của kinh tế nhà nước tô, nơi phân phối lại tô lợi tài nguyên san bằng khác biệt năng suất giữa doanh nghiệp (§4.1, Chuyên đề 1). Cú sốc xung đột Trung Đông năm 2026, với giá năng lượng dự báo tăng 24% và giá hàng hóa nói chung tăng 16%, đẩy giá kim loại cơ bản và quý lên mức cao kỷ lục (World Bank, 2026d), củng cố vị thế tô lợi của nhóm này trong ngắn hạn nhưng đồng thời khắc sâu rủi ro phụ thuộc tài nguyên mà mô hình tăng trưởng dựa trên đổi mới (Nhóm I) không gặp phải. Bối cảnh hàng hóa 2026 vì vậy làm rõ hơn vì sao việc gộp hai loại Advanced thành một nhóm duy nhất, như văn liệu trước thường làm, che khuất hai cơ chế chuyển hóa quốc tế hóa hoàn toàn khác nhau.</w:t>
+        <w:t xml:space="preserve">Luận án cho thấy nhóm Advanced tài nguyên dẫn dắt (Nhóm II, các nền GCC) có phân tán năng suất hẹp đặc trưng của kinh tế nhà nước tô, nơi phân phối lại tô lợi tài nguyên san bằng khác biệt năng suất giữa doanh nghiệp (Mục 4.1, Chuyên đề 1). Cú sốc xung đột Trung Đông năm 2026, với giá năng lượng dự báo tăng 24% và giá hàng hóa nói chung tăng 16%, đẩy giá kim loại cơ bản và quý lên mức cao kỷ lục (World Bank, 2026d), củng cố vị thế tô lợi của nhóm này trong ngắn hạn nhưng đồng thời khắc sâu rủi ro phụ thuộc tài nguyên mà mô hình tăng trưởng dựa trên đổi mới (Nhóm I) không gặp phải. Bối cảnh hàng hóa 2026 vì vậy làm rõ hơn vì sao việc gộp hai loại Advanced thành một nhóm duy nhất, như văn liệu trước thường làm, che khuất hai cơ chế chuyển hóa quốc tế hóa hoàn toàn khác nhau.</w:t>
       </w:r>
     </w:p>
     <w:p>
@@ -34413,7 +34413,7 @@
         <w:t xml:space="preserve"> </w:t>
       </w:r>
       <w:r>
-        <w:t xml:space="preserve">Luận án cho thấy phần thưởng của hiện diện số Tier-1 co lại ở các nền kinh tế tiên tiến nơi nó đã tiệm cận bão hòa, trong khi vẫn còn dư địa ở các nền đang chuyển đổi (§4.3.2, §4.6.3). Phân tích của Ngân hàng Thế giới về thể chế công trong kỷ nguyên trí tuệ nhân tạo nhấn mạnh rằng hạ tầng số công và quản trị dữ liệu là điều kiện nền tảng quyết định năng lực số được chuyển hóa thành giá trị, và rằng giai đoạn trưởng thành số khác nhau đòi hỏi công cụ chính sách khác nhau (World Bank, 2026e). Sự tương đồng này củng cố luận điểm cốt lõi của khung CDCM: phần thưởng của áp dụng số là hàm của mức độ phát triển thể chế và tầng năng lực số được đo, chứ không phải một</w:t>
+        <w:t xml:space="preserve">Luận án cho thấy phần thưởng của hiện diện số Tier-1 co lại ở các nền kinh tế tiên tiến nơi nó đã tiệm cận bão hòa, trong khi vẫn còn dư địa ở các nền đang chuyển đổi (Mục 4.3.2, Mục 4.6.3). Phân tích của Ngân hàng Thế giới về thể chế công trong kỷ nguyên trí tuệ nhân tạo nhấn mạnh rằng hạ tầng số công và quản trị dữ liệu là điều kiện nền tảng quyết định năng lực số được chuyển hóa thành giá trị, và rằng giai đoạn trưởng thành số khác nhau đòi hỏi công cụ chính sách khác nhau (World Bank, 2026e). Sự tương đồng này củng cố luận điểm cốt lõi của khung CDCM: phần thưởng của áp dụng số là hàm của mức độ phát triển thể chế và tầng năng lực số được đo, chứ không phải một</w:t>
       </w:r>
       <w:r>
         <w:t xml:space="preserve"> </w:t>
@@ -34449,7 +34449,7 @@
         <w:t xml:space="preserve"> </w:t>
       </w:r>
       <w:r>
-        <w:t xml:space="preserve">Phát hiện FIP tại SIDS (§4.7) và việc xác nhận rằng quốc tế hóa chỉ tạo phần thưởng năng suất trong điều kiện thể chế và năng lực đủ mạnh, đặt trong bối cảnh hơn 230 triệu người sẽ bước vào tuổi lao động ở các thị trường biên giai đoạn 2025–2035 (World Bank, 2026c), cho thấy chính sách thúc đẩy xuất khẩu đơn thuần là chưa đủ và có thể phản tác dụng ở những bối cảnh dễ tổn thương. Hàm ý chính sách của luận án, ưu tiên nâng cấp năng lực công nghệ trước khi mở rộng cường độ quốc tế hóa, vì vậy nhất quán với khuyến nghị vĩ mô của Ngân hàng Thế giới về việc đầu tư vào hạ tầng nền tảng và năng lực hấp thụ như điều kiện để các nền kinh tế biên hiện thực hóa tiềm năng (World Bank, 2026c).</w:t>
+        <w:t xml:space="preserve">Phát hiện FIP tại SIDS (Mục 4.7) và việc xác nhận rằng quốc tế hóa chỉ tạo phần thưởng năng suất trong điều kiện thể chế và năng lực đủ mạnh, đặt trong bối cảnh hơn 230 triệu người sẽ bước vào tuổi lao động ở các thị trường biên giai đoạn 2025–2035 (World Bank, 2026c), cho thấy chính sách thúc đẩy xuất khẩu đơn thuần là chưa đủ và có thể phản tác dụng ở những bối cảnh dễ tổn thương. Hàm ý chính sách của luận án, ưu tiên nâng cấp năng lực công nghệ trước khi mở rộng cường độ quốc tế hóa, vì vậy nhất quán với khuyến nghị vĩ mô của Ngân hàng Thế giới về việc đầu tư vào hạ tầng nền tảng và năng lực hấp thụ như điều kiện để các nền kinh tế biên hiện thực hóa tiềm năng (World Bank, 2026c).</w:t>
       </w:r>
     </w:p>
     <w:p>
@@ -34853,7 +34853,7 @@
               <w:jc w:val="left"/>
             </w:pPr>
             <w:r>
-              <w:t xml:space="preserve">dương (+0,26→+0,43)</w:t>
+              <w:t xml:space="preserve">dương (+0,26 lên +0,43)</w:t>
             </w:r>
           </w:p>
         </w:tc>
@@ -35173,19 +35173,19 @@
               <w:jc w:val="left"/>
             </w:pPr>
             <w:r>
-              <w:t xml:space="preserve">U ngược → sụp đổ ngưỡng</w:t>
-            </w:r>
-          </w:p>
-        </w:tc>
-        <w:tc>
-          <w:tcPr/>
-          <w:p>
-            <w:pPr>
-              <w:pStyle w:val="Compact"/>
-              <w:jc w:val="left"/>
-            </w:pPr>
-            <w:r>
-              <w:t xml:space="preserve">61,8%→40,7%→tan biến</w:t>
+              <w:t xml:space="preserve">U ngược chuyển sang sụp đổ ngưỡng</w:t>
+            </w:r>
+          </w:p>
+        </w:tc>
+        <w:tc>
+          <w:tcPr/>
+          <w:p>
+            <w:pPr>
+              <w:pStyle w:val="Compact"/>
+              <w:jc w:val="left"/>
+            </w:pPr>
+            <w:r>
+              <w:t xml:space="preserve">61,8% rồi 40,7% rồi tan biến</w:t>
             </w:r>
           </w:p>
         </w:tc>
@@ -35626,7 +35626,7 @@
               <w:t xml:space="preserve"> </w:t>
             </w:r>
             <w:r>
-              <w:t xml:space="preserve">= 3 tại nhóm Frontier (bin FR, hệ 5-regime của P6); gradient ICRV → TP được xác nhận từ P7</w:t>
+              <w:t xml:space="preserve">= 3 tại nhóm Frontier (bin FR, hệ 5-regime của P6); gradient điểm uốn theo ICRV được xác nhận từ P7</w:t>
             </w:r>
           </w:p>
         </w:tc>
@@ -35923,7 +35923,7 @@
               <w:jc w:val="left"/>
             </w:pPr>
             <w:r>
-              <w:t xml:space="preserve">Xác nhận tại Ấn Độ: TP 61,8% (2014) → 40,7% (2022) → tan biến (2025,</w:t>
+              <w:t xml:space="preserve">Xác nhận tại Ấn Độ: TP 61,8% (2014) rồi 40,7% (2022) rồi tan biến (2025,</w:t>
             </w:r>
             <w:r>
               <w:t xml:space="preserve"> </w:t>
@@ -37926,7 +37926,7 @@
         <w:t xml:space="preserve"> </w:t>
       </w:r>
       <w:r>
-        <w:t xml:space="preserve">mà phụ thuộc vào bối cảnh ICRV: từ TP ≈ 88,6% (Singapore, Advanced Innovation; lưu ý điểm uốn này không định vị tin cậy do CI vượt ngưỡng khả thi, xem §4.3) đến TP ≈ 39,7% (Việt Nam pooled, Lower-mid Transition), với Trung Quốc ở mức trung gian (TP ≈ 48,78%). Không có một điểm uốn phổ quát cho tất cả bối cảnh.</w:t>
+        <w:t xml:space="preserve">mà phụ thuộc vào bối cảnh ICRV: từ TP ≈ 88,6% (Singapore, Advanced Innovation; lưu ý điểm uốn này không định vị tin cậy do CI vượt ngưỡng khả thi, xem Mục 4.3) đến TP ≈ 39,7% (Việt Nam pooled, Lower-mid Transition), với Trung Quốc ở mức trung gian (TP ≈ 48,78%). Không có một điểm uốn phổ quát cho tất cả bối cảnh.</w:t>
       </w:r>
     </w:p>
     <w:p>
@@ -39902,7 +39902,7 @@
         <w:t xml:space="preserve"> </w:t>
       </w:r>
       <w:r>
-        <w:t xml:space="preserve">→</w:t>
+        <w:t xml:space="preserve">thành</w:t>
       </w:r>
       <w:r>
         <w:t xml:space="preserve"> </w:t>
@@ -39920,7 +39920,7 @@
         <w:t xml:space="preserve"> </w:t>
       </w:r>
       <w:r>
-        <w:t xml:space="preserve">theo APA 7th §8.31.</w:t>
+        <w:t xml:space="preserve">theo APA 7th Mục 8.31.</w:t>
       </w:r>
     </w:p>
     <w:p>
@@ -40025,7 +40025,7 @@
         <w:t xml:space="preserve"> </w:t>
       </w:r>
       <w:r>
-        <w:t xml:space="preserve">(5 entries): (i) Pirlea &amp; Corso (2026) internet access digital divide; (ii) Mahler, Wang &amp; Weber (2026) AI inequality; (iii) Pirlea et al. (2026) Atlas of Global Development 2026; (iv) Agnolucci, Kenworthy &amp; Kose (2026) Middle East war → commodity markets; (v) Boeddu, Feyen et al. (2025) AI for Financial Sector Supervision (G20 report).</w:t>
+        <w:t xml:space="preserve">(5 entries): (i) Pirlea &amp; Corso (2026) internet access digital divide; (ii) Mahler, Wang &amp; Weber (2026) AI inequality; (iii) Pirlea et al. (2026) Atlas of Global Development 2026; (iv) Agnolucci, Kenworthy &amp; Kose (2026) Middle East war tác động tới commodity markets; (v) Boeddu, Feyen et al. (2025) AI for Financial Sector Supervision (G20 report).</w:t>
       </w:r>
     </w:p>
     <w:p>
@@ -40056,7 +40056,7 @@
         <w:t xml:space="preserve"> </w:t>
       </w:r>
       <w:r>
-        <w:t xml:space="preserve">(5 entries) phục vụ cập nhật §1.1 và §5.1 của P4 Singapore: (i) Enterprise Singapore (2025) SWITCH 2025; (ii) GovTech Singapore (2024) Digital Government Rankings; (iii) IMDA (2025) ATxSG 2025; (iv) StartupBlink (2025) Global Startup Ecosystem Index; (v) StartupBlink (2026) Innovators Business Environment Index.</w:t>
+        <w:t xml:space="preserve">(5 entries) phục vụ cập nhật Mục 1.1 và Mục 5.1 của P4 Singapore: (i) Enterprise Singapore (2025) SWITCH 2025; (ii) GovTech Singapore (2024) Digital Government Rankings; (iii) IMDA (2025) ATxSG 2025; (iv) StartupBlink (2025) Global Startup Ecosystem Index; (v) StartupBlink (2026) Innovators Business Environment Index.</w:t>
       </w:r>
     </w:p>
     <w:p>
@@ -40104,7 +40104,7 @@
         <w:t xml:space="preserve"> </w:t>
       </w:r>
       <w:r>
-        <w:t xml:space="preserve">(Section P); (ii) in-text citations trong P8 §1 (SIDS development lag) và §3.2 (DAI null context — Mahler et al. 2026). Khatua et al. (2024) APA7 format corrected to advance online publication.</w:t>
+        <w:t xml:space="preserve">(Section P); (ii) in-text citations trong P8 Mục 1 (SIDS development lag) và Mục 3.2 (DAI null context — Mahler et al. 2026). Khatua et al. (2024) APA7 format corrected to advance online publication.</w:t>
       </w:r>
     </w:p>
     <w:p>
@@ -40135,7 +40135,7 @@
         <w:t xml:space="preserve"> </w:t>
       </w:r>
       <w:r>
-        <w:t xml:space="preserve">(5 entries) từ đánh giá 11 PDFs upload ngày 16/05/2026: (i) Agarwal, Barattieri &amp; Mattoo (2026) WPS11352 — Vietnam firm LP tăng theo export demand shock; (ii) Barattieri, Mattoo &amp; Signoret (2026) WPS11354 — Vietnam trade liberalization → +2.9%/yr productivity; (iii) Geginat &amp; Ramalho (2015) WPS7460 — electricity quality &amp; firm performance 183 countries (P8/CD1); (iv) Kim, Kumar, Ramalho &amp; Russell (2026) WPS11279 — institutional capacity framework for ICRV (CD2/thesis); (v) Mahler, Serajuddin, Wadhwa &amp; Yonzan (2026) WPS11350 — world slowest development pace 75 yrs, SIDS ≥100 yrs from standards (P8).</w:t>
+        <w:t xml:space="preserve">(5 entries) từ đánh giá 11 PDFs upload ngày 16/05/2026: (i) Agarwal, Barattieri &amp; Mattoo (2026) WPS11352 — Vietnam firm LP tăng theo export demand shock; (ii) Barattieri, Mattoo &amp; Signoret (2026) WPS11354 — Vietnam trade liberalization dẫn đến +2.9%/yr productivity; (iii) Geginat &amp; Ramalho (2015) WPS7460 — electricity quality &amp; firm performance 183 countries (P8/CD1); (iv) Kim, Kumar, Ramalho &amp; Russell (2026) WPS11279 — institutional capacity framework for ICRV (CD2/thesis); (v) Mahler, Serajuddin, Wadhwa &amp; Yonzan (2026) WPS11350 — world slowest development pace 75 yrs, SIDS ≥100 yrs from standards (P8).</w:t>
       </w:r>
       <w:r>
         <w:t xml:space="preserve"> </w:t>
@@ -40184,7 +40184,7 @@
         <w:t xml:space="preserve"> </w:t>
       </w:r>
       <w:r>
-        <w:t xml:space="preserve">= Atlas chapter (Section P). In-text citations added: P3 §5 (Agarwal + Barattieri), P8 §1 (Mahler et al. 2026b), CD2 §3.3 Tầng 3 (Kim et al. 2026).</w:t>
+        <w:t xml:space="preserve">= Atlas chapter (Section P). In-text citations added: P3 Mục 5 (Agarwal + Barattieri), P8 Mục 1 (Mahler et al. 2026b), CD2 Mục 3.3 Tầng 3 (Kim et al. 2026).</w:t>
       </w:r>
     </w:p>
     <w:p>
@@ -40292,7 +40292,7 @@
         <w:t xml:space="preserve">✓ RESOLVED Audit Warning 1 v2.4</w:t>
       </w:r>
       <w:r>
-        <w:t xml:space="preserve">: Lin &amp; Beamish (2005) → Lu &amp; Beamish (2004) replacement đã hoàn tất trong file 14 v3.8 (commit e2f8415).</w:t>
+        <w:t xml:space="preserve">: Lin &amp; Beamish (2005) thành Lu &amp; Beamish (2004) replacement đã hoàn tất trong file 14 v3.8 (commit e2f8415).</w:t>
       </w:r>
     </w:p>
     <w:p>
@@ -40574,7 +40574,7 @@
         <w:t xml:space="preserve">✓ RESOLVED v2.5 — Audit Warning 1</w:t>
       </w:r>
       <w:r>
-        <w:t xml:space="preserve">: Lin &amp; Beamish (2005) → Lu &amp; Beamish (2004) replacement đã hoàn tất trong file 14 v3.8 (commit e2f8415, 07/05/2026): 4 occurrences trong §1.1, §2.6, Bảng 2.6.1 đã updated. Lu &amp; Beamish (2004) AMJ S-curve DOI 10.2307/20159604 đã có sẵn Section B từ v2.1.</w:t>
+        <w:t xml:space="preserve">: Lin &amp; Beamish (2005) thành Lu &amp; Beamish (2004) replacement đã hoàn tất trong file 14 v3.8 (commit e2f8415, 07/05/2026): 4 occurrences trong Mục 1.1, Mục 2.6, Bảng 2.6.1 đã updated. Lu &amp; Beamish (2004) AMJ S-curve DOI 10.2307/20159604 đã có sẵn Section B từ v2.1.</w:t>
       </w:r>
     </w:p>
     <w:bookmarkEnd w:id="198"/>
@@ -42608,7 +42608,7 @@
           <w:iCs/>
           <w:i/>
         </w:rPr>
-        <w:t xml:space="preserve">per §8.31. Cited file 09b_vn_term_glossary.md cho thuật ngữ chuẩn + chuyển dịch tiếng Việt CĐ1 v3.x.)</w:t>
+        <w:t xml:space="preserve">per Mục 8.31. Cited file 09b_vn_term_glossary.md cho thuật ngữ chuẩn + chuyển dịch tiếng Việt CĐ1 v3.x.)</w:t>
       </w:r>
     </w:p>
     <w:p>
@@ -42782,7 +42782,7 @@
           <w:iCs/>
           <w:i/>
         </w:rPr>
-        <w:t xml:space="preserve">để tính GNI per capita. Cited §1.3 phạm vi không gian (47 nước châu Á phân loại theo income group) + §3 ICRV regime classification trong CĐ1 v3.x.)</w:t>
+        <w:t xml:space="preserve">để tính GNI per capita. Cited Mục 1.3 phạm vi không gian (47 nước châu Á phân loại theo income group) + Mục 3 ICRV regime classification trong CĐ1 v3.x.)</w:t>
       </w:r>
     </w:p>
     <w:p>
@@ -43145,7 +43145,7 @@
           <w:iCs/>
           <w:i/>
         </w:rPr>
-        <w:t xml:space="preserve">stage; (d) Lạm phát dự phóng 4,0%; (e) Two-tier framing: FDI-sector 18% global solution contribution vs SMEs nội địa cần hỗ trợ fintech/capacity (ADB Policy-Based Loans $2,4B target nhóm này); (f) GVC re-positioning từ assembly → mid-stream design/R&amp;D dựa trên 3 trụ cột Resilience + Environmental Sustainability + Inclusiveness. Cited §1.1 lớp 6 update + §5.3 Vietnam case study trong CĐ1 v3.9.)</w:t>
+        <w:t xml:space="preserve">stage; (d) Lạm phát dự phóng 4,0%; (e) Two-tier framing: FDI-sector 18% global solution contribution vs SMEs nội địa cần hỗ trợ fintech/capacity (ADB Policy-Based Loans $2,4B target nhóm này); (f) GVC re-positioning từ assembly → mid-stream design/R&amp;D dựa trên 3 trụ cột Resilience + Environmental Sustainability + Inclusiveness. Cited Mục 1.1 lớp 6 update + Mục 5.3 Vietnam case study trong CĐ1 v3.9.)</w:t>
       </w:r>
     </w:p>
     <w:p>
@@ -43442,7 +43442,7 @@
           <w:iCs/>
           <w:i/>
         </w:rPr>
-        <w:t xml:space="preserve">per §8.31; ước lượng 2023-2024. NCS verify trên trang IFC trước final. Cited §6 yếu tố giải thích trong CĐ1 v3.x — bổ sung framework 3 trụ cột cho ICRV interpretation.)</w:t>
+        <w:t xml:space="preserve">per Mục 8.31; ước lượng 2023-2024. NCS verify trên trang IFC trước final. Cited Mục 6 yếu tố giải thích trong CĐ1 v3.x — bổ sung framework 3 trụ cột cho ICRV interpretation.)</w:t>
       </w:r>
     </w:p>
     <w:p>
@@ -43724,13 +43724,13 @@
       </w:r>
     </w:p>
     <w:bookmarkEnd w:id="211"/>
-    <w:bookmarkStart w:id="212" w:name="X2132ca8004af576b93c55ebf0ffe37a44f46a17"/>
+    <w:bookmarkStart w:id="212" w:name="X1ca9aa89636ad43de36398867e3fda3073628b0"/>
     <w:p>
       <w:pPr>
         <w:pStyle w:val="Heading2"/>
       </w:pPr>
       <w:r>
-        <w:t xml:space="preserve">O. Văn bản pháp lý Việt Nam (cited trong CĐ1 §7.3.3)</w:t>
+        <w:t xml:space="preserve">O. Văn bản pháp lý Việt Nam (cited trong CĐ1 Mục 7.3.3)</w:t>
       </w:r>
     </w:p>
     <w:p>
@@ -45391,7 +45391,7 @@
           <w:iCs/>
           <w:i/>
         </w:rPr>
-        <w:t xml:space="preserve">(Cited in P5 §2 — trade re-equilibration, US–China tariff cycle, bilateral trade flow reorientation; Poverty and Equity Global Practice, October 2024.)</w:t>
+        <w:t xml:space="preserve">(Cited in P5 Mục 2 — trade re-equilibration, US–China tariff cycle, bilateral trade flow reorientation; Poverty and Equity Global Practice, October 2024.)</w:t>
       </w:r>
     </w:p>
     <w:p>
@@ -45720,7 +45720,7 @@
           <w:iCs/>
           <w:i/>
         </w:rPr>
-        <w:t xml:space="preserve">(Mới v2.9 — Vietnam DVAR tăng mạnh từ 2018: US demand shock 8,76% → DVAR +2,49 pp trong 2018–2020, giải thích 68,5% tổng tăng DVAR; firms phản ứng bằng cách xuất khẩu nhiều hơn sang cả US và non-US markets và ghi nhận tăng năng suất lao động; non-Chinese-owned firms là động lực chính; cơ chế: implicit rules of origin + FDI vào intermediates. Sử dụng matched firm-level + customs data 2016–2020. Cited P3 §5 Discussion — corroboration cho ascending-limb mechanism.)</w:t>
+        <w:t xml:space="preserve">(Mới v2.9 — Vietnam DVAR tăng mạnh từ 2018: US demand shock 8,76% → DVAR +2,49 pp trong 2018–2020, giải thích 68,5% tổng tăng DVAR; firms phản ứng bằng cách xuất khẩu nhiều hơn sang cả US và non-US markets và ghi nhận tăng năng suất lao động; non-Chinese-owned firms là động lực chính; cơ chế: implicit rules of origin + FDI vào intermediates. Sử dụng matched firm-level + customs data 2016–2020. Cited P3 Mục 5 Discussion — corroboration cho ascending-limb mechanism.)</w:t>
       </w:r>
     </w:p>
     <w:p>
@@ -45796,7 +45796,7 @@
           <w:iCs/>
           <w:i/>
         </w:rPr>
-        <w:t xml:space="preserve">strategy lợi ích hạn chế cho phần lớn đang phát triển; US Supreme Court Feb 20 2026 tuyên bố IEEPA tariffs unconstitutional. Cited P3 §5.5 Policy implications — macro-level corroboration cho tác động của mở cửa thương mại lên năng suất Việt Nam.)</w:t>
+        <w:t xml:space="preserve">strategy lợi ích hạn chế cho phần lớn đang phát triển; US Supreme Court Feb 20 2026 tuyên bố IEEPA tariffs unconstitutional. Cited P3 Mục 5.5 Policy implications — macro-level corroboration cho tác động của mở cửa thương mại lên năng suất Việt Nam.)</w:t>
       </w:r>
     </w:p>
     <w:p>
@@ -45948,7 +45948,7 @@
           <w:iCs/>
           <w:i/>
         </w:rPr>
-        <w:t xml:space="preserve">trong môi trường năng lực thấp; tương quan dương vững giữa năng lực thể chế và phát triển kinh tế. Cited CD2 §3.3 Tầng 3 Institutional Theory — cung cấp định nghĩa và framework chính thức cho ICRV 6-regime classification.)</w:t>
+        <w:t xml:space="preserve">trong môi trường năng lực thấp; tương quan dương vững giữa năng lực thể chế và phát triển kinh tế. Cited CD2 Mục 3.3 Tầng 3 Institutional Theory — cung cấp định nghĩa và framework chính thức cho ICRV 6-regime classification.)</w:t>
       </w:r>
     </w:p>
     <w:p>
@@ -46082,7 +46082,7 @@
           <w:iCs/>
           <w:i/>
         </w:rPr>
-        <w:t xml:space="preserve">nếu trích dẫn cả hai. Cited P8 §1 Introduction — structural developmental constraints cho Pacific SIDS FIP mechanism.)</w:t>
+        <w:t xml:space="preserve">nếu trích dẫn cả hai. Cited P8 Mục 1 Introduction — structural developmental constraints cho Pacific SIDS FIP mechanism.)</w:t>
       </w:r>
     </w:p>
     <w:p>
@@ -47276,7 +47276,7 @@
         <w:t xml:space="preserve">(pending)</w:t>
       </w:r>
       <w:r>
-        <w:t xml:space="preserve">: Citation trong file 16 §7.3.1 (3)(e) sectoral AI exposure cần verify trên trang BIS Working Papers. Có thể trong reference list của ADB ADO Special Topic April 2026 — NCS cần cross-check.</w:t>
+        <w:t xml:space="preserve">: Citation trong file 16 Mục 7.3.1 (3)(e) sectoral AI exposure cần verify trên trang BIS Working Papers. Có thể trong reference list của ADB ADO Special Topic April 2026 — NCS cần cross-check.</w:t>
       </w:r>
     </w:p>
     <w:p>
@@ -47301,7 +47301,7 @@
         <w:t xml:space="preserve">(pending)</w:t>
       </w:r>
       <w:r>
-        <w:t xml:space="preserve">: Citation trong file 16 §7.3.1 (3)(e) AI-enabling goods exports cần verify với specific publication name (e.g.,</w:t>
+        <w:t xml:space="preserve">: Citation trong file 16 Mục 7.3.1 (3)(e) AI-enabling goods exports cần verify với specific publication name (e.g.,</w:t>
       </w:r>
       <w:r>
         <w:t xml:space="preserve"> </w:t>
@@ -50706,13 +50706,13 @@
     </w:p>
     <w:bookmarkEnd w:id="228"/>
     <w:bookmarkEnd w:id="229"/>
-    <w:bookmarkStart w:id="230" w:name="Xfcfd97cb98ed3f4d1b64063e814942600c7ed0b"/>
+    <w:bookmarkStart w:id="230" w:name="X4ad38a67506c0aa3a2d571e9cd2db0013b86176"/>
     <w:p>
       <w:pPr>
         <w:pStyle w:val="Heading2"/>
       </w:pPr>
       <w:r>
-        <w:t xml:space="preserve">Bổ sung v2.8 — Thao tác hóa FSTS trực tiếp/gián tiếp (Chương 3 §3.3.2, CĐ1 §2.2)</w:t>
+        <w:t xml:space="preserve">Bổ sung v2.8 — Thao tác hóa FSTS trực tiếp/gián tiếp (Chương 3 Mục 3.3.2, CĐ1 Mục 2.2)</w:t>
       </w:r>
     </w:p>
     <w:p>
@@ -50779,13 +50779,13 @@
       </w:r>
     </w:p>
     <w:bookmarkEnd w:id="230"/>
-    <w:bookmarkStart w:id="231" w:name="X0594839b64ebc9cf139e008fd0f7618dc7babbe"/>
+    <w:bookmarkStart w:id="231" w:name="X4810745a8b7558f6ac6877d26fce4f3b946fba5"/>
     <w:p>
       <w:pPr>
         <w:pStyle w:val="Heading2"/>
       </w:pPr>
       <w:r>
-        <w:t xml:space="preserve">Bổ sung v2.9 — Phân biệt cấu trúc số (Chương 2 §2.2.5, Chương 3 §3.3.3)</w:t>
+        <w:t xml:space="preserve">Bổ sung v2.9 — Phân biệt cấu trúc số (Chương 2 Mục 2.2.5, Chương 3 Mục 3.3.3)</w:t>
       </w:r>
     </w:p>
     <w:p>
@@ -51383,7 +51383,7 @@
         <w:pStyle w:val="BodyText"/>
       </w:pPr>
       <w:r>
-        <w:t xml:space="preserve">Phụ lục A bổ sung cho Chương 3 (§3.3) ở cấp độ</w:t>
+        <w:t xml:space="preserve">Phụ lục A bổ sung cho Chương 3 (Mục 3.3) ở cấp độ</w:t>
       </w:r>
       <w:r>
         <w:t xml:space="preserve"> </w:t>
@@ -51405,7 +51405,7 @@
         <w:t xml:space="preserve"> </w:t>
       </w:r>
       <w:r>
-        <w:t xml:space="preserve">trong khi §3.3 nêu nguồn dữ liệu và định nghĩa biến, Phụ lục A tài liệu hóa từng bước</w:t>
+        <w:t xml:space="preserve">trong khi Mục 3.3 nêu nguồn dữ liệu và định nghĩa biến, Phụ lục A tài liệu hóa từng bước</w:t>
       </w:r>
       <w:r>
         <w:t xml:space="preserve"> </w:t>
@@ -52489,7 +52489,7 @@
         <w:rPr>
           <w:rStyle w:val="VerbatimChar"/>
         </w:rPr>
-        <w:t xml:space="preserve">    D --&gt;|"S4 · mã thiếu −9/−8/−7 → khuyết;&lt;br/&gt;kiểm tra miền giá trị"| E["106.765 bản ghi doanh nghiệp–năm"]</w:t>
+        <w:t xml:space="preserve">    D --&gt;|"S4 · mã thiếu −9/−8/−7 thành khuyết;&lt;br/&gt;kiểm tra miền giá trị"| E["106.765 bản ghi doanh nghiệp–năm"]</w:t>
       </w:r>
       <w:r>
         <w:br/>
@@ -52941,7 +52941,7 @@
         <w:t xml:space="preserve">c22b</w:t>
       </w:r>
       <w:r>
-        <w:t xml:space="preserve">; email; thanh toán điện tử), tách biệt theo lập luận thuần khiết cấu trúc (construct purity) ở §2.1.3 và Coltman et al. (2008).</w:t>
+        <w:t xml:space="preserve">; email; thanh toán điện tử), tách biệt theo lập luận thuần khiết cấu trúc (construct purity) ở Mục 2.1.3 và Coltman et al. (2008).</w:t>
       </w:r>
     </w:p>
     <w:p>
@@ -53332,7 +53332,7 @@
         <w:t xml:space="preserve"> </w:t>
       </w:r>
       <w:r>
-        <w:t xml:space="preserve">đại lượng bất biến với đơn vị tiền tệ (xem §4.1.1). Khi cần so sánh</w:t>
+        <w:t xml:space="preserve">đại lượng bất biến với đơn vị tiền tệ (xem Mục 4.1.1). Khi cần so sánh</w:t>
       </w:r>
       <w:r>
         <w:t xml:space="preserve"> </w:t>

</xml_diff>

<commit_message>
style(thesis): standardize Anh–Việt code-mixing in Ch3/Ch4/Ch5
Per the Vietnamese-standard requirement (no mid-sentence English terms), replaced bare
English terms in existing chapter prose with their Vietnamese equivalents, protecting
first-mention '(English)' glosses, math, and code: fixed effects→hiệu ứng cố định,
moderation→điều tiết, pooled→gộp, exporters→doanh nghiệp xuất khẩu, subsamples→mẫu phụ,
situational resource→nguồn lực tình huống, foundational capability→năng lực nền tảng,
digital shield→lá chắn số, selection bias→thiên lệch chọn lựa, institutional voids→
khoảng trống thể chế, absorptive capacity→năng lực hấp thụ, emerging markets→thị trường
mới nổi, temporal stability/heterogeneity, cross-sectional→lát cắt ngang, multicollinearity/
heteroscedasticity/outliers, amplification→khuếch đại, etc. Standard acronyms (TCI, DAI,
FSTS, WBES, OLS, HC1) and statistical notation kept. Section headings updated accordingly.
</commit_message>
<xml_diff>
--- a/dist/luan_an_ctu/LUAN_AN_FULL_vi.docx
+++ b/dist/luan_an_ctu/LUAN_AN_FULL_vi.docx
@@ -5920,7 +5920,7 @@
         </m:r>
       </m:oMath>
       <w:r>
-        <w:t xml:space="preserve">, tính pooled effect size theo random-effects, kiểm định heterogeneity bằng</w:t>
+        <w:t xml:space="preserve">, tính gộp effect size theo random-effects, kiểm định heterogeneity bằng</w:t>
       </w:r>
       <w:r>
         <w:t xml:space="preserve"> </w:t>
@@ -6176,7 +6176,7 @@
         <w:t xml:space="preserve"> </w:t>
       </w:r>
       <w:r>
-        <w:t xml:space="preserve">(88.869 doanh nghiệp trong khung phân tích, 103 cặp nền kinh tế và năm; bao gồm Nhật Bản 2025; pool phân loại ICRV 96.415 doanh nghiệp/52 nhãn nền) (World Bank, n.d., 2019, 2023, 2026). WBES là bộ dữ liệu doanh nghiệp chuẩn hóa, phù hợp cho nghiên cứu so sánh đa quốc gia về firm-level outcomes (Aterido et al., 2011). Quy trình hợp nhất và hài hòa hóa chi tiết các bộ khảo sát quốc gia–năm thành bộ dữ liệu phân tích thống nhất (sáu bước S1–S6, xử lý tính so sánh tiền tệ, chiến lược pooled cross-section với hiệu ứng cố định hai chiều, cùng dòng dữ liệu PRISMA và mã tái lập) được trình bày đầy đủ ở</w:t>
+        <w:t xml:space="preserve">(88.869 doanh nghiệp trong khung phân tích, 103 cặp nền kinh tế và năm; bao gồm Nhật Bản 2025; pool phân loại ICRV 96.415 doanh nghiệp/52 nhãn nền) (World Bank, n.d., 2019, 2023, 2026). WBES là bộ dữ liệu doanh nghiệp chuẩn hóa, phù hợp cho nghiên cứu so sánh đa quốc gia về cấp doanh nghiệp outcomes (Aterido et al., 2011). Quy trình hợp nhất và hài hòa hóa chi tiết các bộ khảo sát quốc gia–năm thành bộ dữ liệu phân tích thống nhất (sáu bước S1–S6, xử lý tính so sánh tiền tệ, chiến lược lát cắt ngang gộp với hiệu ứng cố định hai chiều, cùng dòng dữ liệu PRISMA và mã tái lập) được trình bày đầy đủ ở</w:t>
       </w:r>
       <w:r>
         <w:t xml:space="preserve"> </w:t>
@@ -6204,7 +6204,7 @@
         <w:t xml:space="preserve">Cơ sở kế thừa</w:t>
       </w:r>
       <w:r>
-        <w:t xml:space="preserve">: WBES đã được sử dụng rộng rãi trong nghiên cứu IB về emerging markets (Ayyagari et al., 2011; Cuervo-Cazurra et al., 2018; Chen &amp; Meng, 2022), đồng thời đã được sử dụng trong bài nghiên cứu thực trạng emerging Asia với 17 nền kinh tế và ~40.633 quan sát doanh nghiệp (nghiên cứu thành phần P1).</w:t>
+        <w:t xml:space="preserve">: WBES đã được sử dụng rộng rãi trong nghiên cứu IB về thị trường mới nổi (Ayyagari et al., 2011; Cuervo-Cazurra et al., 2018; Chen &amp; Meng, 2022), đồng thời đã được sử dụng trong bài nghiên cứu thực trạng emerging Asia với 17 nền kinh tế và ~40.633 quan sát doanh nghiệp (nghiên cứu thành phần P1).</w:t>
       </w:r>
     </w:p>
     <w:p>
@@ -6232,7 +6232,7 @@
         <w:t xml:space="preserve">50 nền kinh tế châu Á và Thái Bình Dương</w:t>
       </w:r>
       <w:r>
-        <w:t xml:space="preserve">, với 6 sub-regime ICRV (Advanced innovation-driven, Advanced resource-driven, Upper-middle, Lower-middle transition, Emerging, SIDS). Quy mô này là lớn nhất cho khu vực trong văn liệu internationalization–performance, gồm cả boundary case Pacific SIDS (7 nước, n=959 (mẫu phân tích sau lọc missing)) cho phép kiểm định forced internationalization penalty (nghiên cứu thành phần P8).</w:t>
+        <w:t xml:space="preserve">, với 6 sub-regime ICRV (Advanced innovation-driven, Advanced resource-driven, Upper-middle, Lower-middle transition, Emerging, SIDS). Quy mô này là lớn nhất cho khu vực trong văn liệu internationalization–performance, gồm cả trường hợp biên Pacific SIDS (7 nước, n=959 (mẫu phân tích sau lọc missing)) cho phép kiểm định forced internationalization penalty (nghiên cứu thành phần P8).</w:t>
       </w:r>
     </w:p>
     <w:p>
@@ -6266,7 +6266,7 @@
         <w:t xml:space="preserve"> </w:t>
       </w:r>
       <w:r>
-        <w:t xml:space="preserve">trong ước lượng mô hình hồi quy vì ba lý do: (1) Mục tiêu của luận án là kiểm định cơ chế lý thuyết (mechanism testing) chứ không phải ước lượng mô tả đại diện tổng thể (population-representative descriptive estimation), trong bối cảnh này, không áp dụng weights là thực hành chuẩn trong văn liệu IB sử dụng WBES (Aterido et al., 2011; Cuervo-Cazurra et al., 2018); (2) Fixed effects ở cấp country-year đã kiểm soát đặc điểm cấu trúc của từng sóng khảo sát; (3) Việc áp dụng weights có thể làm sai lệch ước lượng khi mẫu được gộp chung từ nhiều quốc gia có quy mô tổng thể doanh nghiệp khác nhau nhiều bậc (ví dụ: Trung Quốc ~100 triệu so với Tonga ~500 doanh nghiệp). Phân tích độ nhạy có áp dụng survey weights cho từng quốc gia riêng lẻ (P3/P4/P5) không thay đổi hướng hoặc mức độ ý nghĩa của các hệ số chính (xem Mục 3.5).</w:t>
+        <w:t xml:space="preserve">trong ước lượng mô hình hồi quy vì ba lý do: (1) Mục tiêu của luận án là kiểm định cơ chế lý thuyết (mechanism testing) chứ không phải ước lượng mô tả đại diện tổng thể (population-representative descriptive estimation), trong bối cảnh này, không áp dụng weights là thực hành chuẩn trong văn liệu IB sử dụng WBES (Aterido et al., 2011; Cuervo-Cazurra et al., 2018); (2) hiệu ứng cố định ở cấp country-year đã kiểm soát đặc điểm cấu trúc của từng sóng khảo sát; (3) Việc áp dụng weights có thể làm sai lệch ước lượng khi mẫu được gộp chung từ nhiều quốc gia có quy mô tổng thể doanh nghiệp khác nhau nhiều bậc (ví dụ: Trung Quốc ~100 triệu so với Tonga ~500 doanh nghiệp). Phân tích độ nhạy có áp dụng survey weights cho từng quốc gia riêng lẻ (P3/P4/P5) không thay đổi hướng hoặc mức độ ý nghĩa của các hệ số chính (xem Mục 3.5).</w:t>
       </w:r>
     </w:p>
     <w:bookmarkEnd w:id="88"/>
@@ -7280,7 +7280,7 @@
         <w:t xml:space="preserve">“</w:t>
       </w:r>
       <w:r>
-        <w:t xml:space="preserve">digital shield effect</w:t>
+        <w:t xml:space="preserve">lá chắn số effect</w:t>
       </w:r>
       <w:r>
         <w:t xml:space="preserve">”</w:t>
@@ -7360,7 +7360,7 @@
         <w:t xml:space="preserve">Cơ sở kế thừa</w:t>
       </w:r>
       <w:r>
-        <w:t xml:space="preserve">: Khanna và Palepu (2010) với institutional voids; North (1990) với institutional analysis; Marano et al. (2016) với meta-analytic evidence về institutional các biến điều tiết.</w:t>
+        <w:t xml:space="preserve">: Khanna và Palepu (2010) với khoảng trống thể chế; North (1990) với institutional analysis; Marano et al. (2016) với meta-analytic evidence về institutional các biến điều tiết.</w:t>
       </w:r>
     </w:p>
     <w:bookmarkEnd w:id="95"/>
@@ -7471,7 +7471,7 @@
         <w:t xml:space="preserve"> </w:t>
       </w:r>
       <w:r>
-        <w:t xml:space="preserve">employment, firm age, foreign ownership dummy, sector dummy, country fixed effects, year fixed effects.</w:t>
+        <w:t xml:space="preserve">employment, firm age, foreign ownership dummy, sector dummy, country hiệu ứng cố định, year hiệu ứng cố định.</w:t>
       </w:r>
     </w:p>
     <w:p>
@@ -7679,7 +7679,7 @@
         </m:r>
       </m:oMath>
       <w:r>
-        <w:t xml:space="preserve">. Pooled effect size tính theo inverse-variance weighting (Borenstein et al., 2009).</w:t>
+        <w:t xml:space="preserve">. gộp effect size tính theo inverse-variance weighting (Borenstein et al., 2009).</w:t>
       </w:r>
     </w:p>
     <w:p>
@@ -8661,13 +8661,13 @@
       </w:r>
     </w:p>
     <w:bookmarkEnd w:id="104"/>
-    <w:bookmarkStart w:id="107" w:name="mô-hình-moderation-h2h6"/>
+    <w:bookmarkStart w:id="107" w:name="mô-hình-điều-tiết-h2h6"/>
     <w:p>
       <w:pPr>
         <w:pStyle w:val="Heading3"/>
       </w:pPr>
       <w:r>
-        <w:t xml:space="preserve">3.4.4 Mô hình moderation (H2–H6)</w:t>
+        <w:t xml:space="preserve">3.4.4 Mô hình điều tiết (H2–H6)</w:t>
       </w:r>
     </w:p>
     <w:bookmarkStart w:id="105" w:name="two-way-interaction-h2-h3"/>
@@ -9438,7 +9438,7 @@
         <w:t xml:space="preserve">Cơ sở kế thừa</w:t>
       </w:r>
       <w:r>
-        <w:t xml:space="preserve">: chuẩn moderation trong quản trị chiến lược (Aiken &amp; West, 1991; Dawson, 2014).</w:t>
+        <w:t xml:space="preserve">: chuẩn điều tiết trong quản trị chiến lược (Aiken &amp; West, 1991; Dawson, 2014).</w:t>
       </w:r>
     </w:p>
     <w:p>
@@ -9453,18 +9453,18 @@
         <w:t xml:space="preserve">Đóng góp mới</w:t>
       </w:r>
       <w:r>
-        <w:t xml:space="preserve">: three-way moderation digital × institutional × manager trong bối cảnh châu Á và Pacific với 50 nước chưa được kiểm định trước đây.</w:t>
+        <w:t xml:space="preserve">: three-way điều tiết digital × institutional × manager trong bối cảnh châu Á và Pacific với 50 nước chưa được kiểm định trước đây.</w:t>
       </w:r>
     </w:p>
     <w:bookmarkEnd w:id="106"/>
     <w:bookmarkEnd w:id="107"/>
-    <w:bookmarkStart w:id="108" w:name="mô-hình-temporal-heterogeneity-h6"/>
+    <w:bookmarkStart w:id="108" w:name="mô-hình-dị-biệt-theo-thời-gian-h6"/>
     <w:p>
       <w:pPr>
         <w:pStyle w:val="Heading3"/>
       </w:pPr>
       <w:r>
-        <w:t xml:space="preserve">3.4.5 Mô hình temporal heterogeneity (H6)</w:t>
+        <w:t xml:space="preserve">3.4.5 Mô hình dị biệt theo thời gian (H6)</w:t>
       </w:r>
     </w:p>
     <w:p>
@@ -10158,7 +10158,7 @@
         <w:pStyle w:val="FirstParagraph"/>
       </w:pPr>
       <w:r>
-        <w:t xml:space="preserve">Nghiên cứu 3 sử dụng chuỗi mô hình lồng nhau M0–M8 ước lượng riêng theo từng sóng khảo sát (2009, 2015, 2023) và gộp pooled. Ký hiệu tiếng Việt:</w:t>
+        <w:t xml:space="preserve">Nghiên cứu 3 sử dụng chuỗi mô hình lồng nhau M0–M8 ước lượng riêng theo từng sóng khảo sát (2009, 2015, 2023) và gộp gộp. Ký hiệu tiếng Việt:</w:t>
       </w:r>
     </w:p>
     <w:p>
@@ -13437,7 +13437,7 @@
           <w:iCs/>
           <w:i/>
         </w:rPr>
-        <w:t xml:space="preserve">chỉ áp dụng trong mô hình pooled. Mô hình được ước lượng riêng cho 3 sóng và gộp (N = 989 / 956 / 1.013 / 2.958).</w:t>
+        <w:t xml:space="preserve">chỉ áp dụng trong mô hình gộp. Mô hình được ước lượng riêng cho 3 sóng và gộp (N = 989 / 956 / 1.013 / 2.958).</w:t>
       </w:r>
     </w:p>
     <w:p>
@@ -14271,7 +14271,7 @@
         <w:t xml:space="preserve">δ_s</w:t>
       </w:r>
       <w:r>
-        <w:t xml:space="preserve">: sector fixed effects (ISIC 1-chữ số)</w:t>
+        <w:t xml:space="preserve">: sector hiệu ứng cố định (ISIC 1-chữ số)</w:t>
       </w:r>
     </w:p>
     <w:p>
@@ -15203,7 +15203,7 @@
         <w:t xml:space="preserve">δ_s</w:t>
       </w:r>
       <w:r>
-        <w:t xml:space="preserve">: sector fixed effects;</w:t>
+        <w:t xml:space="preserve">: sector hiệu ứng cố định;</w:t>
       </w:r>
       <w:r>
         <w:t xml:space="preserve"> </w:t>
@@ -15216,7 +15216,7 @@
         <w:t xml:space="preserve">λ_t</w:t>
       </w:r>
       <w:r>
-        <w:t xml:space="preserve">: wave fixed effects (pooled)</w:t>
+        <w:t xml:space="preserve">: wave hiệu ứng cố định (pooled)</w:t>
       </w:r>
     </w:p>
     <w:p>
@@ -16302,7 +16302,7 @@
         <w:t xml:space="preserve">δ_ct</w:t>
       </w:r>
       <w:r>
-        <w:t xml:space="preserve">: country × year fixed effects (M5)</w:t>
+        <w:t xml:space="preserve">: country × year hiệu ứng cố định (M5)</w:t>
       </w:r>
     </w:p>
     <w:p>
@@ -20967,7 +20967,7 @@
               <w:jc w:val="left"/>
             </w:pPr>
             <w:r>
-              <w:t xml:space="preserve">Fixed effects</w:t>
+              <w:t xml:space="preserve">hiệu ứng cố định</w:t>
             </w:r>
           </w:p>
         </w:tc>
@@ -21603,7 +21603,7 @@
               <w:jc w:val="left"/>
             </w:pPr>
             <w:r>
-              <w:t xml:space="preserve">Country fixed effects</w:t>
+              <w:t xml:space="preserve">Country hiệu ứng cố định</w:t>
             </w:r>
           </w:p>
         </w:tc>
@@ -21653,7 +21653,7 @@
               <w:jc w:val="left"/>
             </w:pPr>
             <w:r>
-              <w:t xml:space="preserve">Wave fixed effects</w:t>
+              <w:t xml:space="preserve">Wave hiệu ứng cố định</w:t>
             </w:r>
           </w:p>
         </w:tc>
@@ -23471,7 +23471,7 @@
               <w:jc w:val="left"/>
             </w:pPr>
             <w:r>
-              <w:t xml:space="preserve">Exporters-only (N = 26)</w:t>
+              <w:t xml:space="preserve">chỉ doanh nghiệp xuất khẩu (N = 26)</w:t>
             </w:r>
           </w:p>
         </w:tc>
@@ -23522,7 +23522,7 @@
           <w:iCs/>
           <w:i/>
         </w:rPr>
-        <w:t xml:space="preserve">Hệ số âm nhất quán về dấu qua các specification; suy luận FIP dựa chủ yếu vào các mô hình fixed-effects (M1, year-FE), trong khi exporters-only (N=26) thiếu công suất thống kê.</w:t>
+        <w:t xml:space="preserve">Hệ số âm nhất quán về dấu qua các specification; suy luận FIP dựa chủ yếu vào các mô hình fixed-effects (M1, year-FE), trong khi chỉ doanh nghiệp xuất khẩu (N=26) thiếu công suất thống kê.</w:t>
       </w:r>
     </w:p>
     <w:p>
@@ -24048,7 +24048,7 @@
               <w:jc w:val="left"/>
             </w:pPr>
             <w:r>
-              <w:t xml:space="preserve">Fixed effects</w:t>
+              <w:t xml:space="preserve">hiệu ứng cố định</w:t>
             </w:r>
           </w:p>
         </w:tc>
@@ -24098,7 +24098,7 @@
               <w:jc w:val="left"/>
             </w:pPr>
             <w:r>
-              <w:t xml:space="preserve">Fixed effects</w:t>
+              <w:t xml:space="preserve">hiệu ứng cố định</w:t>
             </w:r>
           </w:p>
         </w:tc>
@@ -24293,7 +24293,7 @@
         <w:pStyle w:val="FirstParagraph"/>
       </w:pPr>
       <w:r>
-        <w:t xml:space="preserve">Tất cả các mô hình đều sử dụng HC1/HC3 robust standard errors (Long &amp; Ervin, 2000; White, 1980) để xử lý heteroscedasticity. Đối với multi-country, bổ sung clustered SE theo country.</w:t>
+        <w:t xml:space="preserve">Tất cả các mô hình đều sử dụng HC1/HC3 robust standard errors (Long &amp; Ervin, 2000; White, 1980) để xử lý phương sai thay đổi. Đối với multi-country, bổ sung clustered SE theo country.</w:t>
       </w:r>
     </w:p>
     <w:bookmarkEnd w:id="116"/>
@@ -24426,17 +24426,17 @@
         <w:pStyle w:val="FirstParagraph"/>
       </w:pPr>
       <w:r>
-        <w:t xml:space="preserve">Loại trừ micro firms (&lt;5 lao động); chỉ giữ SMEs; chỉ giữ manufacturing; chỉ giữ exporters (FSTS &gt; 0); subgroup theo 6 sub-regime ICRV.</w:t>
+        <w:t xml:space="preserve">Loại trừ micro firms (&lt;5 lao động); chỉ giữ SMEs; chỉ giữ manufacturing; chỉ giữ doanh nghiệp xuất khẩu (FSTS &gt; 0); subgroup theo 6 sub-regime ICRV.</w:t>
       </w:r>
     </w:p>
     <w:bookmarkEnd w:id="120"/>
-    <w:bookmarkStart w:id="121" w:name="outliers"/>
+    <w:bookmarkStart w:id="121" w:name="giá-trị-ngoại-lai"/>
     <w:p>
       <w:pPr>
         <w:pStyle w:val="Heading3"/>
       </w:pPr>
       <w:r>
-        <w:t xml:space="preserve">3.5.3 Outliers</w:t>
+        <w:t xml:space="preserve">3.5.3 Giá trị ngoại lai</w:t>
       </w:r>
     </w:p>
     <w:p>
@@ -24448,13 +24448,13 @@
       </w:r>
     </w:p>
     <w:bookmarkEnd w:id="121"/>
-    <w:bookmarkStart w:id="122" w:name="multicollinearity-và-heteroscedasticity"/>
+    <w:bookmarkStart w:id="122" w:name="đa-cộng-tuyến-và-phương-sai-thay-đổi"/>
     <w:p>
       <w:pPr>
         <w:pStyle w:val="Heading3"/>
       </w:pPr>
       <w:r>
-        <w:t xml:space="preserve">3.5.4 Multicollinearity và heteroscedasticity</w:t>
+        <w:t xml:space="preserve">3.5.4 Đa cộng tuyến và phương sai thay đổi</w:t>
       </w:r>
     </w:p>
     <w:p>
@@ -24482,13 +24482,13 @@
       </w:r>
     </w:p>
     <w:bookmarkEnd w:id="122"/>
-    <w:bookmarkStart w:id="123" w:name="sensitivity-analysis-cho-meta-analysis"/>
+    <w:bookmarkStart w:id="123" w:name="phân-tích-độ-nhạy-cho-meta-analysis"/>
     <w:p>
       <w:pPr>
         <w:pStyle w:val="Heading3"/>
       </w:pPr>
       <w:r>
-        <w:t xml:space="preserve">3.5.5 Sensitivity analysis cho meta-analysis</w:t>
+        <w:t xml:space="preserve">3.5.5 phân tích độ nhạy cho meta-analysis</w:t>
       </w:r>
     </w:p>
     <w:p>
@@ -24500,7 +24500,7 @@
         <w:pStyle w:val="Compact"/>
       </w:pPr>
       <w:r>
-        <w:t xml:space="preserve">Leave-one-out: loại từng nghiên cứu và tái tính pooled effect.</w:t>
+        <w:t xml:space="preserve">Leave-one-out: loại từng nghiên cứu và tái tính gộp effect.</w:t>
       </w:r>
     </w:p>
     <w:p>
@@ -24926,7 +24926,7 @@
               <w:jc w:val="left"/>
             </w:pPr>
             <w:r>
-              <w:t xml:space="preserve">Đưa vào cùng three-way moderation framework</w:t>
+              <w:t xml:space="preserve">Đưa vào cùng three-way điều tiết framework</w:t>
             </w:r>
           </w:p>
         </w:tc>
@@ -24964,7 +24964,7 @@
               <w:jc w:val="left"/>
             </w:pPr>
             <w:r>
-              <w:t xml:space="preserve">Non-overlapping construct purity protocol cho WBES; digital shield mở rộng (nghiên cứu thành phần P1)</w:t>
+              <w:t xml:space="preserve">Non-overlapping construct purity protocol cho WBES; lá chắn số mở rộng (nghiên cứu thành phần P1)</w:t>
             </w:r>
           </w:p>
         </w:tc>
@@ -25016,7 +25016,7 @@
               <w:jc w:val="left"/>
             </w:pPr>
             <w:r>
-              <w:t xml:space="preserve">Three-way moderation</w:t>
+              <w:t xml:space="preserve">Three-way điều tiết</w:t>
             </w:r>
           </w:p>
         </w:tc>
@@ -25054,7 +25054,7 @@
               <w:jc w:val="left"/>
             </w:pPr>
             <w:r>
-              <w:t xml:space="preserve">Temporal heterogeneity</w:t>
+              <w:t xml:space="preserve">dị biệt theo thời gian</w:t>
             </w:r>
           </w:p>
         </w:tc>
@@ -26970,7 +26970,7 @@
         <w:t xml:space="preserve">“</w:t>
       </w:r>
       <w:r>
-        <w:t xml:space="preserve">institutional voids</w:t>
+        <w:t xml:space="preserve">khoảng trống thể chế</w:t>
       </w:r>
       <w:r>
         <w:t xml:space="preserve">”</w:t>
@@ -28121,13 +28121,13 @@
       </w:r>
     </w:p>
     <w:bookmarkEnd w:id="140"/>
-    <w:bookmarkStart w:id="141" w:name="X0fe7021f65141f72ccca43dd2595712a4bb11b5"/>
+    <w:bookmarkStart w:id="141" w:name="Xe94b529119c3fd3938f18203d533a55edb6dd3b"/>
     <w:p>
       <w:pPr>
         <w:pStyle w:val="Heading3"/>
       </w:pPr>
       <w:r>
-        <w:t xml:space="preserve">4.2.3 Điều tiết bởi chế độ thể chế: ICRV moderation</w:t>
+        <w:t xml:space="preserve">4.2.3 Điều tiết bởi chế độ thể chế: ICRV điều tiết</w:t>
       </w:r>
     </w:p>
     <w:p>
@@ -28777,7 +28777,7 @@
         </m:r>
       </m:oMath>
       <w:r>
-        <w:t xml:space="preserve">): pooled effect thực</w:t>
+        <w:t xml:space="preserve">): gộp effect thực</w:t>
       </w:r>
       <w:r>
         <w:t xml:space="preserve"> </w:t>
@@ -31696,7 +31696,7 @@
           <w:bCs/>
           <w:b/>
         </w:rPr>
-        <w:t xml:space="preserve">Pooled (toàn mẫu)</w:t>
+        <w:t xml:space="preserve">gộp (toàn mẫu)</w:t>
       </w:r>
       <w:r>
         <w:t xml:space="preserve">: TP = 48,78% FSTS</w:t>
@@ -31711,13 +31711,13 @@
       </w:r>
     </w:p>
     <w:bookmarkEnd w:id="152"/>
-    <w:bookmarkStart w:id="153" w:name="Xe662776ac4ed20d7263c0278e37e5e670eb65fc"/>
+    <w:bookmarkStart w:id="153" w:name="X28c1d9c57eb0f73d2f6207fea4a34aaa44333b8"/>
     <w:p>
       <w:pPr>
         <w:pStyle w:val="Heading3"/>
       </w:pPr>
       <w:r>
-        <w:t xml:space="preserve">4.4.2 Kiểm định tính ổn định theo thời gian: Temporal Stability</w:t>
+        <w:t xml:space="preserve">4.4.2 Kiểm định tính ổn định theo thời gian: tính ổn định theo thời gian</w:t>
       </w:r>
     </w:p>
     <w:p>
@@ -32011,7 +32011,7 @@
         </m:r>
       </m:oMath>
       <w:r>
-        <w:t xml:space="preserve">), cho thấy Technological Capability Index không phát huy vai trò điều tiết đáng kể ở bối cảnh Trung Quốc theo mô hình P5. Tương tự, DAI cũng không cho thấy điều tiết có ý nghĩa trong bối cảnh này. Kết quả null về moderation tại Trung Quốc có thể phản ánh thực tế rằng năng lực công nghệ đã được phân phối tương đối đồng đều hơn trong mẫu doanh nghiệp xuất khẩu Trung Quốc, làm giảm phương sai đủ để phát hiện hiệu ứng điều tiết.</w:t>
+        <w:t xml:space="preserve">), cho thấy Technological Capability Index không phát huy vai trò điều tiết đáng kể ở bối cảnh Trung Quốc theo mô hình P5. Tương tự, DAI cũng không cho thấy điều tiết có ý nghĩa trong bối cảnh này. Kết quả null về điều tiết tại Trung Quốc có thể phản ánh thực tế rằng năng lực công nghệ đã được phân phối tương đối đồng đều hơn trong mẫu doanh nghiệp xuất khẩu Trung Quốc, làm giảm phương sai đủ để phát hiện hiệu ứng điều tiết.</w:t>
       </w:r>
     </w:p>
     <w:bookmarkEnd w:id="154"/>
@@ -35282,7 +35282,7 @@
         <w:pStyle w:val="FirstParagraph"/>
       </w:pPr>
       <w:r>
-        <w:t xml:space="preserve">Điểm uốn được ước lượng riêng cho từng làn sóng và cho pooled:</w:t>
+        <w:t xml:space="preserve">Điểm uốn được ước lượng riêng cho từng làn sóng và cho gộp:</w:t>
       </w:r>
     </w:p>
     <w:tbl>
@@ -35412,7 +35412,7 @@
               <w:jc w:val="left"/>
             </w:pPr>
             <w:r>
-              <w:t xml:space="preserve">Pooled</w:t>
+              <w:t xml:space="preserve">gộp</w:t>
             </w:r>
           </w:p>
         </w:tc>
@@ -40986,7 +40986,7 @@
         <w:pStyle w:val="FirstParagraph"/>
       </w:pPr>
       <w:r>
-        <w:t xml:space="preserve">Đây là phát hiện nổi bật nhất và khác biệt nhất của luận án so với toàn bộ kết quả từ các bối cảnh ICRV khác. Mô hình M1 với country fixed effects và year fixed effects cho:</w:t>
+        <w:t xml:space="preserve">Đây là phát hiện nổi bật nhất và khác biệt nhất của luận án so với toàn bộ kết quả từ các bối cảnh ICRV khác. Mô hình M1 với country hiệu ứng cố định và year hiệu ứng cố định cho:</w:t>
       </w:r>
     </w:p>
     <w:p>
@@ -51405,7 +51405,7 @@
               <w:t xml:space="preserve"> </w:t>
             </w:r>
             <w:r>
-              <w:t xml:space="preserve">(year-FE); exporters-only NS do mẫu nhỏ (N=26)</w:t>
+              <w:t xml:space="preserve">(year-FE); chỉ doanh nghiệp xuất khẩu NS do mẫu nhỏ (N=26)</w:t>
             </w:r>
           </w:p>
         </w:tc>
@@ -51780,7 +51780,7 @@
           <w:iCs/>
           <w:i/>
         </w:rPr>
-        <w:t xml:space="preserve">Winning in emerging markets: A road map for strategy and execution</w:t>
+        <w:t xml:space="preserve">Winning in thị trường mới nổi: A road map for strategy and execution</w:t>
       </w:r>
       <w:r>
         <w:t xml:space="preserve">. Harvard Business Press.</w:t>
@@ -52331,7 +52331,7 @@
         <w:pStyle w:val="BodyText"/>
       </w:pPr>
       <w:r>
-        <w:t xml:space="preserve">Cơ chế lý thuyết đằng sau kết quả này bắt nguồn từ Resource-Based View (Barney, 1991): TCI là nguồn lực VRIN (có giá trị, hiếm, khó sao chép, khó thay thế), do đó tạo ra lợi thế cạnh tranh bền vững ngay cả khi doanh nghiệp mở rộng ra thị trường nước ngoài với mức độ bất định cao. Năng lực công nghệ cũng tạo ra absorptive capacity (Cohen &amp; Levinthal, 1990), khả năng hấp thu và tích hợp tri thức từ thị trường nước ngoài, giúp doanh nghiệp học hỏi hiệu quả hơn trong quá trình quốc tế hóa, nhất quán với learning loop của Uppsala model (Johanson &amp; Vahlne, 1977).</w:t>
+        <w:t xml:space="preserve">Cơ chế lý thuyết đằng sau kết quả này bắt nguồn từ Resource-Based View (Barney, 1991): TCI là nguồn lực VRIN (có giá trị, hiếm, khó sao chép, khó thay thế), do đó tạo ra lợi thế cạnh tranh bền vững ngay cả khi doanh nghiệp mở rộng ra thị trường nước ngoài với mức độ bất định cao. Năng lực công nghệ cũng tạo ra năng lực hấp thụ (Cohen &amp; Levinthal, 1990), khả năng hấp thu và tích hợp tri thức từ thị trường nước ngoài, giúp doanh nghiệp học hỏi hiệu quả hơn trong quá trình quốc tế hóa, nhất quán với learning loop của Uppsala model (Johanson &amp; Vahlne, 1977).</w:t>
       </w:r>
     </w:p>
     <w:bookmarkEnd w:id="197"/>
@@ -52616,7 +52616,7 @@
         </m:r>
       </m:oMath>
       <w:r>
-        <w:t xml:space="preserve">), nghĩa là hiệu ứng uốn đường cong của DAI không phổ quát mà tập trung ở các bối cảnh đặc thù. Tại Singapore (P4, DAI Tier-1+2), DAI phát huy rõ nhất dưới dạng amplification effect (</w:t>
+        <w:t xml:space="preserve">), nghĩa là hiệu ứng uốn đường cong của DAI không phổ quát mà tập trung ở các bối cảnh đặc thù. Tại Singapore (P4, DAI Tier-1+2), DAI phát huy rõ nhất dưới dạng hiệu ứng khuếch đại (</w:t>
       </w:r>
       <m:oMath>
         <m:acc>
@@ -52720,7 +52720,7 @@
         </m:r>
       </m:oMath>
       <w:r>
-        <w:t xml:space="preserve">). Tại Việt Nam (P3, Tier-1 only, IV-estimated), DAI null phản ánh hạn chế đo lường và selection bias hơn là bác bỏ H3.</w:t>
+        <w:t xml:space="preserve">). Tại Việt Nam (P3, Tier-1 only, IV-estimated), DAI null phản ánh hạn chế đo lường và thiên lệch chọn lựa hơn là bác bỏ H3.</w:t>
       </w:r>
     </w:p>
     <w:p>
@@ -52802,7 +52802,7 @@
         <w:t xml:space="preserve"> </w:t>
       </w:r>
       <w:r>
-        <w:t xml:space="preserve">theo nghĩa của dynamic capabilities theory (Teece et al., 1997) vì dữ liệu WBES không có đủ thang đo để đo lường tính động của năng lực số.</w:t>
+        <w:t xml:space="preserve">theo nghĩa của năng lực động theory (Teece et al., 1997) vì dữ liệu WBES không có đủ thang đo để đo lường tính động của năng lực số.</w:t>
       </w:r>
     </w:p>
     <w:p>
@@ -52974,7 +52974,7 @@
         <w:pStyle w:val="BodyText"/>
       </w:pPr>
       <w:r>
-        <w:t xml:space="preserve">Tuy nhiên, cần lưu ý rằng tác động này được phát hiện ở cấp pooled toàn mẫu (P7) và cần kiểm định riêng biệt theo từng bối cảnh ICRV để hiểu đầy đủ điều kiện biên của biến điều tiết cấp quản trị. Kết quả null về kinh nghiệm nhà quản trị (mgr_experience) gợi ý rằng trong bối cảnh châu Á đa dạng, số năm kinh nghiệm đơn thuần không nắm bắt được</w:t>
+        <w:t xml:space="preserve">Tuy nhiên, cần lưu ý rằng tác động này được phát hiện ở cấp gộp toàn mẫu (P7) và cần kiểm định riêng biệt theo từng bối cảnh ICRV để hiểu đầy đủ điều kiện biên của biến điều tiết cấp quản trị. Kết quả null về kinh nghiệm nhà quản trị (mgr_experience) gợi ý rằng trong bối cảnh châu Á đa dạng, số năm kinh nghiệm đơn thuần không nắm bắt được</w:t>
       </w:r>
       <w:r>
         <w:t xml:space="preserve"> </w:t>
@@ -53266,7 +53266,7 @@
         <w:pStyle w:val="FirstParagraph"/>
       </w:pPr>
       <w:r>
-        <w:t xml:space="preserve">Kết quả pooled effect</w:t>
+        <w:t xml:space="preserve">Kết quả gộp effect</w:t>
       </w:r>
       <w:r>
         <w:t xml:space="preserve"> </w:t>
@@ -53373,7 +53373,7 @@
         </m:r>
       </m:oMath>
       <w:r>
-        <w:t xml:space="preserve">, đồng thời áp dụng cấu trúc ba tầng phức tạp hơn. Tính vững của pooled effect khi mở rộng pool nghiên cứu là bằng chứng về tính ổn định của baseline ước lượng.</w:t>
+        <w:t xml:space="preserve">, đồng thời áp dụng cấu trúc ba tầng phức tạp hơn. Tính vững của gộp effect khi mở rộng pool nghiên cứu là bằng chứng về tính ổn định của baseline ước lượng.</w:t>
       </w:r>
     </w:p>
     <w:p>
@@ -53381,7 +53381,7 @@
         <w:pStyle w:val="BodyText"/>
       </w:pPr>
       <w:r>
-        <w:t xml:space="preserve">Tuy nhiên, đóng góp của P6 so với baseline không phải ở pooled</w:t>
+        <w:t xml:space="preserve">Tuy nhiên, đóng góp của P6 so với baseline không phải ở gộp</w:t>
       </w:r>
       <w:r>
         <w:t xml:space="preserve"> </w:t>
@@ -53684,7 +53684,7 @@
         <w:t xml:space="preserve"> </w:t>
       </w:r>
       <w:r>
-        <w:t xml:space="preserve">(các tương tác đường cong cùng chiều nhưng không ý nghĩa toàn mẫu; bằng chứng rõ nhất ở bối cảnh đơn quốc gia P4) gợi ý rằng DAI không phải là foundational capability (như TCI) mà là</w:t>
+        <w:t xml:space="preserve">(các tương tác đường cong cùng chiều nhưng không ý nghĩa toàn mẫu; bằng chứng rõ nhất ở bối cảnh đơn quốc gia P4) gợi ý rằng DAI không phải là năng lực nền tảng (như TCI) mà là</w:t>
       </w:r>
       <w:r>
         <w:t xml:space="preserve"> </w:t>
@@ -53694,7 +53694,7 @@
           <w:bCs/>
           <w:b/>
         </w:rPr>
-        <w:t xml:space="preserve">situational resource</w:t>
+        <w:t xml:space="preserve">nguồn lực tình huống</w:t>
       </w:r>
       <w:r>
         <w:t xml:space="preserve">, tài nguyên có vai trò thay đổi theo bối cảnh thể chế. Quan trọng: tương tác chế độ-yếu (FSTS×Weak = −0,523, p = ,087, biên ý nghĩa) cho thấy hiệu ứng điều tiết của DAI</w:t>
@@ -53722,7 +53722,7 @@
         <w:t xml:space="preserve">“</w:t>
       </w:r>
       <w:r>
-        <w:t xml:space="preserve">digital shield</w:t>
+        <w:t xml:space="preserve">lá chắn số</w:t>
       </w:r>
       <w:r>
         <w:t xml:space="preserve">”</w:t>
@@ -53749,7 +53749,7 @@
           <w:bCs/>
           <w:b/>
         </w:rPr>
-        <w:t xml:space="preserve">complementary asset</w:t>
+        <w:t xml:space="preserve">tài sản bổ trợ</w:t>
       </w:r>
       <w:r>
         <w:t xml:space="preserve"> </w:t>
@@ -54449,17 +54449,17 @@
         <w:t xml:space="preserve"> </w:t>
       </w:r>
       <w:r>
-        <w:t xml:space="preserve">của việc cập nhật và tái cấu hình năng lực số theo thời gian. Điều này có nghĩa là các phát hiện về DAI trong luận án phản ánh mức độ chấp nhận số tại một thời điểm chứ không phải năng lực số năng động theo nghĩa của dynamic capabilities theory (Teece et al., 1997).</w:t>
+        <w:t xml:space="preserve">của việc cập nhật và tái cấu hình năng lực số theo thời gian. Điều này có nghĩa là các phát hiện về DAI trong luận án phản ánh mức độ chấp nhận số tại một thời điểm chứ không phải năng lực số năng động theo nghĩa của năng lực động theory (Teece et al., 1997).</w:t>
       </w:r>
     </w:p>
     <w:bookmarkEnd w:id="220"/>
-    <w:bookmarkStart w:id="221" w:name="X0fb0169567c230dc5c1d35515099b26124d99e1"/>
+    <w:bookmarkStart w:id="221" w:name="Xa9f4dc0d92bb938d40b6358e6a43bf594a5cc9a"/>
     <w:p>
       <w:pPr>
         <w:pStyle w:val="Heading3"/>
       </w:pPr>
       <w:r>
-        <w:t xml:space="preserve">5.5.2 Hạn chế về selection bias trong exporters subsamples</w:t>
+        <w:t xml:space="preserve">5.5.2 Hạn chế về thiên lệch chọn lựa trong mẫu phụ doanh nghiệp xuất khẩu</w:t>
       </w:r>
     </w:p>
     <w:p>
@@ -54467,7 +54467,7 @@
         <w:pStyle w:val="FirstParagraph"/>
       </w:pPr>
       <w:r>
-        <w:t xml:space="preserve">Các phân tích sử dụng mẫu chỉ gồm doanh nghiệp xuất khẩu (ví dụ: Singapore mẫu phụ xuất khẩu N = 84, SIDS exporters-only N = 26) đối mặt với rủi ro selection bias nghiêm trọng: doanh nghiệp xuất khẩu không phải là mẫu ngẫu nhiên từ tổng thể doanh nghiệp mà có khả năng là các doanh nghiệp đã có một số lợi thế ban đầu (productivity, resources, connections). Kết quả từ exporters-only không thể tổng quát hóa trực tiếp cho toàn bộ doanh nghiệp, và có thể understate hoặc overstate các hiệu ứng tùy thuộc vào phương hướng của selection.</w:t>
+        <w:t xml:space="preserve">Các phân tích sử dụng mẫu chỉ gồm doanh nghiệp xuất khẩu (ví dụ: Singapore mẫu phụ xuất khẩu N = 84, SIDS exporters-only N = 26) đối mặt với rủi ro thiên lệch chọn lựa nghiêm trọng: doanh nghiệp xuất khẩu không phải là mẫu ngẫu nhiên từ tổng thể doanh nghiệp mà có khả năng là các doanh nghiệp đã có một số lợi thế ban đầu (productivity, resources, connections). Kết quả từ chỉ doanh nghiệp xuất khẩu không thể tổng quát hóa trực tiếp cho toàn bộ doanh nghiệp, và có thể understate hoặc overstate các hiệu ứng tùy thuộc vào phương hướng của selection.</w:t>
       </w:r>
     </w:p>
     <w:p>
@@ -54493,7 +54493,7 @@
         <w:pStyle w:val="FirstParagraph"/>
       </w:pPr>
       <w:r>
-        <w:t xml:space="preserve">Thiết kế cross-sectional (hoặc pooled panel nhưng với WBES không phải là panel thực sự cho cùng doanh nghiệp qua thời gian) giới hạn khả năng suy luận nhân quả. Quan hệ I–P có thể bị ảnh hưởng bởi reverse causality: doanh nghiệp hiệu quả hơn có thể có nhiều nguồn lực để quốc tế hóa hơn, tạo ra chiều nhân quả ngược lại. Country fixed effects và year fixed effects giúp kiểm soát một phần, nhưng không giải quyết hoàn toàn vấn đề endogeneity.</w:t>
+        <w:t xml:space="preserve">Thiết kế lát cắt ngang (hoặc dữ liệu bảng gộp nhưng với WBES không phải là panel thực sự cho cùng doanh nghiệp qua thời gian) giới hạn khả năng suy luận nhân quả. Quan hệ I–P có thể bị ảnh hưởng bởi reverse causality: doanh nghiệp hiệu quả hơn có thể có nhiều nguồn lực để quốc tế hóa hơn, tạo ra chiều nhân quả ngược lại. Country hiệu ứng cố định và year hiệu ứng cố định giúp kiểm soát một phần, nhưng không giải quyết hoàn toàn vấn đề endogeneity.</w:t>
       </w:r>
     </w:p>
     <w:bookmarkEnd w:id="222"/>
@@ -54978,7 +54978,7 @@
         <w:t xml:space="preserve"> </w:t>
       </w:r>
       <w:r>
-        <w:t xml:space="preserve">(54,1% tầng 2 + 8,4% tầng 3), ICRV moderation</w:t>
+        <w:t xml:space="preserve">(54,1% tầng 2 + 8,4% tầng 3), ICRV điều tiết</w:t>
       </w:r>
       <w:r>
         <w:t xml:space="preserve"> </w:t>
@@ -55520,7 +55520,7 @@
         <w:pStyle w:val="FirstParagraph"/>
       </w:pPr>
       <w:r>
-        <w:t xml:space="preserve">Về lý thuyết, luận án đóng góp vào ba dòng nghiên cứu: (i) meta-analytic văn liệu về I–P bằng cách phân tách cấu trúc dị biệt và xác định ICRV như biến điều tiết có ý nghĩa; (ii) văn liệu về digital capability bằng cách làm rõ DAI là situational resource chứ không phải foundational capability; và (iii) văn liệu về internationalization và SIDS bằng cách đặt tên và cung cấp bằng chứng đầu tiên cho FIP.</w:t>
+        <w:t xml:space="preserve">Về lý thuyết, luận án đóng góp vào ba dòng nghiên cứu: (i) meta-analytic văn liệu về I–P bằng cách phân tách cấu trúc dị biệt và xác định ICRV như biến điều tiết có ý nghĩa; (ii) văn liệu về digital capability bằng cách làm rõ DAI là nguồn lực tình huống chứ không phải năng lực nền tảng; và (iii) văn liệu về internationalization và SIDS bằng cách đặt tên và cung cấp bằng chứng đầu tiên cho FIP.</w:t>
       </w:r>
     </w:p>
     <w:p>

</xml_diff>

<commit_message>
style(thesis): second-pass Anh–Việt standardization (Ch2–5)
Extended the code-mixing cleanup to remaining clear terms (glosses/math/code protected):
construct→cấu trúc, sub-regime→chế độ con, wave→đợt, baseline→cơ sở, cubic→bậc ba,
composite→chỉ số hợp thành, proxy→biến đại diện, dummy→biến giả, S-curve→đường cong chữ S,
null→không có ý nghĩa, nomological nets→mạng quan hệ lý thuyết, liability of foreignness→
gánh nặng người nước ngoài, economies of scale/scope, over-extension→siêu mở rộng, etc.
Variable names (Wave_2022), method names (bootstrap, Paternoster, Heckman, Oster) and
statistical notation preserved. Fixed a 'Wave FE'→'Hiệu ứng cố định đợt' table label.
</commit_message>
<xml_diff>
--- a/dist/luan_an_ctu/LUAN_AN_FULL_vi.docx
+++ b/dist/luan_an_ctu/LUAN_AN_FULL_vi.docx
@@ -3912,7 +3912,7 @@
         <w:pStyle w:val="FirstParagraph"/>
       </w:pPr>
       <w:r>
-        <w:t xml:space="preserve">Một trong những đóng góp khái niệm trọng tâm của luận án là sự phân biệt rõ ràng giữa hai construct: năng lực công nghệ (Technological Capability Index, TCI) và chỉ số chấp nhận số (Digital Adoption Index, DAI). Trong nhiều nghiên cứu trước đây, hai construct này thường bị gộp lại thành một khái niệm chung về</w:t>
+        <w:t xml:space="preserve">Một trong những đóng góp khái niệm trọng tâm của luận án là sự phân biệt rõ ràng giữa hai cấu trúc: năng lực công nghệ (Technological Capability Index, TCI) và chỉ số chấp nhận số (Digital Adoption Index, DAI). Trong nhiều nghiên cứu trước đây, hai cấu trúc này thường bị gộp lại thành một khái niệm chung về</w:t>
       </w:r>
       <w:r>
         <w:t xml:space="preserve"> </w:t>
@@ -3946,7 +3946,7 @@
         <w:pStyle w:val="BodyText"/>
       </w:pPr>
       <w:r>
-        <w:t xml:space="preserve">Chỉ số chấp nhận số (Digital Adoption Index, DAI), ngược lại, phản ánh mức độ áp dụng các công cụ số tại giao diện ngoại tại của doanh nghiệp, bao gồm việc sở hữu website, sử dụng email trong giao dịch kinh doanh, thanh toán điện tử, và bán hàng trực tuyến. Đây là các công cụ số có tính bề mặt (surface digital tools) theo phân loại của Verhoef et al. (2021), tức là nằm ở cấp độ số hóa (digitization) và số hóa quy trình (digitalization), chưa đạt đến cấp độ chuyển đổi số toàn diện (digital transformation). Trong phạm vi luận án, DAI được đo bằng proxy</w:t>
+        <w:t xml:space="preserve">Chỉ số chấp nhận số (Digital Adoption Index, DAI), ngược lại, phản ánh mức độ áp dụng các công cụ số tại giao diện ngoại tại của doanh nghiệp, bao gồm việc sở hữu website, sử dụng email trong giao dịch kinh doanh, thanh toán điện tử, và bán hàng trực tuyến. Đây là các công cụ số có tính bề mặt (surface digital tools) theo phân loại của Verhoef et al. (2021), tức là nằm ở cấp độ số hóa (digitization) và số hóa quy trình (digitalization), chưa đạt đến cấp độ chuyển đổi số toàn diện (digital transformation). Trong phạm vi luận án, DAI được đo bằng biến đại diện</w:t>
       </w:r>
       <w:r>
         <w:t xml:space="preserve"> </w:t>
@@ -3972,7 +3972,7 @@
         <w:pStyle w:val="BodyText"/>
       </w:pPr>
       <w:r>
-        <w:t xml:space="preserve">Hai construct TCI và DAI không đồng nhất và vận hành theo cơ chế khác nhau trong mối quan hệ quốc tế hóa, hiệu quả: TCI hoạt động chủ yếu như một nhân tố nâng mặt bằng hiệu quả (level shifter), trong khi DAI có xu hướng làm thay đổi độ dốc hoặc độ cong của đường quan hệ I–P tùy theo bối cảnh (Bhandari et al., 2023; Chen &amp; Meng, 2022). Việc duy trì sự phân biệt rõ ràng này trong suốt luận án là điều kiện tiên quyết để đảm bảo tính thuần khiết của cấu trúc (construct purity) theo tiêu chuẩn của Coltman et al. (2008).</w:t>
+        <w:t xml:space="preserve">Hai cấu trúc TCI và DAI không đồng nhất và vận hành theo cơ chế khác nhau trong mối quan hệ quốc tế hóa, hiệu quả: TCI hoạt động chủ yếu như một nhân tố nâng mặt bằng hiệu quả (level shifter), trong khi DAI có xu hướng làm thay đổi độ dốc hoặc độ cong của đường quan hệ I–P tùy theo bối cảnh (Bhandari et al., 2023; Chen &amp; Meng, 2022). Việc duy trì sự phân biệt rõ ràng này trong suốt luận án là điều kiện tiên quyết để đảm bảo tính thuần khiết của cấu trúc (construct purity) theo tiêu chuẩn của Coltman et al. (2008).</w:t>
       </w:r>
     </w:p>
     <w:bookmarkEnd w:id="49"/>
@@ -4163,7 +4163,7 @@
         <w:pStyle w:val="BodyText"/>
       </w:pPr>
       <w:r>
-        <w:t xml:space="preserve">Áp dụng vào bối cảnh quốc tế hóa, RBV giải thích vì sao cùng một mức độ FSTS nhưng các doanh nghiệp lại đạt hiệu quả rất khác nhau: những doanh nghiệp sở hữu năng lực công nghệ, năng lực quản trị vượt trội, và năng lực học hỏi mạnh hơn sẽ chuyển hóa quốc tế hóa thành hiệu quả tốt hơn do họ có thể giảm chi phí liability of foreignness và khai thác lợi thế cạnh tranh trên phạm vi quốc tế hiệu quả hơn (Hitt et al., 2006; Peng, 2001). Cùng mức độ quốc tế hóa, doanh nghiệp có nguồn lực yếu hơn sẽ gánh chịu chi phí điều phối và rủi ro lớn hơn, trong khi doanh nghiệp có nguồn lực VRIN mạnh hơn có thể biến những thách thức đó thành lợi thế cạnh tranh.</w:t>
+        <w:t xml:space="preserve">Áp dụng vào bối cảnh quốc tế hóa, RBV giải thích vì sao cùng một mức độ FSTS nhưng các doanh nghiệp lại đạt hiệu quả rất khác nhau: những doanh nghiệp sở hữu năng lực công nghệ, năng lực quản trị vượt trội, và năng lực học hỏi mạnh hơn sẽ chuyển hóa quốc tế hóa thành hiệu quả tốt hơn do họ có thể giảm chi phí gánh nặng người nước ngoài và khai thác lợi thế cạnh tranh trên phạm vi quốc tế hiệu quả hơn (Hitt et al., 2006; Peng, 2001). Cùng mức độ quốc tế hóa, doanh nghiệp có nguồn lực yếu hơn sẽ gánh chịu chi phí điều phối và rủi ro lớn hơn, trong khi doanh nghiệp có nguồn lực VRIN mạnh hơn có thể biến những thách thức đó thành lợi thế cạnh tranh.</w:t>
       </w:r>
     </w:p>
     <w:p>
@@ -4283,7 +4283,7 @@
         <w:pStyle w:val="BodyText"/>
       </w:pPr>
       <w:r>
-        <w:t xml:space="preserve">Trong bối cảnh quốc tế hóa, Upper Echelons Theory có hai hàm ý trực tiếp. Thứ nhất, kinh nghiệm quốc tế của nhà quản trị cấp cao, được đo bằng số năm kinh nghiệm làm việc hoặc học tập ở nước ngoài, hay tiếp xúc với thị trường quốc tế, giúp giảm nhận thức về liability of foreignness và nâng cao khả năng đánh giá cơ hội, quản trị rủi ro ở thị trường quốc tế (Hsu et al., 2013; Sambharya, 1996). Thứ hai, sự đa dạng giới tính trong lãnh đạo, đặc biệt là sự hiện diện của quản trị viên nữ ở các vị trí lãnh đạo, liên quan đến nhận thức chiến lược đa chiều hơn và thực tiễn quản trị rủi ro thận trọng hơn, qua đó có tác động tích cực đến hiệu quả doanh nghiệp trong quá trình quốc tế hóa (Post &amp; Byron, 2015). Những hàm ý này cung cấp cơ sở lý thuyết cho giả thuyết H4 về vai trò điều tiết của đặc điểm nhà quản trị cấp cao.</w:t>
+        <w:t xml:space="preserve">Trong bối cảnh quốc tế hóa, Upper Echelons Theory có hai hàm ý trực tiếp. Thứ nhất, kinh nghiệm quốc tế của nhà quản trị cấp cao, được đo bằng số năm kinh nghiệm làm việc hoặc học tập ở nước ngoài, hay tiếp xúc với thị trường quốc tế, giúp giảm nhận thức về gánh nặng người nước ngoài và nâng cao khả năng đánh giá cơ hội, quản trị rủi ro ở thị trường quốc tế (Hsu et al., 2013; Sambharya, 1996). Thứ hai, sự đa dạng giới tính trong lãnh đạo, đặc biệt là sự hiện diện của quản trị viên nữ ở các vị trí lãnh đạo, liên quan đến nhận thức chiến lược đa chiều hơn và thực tiễn quản trị rủi ro thận trọng hơn, qua đó có tác động tích cực đến hiệu quả doanh nghiệp trong quá trình quốc tế hóa (Post &amp; Byron, 2015). Những hàm ý này cung cấp cơ sở lý thuyết cho giả thuyết H4 về vai trò điều tiết của đặc điểm nhà quản trị cấp cao.</w:t>
       </w:r>
     </w:p>
     <w:p>
@@ -4325,7 +4325,7 @@
         <w:pStyle w:val="BodyText"/>
       </w:pPr>
       <w:r>
-        <w:t xml:space="preserve">Sự phân biệt giữa hai cấu trúc số có nền tảng đo lường vững chắc trong văn liệu. Bharadwaj et al. (2013) lập luận rằng năng lực công nghệ thông tin (IT capability) và chiến lược kinh doanh số (digital business strategy) có nomological nets khác nhau, nghĩa là chúng liên hệ với các tiền tố và hệ quả khác nhau, do đó không nên gộp thành một cấu trúc. Coltman et al. (2008) cung cấp bốn tiêu chí để phân biệt cấu trúc formative với reflective, làm cơ sở phương pháp luận cho việc xây dựng TCI và DAI như hai composite formative độc lập thay vì các chỉ báo của một cấu trúc tiềm ẩn chung. Trên nền đó, luận án định vị TCI ở truyền thống năng lực công nghệ hóa công nghiệp và năng lực hấp thụ, vốn xem năng lực công nghệ là chiều sâu năng lực nội tại được tích lũy qua đầu tư và học hỏi (Cohen &amp; Levinthal, 1990; Lall, 1992), trong khi DAI phản ánh mức độ áp dụng công cụ số ở giao diện ngoại tại. Sự tách biệt khái niệm này không chỉ là tinh tế đo lường mà có hệ quả lý thuyết trực tiếp: nếu hai cấu trúc vận hành qua hai cơ chế khác nhau, thì việc gộp chúng sẽ trung bình hóa hai hiệu ứng trái chiều và che khuất chính cơ chế mà nhà nghiên cứu và nhà hoạch định chính sách cần phân biệt.</w:t>
+        <w:t xml:space="preserve">Sự phân biệt giữa hai cấu trúc số có nền tảng đo lường vững chắc trong văn liệu. Bharadwaj et al. (2013) lập luận rằng năng lực công nghệ thông tin (IT capability) và chiến lược kinh doanh số (digital business strategy) có mạng quan hệ lý thuyết khác nhau, nghĩa là chúng liên hệ với các tiền tố và hệ quả khác nhau, do đó không nên gộp thành một cấu trúc. Coltman et al. (2008) cung cấp bốn tiêu chí để phân biệt cấu trúc formative với reflective, làm cơ sở phương pháp luận cho việc xây dựng TCI và DAI như hai chỉ số hợp thành formative độc lập thay vì các chỉ báo của một cấu trúc tiềm ẩn chung. Trên nền đó, luận án định vị TCI ở truyền thống năng lực công nghệ hóa công nghiệp và năng lực hấp thụ, vốn xem năng lực công nghệ là chiều sâu năng lực nội tại được tích lũy qua đầu tư và học hỏi (Cohen &amp; Levinthal, 1990; Lall, 1992), trong khi DAI phản ánh mức độ áp dụng công cụ số ở giao diện ngoại tại. Sự tách biệt khái niệm này không chỉ là tinh tế đo lường mà có hệ quả lý thuyết trực tiếp: nếu hai cấu trúc vận hành qua hai cơ chế khác nhau, thì việc gộp chúng sẽ trung bình hóa hai hiệu ứng trái chiều và che khuất chính cơ chế mà nhà nghiên cứu và nhà hoạch định chính sách cần phân biệt.</w:t>
       </w:r>
     </w:p>
     <w:p>
@@ -4540,7 +4540,7 @@
         <w:t xml:space="preserve"> </w:t>
       </w:r>
       <w:r>
-        <w:t xml:space="preserve">(digital shield effect). Nghiên cứu thành phần P2 kiểm định cụ thể với dữ liệu doanh nghiệp Trung Quốc và tìm thấy cấu trúc cubic chữ U ngược với ngưỡng FSTS tối ưu khoảng 47,8%, tức điểm điểm uốn khá thấp so với các nền kinh tế tiên tiến. Luận án kế thừa và mở rộng các kết quả này trên pool đầy đủ 50 nền kinh tế (bao gồm 7 nền kinh tế đảo nhỏ Thái Bình Dương (mẫu chính; 9 nền khi mở rộng độ vững)).</w:t>
+        <w:t xml:space="preserve">(digital shield effect). Nghiên cứu thành phần P2 kiểm định cụ thể với dữ liệu doanh nghiệp Trung Quốc và tìm thấy cấu trúc bậc ba chữ U ngược với ngưỡng FSTS tối ưu khoảng 47,8%, tức điểm điểm uốn khá thấp so với các nền kinh tế tiên tiến. Luận án kế thừa và mở rộng các kết quả này trên pool đầy đủ 50 nền kinh tế (bao gồm 7 nền kinh tế đảo nhỏ Thái Bình Dương (mẫu chính; 9 nền khi mở rộng độ vững)).</w:t>
       </w:r>
     </w:p>
     <w:p>
@@ -4737,7 +4737,7 @@
         <w:t xml:space="preserve"> </w:t>
       </w:r>
       <w:r>
-        <w:t xml:space="preserve">Phần lớn các nghiên cứu về năng lực số trong bối cảnh I–P hoặc là không đo lường năng lực số, hoặc là gộp tất cả các chỉ báo số vào một composite duy nhất, không phân biệt giữa chiều sâu năng lực công nghệ tổ chức (TCI) và mức độ chấp nhận công cụ số bề mặt (DAI). Hậu quả thực tiễn của sự đồng nhất này là: (i) không thể trả lời câu hỏi liệu nên đầu tư vào năng lực công nghệ nội tại hay vào việc áp dụng công cụ số giao diện; (ii) không thể phân biệt được hai cơ chế tác động có hàm ý chính sách khác nhau. Phân biệt rõ TCI và DAI là điều kiện cần để rút ra hàm ý quản trị và chính sách có tính cụ thể và ứng dụng cao.</w:t>
+        <w:t xml:space="preserve">Phần lớn các nghiên cứu về năng lực số trong bối cảnh I–P hoặc là không đo lường năng lực số, hoặc là gộp tất cả các chỉ báo số vào một chỉ số hợp thành duy nhất, không phân biệt giữa chiều sâu năng lực công nghệ tổ chức (TCI) và mức độ chấp nhận công cụ số bề mặt (DAI). Hậu quả thực tiễn của sự đồng nhất này là: (i) không thể trả lời câu hỏi liệu nên đầu tư vào năng lực công nghệ nội tại hay vào việc áp dụng công cụ số giao diện; (ii) không thể phân biệt được hai cơ chế tác động có hàm ý chính sách khác nhau. Phân biệt rõ TCI và DAI là điều kiện cần để rút ra hàm ý quản trị và chính sách có tính cụ thể và ứng dụng cao.</w:t>
       </w:r>
     </w:p>
     <w:p>
@@ -4755,7 +4755,7 @@
         <w:t xml:space="preserve"> </w:t>
       </w:r>
       <w:r>
-        <w:t xml:space="preserve">Mặc dù châu Á là khu vực kinh tế năng động và đa dạng nhất thế giới, văn liệu về I–P vẫn thiếu bằng chứng đa quốc gia bao quát đủ rộng để kiểm định khả năng tổng quát hóa của các lý thuyết. Pool 17 nước của nghiên cứu thành phần P1 là baseline lớn nhất hiện có trong văn liệu về châu Á, nhưng vẫn chưa bao gồm các nền kinh tế frontier và SIDS, những địa điểm cực kỳ quan trọng để kiểm định điều kiện biên. Thiếu vắng các bằng chứng này khiến cho các lý thuyết về I–P, vốn được xây dựng chủ yếu trên dữ liệu từ Nhật Bản, Hàn Quốc, và các nền kinh tế tiên tiến, có nguy cơ bị áp dụng sai trong bối cảnh các nền kinh tế đang phát triển và chuyển đổi ở châu Á.</w:t>
+        <w:t xml:space="preserve">Mặc dù châu Á là khu vực kinh tế năng động và đa dạng nhất thế giới, văn liệu về I–P vẫn thiếu bằng chứng đa quốc gia bao quát đủ rộng để kiểm định khả năng tổng quát hóa của các lý thuyết. Pool 17 nước của nghiên cứu thành phần P1 là cơ sở lớn nhất hiện có trong văn liệu về châu Á, nhưng vẫn chưa bao gồm các nền kinh tế frontier và SIDS, những địa điểm cực kỳ quan trọng để kiểm định điều kiện biên. Thiếu vắng các bằng chứng này khiến cho các lý thuyết về I–P, vốn được xây dựng chủ yếu trên dữ liệu từ Nhật Bản, Hàn Quốc, và các nền kinh tế tiên tiến, có nguy cơ bị áp dụng sai trong bối cảnh các nền kinh tế đang phát triển và chuyển đổi ở châu Á.</w:t>
       </w:r>
     </w:p>
     <w:p>
@@ -4859,7 +4859,7 @@
         <w:pStyle w:val="BodyText"/>
       </w:pPr>
       <w:r>
-        <w:t xml:space="preserve">Tầng vĩ mô, bối cảnh thể chế, được vận hành hóa bằng khung ICRV với sáu sub-regime theo gradient từ Advanced Innovation-Driven đến SIDS. Ở tầng này, ICRV điều tiết mối quan hệ I–P thông qua hai cơ chế: (i) mức độ khoảng trống thể chế (institutional voids) ảnh hưởng đến chi phí giao dịch xuyên biên giới; và (ii) chất lượng thể chế ảnh hưởng đến khả năng doanh nghiệp khai thác lợi ích từ quốc tế hóa. Ở các nền kinh tế frontier và SIDS, khoảng trống thể chế cực kỳ lớn có thể đảo ngược quan hệ I–P, biến lợi ích tiềm năng thành tổn thất thực tế (nghiên cứu thành phần P8).</w:t>
+        <w:t xml:space="preserve">Tầng vĩ mô, bối cảnh thể chế, được vận hành hóa bằng khung ICRV với sáu chế độ con theo gradient từ Advanced Innovation-Driven đến SIDS. Ở tầng này, ICRV điều tiết mối quan hệ I–P thông qua hai cơ chế: (i) mức độ khoảng trống thể chế (institutional voids) ảnh hưởng đến chi phí giao dịch xuyên biên giới; và (ii) chất lượng thể chế ảnh hưởng đến khả năng doanh nghiệp khai thác lợi ích từ quốc tế hóa. Ở các nền kinh tế frontier và SIDS, khoảng trống thể chế cực kỳ lớn có thể đảo ngược quan hệ I–P, biến lợi ích tiềm năng thành tổn thất thực tế (nghiên cứu thành phần P8).</w:t>
       </w:r>
     </w:p>
     <w:p>
@@ -4911,7 +4911,7 @@
         <w:pStyle w:val="BodyText"/>
       </w:pPr>
       <w:r>
-        <w:t xml:space="preserve">Tầng cá nhân, đặc điểm nhà quản trị cấp cao, bao gồm kinh nghiệm quản trị và giới tính nhà quản trị như các biến điều tiết vi mô. Kinh nghiệm quốc tế của nhà quản trị giảm chi phí nhận thức của liability of foreignness; sự hiện diện của quản trị viên nữ tăng cường đa dạng nhận thức và thận trọng trong quản trị rủi ro quốc tế.</w:t>
+        <w:t xml:space="preserve">Tầng cá nhân, đặc điểm nhà quản trị cấp cao, bao gồm kinh nghiệm quản trị và giới tính nhà quản trị như các biến điều tiết vi mô. Kinh nghiệm quốc tế của nhà quản trị giảm chi phí nhận thức của gánh nặng người nước ngoài; sự hiện diện của quản trị viên nữ tăng cường đa dạng nhận thức và thận trọng trong quản trị rủi ro quốc tế.</w:t>
       </w:r>
     </w:p>
     <w:p>
@@ -5030,7 +5030,7 @@
         <w:pStyle w:val="FirstParagraph"/>
       </w:pPr>
       <w:r>
-        <w:t xml:space="preserve">Trên cơ sở lý thuyết từ Uppsala về chi phí thâm nhập giai đoạn đầu, RBV về lợi thế cạnh tranh tích lũy ở giai đoạn trung, và lý thuyết chi phí giao dịch về sự phức tạp điều phối ở giai đoạn mở rộng quá mức, giả thuyết H1 được phát biểu như sau. Quan hệ giữa mức độ quốc tế hóa và hiệu quả hoạt động của các doanh nghiệp ở các quốc gia châu Á có dạng phi tuyến chữ U ngược, với một điểm điểm uốn tối ưu trước khi chi phí điều phối và bất định vượt qua lợi ích từ mở rộng thị trường quốc tế. Cơ sở lý thuyết trực tiếp bao gồm mô hình S-curve của Lu và Beamish (2004), lý thuyết ba giai đoạn của Contractor et al. (2003), và bằng chứng chữ U ngược ban đầu của Hitt et al. (1997).</w:t>
+        <w:t xml:space="preserve">Trên cơ sở lý thuyết từ Uppsala về chi phí thâm nhập giai đoạn đầu, RBV về lợi thế cạnh tranh tích lũy ở giai đoạn trung, và lý thuyết chi phí giao dịch về sự phức tạp điều phối ở giai đoạn mở rộng quá mức, giả thuyết H1 được phát biểu như sau. Quan hệ giữa mức độ quốc tế hóa và hiệu quả hoạt động của các doanh nghiệp ở các quốc gia châu Á có dạng phi tuyến chữ U ngược, với một điểm điểm uốn tối ưu trước khi chi phí điều phối và bất định vượt qua lợi ích từ mở rộng thị trường quốc tế. Cơ sở lý thuyết trực tiếp bao gồm mô hình đường cong chữ S của Lu và Beamish (2004), lý thuyết ba giai đoạn của Contractor et al. (2003), và bằng chứng chữ U ngược ban đầu của Hitt et al. (1997).</w:t>
       </w:r>
     </w:p>
     <w:bookmarkEnd w:id="69"/>
@@ -5801,7 +5801,7 @@
         <w:pStyle w:val="BodyText"/>
       </w:pPr>
       <w:r>
-        <w:t xml:space="preserve">Phần đầu chương xác lập bốn khái niệm cốt lõi: quốc tế hóa doanh nghiệp (đo bằng FSTS), hiệu quả hoạt động (đo bằng labor productivity là chính), năng lực công nghệ (TCI) và chỉ số chấp nhận số (DAI) như hai construct độc lập, và bối cảnh thể chế được vận hành hóa bằng khung ICRV sáu nhóm. Phần lý thuyết nền trình bày và phân tích bốn lý thuyết kinh điển, Uppsala, RBV, Institutional Theory, và Upper Echelons Theory, cùng với lớp mở rộng Digital Capability Lens, xác định vai trò của từng lý thuyết trong khung giải thích tổng thể của luận án.</w:t>
+        <w:t xml:space="preserve">Phần đầu chương xác lập bốn khái niệm cốt lõi: quốc tế hóa doanh nghiệp (đo bằng FSTS), hiệu quả hoạt động (đo bằng labor productivity là chính), năng lực công nghệ (TCI) và chỉ số chấp nhận số (DAI) như hai cấu trúc độc lập, và bối cảnh thể chế được vận hành hóa bằng khung ICRV sáu nhóm. Phần lý thuyết nền trình bày và phân tích bốn lý thuyết kinh điển, Uppsala, RBV, Institutional Theory, và Upper Echelons Theory, cùng với lớp mở rộng Digital Capability Lens, xác định vai trò của từng lý thuyết trong khung giải thích tổng thể của luận án.</w:t>
       </w:r>
     </w:p>
     <w:p>
@@ -5883,7 +5883,7 @@
         <w:t xml:space="preserve"> </w:t>
       </w:r>
       <w:r>
-        <w:t xml:space="preserve">gồm hai phase bổ sung cho nhau. Phase thứ nhất là meta-analysis tổng hợp văn liệu để trả lời RQ1, còn phase thứ hai là phân tích thực nghiệm doanh nghiệp đa quốc gia để trả lời RQ2–RQ4. Hai phase đối thoại hai chiều: meta cung cấp baseline và gợi ý biến điều tiết cần kiểm định, còn empirical cung cấp bằng chứng bổ sung cho meta về bối cảnh châu Á và Pacific.</w:t>
+        <w:t xml:space="preserve">gồm hai phase bổ sung cho nhau. Phase thứ nhất là meta-analysis tổng hợp văn liệu để trả lời RQ1, còn phase thứ hai là phân tích thực nghiệm doanh nghiệp đa quốc gia để trả lời RQ2–RQ4. Hai phase đối thoại hai chiều: meta cung cấp cơ sở và gợi ý biến điều tiết cần kiểm định, còn empirical cung cấp bằng chứng bổ sung cho meta về bối cảnh châu Á và Pacific.</w:t>
       </w:r>
     </w:p>
     <w:p>
@@ -6094,7 +6094,7 @@
         <w:t xml:space="preserve">Mở rộng biến điều tiết coverage</w:t>
       </w:r>
       <w:r>
-        <w:t xml:space="preserve">: thêm cụm biến điều tiết về digital capability và 6 sub-regime ICRV, chưa được xem xét đầy đủ trong các meta-analyses trước.</w:t>
+        <w:t xml:space="preserve">: thêm cụm biến điều tiết về digital capability và 6 chế độ con ICRV, chưa được xem xét đầy đủ trong các meta-analyses trước.</w:t>
       </w:r>
     </w:p>
     <w:p>
@@ -6147,7 +6147,7 @@
         <w:t xml:space="preserve">Subgroup theo châu Á và Pacific</w:t>
       </w:r>
       <w:r>
-        <w:t xml:space="preserve">: tách riêng nhóm nghiên cứu về doanh nghiệp châu Á và Pacific để cung cấp baseline trực tiếp cho phase empirical, đối chiếu với pool 17 nước trong nghiên cứu thành phần P1.</w:t>
+        <w:t xml:space="preserve">: tách riêng nhóm nghiên cứu về doanh nghiệp châu Á và Pacific để cung cấp cơ sở trực tiếp cho phase empirical, đối chiếu với pool 17 nước trong nghiên cứu thành phần P1.</w:t>
       </w:r>
     </w:p>
     <w:bookmarkEnd w:id="85"/>
@@ -6314,7 +6314,7 @@
         <w:t xml:space="preserve">50 nền kinh tế châu Á và Thái Bình Dương</w:t>
       </w:r>
       <w:r>
-        <w:t xml:space="preserve">, với 6 sub-regime ICRV (Advanced innovation-driven, Advanced resource-driven, Upper-middle, Lower-middle transition, Emerging, SIDS). Quy mô này là lớn nhất cho khu vực trong văn liệu internationalization–performance, gồm cả trường hợp biên Pacific SIDS (7 nước, n=959 (mẫu phân tích sau lọc missing)) cho phép kiểm định forced internationalization penalty (nghiên cứu thành phần P8).</w:t>
+        <w:t xml:space="preserve">, với 6 chế độ con ICRV (Advanced innovation-driven, Advanced resource-driven, Upper-middle, Lower-middle transition, Emerging, SIDS). Quy mô này là lớn nhất cho khu vực trong văn liệu internationalization–performance, gồm cả trường hợp biên Pacific SIDS (7 nước, n=959 (mẫu phân tích sau lọc missing)) cho phép kiểm định forced internationalization penalty (nghiên cứu thành phần P8).</w:t>
       </w:r>
     </w:p>
     <w:p>
@@ -6488,7 +6488,7 @@
         <w:t xml:space="preserve">Nhất quán đo lường xuyên các nghiên cứu thành phần và điều kiện so sánh tiền tệ</w:t>
       </w:r>
       <w:r>
-        <w:t xml:space="preserve">: cùng một construct</w:t>
+        <w:t xml:space="preserve">: cùng một cấu trúc</w:t>
       </w:r>
       <w:r>
         <w:t xml:space="preserve"> </w:t>
@@ -7029,7 +7029,7 @@
         <w:t xml:space="preserve"> </w:t>
       </w:r>
       <w:r>
-        <w:t xml:space="preserve">để kiểm định phi tuyến S-curve / cubic.</w:t>
+        <w:t xml:space="preserve">để kiểm định phi tuyến đường cong chữ S / bậc ba.</w:t>
       </w:r>
     </w:p>
     <w:p>
@@ -7076,7 +7076,7 @@
         <w:t xml:space="preserve"> </w:t>
       </w:r>
       <w:r>
-        <w:t xml:space="preserve">để kiểm định phi tuyến đã được áp dụng trong Lu và Beamish (2004), Contractor et al. (2003), và Hitt et al. (1997). Specification cubic được nghiên cứu thành phần P2 xác nhận có ý nghĩa thống kê ở Trung Quốc với điểm uốn ~47,8% FSTS, làm baseline cho việc kiểm định mở rộng trong luận án.</w:t>
+        <w:t xml:space="preserve">để kiểm định phi tuyến đã được áp dụng trong Lu và Beamish (2004), Contractor et al. (2003), và Hitt et al. (1997). Specification bậc ba được nghiên cứu thành phần P2 xác nhận có ý nghĩa thống kê ở Trung Quốc với điểm uốn ~47,8% FSTS, làm cơ sở cho việc kiểm định mở rộng trong luận án.</w:t>
       </w:r>
     </w:p>
     <w:bookmarkEnd w:id="92"/>
@@ -7200,7 +7200,7 @@
         <w:pStyle w:val="FirstParagraph"/>
       </w:pPr>
       <w:r>
-        <w:t xml:space="preserve">Luận án phân biệt rõ hai construct:</w:t>
+        <w:t xml:space="preserve">Luận án phân biệt rõ hai cấu trúc:</w:t>
       </w:r>
     </w:p>
     <w:p>
@@ -7253,7 +7253,7 @@
         <w:t xml:space="preserve">Nguyên tắc non-overlapping</w:t>
       </w:r>
       <w:r>
-        <w:t xml:space="preserve">: TCI và DAI không được chia sẻ component để bảo đảm construct purity. Đặc biệt, foreign technology licensing thuộc TCI chứ không được đồng thời tính vào DAI.</w:t>
+        <w:t xml:space="preserve">: TCI và DAI không được chia sẻ component để bảo đảm cấu trúc purity. Đặc biệt, foreign technology licensing thuộc TCI chứ không được đồng thời tính vào DAI.</w:t>
       </w:r>
     </w:p>
     <w:p>
@@ -7271,7 +7271,7 @@
         <w:t xml:space="preserve"> </w:t>
       </w:r>
       <w:r>
-        <w:t xml:space="preserve">Do bộ công cụ WBES thay đổi qua ba thế hệ bảng hỏi (PICS3, Standardized, BREADY) khiến không phải mọi mục đều khả dụng ở mọi sóng, TCI được vận hành hóa thống nhất theo hai biến thể của cùng một composite formative:</w:t>
+        <w:t xml:space="preserve">Do bộ công cụ WBES thay đổi qua ba thế hệ bảng hỏi (PICS3, Standardized, BREADY) khiến không phải mọi mục đều khả dụng ở mọi sóng, TCI được vận hành hóa thống nhất theo hai biến thể của cùng một chỉ số hợp thành formative:</w:t>
       </w:r>
     </w:p>
     <w:p>
@@ -7323,7 +7323,7 @@
         <w:pStyle w:val="FirstParagraph"/>
       </w:pPr>
       <w:r>
-        <w:t xml:space="preserve">Bộ mục chính xác của mỗi nghiên cứu thành phần được nêu lại trong bảng định nghĩa biến của nghiên cứu đó (Mục 3.4.5) và Phụ lục A; khác biệt giữa thin và full phản ánh ràng buộc khả dụng dữ liệu khách quan, không phải lựa chọn tùy ý. Vì các mục là chỉ báo nhị phân của cùng một construct formative (năng lực công nghệ), hai biến thể tương quan cao và cho kết luận điều tiết nhất quán về dấu; phần độ vững (Mục 3.5.1) kiểm tra độ nhạy của kết quả với lựa chọn biến thể. Bộ mục TCI của nghiên cứu đa quốc gia (P7) đã được đối chiếu trực tiếp với mã xây dựng dữ liệu thực tế (pipeline raw WBES 50 nền kinh tế, gồm Nhật Bản 2025): biến</w:t>
+        <w:t xml:space="preserve">Bộ mục chính xác của mỗi nghiên cứu thành phần được nêu lại trong bảng định nghĩa biến của nghiên cứu đó (Mục 3.4.5) và Phụ lục A; khác biệt giữa thin và full phản ánh ràng buộc khả dụng dữ liệu khách quan, không phải lựa chọn tùy ý. Vì các mục là chỉ báo nhị phân của cùng một cấu trúc formative (năng lực công nghệ), hai biến thể tương quan cao và cho kết luận điều tiết nhất quán về dấu; phần độ vững (Mục 3.5.1) kiểm tra độ nhạy của kết quả với lựa chọn biến thể. Bộ mục TCI của nghiên cứu đa quốc gia (P7) đã được đối chiếu trực tiếp với mã xây dựng dữ liệu thực tế (pipeline raw WBES 50 nền kinh tế, gồm Nhật Bản 2025): biến</w:t>
       </w:r>
       <w:r>
         <w:t xml:space="preserve"> </w:t>
@@ -7402,7 +7402,7 @@
         <w:t xml:space="preserve"> </w:t>
       </w:r>
       <w:r>
-        <w:t xml:space="preserve">trong bối cảnh WBES, đảm bảo construct purity ở 50 nền kinh tế châu Á và Thái Bình Dương, với pipeline hòa hợp 3 thế hệ schema. Phân tách TCI và DAI theo (i) Bharadwaj et al. (2013), IT capability vs digital business strategy có nomological nets khác nhau; (ii) phân tầng 3 cấp của Verhoef et al. (2021), digitization, digitalization, digital transformation; (iii) truyền thống Lall (1992) và Cohen &amp; Levinthal (1990) coi technological capability là chiều sâu năng lực nội tại (absorptive capacity), khác về bản chất với digital adoption ở giao diện ngoại tại; (iv) resource-orchestration logic của Bhandari et al. (2023) cho I–P relationship; và (v) 4 tiêu chí formative composite của Coltman et al. (2008), đảm bảo TCI và DAI là hai composite độc lập.</w:t>
+        <w:t xml:space="preserve">trong bối cảnh WBES, đảm bảo cấu trúc purity ở 50 nền kinh tế châu Á và Thái Bình Dương, với pipeline hòa hợp 3 thế hệ schema. Phân tách TCI và DAI theo (i) Bharadwaj et al. (2013), IT capability vs digital business strategy có mạng quan hệ lý thuyết khác nhau; (ii) phân tầng 3 cấp của Verhoef et al. (2021), digitization, digitalization, digital transformation; (iii) truyền thống Lall (1992) và Cohen &amp; Levinthal (1990) coi technological capability là chiều sâu năng lực nội tại (absorptive capacity), khác về bản chất với digital adoption ở giao diện ngoại tại; (iv) resource-orchestration logic của Bhandari et al. (2023) cho I–P relationship; và (v) 4 tiêu chí formative chỉ số hợp thành của Coltman et al. (2008), đảm bảo TCI và DAI là hai chỉ số hợp thành độc lập.</w:t>
       </w:r>
     </w:p>
     <w:bookmarkEnd w:id="94"/>
@@ -7427,7 +7427,7 @@
         <w:t xml:space="preserve">Biến chính</w:t>
       </w:r>
       <w:r>
-        <w:t xml:space="preserve">: business obstacle index (tổng hợp từ các câu hỏi WBES về obstacles), country-level governance proxies, chỉ số pháp quyền WGI (Kaufmann et al., 2011), 6 sub-regime ICRV (classification từ Khanna &amp; Palepu, 2010 mở rộng).</w:t>
+        <w:t xml:space="preserve">: business obstacle index (tổng hợp từ các câu hỏi WBES về obstacles), country-level governance proxies, chỉ số pháp quyền WGI (Kaufmann et al., 2011), 6 chế độ con ICRV (classification từ Khanna &amp; Palepu, 2010 mở rộng).</w:t>
       </w:r>
     </w:p>
     <w:p>
@@ -7553,7 +7553,7 @@
         <w:t xml:space="preserve"> </w:t>
       </w:r>
       <w:r>
-        <w:t xml:space="preserve">employment, firm age, foreign ownership dummy, sector dummy, country hiệu ứng cố định, year hiệu ứng cố định.</w:t>
+        <w:t xml:space="preserve">employment, firm age, foreign ownership biến giả, sector biến giả, country hiệu ứng cố định, year hiệu ứng cố định.</w:t>
       </w:r>
     </w:p>
     <w:p>
@@ -8340,7 +8340,7 @@
         <w:pStyle w:val="BodyText"/>
       </w:pPr>
       <w:r>
-        <w:t xml:space="preserve">Đối với Trung Quốc, mô hình mở rộng cubic theo specification đã được công bố:</w:t>
+        <w:t xml:space="preserve">Đối với Trung Quốc, mô hình mở rộng bậc ba theo specification đã được công bố:</w:t>
       </w:r>
     </w:p>
     <w:p>
@@ -8588,7 +8588,7 @@
         <w:t xml:space="preserve">Cơ sở kế thừa</w:t>
       </w:r>
       <w:r>
-        <w:t xml:space="preserve">: Lu và Beamish (2004), Hitt et al. (1997), Contractor et al. (2003); nghiên cứu thành phần P2 cho cubic specification ở China với điểm uốn ~47,8% FSTS.</w:t>
+        <w:t xml:space="preserve">: Lu và Beamish (2004), Hitt et al. (1997), Contractor et al. (2003); nghiên cứu thành phần P2 cho bậc ba specification ở China với điểm uốn ~47,8% FSTS.</w:t>
       </w:r>
     </w:p>
     <w:p>
@@ -10000,7 +10000,7 @@
         <w:t xml:space="preserve">Cơ sở kế thừa</w:t>
       </w:r>
       <w:r>
-        <w:t xml:space="preserve">: Wu et al. (2022) với twenty-year evolution; Xiao et al. (2013) với China-specific contingencies; nghiên cứu thành phần P2 làm baseline cubic 2012.</w:t>
+        <w:t xml:space="preserve">: Wu et al. (2022) với twenty-year evolution; Xiao et al. (2013) với China-specific contingencies; nghiên cứu thành phần P2 làm cơ sở bậc ba 2012.</w:t>
       </w:r>
     </w:p>
     <w:p>
@@ -10015,7 +10015,7 @@
         <w:t xml:space="preserve">Đóng góp mới</w:t>
       </w:r>
       <w:r>
-        <w:t xml:space="preserve">: áp dụng cho China 2012 và 2024 để kiểm định stability của cubic điểm uốn (~47,8% FSTS) sau hơn một thập kỷ chuyển đổi số.</w:t>
+        <w:t xml:space="preserve">: áp dụng cho China 2012 và 2024 để kiểm định stability của bậc ba điểm uốn (~47,8% FSTS) sau hơn một thập kỷ chuyển đổi số.</w:t>
       </w:r>
     </w:p>
     <w:bookmarkEnd w:id="108"/>
@@ -14121,7 +14121,7 @@
               <w:jc w:val="left"/>
             </w:pPr>
             <w:r>
-              <w:t xml:space="preserve">wave</w:t>
+              <w:t xml:space="preserve">đợt</w:t>
             </w:r>
           </w:p>
         </w:tc>
@@ -15298,7 +15298,7 @@
         <w:t xml:space="preserve">λ_t</w:t>
       </w:r>
       <w:r>
-        <w:t xml:space="preserve">: wave hiệu ứng cố định (pooled)</w:t>
+        <w:t xml:space="preserve">: đợt hiệu ứng cố định (pooled)</w:t>
       </w:r>
     </w:p>
     <w:p>
@@ -16048,19 +16048,19 @@
               <w:jc w:val="left"/>
             </w:pPr>
             <w:r>
-              <w:t xml:space="preserve">wave (2012/2024)</w:t>
-            </w:r>
-          </w:p>
-        </w:tc>
-        <w:tc>
-          <w:tcPr/>
-          <w:p>
-            <w:pPr>
-              <w:pStyle w:val="Compact"/>
-              <w:jc w:val="left"/>
-            </w:pPr>
-            <w:r>
-              <w:t xml:space="preserve">Wave FE (chỉ pooled)</w:t>
+              <w:t xml:space="preserve">đợt (2012/2024)</w:t>
+            </w:r>
+          </w:p>
+        </w:tc>
+        <w:tc>
+          <w:tcPr/>
+          <w:p>
+            <w:pPr>
+              <w:pStyle w:val="Compact"/>
+              <w:jc w:val="left"/>
+            </w:pPr>
+            <w:r>
+              <w:t xml:space="preserve">đợt FE (chỉ pooled)</w:t>
             </w:r>
           </w:p>
         </w:tc>
@@ -21709,7 +21709,7 @@
               <w:jc w:val="left"/>
             </w:pPr>
             <w:r>
-              <w:t xml:space="preserve">dummy theo quốc gia</w:t>
+              <w:t xml:space="preserve">biến giả theo quốc gia</w:t>
             </w:r>
           </w:p>
         </w:tc>
@@ -21735,31 +21735,31 @@
               <w:jc w:val="left"/>
             </w:pPr>
             <w:r>
-              <w:t xml:space="preserve">Wave hiệu ứng cố định</w:t>
-            </w:r>
-          </w:p>
-        </w:tc>
-        <w:tc>
-          <w:tcPr/>
-          <w:p>
-            <w:pPr>
-              <w:pStyle w:val="Compact"/>
-              <w:jc w:val="left"/>
-            </w:pPr>
-            <w:r>
-              <w:t xml:space="preserve">wave</w:t>
-            </w:r>
-          </w:p>
-        </w:tc>
-        <w:tc>
-          <w:tcPr/>
-          <w:p>
-            <w:pPr>
-              <w:pStyle w:val="Compact"/>
-              <w:jc w:val="left"/>
-            </w:pPr>
-            <w:r>
-              <w:t xml:space="preserve">dummy theo sóng điều tra</w:t>
+              <w:t xml:space="preserve">đợt hiệu ứng cố định</w:t>
+            </w:r>
+          </w:p>
+        </w:tc>
+        <w:tc>
+          <w:tcPr/>
+          <w:p>
+            <w:pPr>
+              <w:pStyle w:val="Compact"/>
+              <w:jc w:val="left"/>
+            </w:pPr>
+            <w:r>
+              <w:t xml:space="preserve">đợt</w:t>
+            </w:r>
+          </w:p>
+        </w:tc>
+        <w:tc>
+          <w:tcPr/>
+          <w:p>
+            <w:pPr>
+              <w:pStyle w:val="Compact"/>
+              <w:jc w:val="left"/>
+            </w:pPr>
+            <w:r>
+              <w:t xml:space="preserve">biến giả theo sóng điều tra</w:t>
             </w:r>
           </w:p>
         </w:tc>
@@ -21774,7 +21774,7 @@
           <w:iCs/>
           <w:i/>
         </w:rPr>
-        <w:t xml:space="preserve">Ghi chú: CSS_z (DAI) là proxy tĩnh Tier-1 (website binary c22b). WBES không thu thập đủ thang đo cho số hoá động tại các đảo nhỏ, KHÔNG gọi là</w:t>
+        <w:t xml:space="preserve">Ghi chú: CSS_z (DAI) là biến đại diện tĩnh Tier-1 (website binary c22b). WBES không thu thập đủ thang đo cho số hoá động tại các đảo nhỏ, KHÔNG gọi là</w:t>
       </w:r>
       <w:r>
         <w:rPr>
@@ -21829,7 +21829,7 @@
         <w:pStyle w:val="BodyText"/>
       </w:pPr>
       <w:r>
-        <w:t xml:space="preserve">M0, Baseline kiểm soát:</w:t>
+        <w:t xml:space="preserve">M0, cơ sở kiểm soát:</w:t>
       </w:r>
     </w:p>
     <w:p>
@@ -23930,7 +23930,7 @@
               <w:jc w:val="left"/>
             </w:pPr>
             <w:r>
-              <w:t xml:space="preserve">Số hoá, proxy tĩnh</w:t>
+              <w:t xml:space="preserve">Số hoá, biến đại diện tĩnh</w:t>
             </w:r>
           </w:p>
         </w:tc>
@@ -24156,19 +24156,19 @@
               <w:jc w:val="left"/>
             </w:pPr>
             <w:r>
-              <w:t xml:space="preserve">wave</w:t>
-            </w:r>
-          </w:p>
-        </w:tc>
-        <w:tc>
-          <w:tcPr/>
-          <w:p>
-            <w:pPr>
-              <w:pStyle w:val="Compact"/>
-              <w:jc w:val="left"/>
-            </w:pPr>
-            <w:r>
-              <w:t xml:space="preserve">wave FE</w:t>
+              <w:t xml:space="preserve">đợt</w:t>
+            </w:r>
+          </w:p>
+        </w:tc>
+        <w:tc>
+          <w:tcPr/>
+          <w:p>
+            <w:pPr>
+              <w:pStyle w:val="Compact"/>
+              <w:jc w:val="left"/>
+            </w:pPr>
+            <w:r>
+              <w:t xml:space="preserve">đợt FE</w:t>
             </w:r>
           </w:p>
         </w:tc>
@@ -24508,7 +24508,7 @@
         <w:pStyle w:val="FirstParagraph"/>
       </w:pPr>
       <w:r>
-        <w:t xml:space="preserve">Loại trừ micro firms (&lt;5 lao động); chỉ giữ SMEs; chỉ giữ manufacturing; chỉ giữ doanh nghiệp xuất khẩu (FSTS &gt; 0); subgroup theo 6 sub-regime ICRV.</w:t>
+        <w:t xml:space="preserve">Loại trừ micro firms (&lt;5 lao động); chỉ giữ SMEs; chỉ giữ manufacturing; chỉ giữ doanh nghiệp xuất khẩu (FSTS &gt; 0); subgroup theo 6 chế độ con ICRV.</w:t>
       </w:r>
     </w:p>
     <w:bookmarkEnd w:id="120"/>
@@ -24672,7 +24672,7 @@
         <w:t xml:space="preserve"> </w:t>
       </w:r>
       <w:r>
-        <w:t xml:space="preserve">của các construct TCI và DAI qua ba thế hệ bảng hỏi WBES: do cấu trúc câu hỏi thay đổi giữa PICS3, Standardized và BREADY, một phần khác biệt theo thời gian có thể phản ánh hiệu ứng schema thay vì thay đổi thực chất (ví dụ mức R&amp;D đo được ở một số nhóm). Luận án giảm thiểu rủi ro này bằng hiệu ứng cố định năm/đợt, chuẩn hóa within country–year, và kiểm tra độ nhạy với biến thể thước đo (Mục 3.5.1); tuy vậy luận án chưa thực hiện kiểm định bất biến đo lường chính thức, nên mọi so sánh xuyên-schema cần được đọc một cách thận trọng.</w:t>
+        <w:t xml:space="preserve">của các cấu trúc TCI và DAI qua ba thế hệ bảng hỏi WBES: do cấu trúc câu hỏi thay đổi giữa PICS3, Standardized và BREADY, một phần khác biệt theo thời gian có thể phản ánh hiệu ứng schema thay vì thay đổi thực chất (ví dụ mức R&amp;D đo được ở một số nhóm). Luận án giảm thiểu rủi ro này bằng hiệu ứng cố định năm/đợt, chuẩn hóa within country–year, và kiểm tra độ nhạy với biến thể thước đo (Mục 3.5.1); tuy vậy luận án chưa thực hiện kiểm định bất biến đo lường chính thức, nên mọi so sánh xuyên-schema cần được đọc một cách thận trọng.</w:t>
       </w:r>
     </w:p>
     <w:bookmarkEnd w:id="125"/>
@@ -24878,7 +24878,7 @@
               <w:jc w:val="left"/>
             </w:pPr>
             <w:r>
-              <w:t xml:space="preserve">Mở rộng coverage, bổ sung digital và 6 sub-regime ICRV moderators</w:t>
+              <w:t xml:space="preserve">Mở rộng coverage, bổ sung digital và 6 chế độ con ICRV moderators</w:t>
             </w:r>
           </w:p>
         </w:tc>
@@ -25046,7 +25046,7 @@
               <w:jc w:val="left"/>
             </w:pPr>
             <w:r>
-              <w:t xml:space="preserve">Non-overlapping construct purity protocol cho WBES; lá chắn số mở rộng (nghiên cứu thành phần P1)</w:t>
+              <w:t xml:space="preserve">Non-overlapping cấu trúc purity protocol cho WBES; lá chắn số mở rộng (nghiên cứu thành phần P1)</w:t>
             </w:r>
           </w:p>
         </w:tc>
@@ -26179,7 +26179,7 @@
           <w:bCs/>
           <w:b/>
         </w:rPr>
-        <w:t xml:space="preserve">proxy gián tiếp</w:t>
+        <w:t xml:space="preserve">biến đại diện gián tiếp</w:t>
       </w:r>
       <w:r>
         <w:t xml:space="preserve"> </w:t>
@@ -27918,7 +27918,7 @@
         <w:pStyle w:val="BodyText"/>
       </w:pPr>
       <w:r>
-        <w:t xml:space="preserve">Đặc biệt đáng lưu ý, kết quả P6 hoàn toàn nhất quán với baseline meta-analysis đã công bố tại hội nghị ICBEF 2024, với</w:t>
+        <w:t xml:space="preserve">Đặc biệt đáng lưu ý, kết quả P6 hoàn toàn nhất quán với cơ sở meta-analysis đã công bố tại hội nghị ICBEF 2024, với</w:t>
       </w:r>
       <w:r>
         <w:t xml:space="preserve"> </w:t>
@@ -32093,7 +32093,7 @@
         </m:r>
       </m:oMath>
       <w:r>
-        <w:t xml:space="preserve">), cho thấy Technological Capability Index không phát huy vai trò điều tiết đáng kể ở bối cảnh Trung Quốc theo mô hình P5. Tương tự, DAI cũng không cho thấy điều tiết có ý nghĩa trong bối cảnh này. Kết quả null về điều tiết tại Trung Quốc có thể phản ánh thực tế rằng năng lực công nghệ đã được phân phối tương đối đồng đều hơn trong mẫu doanh nghiệp xuất khẩu Trung Quốc, làm giảm phương sai đủ để phát hiện hiệu ứng điều tiết.</w:t>
+        <w:t xml:space="preserve">), cho thấy Technological Capability Index không phát huy vai trò điều tiết đáng kể ở bối cảnh Trung Quốc theo mô hình P5. Tương tự, DAI cũng không cho thấy điều tiết có ý nghĩa trong bối cảnh này. kết quả không có ý nghĩa về điều tiết tại Trung Quốc có thể phản ánh thực tế rằng năng lực công nghệ đã được phân phối tương đối đồng đều hơn trong mẫu doanh nghiệp xuất khẩu Trung Quốc, làm giảm phương sai đủ để phát hiện hiệu ứng điều tiết.</w:t>
       </w:r>
     </w:p>
     <w:bookmarkEnd w:id="154"/>
@@ -41439,7 +41439,7 @@
         <w:t xml:space="preserve">Forced Internationalization Penalty (FIP)</w:t>
       </w:r>
       <w:r>
-        <w:t xml:space="preserve">, gánh nặng quốc tế hóa bắt buộc, một construct lý thuyết mới chưa có trong văn liệu IB trước đây. Cơ chế giải thích gồm ba yếu tố cấu trúc đặc thù của SIDS: (1) thị trường nội địa quá nhỏ, buộc doanh nghiệp SIDS xuất khẩu không phải vì có lợi thế cạnh tranh mà vì nhu cầu nội địa không đủ để duy trì hoạt động; (2) chi phí hậu cần và tiếp cận thị trường cực cao do vị trí địa lý xa xôi và phân tán; và (3) thiếu hỗ trợ thể chế và năng lực xuất khẩu.</w:t>
+        <w:t xml:space="preserve">, gánh nặng quốc tế hóa bắt buộc, một cấu trúc lý thuyết mới chưa có trong văn liệu IB trước đây. Cơ chế giải thích gồm ba yếu tố cấu trúc đặc thù của SIDS: (1) thị trường nội địa quá nhỏ, buộc doanh nghiệp SIDS xuất khẩu không phải vì có lợi thế cạnh tranh mà vì nhu cầu nội địa không đủ để duy trì hoạt động; (2) chi phí hậu cần và tiếp cận thị trường cực cao do vị trí địa lý xa xôi và phân tán; và (3) thiếu hỗ trợ thể chế và năng lực xuất khẩu.</w:t>
       </w:r>
     </w:p>
     <w:p>
@@ -50311,7 +50311,7 @@
               <w:jc w:val="left"/>
             </w:pPr>
             <w:r>
-              <w:t xml:space="preserve">null (Tier-1)</w:t>
+              <w:t xml:space="preserve">không có ý nghĩa (Tier-1)</w:t>
             </w:r>
           </w:p>
         </w:tc>
@@ -51064,7 +51064,7 @@
               <w:t xml:space="preserve">, 50 nền); tương tác đường cong cùng chiều nén nhưng không ý nghĩa toàn mẫu; bằng chứng điều tiết rõ nhất ở bối cảnh đơn quốc gia (P4: FSTS²×DAI = +3,119</w:t>
             </w:r>
             <w:r>
-              <w:t xml:space="preserve">); null tại Việt Nam (Tier-1) tương thích với hạn chế đo lường</w:t>
+              <w:t xml:space="preserve">); không có ý nghĩa tại Việt Nam (Tier-1) tương thích với hạn chế đo lường</w:t>
             </w:r>
           </w:p>
         </w:tc>
@@ -52292,7 +52292,7 @@
         <w:t xml:space="preserve">cả một chế độ thể chế</w:t>
       </w:r>
       <w:r>
-        <w:t xml:space="preserve">, được vận hành hóa thành sáu sub-regime ICRV, xác định điều kiện biên cho quan hệ I–P. Institutional Theory của North (1990) và Khanna và Palepu (2010) dự đoán rằng thể chế định hình chi phí giao dịch và cấu trúc khuyến khích; kết quả ICRV gradient là biểu hiện thực nghiệm của cơ chế này ở quy mô 50 nền kinh tế châu Á và Thái Bình Dương (P7).</w:t>
+        <w:t xml:space="preserve">, được vận hành hóa thành sáu chế độ con ICRV, xác định điều kiện biên cho quan hệ I–P. Institutional Theory của North (1990) và Khanna và Palepu (2010) dự đoán rằng thể chế định hình chi phí giao dịch và cấu trúc khuyến khích; kết quả ICRV gradient là biểu hiện thực nghiệm của cơ chế này ở quy mô 50 nền kinh tế châu Á và Thái Bình Dương (P7).</w:t>
       </w:r>
     </w:p>
     <w:p>
@@ -52802,7 +52802,7 @@
         </m:r>
       </m:oMath>
       <w:r>
-        <w:t xml:space="preserve">). Tại Việt Nam (P3, Tier-1 only, IV-estimated), DAI null phản ánh hạn chế đo lường và thiên lệch chọn lựa hơn là bác bỏ H3.</w:t>
+        <w:t xml:space="preserve">). Tại Việt Nam (P3, Tier-1 only, IV-estimated), DAI không có ý nghĩa phản ánh hạn chế đo lường và thiên lệch chọn lựa hơn là bác bỏ H3.</w:t>
       </w:r>
     </w:p>
     <w:p>
@@ -52850,7 +52850,7 @@
         <w:pStyle w:val="BodyText"/>
       </w:pPr>
       <w:r>
-        <w:t xml:space="preserve">Cần lưu ý rằng kết quả null về DAI tại Việt Nam (P3) và các bối cảnh thấp hơn không nhất thiết bác bỏ H3, mà còn phản ánh hạn chế đo lường: Tier-1 DAI (website, email, online sales) chưa nắm bắt được chiều sâu của năng lực số. Khi DAI được đo bằng Tier-1+2 (bổ sung e-payment, e-supplier) như tại Singapore, hiệu ứng điều tiết xuất hiện rõ ràng hơn. Quan trọng hơn, tất cả đo lường DAI trong luận án đều là</w:t>
+        <w:t xml:space="preserve">Cần lưu ý rằng kết quả không có ý nghĩa về DAI tại Việt Nam (P3) và các bối cảnh thấp hơn không nhất thiết bác bỏ H3, mà còn phản ánh hạn chế đo lường: Tier-1 DAI (website, email, online sales) chưa nắm bắt được chiều sâu của năng lực số. Khi DAI được đo bằng Tier-1+2 (bổ sung e-payment, e-supplier) như tại Singapore, hiệu ứng điều tiết xuất hiện rõ ràng hơn. Quan trọng hơn, tất cả đo lường DAI trong luận án đều là</w:t>
       </w:r>
       <w:r>
         <w:t xml:space="preserve"> </w:t>
@@ -53056,7 +53056,7 @@
         <w:pStyle w:val="BodyText"/>
       </w:pPr>
       <w:r>
-        <w:t xml:space="preserve">Tuy nhiên, cần lưu ý rằng tác động này được phát hiện ở cấp gộp toàn mẫu (P7) và cần kiểm định riêng biệt theo từng bối cảnh ICRV để hiểu đầy đủ điều kiện biên của biến điều tiết cấp quản trị. Kết quả null về kinh nghiệm nhà quản trị (mgr_experience) gợi ý rằng trong bối cảnh châu Á đa dạng, số năm kinh nghiệm đơn thuần không nắm bắt được</w:t>
+        <w:t xml:space="preserve">Tuy nhiên, cần lưu ý rằng tác động này được phát hiện ở cấp gộp toàn mẫu (P7) và cần kiểm định riêng biệt theo từng bối cảnh ICRV để hiểu đầy đủ điều kiện biên của biến điều tiết cấp quản trị. kết quả không có ý nghĩa về kinh nghiệm nhà quản trị (mgr_experience) gợi ý rằng trong bối cảnh châu Á đa dạng, số năm kinh nghiệm đơn thuần không nắm bắt được</w:t>
       </w:r>
       <w:r>
         <w:t xml:space="preserve"> </w:t>
@@ -53334,13 +53334,13 @@
         <w:t xml:space="preserve">5.2 So sánh với nghiên cứu trước đây</w:t>
       </w:r>
     </w:p>
-    <w:bookmarkStart w:id="204" w:name="nhất-quán-với-baseline-icbef-2024"/>
+    <w:bookmarkStart w:id="204" w:name="nhất-quán-với-cơ-sở-icbef-2024"/>
     <w:p>
       <w:pPr>
         <w:pStyle w:val="Heading3"/>
       </w:pPr>
       <w:r>
-        <w:t xml:space="preserve">5.2.1 Nhất quán với baseline ICBEF 2024</w:t>
+        <w:t xml:space="preserve">5.2.1 Nhất quán với cơ sở ICBEF 2024</w:t>
       </w:r>
     </w:p>
     <w:p>
@@ -53412,7 +53412,7 @@
         <w:t xml:space="preserve"> </w:t>
       </w:r>
       <w:r>
-        <w:t xml:space="preserve">từ meta-analysis baseline đã công bố tại hội nghị ICBEF 2024 (nghiên cứu thành phần P1–P2 của luận án). Sự hội tụ này là đáng kể vì P6 mở rộng pool lên</w:t>
+        <w:t xml:space="preserve">từ meta-analysis cơ sở đã công bố tại hội nghị ICBEF 2024 (nghiên cứu thành phần P1–P2 của luận án). Sự hội tụ này là đáng kể vì P6 mở rộng pool lên</w:t>
       </w:r>
       <w:r>
         <w:t xml:space="preserve"> </w:t>
@@ -53455,7 +53455,7 @@
         </m:r>
       </m:oMath>
       <w:r>
-        <w:t xml:space="preserve">, đồng thời áp dụng cấu trúc ba tầng phức tạp hơn. Tính vững của gộp effect khi mở rộng pool nghiên cứu là bằng chứng về tính ổn định của baseline ước lượng.</w:t>
+        <w:t xml:space="preserve">, đồng thời áp dụng cấu trúc ba tầng phức tạp hơn. Tính vững của gộp effect khi mở rộng pool nghiên cứu là bằng chứng về tính ổn định của cơ sở ước lượng.</w:t>
       </w:r>
     </w:p>
     <w:p>
@@ -53463,7 +53463,7 @@
         <w:pStyle w:val="BodyText"/>
       </w:pPr>
       <w:r>
-        <w:t xml:space="preserve">Tuy nhiên, đóng góp của P6 so với baseline không phải ở gộp</w:t>
+        <w:t xml:space="preserve">Tuy nhiên, đóng góp của P6 so với cơ sở không phải ở gộp</w:t>
       </w:r>
       <w:r>
         <w:t xml:space="preserve"> </w:t>
@@ -53555,7 +53555,7 @@
         <w:pStyle w:val="FirstParagraph"/>
       </w:pPr>
       <w:r>
-        <w:t xml:space="preserve">Lu và Beamish (2004) và Contractor et al. (2003) là hai công trình nền tảng về quan hệ phi tuyến I–P. Lu và Beamish (2004) tìm điểm uốn khoảng 60% FSTS trong mẫu doanh nghiệp Nhật Bản, trong khi Contractor et al. (2003) đề xuất S-curve ba giai đoạn. Luận án này vượt qua hai công trình đó theo ba hướng:</w:t>
+        <w:t xml:space="preserve">Lu và Beamish (2004) và Contractor et al. (2003) là hai công trình nền tảng về quan hệ phi tuyến I–P. Lu và Beamish (2004) tìm điểm uốn khoảng 60% FSTS trong mẫu doanh nghiệp Nhật Bản, trong khi Contractor et al. (2003) đề xuất đường cong chữ S ba giai đoạn. Luận án này vượt qua hai công trình đó theo ba hướng:</w:t>
       </w:r>
     </w:p>
     <w:p>
@@ -53601,7 +53601,7 @@
         <w:t xml:space="preserve">Thứ hai</w:t>
       </w:r>
       <w:r>
-        <w:t xml:space="preserve">, luận án xác định trường hợp biên FIP tại SIDS, không phải là S-curve hay chữ U ngược mà là quan hệ âm đơn điệu, điều mà cả ba-stage theory lẫn S-curve không dự báo được.</w:t>
+        <w:t xml:space="preserve">, luận án xác định trường hợp biên FIP tại SIDS, không phải là đường cong chữ S hay chữ U ngược mà là quan hệ âm đơn điệu, điều mà cả ba-stage theory lẫn đường cong chữ S không dự báo được.</w:t>
       </w:r>
     </w:p>
     <w:p>
@@ -53655,7 +53655,7 @@
         <w:t xml:space="preserve">phân loại đa chiều</w:t>
       </w:r>
       <w:r>
-        <w:t xml:space="preserve">: ICRV sáu sub-regime nắm bắt được sự đa dạng trong nội bộ nhóm</w:t>
+        <w:t xml:space="preserve">: ICRV sáu chế độ con nắm bắt được sự đa dạng trong nội bộ nhóm</w:t>
       </w:r>
       <w:r>
         <w:t xml:space="preserve"> </w:t>
@@ -53923,7 +53923,7 @@
         <w:t xml:space="preserve">Forced Internationalization Penalty (FIP)</w:t>
       </w:r>
       <w:r>
-        <w:t xml:space="preserve">, một construct lý thuyết mới chưa được định danh trong văn liệu kinh doanh quốc tế, như một hiện tượng lý thuyết độc lập, khác biệt về bản chất với</w:t>
+        <w:t xml:space="preserve">, một cấu trúc lý thuyết mới chưa được định danh trong văn liệu kinh doanh quốc tế, như một hiện tượng lý thuyết độc lập, khác biệt về bản chất với</w:t>
       </w:r>
       <w:r>
         <w:t xml:space="preserve"> </w:t>
@@ -53941,7 +53941,7 @@
         <w:t xml:space="preserve"> </w:t>
       </w:r>
       <w:r>
-        <w:t xml:space="preserve">trong S-curve theory. FIP không phải là giai đoạn đầu của quá trình học hỏi (learning costs) như mô hình Uppsala dự đoán, mà là một trạng thái cấu trúc bất lợi dài hạn: doanh nghiệp SIDS phải xuất khẩu để tồn tại (do thị trường nội địa quá nhỏ) nhưng không có năng lực và môi trường để đạt lợi thế từ xuất khẩu.</w:t>
+        <w:t xml:space="preserve">trong đường cong chữ S theory. FIP không phải là giai đoạn đầu của quá trình học hỏi (learning costs) như mô hình Uppsala dự đoán, mà là một trạng thái cấu trúc bất lợi dài hạn: doanh nghiệp SIDS phải xuất khẩu để tồn tại (do thị trường nội địa quá nhỏ) nhưng không có năng lực và môi trường để đạt lợi thế từ xuất khẩu.</w:t>
       </w:r>
     </w:p>
     <w:p>
@@ -54038,7 +54038,7 @@
           <w:bCs/>
           <w:b/>
         </w:rPr>
-        <w:t xml:space="preserve">khung ICRV sáu sub-regime</w:t>
+        <w:t xml:space="preserve">khung ICRV sáu chế độ con</w:t>
       </w:r>
       <w:r>
         <w:t xml:space="preserve"> </w:t>
@@ -54507,7 +54507,7 @@
           <w:bCs/>
           <w:b/>
         </w:rPr>
-        <w:t xml:space="preserve">static</w:t>
+        <w:t xml:space="preserve">tĩnh</w:t>
       </w:r>
       <w:r>
         <w:t xml:space="preserve"> </w:t>
@@ -54788,7 +54788,7 @@
         <w:t xml:space="preserve"> </w:t>
       </w:r>
       <w:r>
-        <w:t xml:space="preserve">(đã công bố tại ICBEF 2024): thiết lập baseline meta-analytic với</w:t>
+        <w:t xml:space="preserve">(đã công bố tại ICBEF 2024): thiết lập cơ sở meta-analytic với</w:t>
       </w:r>
       <w:r>
         <w:t xml:space="preserve"> </w:t>

</xml_diff>

<commit_message>
docs(thesis): deepen Ch1 introduction + finalize code-mixing capitalization
Added 6 grounded Ch1 blocks (§1.1.2 three-force convergence, sharpened research gap,
§1.8.1 CDCM/ICRV/FIP architecture, §1.8.3 regime-specific policy, tightened novelty
statement, §1.5.4 scope & delimitations). Citations Hennart (2007), Berry & Kaul (2016),
Pisani et al. (2020) verified present in references; no fabricated numbers. Ch1
5,774→7,667 words. Also applied the Anh–Việt standardization to Ch1 (heterogeneity→dị
biệt, construct→cấu trúc, Upper Echelons Theory→lý thuyết thượng tầng quản trị,
institutional voids→khoảng trống thể chế, digitization/digitalization/transformation→
số hóa thông tin/quy trình/chuyển đổi số toàn diện) and capitalized sentence-initial
replaced terms across all five chapters.

MILESTONE: all five chapters (Ch1–5) now expanded; main content = 106 pages (LaTeX
render), comfortably above the CTU QĐ 1799 minimum of 100. Total dissertation 148 pp.
</commit_message>
<xml_diff>
--- a/dist/luan_an_ctu/LUAN_AN_FULL_vi.docx
+++ b/dist/luan_an_ctu/LUAN_AN_FULL_vi.docx
@@ -2746,7 +2746,7 @@
         </w:pict>
       </w:r>
     </w:p>
-    <w:bookmarkStart w:id="31" w:name="bối-cảnh-nghiên-cứu"/>
+    <w:bookmarkStart w:id="32" w:name="bối-cảnh-nghiên-cứu"/>
     <w:p>
       <w:pPr>
         <w:pStyle w:val="Heading2"/>
@@ -2776,7 +2776,7 @@
         <w:pStyle w:val="BodyText"/>
       </w:pPr>
       <w:r>
-        <w:t xml:space="preserve">Chuyển đổi số đang làm thay đổi căn bản cách thức doanh nghiệp quốc tế hóa và cách thức quốc tế hóa ảnh hưởng đến hiệu quả hoạt động. Banalieva và Dhanaraj (2019) lập luận rằng lý thuyết nội địa hóa cần được cập nhật cho nền kinh tế số, vì dữ liệu số và tương tác qua nền tảng làm giảm sự phụ thuộc vào hiện diện vật lý. Stallkamp và Schotter (2021) chỉ ra rằng các nền tảng số quốc tế hóa theo logic hoàn toàn khác các công ty đa quốc gia truyền thống. Verhoef et al. (2021) cung cấp khung phân tầng ba cấp từ digitization đến digitalization và digital transformation. Tuy nhiên, phần lớn bằng chứng thực nghiệm hiện có về vai trò của năng lực số trong quan hệ I–P vẫn tập trung vào các nền kinh tế phát triển, đặc biệt là Bắc Mỹ và Tây Âu, trong khi bằng chứng cho châu Á mới nổi còn rất hạn chế (Bhandari et al., 2023).</w:t>
+        <w:t xml:space="preserve">Chuyển đổi số đang làm thay đổi căn bản cách thức doanh nghiệp quốc tế hóa và cách thức quốc tế hóa ảnh hưởng đến hiệu quả hoạt động. Banalieva và Dhanaraj (2019) lập luận rằng lý thuyết nội địa hóa cần được cập nhật cho nền kinh tế số, vì dữ liệu số và tương tác qua nền tảng làm giảm sự phụ thuộc vào hiện diện vật lý. Stallkamp và Schotter (2021) chỉ ra rằng các nền tảng số quốc tế hóa theo logic hoàn toàn khác các công ty đa quốc gia truyền thống. Verhoef et al. (2021) cung cấp khung phân tầng ba cấp từ số hóa thông tin đến số hóa quy trình và chuyển đổi số toàn diện. Tuy nhiên, phần lớn bằng chứng thực nghiệm hiện có về vai trò của năng lực số trong quan hệ I–P vẫn tập trung vào các nền kinh tế phát triển, đặc biệt là Bắc Mỹ và Tây Âu, trong khi bằng chứng cho châu Á mới nổi còn rất hạn chế (Bhandari et al., 2023).</w:t>
       </w:r>
     </w:p>
     <w:p>
@@ -2784,7 +2784,7 @@
         <w:pStyle w:val="BodyText"/>
       </w:pPr>
       <w:r>
-        <w:t xml:space="preserve">Không thể bỏ qua vai trò của thể chế trong việc hình thành kết quả quốc tế hóa. Institutional Theory (North, 1990; Khanna &amp; Palepu, 2010) khẳng định rằng thể chế tạo ra cấu trúc khuyến khích và chi phí giao dịch khác nhau giữa các quốc gia. Ở các thị trường mới nổi,</w:t>
+        <w:t xml:space="preserve">Không thể bỏ qua vai trò của thể chế trong việc hình thành kết quả quốc tế hóa. Lý thuyết thể chế (North, 1990; Khanna &amp; Palepu, 2010) khẳng định rằng thể chế tạo ra cấu trúc khuyến khích và chi phí giao dịch khác nhau giữa các quốc gia. Ở các thị trường mới nổi,</w:t>
       </w:r>
       <w:r>
         <w:t xml:space="preserve"> </w:t>
@@ -2793,7 +2793,7 @@
         <w:t xml:space="preserve">“</w:t>
       </w:r>
       <w:r>
-        <w:t xml:space="preserve">institutional voids</w:t>
+        <w:t xml:space="preserve">khoảng trống thể chế</w:t>
       </w:r>
       <w:r>
         <w:t xml:space="preserve">”</w:t>
@@ -2807,7 +2807,7 @@
         <w:pStyle w:val="BodyText"/>
       </w:pPr>
       <w:r>
-        <w:t xml:space="preserve">Cuối cùng, nhà quản trị cấp cao đóng vai trò không thể bỏ qua trong việc hình thành chiến lược và kết quả quốc tế hóa. Upper Echelons Theory (Hambrick &amp; Mason, 1984) khẳng định rằng quyết định chiến lược phản ánh đặc điểm nhận thức, kinh nghiệm và giá trị của nhà quản trị. Kinh nghiệm quốc tế giúp nhà quản trị nhận diện cơ hội và giảm chi phí của liability of foreignness, trong khi sự đa dạng giới tính ở cấp lãnh đạo có thể tăng cường quản trị rủi ro và ra quyết định đa chiều (Hsu et al., 2013; Post &amp; Byron, 2015). Tích hợp tầng nhà quản trị vào khung giải thích đa tầng là cần thiết để phản ánh đầy đủ sự phức tạp của quan hệ I–P trong bối cảnh châu Á.</w:t>
+        <w:t xml:space="preserve">Cuối cùng, nhà quản trị cấp cao đóng vai trò không thể bỏ qua trong việc hình thành chiến lược và kết quả quốc tế hóa. Lý thuyết thượng tầng quản trị (Hambrick &amp; Mason, 1984) khẳng định rằng quyết định chiến lược phản ánh đặc điểm nhận thức, kinh nghiệm và giá trị của nhà quản trị. Kinh nghiệm quốc tế giúp nhà quản trị nhận diện cơ hội và giảm chi phí của gánh nặng người nước ngoài, trong khi sự đa dạng giới tính ở cấp lãnh đạo có thể tăng cường quản trị rủi ro và ra quyết định đa chiều (Hsu et al., 2013; Post &amp; Byron, 2015). Tích hợp tầng nhà quản trị vào khung giải thích đa tầng là cần thiết để phản ánh đầy đủ sự phức tạp của quan hệ I–P trong bối cảnh châu Á.</w:t>
       </w:r>
     </w:p>
     <w:bookmarkStart w:id="30" w:name="Xc1dcee8f5373723512b0db114b71fe5e38a510a"/>
@@ -2934,8 +2934,42 @@
       </w:r>
     </w:p>
     <w:bookmarkEnd w:id="30"/>
+    <w:bookmarkStart w:id="31" w:name="X346fcb4d6ebbabf90a0e086a0b893e2cbb8cd87"/>
+    <w:p>
+      <w:pPr>
+        <w:pStyle w:val="Heading3"/>
+      </w:pPr>
+      <w:r>
+        <w:t xml:space="preserve">1.1.2 Hội tụ của ba lực dịch chuyển vào câu hỏi cấp doanh nghiệp</w:t>
+      </w:r>
+    </w:p>
+    <w:p>
+      <w:pPr>
+        <w:pStyle w:val="FirstParagraph"/>
+      </w:pPr>
+      <w:r>
+        <w:t xml:space="preserve">Ba lực dịch chuyển vĩ mô nêu trên không tác động độc lập mà giao thoa theo cách làm sắc nét thêm câu hỏi nghiên cứu ở cấp doanh nghiệp. Áp lực việc làm ở các nền kinh tế biên chỉ được hóa giải nếu khu vực doanh nghiệp tạo ra được việc làm năng suất cao, mà nguồn năng suất quan trọng nhất ở các nền kinh tế nhỏ và mở chính là sự tham gia hiệu quả vào thị trường quốc tế. Do đó, câu hỏi về điều kiện để quốc tế hóa cải thiện hiệu quả doanh nghiệp gắn trực tiếp với năng lực hấp thụ lực lượng lao động trẻ đang gia tăng nhanh trong khu vực.</w:t>
+      </w:r>
+    </w:p>
+    <w:p>
+      <w:pPr>
+        <w:pStyle w:val="BodyText"/>
+      </w:pPr>
+      <w:r>
+        <w:t xml:space="preserve">Gradient thể chế (institutional gradient) là trục tổ chức xuyên suốt của luận án. Khu vực châu Á và lân cận trải dài từ những nền kinh tế đổi mới dẫn dắt với pháp quyền mạnh đến những nền kinh tế đảo nhỏ có hạ tầng thể chế sơ khai, tạo ra một dải biến thiên thể chế hiếm có để kiểm định liệu cùng một mức độ quốc tế hóa có tạo ra kết quả khác nhau theo chế độ thể chế hay không. Chính dải biến thiên này, chứ không phải một quốc gia đơn lẻ, là điều kiện cho phép phân biệt giữa giả thuyết về một quy luật phổ quát và giả thuyết về một quan hệ có điều kiện.</w:t>
+      </w:r>
+    </w:p>
+    <w:p>
+      <w:pPr>
+        <w:pStyle w:val="BodyText"/>
+      </w:pPr>
+      <w:r>
+        <w:t xml:space="preserve">Kỷ nguyên số bổ sung một chiều phức tạp mới. Khi công cụ số trở nên phổ cập, ranh giới giữa chiều sâu năng lực công nghệ nội tại và mức độ chấp nhận công cụ số bề mặt dễ bị xóa nhòa trong đo lường, dẫn đến nguy cơ quy hai cơ chế khác nhau về một hiệu ứng đồng nhất. Vì hai loại năng lực số này có thể tác động trái chiều theo chế độ thể chế, việc giữ chúng tách biệt trở thành điều kiện tiên quyết để rút ra hàm ý chính sách chính xác cho từng nhóm nền kinh tế trong khu vực.</w:t>
+      </w:r>
+    </w:p>
     <w:bookmarkEnd w:id="31"/>
-    <w:bookmarkStart w:id="32" w:name="vấn-đề-nghiên-cứu"/>
+    <w:bookmarkEnd w:id="32"/>
+    <w:bookmarkStart w:id="33" w:name="vấn-đề-nghiên-cứu"/>
     <w:p>
       <w:pPr>
         <w:pStyle w:val="Heading2"/>
@@ -2949,7 +2983,7 @@
         <w:pStyle w:val="FirstParagraph"/>
       </w:pPr>
       <w:r>
-        <w:t xml:space="preserve">Mặc dù đã có hàng trăm nghiên cứu thực nghiệm, bằng chứng về mối quan hệ giữa quốc tế hóa và hiệu quả hoạt động của doanh nghiệp vẫn chưa thống nhất và tản mạn. Các phân tích tổng hợp (meta-analyses) về quan hệ I–P liên tục cho thấy tác động tổng hợp là dương nhưng nhỏ, hệ số tương quan tổng hợp r trong khoảng 0,07–0,13, đồng thời mức độ dị biệt giữa các nghiên cứu rất cao với I² thường vượt 80% (Bausch &amp; Krist, 2007; Kirca et al., 2012; Marano et al., 2016; Wu et al., 2022). Tình trạng dị biệt cao này không phải là tín hiệu của sai sót phương pháp, mà là bằng chứng cho thấy quan hệ I–P phụ thuộc sâu sắc vào điều kiện bối cảnh. Arte và Larimo (2022) lập luận rằng heterogeneity cao gợi ý sự cần thiết phải chuyển dịch từ mô hình đơn biến sang khung đa tầng có tính đến thể chế, năng lực và đặc điểm nhà quản trị.</w:t>
+        <w:t xml:space="preserve">Mặc dù đã có hàng trăm nghiên cứu thực nghiệm, bằng chứng về mối quan hệ giữa quốc tế hóa và hiệu quả hoạt động của doanh nghiệp vẫn chưa thống nhất và tản mạn. Các phân tích tổng hợp (meta-analyses) về quan hệ I–P liên tục cho thấy tác động tổng hợp là dương nhưng nhỏ, hệ số tương quan tổng hợp r trong khoảng 0,07–0,13, đồng thời mức độ dị biệt giữa các nghiên cứu rất cao với I² thường vượt 80% (Bausch &amp; Krist, 2007; Kirca et al., 2012; Marano et al., 2016; Wu et al., 2022). Tình trạng dị biệt cao này không phải là tín hiệu của sai sót phương pháp, mà là bằng chứng cho thấy quan hệ I–P phụ thuộc sâu sắc vào điều kiện bối cảnh. Arte và Larimo (2022) lập luận rằng dị biệt cao gợi ý sự cần thiết phải chuyển dịch từ mô hình đơn biến sang khung đa tầng có tính đến thể chế, năng lực và đặc điểm nhà quản trị.</w:t>
       </w:r>
     </w:p>
     <w:p>
@@ -2957,7 +2991,7 @@
         <w:pStyle w:val="BodyText"/>
       </w:pPr>
       <w:r>
-        <w:t xml:space="preserve">Ba khoảng trống nghiên cứu quan trọng được xác định từ tổng quan tài liệu. Khoảng trống thứ nhất là thiếu khung lý thuyết tích hợp đủ sức giải thích heterogeneity cao đó. Các nghiên cứu hiện tại thường chọn một hoặc hai lý thuyết làm nền, dẫn đến mô hình không đủ đa tầng để nắm bắt sự phức tạp thực tế. Uppsala model giải thích chi phí học hỏi nhưng không đủ để xử lý vai trò của thể chế; RBV giải thích sự khác biệt năng lực nhưng bỏ qua macro-context; Institutional Theory giải thích bối cảnh vĩ mô nhưng không tích hợp đặc điểm cá nhân nhà quản trị. Không một lý thuyết nào đứng riêng có thể giải thích đầy đủ heterogeneity đó. Khoảng trống thứ hai là sự đồng nhất không hợp lý giữa hai construct số khác nhau về bản chất: technological capability, chiều sâu năng lực công nghệ nhập vào tổ chức, và digital adoption, mức độ áp dụng công cụ số bề mặt trong hoạt động kinh doanh. Nhiều nghiên cứu trước gộp hai construct này thành một chỉ số composite duy nhất, điều này làm giảm độ chính xác của kết luận và có thể che khuất các cơ chế tác động khác nhau (Bharadwaj et al., 2013; Coltman et al., 2008; Verhoef et al., 2021). Khoảng trống thứ ba là thiếu bằng chứng cross-country quy mô lớn cho châu Á. Phần lớn nghiên cứu hiện có tập trung vào một quốc gia hoặc một tiểu vùng, và thậm chí khi có nghiên cứu đa quốc gia, phạm vi thường hẹp và thiếu sự đa dạng thể chế đủ lớn để kiểm định các điều kiện biên có ý nghĩa.</w:t>
+        <w:t xml:space="preserve">Ba khoảng trống nghiên cứu quan trọng được xác định từ tổng quan tài liệu. Khoảng trống thứ nhất là thiếu khung lý thuyết tích hợp đủ sức giải thích dị biệt cao đó. Các nghiên cứu hiện tại thường chọn một hoặc hai lý thuyết làm nền, dẫn đến mô hình không đủ đa tầng để nắm bắt sự phức tạp thực tế. Mô hình Uppsala giải thích chi phí học hỏi nhưng không đủ để xử lý vai trò của thể chế; RBV giải thích sự khác biệt năng lực nhưng bỏ qua bối cảnh vĩ mô; lý thuyết thể chế giải thích bối cảnh vĩ mô nhưng không tích hợp đặc điểm cá nhân nhà quản trị. Không một lý thuyết nào đứng riêng có thể giải thích đầy đủ dị biệt đó. Khoảng trống thứ hai là sự đồng nhất không hợp lý giữa hai cấu trúc số khác nhau về bản chất: năng lực công nghệ, chiều sâu năng lực công nghệ nhập vào tổ chức, và chấp nhận số, mức độ áp dụng công cụ số bề mặt trong hoạt động kinh doanh. Nhiều nghiên cứu trước gộp hai cấu trúc này thành một chỉ số chỉ số hợp thành duy nhất, điều này làm giảm độ chính xác của kết luận và có thể che khuất các cơ chế tác động khác nhau (Bharadwaj et al., 2013; Coltman et al., 2008; Verhoef et al., 2021). Khoảng trống thứ ba là thiếu bằng chứng đa quốc gia quy mô lớn cho châu Á. Phần lớn nghiên cứu hiện có tập trung vào một quốc gia hoặc một tiểu vùng, và thậm chí khi có nghiên cứu đa quốc gia, phạm vi thường hẹp và thiếu sự đa dạng thể chế đủ lớn để kiểm định các điều kiện biên có ý nghĩa.</w:t>
       </w:r>
     </w:p>
     <w:p>
@@ -2965,7 +2999,31 @@
         <w:pStyle w:val="BodyText"/>
       </w:pPr>
       <w:r>
-        <w:t xml:space="preserve">Luận án này được thiết kế để giải quyết ba khoảng trống đó bằng cách xây dựng và kiểm định một khung giải thích đa tầng cho quan hệ I–P tại châu Á, với thiết kế mixed synthesis-empirical kết hợp meta-analysis và phân tích đa quốc gia quy mô lớn. Trọng tâm khoa học của luận án là vai trò điều tiết của thể chế, năng lực số và đặc điểm nhà quản trị, ba tầng điều tiết mà, theo lập luận của luận án, cùng nhau tạo nên cấu trúc giải thích cần thiết cho heterogeneity cao trong quan hệ I–P.</w:t>
+        <w:t xml:space="preserve">Ba khoảng trống trên cần được phát biểu sắc nét hơn để làm rõ rằng chúng không phải là ba thiếu sót rời rạc mà là ba biểu hiện của cùng một hạn chế nền tảng: văn liệu hiện hành thiếu một cấu trúc giải thích đủ phân tầng để nắm bắt mức dị biệt cao của quan hệ I–P. Về khoảng trống thứ nhất, không một lý thuyết đơn lẻ nào, dù là mô hình Uppsala, lý thuyết dựa trên nguồn lực hay lý thuyết thể chế, cung cấp được một lý giải đầy đủ cho sự dị biệt đó, bởi mỗi lý thuyết chỉ soi sáng một loại dị biệt và bỏ trống các tầng còn lại. Hennart (2007) cảnh báo rằng quan hệ giữa mức độ đa quốc gia và hiệu quả không phải là quy luật phổ quát tự thân mà phụ thuộc vào bản chất tài sản đặc thù được khai thác xuyên biên giới, hàm ý rằng việc kiểm định một dạng hàm duy nhất cho mọi bối cảnh là không thỏa đáng về mặt lý thuyết.</w:t>
+      </w:r>
+    </w:p>
+    <w:p>
+      <w:pPr>
+        <w:pStyle w:val="BodyText"/>
+      </w:pPr>
+      <w:r>
+        <w:t xml:space="preserve">Về khoảng trống thứ hai, sự đồng nhất không hợp lý giữa năng lực công nghệ và mức độ chấp nhận số không chỉ là vấn đề tinh chỉnh đo lường mà có hệ quả lý thuyết trực tiếp. Khi hai cấu trúc có chiều sâu tổ chức khác nhau bị gộp thành một chỉ số tổng hợp duy nhất, hai cơ chế tác động có thể trái chiều sẽ bị trung bình hóa, làm che khuất chính cơ chế mà nhà quản trị và nhà hoạch định chính sách cần phân biệt khi quyết định đầu tư vào chiều sâu năng lực hay vào công cụ giao diện.</w:t>
+      </w:r>
+    </w:p>
+    <w:p>
+      <w:pPr>
+        <w:pStyle w:val="BodyText"/>
+      </w:pPr>
+      <w:r>
+        <w:t xml:space="preserve">Về khoảng trống thứ ba, sự thiếu đại diện của các nền kinh tế chuyển đổi và các nền kinh tế đảo nhỏ đang phát triển không chỉ thu hẹp phạm vi mẫu mà còn làm suy yếu khả năng kiểm định điều kiện biên của lý thuyết. Các nỗ lực tái lặp quy mô lớn với chiến lược nhận diện chặt chẽ cho thấy dạng hàm chữ U ngược suy yếu đáng kể, thậm chí biến mất, trong các mẫu gộp xuyên quốc gia (Berry &amp; Kaul, 2016; Pisani et al., 2020), củng cố lập luận rằng chính dị biệt bối cảnh, chứ không phải một quy luật phổ quát, mới chi phối kết quả I–P. Đúng các địa điểm cực trị về thể chế, nơi điều kiện biên dễ bộc lộ nhất, lại là nơi văn liệu thiếu vắng bằng chứng nhất.</w:t>
+      </w:r>
+    </w:p>
+    <w:p>
+      <w:pPr>
+        <w:pStyle w:val="BodyText"/>
+      </w:pPr>
+      <w:r>
+        <w:t xml:space="preserve">Luận án này được thiết kế để giải quyết ba khoảng trống đó bằng cách xây dựng và kiểm định một khung giải thích đa tầng cho quan hệ I–P tại châu Á, với thiết kế hỗn hợp tổng hợp–thực nghiệm kết hợp meta-analysis và phân tích đa quốc gia quy mô lớn. Trọng tâm khoa học của luận án là vai trò điều tiết của thể chế, năng lực số và đặc điểm nhà quản trị, ba tầng điều tiết mà, theo lập luận của luận án, cùng nhau tạo nên cấu trúc giải thích cần thiết cho dị biệt cao trong quan hệ I–P.</w:t>
       </w:r>
     </w:p>
     <w:p>
@@ -2975,8 +3033,8 @@
         </w:pict>
       </w:r>
     </w:p>
-    <w:bookmarkEnd w:id="32"/>
-    <w:bookmarkStart w:id="33" w:name="mục-tiêu-nghiên-cứu"/>
+    <w:bookmarkEnd w:id="33"/>
+    <w:bookmarkStart w:id="34" w:name="mục-tiêu-nghiên-cứu"/>
     <w:p>
       <w:pPr>
         <w:pStyle w:val="Heading2"/>
@@ -2998,7 +3056,7 @@
         <w:pStyle w:val="BodyText"/>
       </w:pPr>
       <w:r>
-        <w:t xml:space="preserve">Từ mục tiêu tổng quát đó, luận án triển khai bốn mục tiêu cụ thể. Mục tiêu cụ thể thứ nhất là tổng hợp và cập nhật bằng chứng meta-analytic về mối quan hệ I–P trong giai đoạn 1982–2026, xác định tác động tổng hợp, mức độ dị biệt và các nhân tố điều tiết (các biến điều tiết) chính giải thích heterogeneity trong văn liệu. Mục tiêu cụ thể thứ hai là kiểm định cơ chế cụ thể trong các bối cảnh quốc gia khác nhau, bao gồm Singapore với tư cách nền kinh tế nhỏ mở tiên tiến, Việt Nam với tư cách nền kinh tế chuyển đổi đang mở rộng, và Trung Quốc với tư cách nền kinh tế mới nổi quy mô lớn, nhằm làm rõ cách thức các cơ chế I–P vận hành khác nhau theo bối cảnh quốc gia. Mục tiêu cụ thể thứ ba là mở rộng phân tích sang 50 nền kinh tế châu Á và Thái Bình Dương (bao gồm 7 nền kinh tế Pacific SIDS) để kiểm định khả năng khái quát hóa của các phát hiện trên phạm vi rộng, kế thừa và mở rộng từ pool 17 nền kinh tế trong nghiên cứu thành phần P1. Mục tiêu cụ thể thứ tư là phân tích vai trò điều tiết của ba nhóm biến: thể chế (bao gồm các sub-regime ICRV và các chỉ số rào cản thể chế), năng lực số (phân biệt rõ technological capability index, TCI và chỉ số chấp nhận số, digital adoption index, DAI), và đặc điểm nhà quản trị cấp cao (kinh nghiệm và giới tính).</w:t>
+        <w:t xml:space="preserve">Từ mục tiêu tổng quát đó, luận án triển khai bốn mục tiêu cụ thể. Mục tiêu cụ thể thứ nhất là tổng hợp và cập nhật bằng chứng meta-analytic về mối quan hệ I–P trong giai đoạn 1982–2026, xác định tác động tổng hợp, mức độ dị biệt và các nhân tố điều tiết (các biến điều tiết) chính giải thích dị biệt trong văn liệu. Mục tiêu cụ thể thứ hai là kiểm định cơ chế cụ thể trong các bối cảnh quốc gia khác nhau, bao gồm Singapore với tư cách nền kinh tế nhỏ mở tiên tiến, Việt Nam với tư cách nền kinh tế chuyển đổi đang mở rộng, và Trung Quốc với tư cách nền kinh tế mới nổi quy mô lớn, nhằm làm rõ cách thức các cơ chế I–P vận hành khác nhau theo bối cảnh quốc gia. Mục tiêu cụ thể thứ ba là mở rộng phân tích sang 50 nền kinh tế châu Á và Thái Bình Dương (bao gồm 7 nền kinh tế Pacific SIDS) để kiểm định khả năng khái quát hóa của các phát hiện trên phạm vi rộng, kế thừa và mở rộng từ pool 17 nền kinh tế trong nghiên cứu thành phần P1. Mục tiêu cụ thể thứ tư là phân tích vai trò điều tiết của ba nhóm biến: thể chế (bao gồm các sub-regime ICRV và các chỉ số rào cản thể chế), năng lực số (phân biệt rõ technological capability index, TCI và chỉ số chấp nhận số, digital adoption index, DAI), và đặc điểm nhà quản trị cấp cao (kinh nghiệm và giới tính).</w:t>
       </w:r>
     </w:p>
     <w:p>
@@ -3008,8 +3066,8 @@
         </w:pict>
       </w:r>
     </w:p>
-    <w:bookmarkEnd w:id="33"/>
-    <w:bookmarkStart w:id="34" w:name="câu-hỏi-nghiên-cứu"/>
+    <w:bookmarkEnd w:id="34"/>
+    <w:bookmarkStart w:id="35" w:name="câu-hỏi-nghiên-cứu"/>
     <w:p>
       <w:pPr>
         <w:pStyle w:val="Heading2"/>
@@ -3031,7 +3089,7 @@
         <w:pStyle w:val="BodyText"/>
       </w:pPr>
       <w:r>
-        <w:t xml:space="preserve">Từ câu hỏi trung tâm đó, bốn câu hỏi nghiên cứu cụ thể được đặt ra. Câu hỏi nghiên cứu thứ nhất (RQ1) là: Tác động tổng hợp của quốc tế hóa lên hiệu quả hoạt động của doanh nghiệp trong văn liệu 1982–2026 là gì, mức độ dị biệt ở mức nào, và những các biến điều tiết nào giải thích heterogeneity đó một cách có hệ thống? Câu hỏi nghiên cứu thứ hai (RQ2) là: Trong từng bối cảnh quốc gia cụ thể bao gồm Singapore, Việt Nam và Trung Quốc, mối quan hệ I–P vận hành theo những cơ chế đặc thù nào và sự phi tuyến có biểu hiện ra sao? Câu hỏi nghiên cứu thứ ba (RQ3) là: Trên phạm vi đa quốc gia châu Á bao gồm 50 nền kinh tế châu Á và Thái Bình Dương (bao gồm 7 nền kinh tế Pacific SIDS), vai trò điều tiết của chỉ số chấp nhận số (DAI) và technological capability index (TCI) có khái quát hóa được không, và hai construct này có thực sự vận hành theo các cơ chế khác nhau không? Câu hỏi nghiên cứu thứ tư (RQ4) là: Vai trò của thể chế, đo bằng sub-regime ICRV, cùng với sự phân biệt giữa TCI và DAI, và đặc điểm nhà quản trị trong việc điều tiết mối quan hệ I–P là gì, và sự tương tác ba chiều giữa ba tầng đó có ý nghĩa như thế nào?</w:t>
+        <w:t xml:space="preserve">Từ câu hỏi trung tâm đó, bốn câu hỏi nghiên cứu cụ thể được đặt ra. Câu hỏi nghiên cứu thứ nhất (RQ1) là: Tác động tổng hợp của quốc tế hóa lên hiệu quả hoạt động của doanh nghiệp trong văn liệu 1982–2026 là gì, mức độ dị biệt ở mức nào, và những các biến điều tiết nào giải thích dị biệt đó một cách có hệ thống? Câu hỏi nghiên cứu thứ hai (RQ2) là: Trong từng bối cảnh quốc gia cụ thể bao gồm Singapore, Việt Nam và Trung Quốc, mối quan hệ I–P vận hành theo những cơ chế đặc thù nào và sự phi tuyến có biểu hiện ra sao? Câu hỏi nghiên cứu thứ ba (RQ3) là: Trên phạm vi đa quốc gia châu Á bao gồm 50 nền kinh tế châu Á và Thái Bình Dương (bao gồm 7 nền kinh tế Pacific SIDS), vai trò điều tiết của chỉ số chấp nhận số (DAI) và năng lực công nghệ index (TCI) có khái quát hóa được không, và hai cấu trúc này có thực sự vận hành theo các cơ chế khác nhau không? Câu hỏi nghiên cứu thứ tư (RQ4) là: Vai trò của thể chế, đo bằng chế độ con ICRV, cùng với sự phân biệt giữa TCI và DAI, và đặc điểm nhà quản trị trong việc điều tiết mối quan hệ I–P là gì, và sự tương tác ba chiều giữa ba tầng đó có ý nghĩa như thế nào?</w:t>
       </w:r>
     </w:p>
     <w:p>
@@ -3041,8 +3099,8 @@
         </w:pict>
       </w:r>
     </w:p>
-    <w:bookmarkEnd w:id="34"/>
-    <w:bookmarkStart w:id="38" w:name="đối-tượng-và-phạm-vi-nghiên-cứu"/>
+    <w:bookmarkEnd w:id="35"/>
+    <w:bookmarkStart w:id="40" w:name="đối-tượng-và-phạm-vi-nghiên-cứu"/>
     <w:p>
       <w:pPr>
         <w:pStyle w:val="Heading2"/>
@@ -3051,7 +3109,7 @@
         <w:t xml:space="preserve">1.5 Đối tượng và phạm vi nghiên cứu</w:t>
       </w:r>
     </w:p>
-    <w:bookmarkStart w:id="35" w:name="đối-tượng-nghiên-cứu"/>
+    <w:bookmarkStart w:id="36" w:name="đối-tượng-nghiên-cứu"/>
     <w:p>
       <w:pPr>
         <w:pStyle w:val="Heading3"/>
@@ -3068,8 +3126,8 @@
         <w:t xml:space="preserve">Đối tượng nghiên cứu của luận án là mối quan hệ giữa quốc tế hóa và hiệu quả hoạt động của doanh nghiệp (internationalization–firm performance relationship) cùng với các yếu tố điều tiết của mối quan hệ đó, bao gồm bối cảnh thể chế, năng lực số và đặc điểm nhà quản trị cấp cao. Đơn vị phân tích là doanh nghiệp ở cấp độ tổ chức (firm-level analysis), không phải cấp độ ngành hay cấp độ quốc gia.</w:t>
       </w:r>
     </w:p>
-    <w:bookmarkEnd w:id="35"/>
-    <w:bookmarkStart w:id="36" w:name="phạm-vi-không-gian"/>
+    <w:bookmarkEnd w:id="36"/>
+    <w:bookmarkStart w:id="37" w:name="phạm-vi-không-gian"/>
     <w:p>
       <w:pPr>
         <w:pStyle w:val="Heading3"/>
@@ -3099,11 +3157,11 @@
         <w:t xml:space="preserve"> </w:t>
       </w:r>
       <w:r>
-        <w:t xml:space="preserve">có dữ liệu trong Khảo sát Doanh nghiệp của Ngân hàng Thế giới (World Bank Enterprise Surveys, WBES), được phân loại và tổ chức theo 6 sub-regime trong khung ICRV. Sáu sub-regime bao gồm: (i) Advanced Innovation-Driven, gồm Singapore, Hong Kong SAR, Hàn Quốc, Đài Loan, Israel và Nhật Bản; (ii) Advanced Resource-Driven, đại diện là các nền kinh tế GCC; (iii) Upper-middle, đại diện là Trung Quốc và Malaysia; (iv) Lower-middle transition, bao gồm Việt Nam và các nền kinh tế ASEAN đang phát triển; (v) Emerging, bao gồm các nền kinh tế kém phát triển nhất châu Á như Campuchia, Nepal và Afghanistan; và (vi) SIDS (Small Island Developing States), bao gồm 7 nền kinh tế đảo nhỏ Thái Bình Dương (mẫu chính P8; mở rộng 9 nền gồm Comoros và Timor-Leste khi kiểm định độ vững) được đưa vào phân tích để kiểm định các điều kiện biên cực đoan của quan hệ I–P. Nhật Bản được Khảo sát Doanh nghiệp của Ngân hàng Thế giới đưa vào lần đầu năm 2025 (N = 2.168) và là thành viên đầy đủ của Nhóm I trong khung phân tích, đồng thời là đối tượng của nghiên cứu thành phần P10.</w:t>
-      </w:r>
-    </w:p>
-    <w:bookmarkEnd w:id="36"/>
-    <w:bookmarkStart w:id="37" w:name="phạm-vi-thời-gian"/>
+        <w:t xml:space="preserve">có dữ liệu trong Khảo sát Doanh nghiệp của Ngân hàng Thế giới (World Bank Enterprise Surveys, WBES), được phân loại và tổ chức theo 6 chế độ con trong khung ICRV. Sáu chế độ con bao gồm: (i) Advanced Innovation-Driven, gồm Singapore, Hong Kong SAR, Hàn Quốc, Đài Loan, Israel và Nhật Bản; (ii) Advanced Resource-Driven, đại diện là các nền kinh tế GCC; (iii) Upper-middle, đại diện là Trung Quốc và Malaysia; (iv) Lower-middle transition, bao gồm Việt Nam và các nền kinh tế ASEAN đang phát triển; (v) Emerging, bao gồm các nền kinh tế kém phát triển nhất châu Á như Campuchia, Nepal và Afghanistan; và (vi) SIDS (Small Island Developing States), bao gồm 7 nền kinh tế đảo nhỏ Thái Bình Dương (mẫu chính P8; mở rộng 9 nền gồm Comoros và Timor-Leste khi kiểm định độ vững) được đưa vào phân tích để kiểm định các điều kiện biên cực đoan của quan hệ I–P. Nhật Bản được Khảo sát Doanh nghiệp của Ngân hàng Thế giới đưa vào lần đầu năm 2025 (N = 2.168) và là thành viên đầy đủ của Nhóm I trong khung phân tích, đồng thời là đối tượng của nghiên cứu thành phần P10.</w:t>
+      </w:r>
+    </w:p>
+    <w:bookmarkEnd w:id="37"/>
+    <w:bookmarkStart w:id="38" w:name="phạm-vi-thời-gian"/>
     <w:p>
       <w:pPr>
         <w:pStyle w:val="Heading3"/>
@@ -3127,9 +3185,35 @@
         </w:pict>
       </w:r>
     </w:p>
-    <w:bookmarkEnd w:id="37"/>
     <w:bookmarkEnd w:id="38"/>
-    <w:bookmarkStart w:id="39" w:name="Xbf9681d2ece38c831068ce83c1d076e11fd1195"/>
+    <w:bookmarkStart w:id="39" w:name="giới-hạn-phạm-vi"/>
+    <w:p>
+      <w:pPr>
+        <w:pStyle w:val="Heading3"/>
+      </w:pPr>
+      <w:r>
+        <w:t xml:space="preserve">1.5.4 Giới hạn phạm vi</w:t>
+      </w:r>
+    </w:p>
+    <w:p>
+      <w:pPr>
+        <w:pStyle w:val="FirstParagraph"/>
+      </w:pPr>
+      <w:r>
+        <w:t xml:space="preserve">Để bảo đảm tính khả thi và độ chặt chẽ, luận án xác định rõ một số giới hạn phạm vi có chủ đích. Thứ nhất, đơn vị phân tích là doanh nghiệp ở cấp độ tổ chức, do đó luận án không nhằm giải thích kết quả ở cấp ngành hay cấp quốc gia, mặc dù bối cảnh ngành và quốc gia được đưa vào như biến điều tiết và biến kiểm soát. Thứ hai, quốc tế hóa được vận hành hóa chủ yếu qua tỷ lệ doanh thu nước ngoài trên tổng doanh thu, phù hợp với cấu trúc dữ liệu khảo sát; các phương thức quốc tế hóa khác như đầu tư trực tiếp ra nước ngoài hay liên doanh không nằm trong trọng tâm đo lường, dù được thừa nhận về mặt khái niệm.</w:t>
+      </w:r>
+    </w:p>
+    <w:p>
+      <w:pPr>
+        <w:pStyle w:val="BodyText"/>
+      </w:pPr>
+      <w:r>
+        <w:t xml:space="preserve">Thứ ba, dữ liệu thực nghiệm là chuỗi cắt ngang lặp lại theo từng đợt khảo sát, không phải dữ liệu bảng theo dõi cùng một doanh nghiệp qua thời gian, nên các suy luận về động thái theo thời gian được giới hạn ở so sánh giữa các đợt khảo sát thay vì theo dõi quỹ đạo của từng doanh nghiệp. Thứ tư, do ràng buộc của bộ dữ liệu, chỉ số chấp nhận số được đo bằng các chỉ báo nền tảng ở giao diện ngoại tại; đây là ràng buộc đo lường có chủ đích chứ không phải thiếu sót khái niệm, và được xử lý nhất quán trong toàn bộ luận án. Cuối cùng, phạm vi không gian giới hạn ở khu vực châu Á và lân cận; việc khái quát hóa các phát hiện sang các khu vực khác cần được kiểm chứng thêm và được nêu như một hướng nghiên cứu tiếp theo trong Chương 5.</w:t>
+      </w:r>
+    </w:p>
+    <w:bookmarkEnd w:id="39"/>
+    <w:bookmarkEnd w:id="40"/>
+    <w:bookmarkStart w:id="41" w:name="Xbf9681d2ece38c831068ce83c1d076e11fd1195"/>
     <w:p>
       <w:pPr>
         <w:pStyle w:val="Heading2"/>
@@ -3143,7 +3227,7 @@
         <w:pStyle w:val="FirstParagraph"/>
       </w:pPr>
       <w:r>
-        <w:t xml:space="preserve">Luận án áp dụng thiết kế nghiên cứu mixed synthesis-empirical, sự kết hợp giữa meta-analysis và phân tích thực nghiệm đa quốc gia, nhằm trả lời bốn câu hỏi nghiên cứu đã đặt ra. Thiết kế này không chỉ đơn thuần là sử dụng hai phương pháp song song, mà tạo ra một đối thoại hai chiều: meta-analysis cung cấp tổng quan có hệ thống về trạng thái bằng chứng và xác định các biến điều tiết quan trọng trong văn liệu, trong khi phân tích thực nghiệm kiểm định trực tiếp các giả thuyết phát sinh từ khung lý thuyết trong bối cảnh châu Á. Sự tương tác này tăng cường đáng kể sức mạnh đóng góp so với việc chỉ sử dụng một phương pháp duy nhất (Borenstein et al., 2009; Hunter &amp; Schmidt, 2004).</w:t>
+        <w:t xml:space="preserve">Luận án áp dụng thiết kế nghiên cứu hỗn hợp tổng hợp–thực nghiệm, sự kết hợp giữa meta-analysis và phân tích thực nghiệm đa quốc gia, nhằm trả lời bốn câu hỏi nghiên cứu đã đặt ra. Thiết kế này không chỉ đơn thuần là sử dụng hai phương pháp song song, mà tạo ra một đối thoại hai chiều: meta-analysis cung cấp tổng quan có hệ thống về trạng thái bằng chứng và xác định các biến điều tiết quan trọng trong văn liệu, trong khi phân tích thực nghiệm kiểm định trực tiếp các giả thuyết phát sinh từ khung lý thuyết trong bối cảnh châu Á. Sự tương tác này tăng cường đáng kể sức mạnh đóng góp so với việc chỉ sử dụng một phương pháp duy nhất (Borenstein et al., 2009; Hunter &amp; Schmidt, 2004).</w:t>
       </w:r>
     </w:p>
     <w:p>
@@ -3151,7 +3235,7 @@
         <w:pStyle w:val="BodyText"/>
       </w:pPr>
       <w:r>
-        <w:t xml:space="preserve">Về phương pháp cụ thể, phase meta-analysis sử dụng random-effects model với Fisher’s z transformation, phân tích nhóm con (subgroup analysis) theo chế độ thể chế, và các kiểm định publication bias bao gồm Egger’s test và Begg–Mazumdar rank correlation test. Phase thực nghiệm sử dụng hồi quy OLS với sai số chuẩn robust HC1/HC3, mô hình bậc hai và bậc ba để kiểm định phi tuyến, tương tác hai chiều và ba chiều để kiểm định moderation, cùng với fixed effects theo quốc gia và năm. Kiểm định Lind–Mehlum U-test được áp dụng để xác nhận dạng chữ U ngược và xác định điểm điểm uốn trong quan hệ phi tuyến (Haans et al., 2016; Lind &amp; Mehlum, 2010).</w:t>
+        <w:t xml:space="preserve">Về phương pháp cụ thể, phase meta-analysis sử dụng random-effects model với Fisher’s z transformation, phân tích nhóm con (subgroup analysis) theo chế độ thể chế, và các kiểm định publication bias bao gồm Egger’s test và Begg–Mazumdar rank correlation test. Phase thực nghiệm sử dụng hồi quy OLS với sai số chuẩn robust HC1/HC3, mô hình bậc hai và bậc ba để kiểm định phi tuyến, tương tác hai chiều và ba chiều để kiểm định điều tiết, cùng với hiệu ứng cố định theo quốc gia và năm. Kiểm định Lind–Mehlum U-test được áp dụng để xác nhận dạng chữ U ngược và xác định điểm điểm uốn trong quan hệ phi tuyến (Haans et al., 2016; Lind &amp; Mehlum, 2010).</w:t>
       </w:r>
     </w:p>
     <w:p>
@@ -3161,8 +3245,8 @@
         </w:pict>
       </w:r>
     </w:p>
-    <w:bookmarkEnd w:id="39"/>
-    <w:bookmarkStart w:id="40" w:name="giả-thuyết-khoa-học-tóm-tắt"/>
+    <w:bookmarkEnd w:id="41"/>
+    <w:bookmarkStart w:id="42" w:name="giả-thuyết-khoa-học-tóm-tắt"/>
     <w:p>
       <w:pPr>
         <w:pStyle w:val="Heading2"/>
@@ -3176,7 +3260,7 @@
         <w:pStyle w:val="FirstParagraph"/>
       </w:pPr>
       <w:r>
-        <w:t xml:space="preserve">Dựa trên khung lý thuyết tích hợp đa tầng bao gồm Uppsala model, RBV, Institutional Theory, Upper Echelons Theory và digital capability lens, luận án đề xuất hệ giả thuyết khoa học với sáu giả thuyết trọng tâm. Quan hệ nền giữa quốc tế hóa và hiệu quả hoạt động doanh nghiệp mang dạng phi tuyến, cụ thể là dạng chữ U ngược, với chi phí thâm nhập và thích nghi cao ở giai đoạn đầu và lợi ích quy mô, học hỏi và đa dạng hóa thị trường ở giai đoạn sau, đến khi chi phí điều phối vượt quá lợi ích sẽ dẫn đến sự suy giảm hiệu quả. Technological capability index (TCI) điều tiết dương quan hệ I–P bằng cách mở rộng biên thích nghi và tăng cường khả năng khai thác lợi thế cạnh tranh ở thị trường quốc tế. Chỉ số chấp nhận số (DAI), được hiểu là proxy foundational digital adoption, có tác động điều tiết không đơn điệu và phụ thuộc vào chế độ thể chế: ở các nền kinh tế có thể chế tốt, DAI khuếch đại lợi ích của quốc tế hóa; ở các nền kinh tế với thể chế yếu, DAI có thể khuếch đại chi phí điều phối khi mức độ quốc tế hóa vượt ngưỡng. Bối cảnh thể chế, đo bằng sub-regime ICRV, điều tiết cả dạng và độ lớn của quan hệ I–P, tạo ra gradient từ tác động dương lớn ở Advanced Innovation-Driven đến tác động âm ở Emerging và SIDS extreme. Đặc điểm nhà quản trị cấp cao, cụ thể là kinh nghiệm quốc tế và đa dạng giới tính, điều tiết dương quan hệ I–P thông qua cơ chế tăng cường nhận diện cơ hội và quản trị rủi ro. Ngoài sáu giả thuyết trọng tâm H1–H6, luận án phát biểu thêm giả thuyết điều kiện biên H1b: tại các nền kinh tế SIDS (ICRV Nhóm VI), nơi ba điều kiện cấu trúc tối thiểu đồng thời bị vi phạm, thị trường nội địa quá nhỏ, chi phí thương mại cực cao, và thiếu hỗ trợ thể chế, quan hệ I–P chuyển từ dạng chữ U ngược sang quan hệ</w:t>
+        <w:t xml:space="preserve">Dựa trên khung lý thuyết tích hợp đa tầng bao gồm mô hình Uppsala, RBV, lý thuyết thể chế, Lý thuyết thượng tầng quản trị và digital capability lens, luận án đề xuất hệ giả thuyết khoa học với sáu giả thuyết trọng tâm. Quan hệ nền giữa quốc tế hóa và hiệu quả hoạt động doanh nghiệp mang dạng phi tuyến, cụ thể là dạng chữ U ngược, với chi phí thâm nhập và thích nghi cao ở giai đoạn đầu và lợi ích quy mô, học hỏi và đa dạng hóa thị trường ở giai đoạn sau, đến khi chi phí điều phối vượt quá lợi ích sẽ dẫn đến sự suy giảm hiệu quả. năng lực công nghệ index (TCI) điều tiết dương quan hệ I–P bằng cách mở rộng biên thích nghi và tăng cường khả năng khai thác lợi thế cạnh tranh ở thị trường quốc tế. Chỉ số chấp nhận số (DAI), được hiểu là biến đại diện foundational chấp nhận số, có tác động điều tiết không đơn điệu và phụ thuộc vào chế độ thể chế: ở các nền kinh tế có thể chế tốt, DAI khuếch đại lợi ích của quốc tế hóa; ở các nền kinh tế với thể chế yếu, DAI có thể khuếch đại chi phí điều phối khi mức độ quốc tế hóa vượt ngưỡng. Bối cảnh thể chế, đo bằng chế độ con ICRV, điều tiết cả dạng và độ lớn của quan hệ I–P, tạo ra gradient từ tác động dương lớn ở Advanced Innovation-Driven đến tác động âm ở Emerging và SIDS extreme. Đặc điểm nhà quản trị cấp cao, cụ thể là kinh nghiệm quốc tế và đa dạng giới tính, điều tiết dương quan hệ I–P thông qua cơ chế tăng cường nhận diện cơ hội và quản trị rủi ro. Ngoài sáu giả thuyết trọng tâm H1–H6, luận án phát biểu thêm giả thuyết điều kiện biên H1b: tại các nền kinh tế SIDS (ICRV Nhóm VI), nơi ba điều kiện cấu trúc tối thiểu đồng thời bị vi phạm, thị trường nội địa quá nhỏ, chi phí thương mại cực cao, và thiếu hỗ trợ thể chế, quan hệ I–P chuyển từ dạng chữ U ngược sang quan hệ</w:t>
       </w:r>
       <w:r>
         <w:t xml:space="preserve"> </w:t>
@@ -3199,8 +3283,8 @@
         </w:pict>
       </w:r>
     </w:p>
-    <w:bookmarkEnd w:id="40"/>
-    <w:bookmarkStart w:id="44" w:name="ý-nghĩa-khoa-học-và-thực-tiễn"/>
+    <w:bookmarkEnd w:id="42"/>
+    <w:bookmarkStart w:id="46" w:name="ý-nghĩa-khoa-học-và-thực-tiễn"/>
     <w:p>
       <w:pPr>
         <w:pStyle w:val="Heading2"/>
@@ -3209,7 +3293,7 @@
         <w:t xml:space="preserve">1.8 Ý nghĩa khoa học và thực tiễn</w:t>
       </w:r>
     </w:p>
-    <w:bookmarkStart w:id="41" w:name="đóng-góp-lý-thuyết"/>
+    <w:bookmarkStart w:id="43" w:name="đóng-góp-lý-thuyết"/>
     <w:p>
       <w:pPr>
         <w:pStyle w:val="Heading3"/>
@@ -3223,7 +3307,7 @@
         <w:pStyle w:val="FirstParagraph"/>
       </w:pPr>
       <w:r>
-        <w:t xml:space="preserve">Về mặt lý thuyết, luận án đóng góp vào văn liệu kinh doanh quốc tế theo ba hướng chính. Hướng thứ nhất là tích hợp bốn lý thuyết kinh điển, Uppsala model, Resource-Based View, Institutional Theory và Upper Echelons Theory, vào một khung giải thích đa tầng thống nhất, bổ sung bởi digital capability lens để phản ánh chuyển đổi số đương đại. Khung này không chỉ là sự ghép nối cơ học các lý thuyết mà là một kiến trúc lý thuyết có tính nhất quán nội tại, trong đó mỗi tầng giải thích một loại heterogeneity khác nhau trong quan hệ I–P. Hướng thứ hai là phân tách rõ ràng technological capability (TCI) và chỉ số chấp nhận số (DAI) như hai construct lý thuyết độc lập, dựa trên các nền tảng khái niệm khác nhau từ Bharadwaj et al. (2013), Verhoef et al. (2021), và Coltman et al. (2008). Sự phân tách này bổ sung vào thiếu hụt khái niệm quan trọng trong văn liệu về số hóa và quốc tế hóa. Hướng thứ ba là tái định vị Uppsala model trong bối cảnh kỷ nguyên AI bằng cách mở rộng cơ chế học hỏi để bao gồm</w:t>
+        <w:t xml:space="preserve">Về mặt lý thuyết, luận án đóng góp vào văn liệu kinh doanh quốc tế theo ba hướng chính. Hướng thứ nhất là tích hợp bốn lý thuyết kinh điển, mô hình Uppsala, Resource-Based View, lý thuyết thể chế và Lý thuyết thượng tầng quản trị, vào một khung giải thích đa tầng thống nhất, bổ sung bởi digital capability lens để phản ánh chuyển đổi số đương đại. Khung này không chỉ là sự ghép nối cơ học các lý thuyết mà là một kiến trúc lý thuyết có tính nhất quán nội tại, trong đó mỗi tầng giải thích một loại dị biệt khác nhau trong quan hệ I–P. Hướng thứ hai là phân tách rõ ràng năng lực công nghệ (TCI) và chỉ số chấp nhận số (DAI) như hai cấu trúc lý thuyết độc lập, dựa trên các nền tảng khái niệm khác nhau từ Bharadwaj et al. (2013), Verhoef et al. (2021), và Coltman et al. (2008). Sự phân tách này bổ sung vào thiếu hụt khái niệm quan trọng trong văn liệu về số hóa và quốc tế hóa. Hướng thứ ba là tái định vị mô hình Uppsala trong bối cảnh kỷ nguyên AI bằng cách mở rộng cơ chế học hỏi để bao gồm</w:t>
       </w:r>
       <w:r>
         <w:t xml:space="preserve"> </w:t>
@@ -3251,11 +3335,45 @@
         <w:t xml:space="preserve">gánh nặng quốc tế hóa bắt buộc (Forced Internationalization Penalty, FIP)</w:t>
       </w:r>
       <w:r>
-        <w:t xml:space="preserve">, một construct lý thuyết mới chưa được định danh trong văn liệu kinh doanh quốc tế, như điều kiện biên cực đoan của mô hình chữ U ngược khi cả ba tầng của khung CDCM (thể chế, năng lực, quản trị) đồng thời ở mức tối thiểu. Bằng chứng thực nghiệm từ bảy nền kinh tế Pacific SIDS xác nhận quan hệ âm đơn điệu không có điểm uốn, mở ra hướng nghiên cứu mới về điều kiện biên của lý thuyết quốc tế hóa.</w:t>
-      </w:r>
-    </w:p>
-    <w:bookmarkEnd w:id="41"/>
-    <w:bookmarkStart w:id="42" w:name="đóng-góp-phương-pháp"/>
+        <w:t xml:space="preserve">, một cấu trúc lý thuyết mới chưa được định danh trong văn liệu kinh doanh quốc tế, như điều kiện biên cực đoan của mô hình chữ U ngược khi cả ba tầng của khung CDCM (thể chế, năng lực, quản trị) đồng thời ở mức tối thiểu. Bằng chứng thực nghiệm từ bảy nền kinh tế Pacific SIDS xác nhận quan hệ âm đơn điệu không có điểm uốn, mở ra hướng nghiên cứu mới về điều kiện biên của lý thuyết quốc tế hóa.</w:t>
+      </w:r>
+    </w:p>
+    <w:p>
+      <w:pPr>
+        <w:pStyle w:val="BodyText"/>
+      </w:pPr>
+      <w:r>
+        <w:t xml:space="preserve">Bốn hướng đóng góp lý thuyết trên hội tụ vào một kiến trúc thống nhất là khung điều tiết bối cảnh, năng lực và quản trị (Country–Digital–Capability Moderation, CDCM), trong đó mỗi tầng giải thích một loại dị biệt riêng của quan hệ I–P thay vì cạnh tranh loại trừ lẫn nhau. Tầng vĩ mô được vận hành hóa bằng khung biến thiên chế độ bối cảnh thể chế (Institutional Context Regime Variation, ICRV), công cụ phân loại sáu nhóm cho phép chuyển một gradient thể chế liên tục thành một biến điều tiết kiểm định được ở cấp doanh nghiệp. Đóng góp của ICRV không nằm ở việc thêm một biến phân loại, mà ở việc cung cấp một cách hệ thống để dự đoán vị trí điểm uốn dịch chuyển theo chế độ thể chế, qua đó biến luận điểm</w:t>
+      </w:r>
+      <w:r>
+        <w:t xml:space="preserve"> </w:t>
+      </w:r>
+      <w:r>
+        <w:t xml:space="preserve">“</w:t>
+      </w:r>
+      <w:r>
+        <w:t xml:space="preserve">bối cảnh quan trọng</w:t>
+      </w:r>
+      <w:r>
+        <w:t xml:space="preserve">”</w:t>
+      </w:r>
+      <w:r>
+        <w:t xml:space="preserve"> </w:t>
+      </w:r>
+      <w:r>
+        <w:t xml:space="preserve">từ một nhận định định tính thành một giả thuyết định lượng có thể bác bỏ.</w:t>
+      </w:r>
+    </w:p>
+    <w:p>
+      <w:pPr>
+        <w:pStyle w:val="BodyText"/>
+      </w:pPr>
+      <w:r>
+        <w:t xml:space="preserve">Đỉnh của kiến trúc lý thuyết là việc định danh gánh nặng quốc tế hóa bắt buộc (Forced Internationalization Penalty, FIP) như một điều kiện biên cực trị của mô hình chữ U ngược. FIP phát biểu rằng khi cả ba tầng của khung CDCM đồng thời ở mức tối thiểu, quan hệ I–P không chỉ mất phần lợi ích giai đoạn đầu mà chuyển hẳn sang dạng âm đơn điệu không có điểm uốn. Việc định danh một điều kiện biên như vậy có giá trị lý thuyết vượt ra ngoài một phát hiện thực nghiệm đơn lẻ, bởi nó xác định ranh giới ứng dụng của cả một họ lý thuyết quốc tế hóa vốn ngầm giả định những điều kiện cấu trúc tối thiểu luôn được thỏa mãn.</w:t>
+      </w:r>
+    </w:p>
+    <w:bookmarkEnd w:id="43"/>
+    <w:bookmarkStart w:id="44" w:name="đóng-góp-phương-pháp"/>
     <w:p>
       <w:pPr>
         <w:pStyle w:val="Heading3"/>
@@ -3269,11 +3387,11 @@
         <w:pStyle w:val="FirstParagraph"/>
       </w:pPr>
       <w:r>
-        <w:t xml:space="preserve">Về mặt phương pháp, luận án đóng góp theo hai hướng. Hướng thứ nhất là thiết kế mixed synthesis-empirical kết hợp meta-analysis và phân tích đa quốc gia, tạo ra khả năng đối chiếu giữa bằng chứng tổng hợp từ văn liệu toàn cầu và bằng chứng thực nghiệm từ bối cảnh châu Á. Hướng thứ hai là phát triển và áp dụng khung phân loại thể chế ICRV cho 50 nền kinh tế, cung cấp một công cụ phân loại mới có ứng dụng tiềm năng trong nhiều nghiên cứu tương lai về moderating effect của thể chế trong văn liệu kinh doanh quốc tế.</w:t>
-      </w:r>
-    </w:p>
-    <w:bookmarkEnd w:id="42"/>
-    <w:bookmarkStart w:id="43" w:name="đóng-góp-thực-tiễn"/>
+        <w:t xml:space="preserve">Về mặt phương pháp, luận án đóng góp theo hai hướng. Hướng thứ nhất là thiết kế hỗn hợp tổng hợp–thực nghiệm kết hợp meta-analysis và phân tích đa quốc gia, tạo ra khả năng đối chiếu giữa bằng chứng tổng hợp từ văn liệu toàn cầu và bằng chứng thực nghiệm từ bối cảnh châu Á. Hướng thứ hai là phát triển và áp dụng khung phân loại thể chế ICRV cho 50 nền kinh tế, cung cấp một công cụ phân loại mới có ứng dụng tiềm năng trong nhiều nghiên cứu tương lai về moderating effect của thể chế trong văn liệu kinh doanh quốc tế.</w:t>
+      </w:r>
+    </w:p>
+    <w:bookmarkEnd w:id="44"/>
+    <w:bookmarkStart w:id="45" w:name="đóng-góp-thực-tiễn"/>
     <w:p>
       <w:pPr>
         <w:pStyle w:val="Heading3"/>
@@ -3287,7 +3405,7 @@
         <w:pStyle w:val="FirstParagraph"/>
       </w:pPr>
       <w:r>
-        <w:t xml:space="preserve">Về mặt thực tiễn, luận án cung cấp căn cứ có hệ thống cho hai nhóm đối tượng sử dụng chính. Đối với doanh nghiệp, kết quả phân tích của luận án cho thấy tồn tại ngưỡng tối ưu trong mối quan hệ giữa mức độ xuất khẩu và hiệu quả hoạt động, và ngưỡng này thay đổi theo bối cảnh thể chế và năng lực số của từng doanh nghiệp. Nhà quản trị cần nhận thức được ngưỡng này và đầu tư có chiến lược vào năng lực công nghệ thay vì chỉ tập trung vào digital adoption bề mặt. Đối với nhà hoạch định chính sách, bằng chứng từ luận án gợi ý rằng cải cách thể chế và hỗ trợ chuyển đổi số có thể có hiệu ứng bổ trợ tích cực, được nghiên cứu về 17 nền kinh tế châu Á mới nổi đặt tên là</w:t>
+        <w:t xml:space="preserve">Về mặt thực tiễn, luận án cung cấp căn cứ có hệ thống cho hai nhóm đối tượng sử dụng chính. Đối với doanh nghiệp, kết quả phân tích của luận án cho thấy tồn tại ngưỡng tối ưu trong mối quan hệ giữa mức độ xuất khẩu và hiệu quả hoạt động, và ngưỡng này thay đổi theo bối cảnh thể chế và năng lực số của từng doanh nghiệp. Nhà quản trị cần nhận thức được ngưỡng này và đầu tư có chiến lược vào năng lực công nghệ thay vì chỉ tập trung vào chấp nhận số bề mặt. Đối với nhà hoạch định chính sách, bằng chứng từ luận án gợi ý rằng cải cách thể chế và hỗ trợ chuyển đổi số có thể có hiệu ứng bổ trợ tích cực, được nghiên cứu về 17 nền kinh tế châu Á mới nổi đặt tên là</w:t>
       </w:r>
       <w:r>
         <w:t xml:space="preserve"> </w:t>
@@ -3312,9 +3430,25 @@
         </w:pict>
       </w:r>
     </w:p>
-    <w:bookmarkEnd w:id="43"/>
-    <w:bookmarkEnd w:id="44"/>
-    <w:bookmarkStart w:id="45" w:name="tính-mới-của-đề-tài"/>
+    <w:p>
+      <w:pPr>
+        <w:pStyle w:val="FirstParagraph"/>
+      </w:pPr>
+      <w:r>
+        <w:t xml:space="preserve">Hàm ý chính sách của luận án mang tính phân biệt theo chế độ thể chế thay vì đưa ra một khuyến nghị đồng nhất cho toàn khu vực. Ở các nền kinh tế thuộc nhóm thể chế mạnh, nơi quan hệ I–P duy trì độ dốc dương trong phần lớn miền quan sát, chính sách hỗ trợ nên tập trung vào việc gỡ bỏ các trần mở rộng và nâng trần năng lực hấp thụ công nghệ. Ở các nền kinh tế chuyển đổi thu nhập trung bình–thấp, nơi đường cong chữ U ngược biểu hiện rõ nét nhất, hàm ý trọng tâm là nhận diện ngưỡng tối ưu và tránh mở rộng vượt ngưỡng khi năng lực điều phối chưa theo kịp.</w:t>
+      </w:r>
+    </w:p>
+    <w:p>
+      <w:pPr>
+        <w:pStyle w:val="BodyText"/>
+      </w:pPr>
+      <w:r>
+        <w:t xml:space="preserve">Ở cực còn lại của gradient, các nền kinh tế đảo nhỏ đang phát triển đòi hỏi một logic chính sách khác hẳn. Khi quốc tế hóa là gánh nặng sinh tồn chứ không phải lựa chọn chiến lược dựa trên lợi thế cạnh tranh, việc khuyến khích tăng cường độ xuất khẩu một cách máy móc có thể phản tác dụng; ưu tiên hợp lý hơn là khắc phục các ràng buộc cấu trúc về chi phí thương mại và hỗ trợ thể chế trước khi kỳ vọng quốc tế hóa cải thiện hiệu quả. Sự phân biệt này cho thấy giá trị thực tiễn cốt lõi của luận án nằm ở việc cung cấp một bản đồ chính sách theo chế độ thể chế, thay vì một đơn thuốc duy nhất áp dụng cho mọi nền kinh tế bất kể vị trí trên gradient.</w:t>
+      </w:r>
+    </w:p>
+    <w:bookmarkEnd w:id="45"/>
+    <w:bookmarkEnd w:id="46"/>
+    <w:bookmarkStart w:id="47" w:name="tính-mới-của-đề-tài"/>
     <w:p>
       <w:pPr>
         <w:pStyle w:val="Heading2"/>
@@ -3328,7 +3462,7 @@
         <w:pStyle w:val="FirstParagraph"/>
       </w:pPr>
       <w:r>
-        <w:t xml:space="preserve">Luận án có sáu điểm mới so với các công trình nghiên cứu trước đây. Điểm mới thứ nhất là đề xuất khung tích hợp đa tầng cho quan hệ I–P trong bối cảnh châu Á, kết hợp bốn lý thuyết kinh điển với digital capability lens thành một kiến trúc lý thuyết thống nhất và có khả năng kiểm định. Không có nghiên cứu trước nào trong bối cảnh châu Á xây dựng khung tích hợp đầy đủ ba tầng điều tiết này theo cách có hệ thống. Điểm mới thứ hai là phân tách TCI và chỉ số chấp nhận số (DAI) như hai construct không trùng lặp, kiểm định chúng riêng biệt trong cùng một mô hình để làm rõ cơ chế tác động khác nhau của hai loại năng lực số đó. Sự phân tách này khắc phục hạn chế của các nghiên cứu trước thường gộp chung hai construct có bản chất khác nhau. Điểm mới thứ ba là phát triển và áp dụng khung phân loại thể chế ICRV với 6 sub-regime cho 50 nền kinh tế, bao gồm cả 7 nền kinh tế Pacific SIDS liền kề như boundary case cực đoan, đây là lần đầu tiên một hệ thống phân loại đủ mịn như vậy được áp dụng trong nghiên cứu thực nghiệm về quan hệ I–P tại châu Á. Điểm mới thứ tư là pool dữ liệu lớn nhất từ trước đến nay cho nghiên cứu đa quốc gia về quan hệ I–P tại châu Á, với 88.869 doanh nghiệp từ 50 nền kinh tế châu Á và Thái Bình Dương, mở rộng đáng kể từ pool 17 nước (nghiên cứu thành phần P1) là nền tảng hiện có lớn nhất trước khi luận án hoàn thành. Điểm mới thứ năm là kiểm định temporal stability của điểm uốn trong quan hệ I–P tại Trung Quốc, cho phép đánh giá liệu cấu trúc phi tuyến đó có ổn định qua hơn một thập kỷ chuyển đổi số hay không. Kết quả phân tích của luận án cho thấy điểm uốn tương đối ổn định qua hai thời điểm quan sát, cung cấp bằng chứng về tính bền vững của cấu trúc I–P phi tuyến ở Trung Quốc dù bối cảnh kinh tế có nhiều thay đổi. Điểm mới thứ sáu là phát hiện và đặt tên lý thuyết cho</w:t>
+        <w:t xml:space="preserve">Luận án có sáu điểm mới so với các công trình nghiên cứu trước đây. Điểm mới thứ nhất là đề xuất khung tích hợp đa tầng cho quan hệ I–P trong bối cảnh châu Á, kết hợp bốn lý thuyết kinh điển với digital capability lens thành một kiến trúc lý thuyết thống nhất và có khả năng kiểm định. Không có nghiên cứu trước nào trong bối cảnh châu Á xây dựng khung tích hợp đầy đủ ba tầng điều tiết này theo cách có hệ thống. Điểm mới thứ hai là phân tách TCI và chỉ số chấp nhận số (DAI) như hai cấu trúc không trùng lặp, kiểm định chúng riêng biệt trong cùng một mô hình để làm rõ cơ chế tác động khác nhau của hai loại năng lực số đó. Sự phân tách này khắc phục hạn chế của các nghiên cứu trước thường gộp chung hai cấu trúc có bản chất khác nhau. Điểm mới thứ ba là phát triển và áp dụng khung phân loại thể chế ICRV với 6 chế độ con cho 50 nền kinh tế, bao gồm cả 7 nền kinh tế Pacific SIDS liền kề như boundary case cực đoan, đây là lần đầu tiên một hệ thống phân loại đủ mịn như vậy được áp dụng trong nghiên cứu thực nghiệm về quan hệ I–P tại châu Á. Điểm mới thứ tư là pool dữ liệu lớn nhất từ trước đến nay cho nghiên cứu đa quốc gia về quan hệ I–P tại châu Á, với 88.869 doanh nghiệp từ 50 nền kinh tế châu Á và Thái Bình Dương, mở rộng đáng kể từ pool 17 nước (nghiên cứu thành phần P1) là nền tảng hiện có lớn nhất trước khi luận án hoàn thành. Điểm mới thứ năm là kiểm định temporal stability của điểm uốn trong quan hệ I–P tại Trung Quốc, cho phép đánh giá liệu cấu trúc phi tuyến đó có ổn định qua hơn một thập kỷ chuyển đổi số hay không. Kết quả phân tích của luận án cho thấy điểm uốn tương đối ổn định qua hai thời điểm quan sát, cung cấp bằng chứng về tính bền vững của cấu trúc I–P phi tuyến ở Trung Quốc dù bối cảnh kinh tế có nhiều thay đổi. Điểm mới thứ sáu là phát hiện và đặt tên lý thuyết cho</w:t>
       </w:r>
       <w:r>
         <w:t xml:space="preserve"> </w:t>
@@ -3354,8 +3488,67 @@
         </w:pict>
       </w:r>
     </w:p>
-    <w:bookmarkEnd w:id="45"/>
-    <w:bookmarkStart w:id="46" w:name="cấu-trúc-của-luận-án"/>
+    <w:p>
+      <w:pPr>
+        <w:pStyle w:val="FirstParagraph"/>
+      </w:pPr>
+      <w:r>
+        <w:t xml:space="preserve">Sáu điểm mới trên có thể được cô đọng thành một tuyên bố tính mới trung tâm: luận án là công trình đầu tiên trong văn liệu kinh doanh quốc tế chuyển luận điểm</w:t>
+      </w:r>
+      <w:r>
+        <w:t xml:space="preserve"> </w:t>
+      </w:r>
+      <w:r>
+        <w:t xml:space="preserve">“</w:t>
+      </w:r>
+      <w:r>
+        <w:t xml:space="preserve">quan hệ I–P phụ thuộc bối cảnh</w:t>
+      </w:r>
+      <w:r>
+        <w:t xml:space="preserve">”</w:t>
+      </w:r>
+      <w:r>
+        <w:t xml:space="preserve"> </w:t>
+      </w:r>
+      <w:r>
+        <w:t xml:space="preserve">từ một nhận định định tính thành một cấu trúc kiểm định được trên toàn bộ gradient thể chế của một khu vực, đồng thời xác định và định danh điểm mà tại đó dạng hàm chữ U ngược không còn ứng dụng được. Khác với các nghiên cứu trước thường dừng lại ở việc chứng minh thể chế điều tiết độ lớn của hiệu ứng, luận án chứng minh thể chế có thể điều tiết cả dấu của hiệu ứng, qua đó nâng luận điểm từ</w:t>
+      </w:r>
+      <w:r>
+        <w:t xml:space="preserve"> </w:t>
+      </w:r>
+      <w:r>
+        <w:t xml:space="preserve">“</w:t>
+      </w:r>
+      <w:r>
+        <w:t xml:space="preserve">phụ thuộc bối cảnh</w:t>
+      </w:r>
+      <w:r>
+        <w:t xml:space="preserve">”</w:t>
+      </w:r>
+      <w:r>
+        <w:t xml:space="preserve"> </w:t>
+      </w:r>
+      <w:r>
+        <w:t xml:space="preserve">lên</w:t>
+      </w:r>
+      <w:r>
+        <w:t xml:space="preserve"> </w:t>
+      </w:r>
+      <w:r>
+        <w:t xml:space="preserve">“</w:t>
+      </w:r>
+      <w:r>
+        <w:t xml:space="preserve">có điều kiện theo bối cảnh</w:t>
+      </w:r>
+      <w:r>
+        <w:t xml:space="preserve">”</w:t>
+      </w:r>
+      <w:r>
+        <w:t xml:space="preserve">. Tính mới này được nâng đỡ bởi sự phân tách hai cấu trúc năng lực số và bởi nền dữ liệu đa quốc gia rộng nhất từng có cho khu vực, hai yếu tố cùng bảo đảm rằng tuyên bố trên dựa trên độ thuần khiết cấu trúc và độ bao phủ thể chế chứ không phải trên một mẫu hẹp hoặc một đo lường gộp.</w:t>
+      </w:r>
+    </w:p>
+    <w:bookmarkEnd w:id="47"/>
+    <w:bookmarkStart w:id="48" w:name="cấu-trúc-của-luận-án"/>
     <w:p>
       <w:pPr>
         <w:pStyle w:val="Heading2"/>
@@ -3773,7 +3966,7 @@
           <w:iCs/>
           <w:i/>
         </w:rPr>
-        <w:t xml:space="preserve">(firm performance) được đo chủ yếu bằng năng suất lao động (labor productivity), bổ sung bằng ROS và sales growth trong các kiểm định độ vững; TCI là technological capability index; DAI là chỉ số chấp nhận số (digital adoption index), được hiểu như proxy foundational digital adoption; ICRV là khung phân loại thể chế 6 nhóm được phát triển cho luận án này; WBES là World Bank Enterprise Surveys.</w:t>
+        <w:t xml:space="preserve">(firm performance) được đo chủ yếu bằng năng suất lao động (labor productivity), bổ sung bằng ROS và sales growth trong các kiểm định độ vững; TCI là năng lực công nghệ index; DAI là chỉ số chấp nhận số (digital adoption index), được hiểu như biến đại diện foundational chấp nhận số; ICRV là khung phân loại thể chế 6 nhóm được phát triển cho luận án này; WBES là World Bank Enterprise Surveys.</w:t>
       </w:r>
     </w:p>
     <w:p>
@@ -3781,8 +3974,8 @@
         <w:br w:type="page"/>
       </w:r>
     </w:p>
-    <w:bookmarkEnd w:id="46"/>
-    <w:bookmarkStart w:id="79" w:name="chương-2-tổng-quan-tài-liệu"/>
+    <w:bookmarkEnd w:id="48"/>
+    <w:bookmarkStart w:id="81" w:name="chương-2-tổng-quan-tài-liệu"/>
     <w:p>
       <w:pPr>
         <w:pStyle w:val="Heading1"/>
@@ -3806,7 +3999,7 @@
         </w:pict>
       </w:r>
     </w:p>
-    <w:bookmarkStart w:id="51" w:name="các-khái-niệm-cốt-lõi"/>
+    <w:bookmarkStart w:id="53" w:name="các-khái-niệm-cốt-lõi"/>
     <w:p>
       <w:pPr>
         <w:pStyle w:val="Heading2"/>
@@ -3815,7 +4008,7 @@
         <w:t xml:space="preserve">2.1 Các khái niệm cốt lõi</w:t>
       </w:r>
     </w:p>
-    <w:bookmarkStart w:id="47" w:name="quốc-tế-hóa-doanh-nghiệp"/>
+    <w:bookmarkStart w:id="49" w:name="quốc-tế-hóa-doanh-nghiệp"/>
     <w:p>
       <w:pPr>
         <w:pStyle w:val="Heading3"/>
@@ -3863,8 +4056,8 @@
         <w:t xml:space="preserve">Điều quan trọng cần lưu ý là quốc tế hóa không phải là một trạng thái nhị phân, mà là một biến liên tục biểu thị cường độ tham gia thị trường quốc tế, có thể thay đổi theo thời gian và phản ánh quá trình cam kết tích lũy của doanh nghiệp vào các thị trường nước ngoài (Johanson &amp; Vahlne, 1977, 2009).</w:t>
       </w:r>
     </w:p>
-    <w:bookmarkEnd w:id="47"/>
-    <w:bookmarkStart w:id="48" w:name="hiệu-quả-hoạt-động-doanh-nghiệp"/>
+    <w:bookmarkEnd w:id="49"/>
+    <w:bookmarkStart w:id="50" w:name="hiệu-quả-hoạt-động-doanh-nghiệp"/>
     <w:p>
       <w:pPr>
         <w:pStyle w:val="Heading3"/>
@@ -3897,8 +4090,8 @@
         <w:t xml:space="preserve">Cần nhấn mạnh rằng việc chọn thước đo hiệu quả không chỉ là quyết định kỹ thuật, mà còn phản ánh quan niệm lý thuyết về hiệu quả. Trong bối cảnh quốc tế hóa ở các nền kinh tế đang phát triển, năng suất lao động phản ánh trực tiếp khả năng chuyển hóa nguồn lực đầu vào thành kết quả đầu ra, qua đó thể hiện năng lực cạnh tranh thực chất của doanh nghiệp, khác với ROA vốn bị ảnh hưởng bởi cấu trúc tài sản và hệ thống kế toán đặc thù của từng quốc gia.</w:t>
       </w:r>
     </w:p>
-    <w:bookmarkEnd w:id="48"/>
-    <w:bookmarkStart w:id="49" w:name="Xfff4943f729a78f5449986a54b8a0ad8ed2eb31"/>
+    <w:bookmarkEnd w:id="50"/>
+    <w:bookmarkStart w:id="51" w:name="Xfff4943f729a78f5449986a54b8a0ad8ed2eb31"/>
     <w:p>
       <w:pPr>
         <w:pStyle w:val="Heading3"/>
@@ -3975,8 +4168,8 @@
         <w:t xml:space="preserve">Hai cấu trúc TCI và DAI không đồng nhất và vận hành theo cơ chế khác nhau trong mối quan hệ quốc tế hóa, hiệu quả: TCI hoạt động chủ yếu như một nhân tố nâng mặt bằng hiệu quả (level shifter), trong khi DAI có xu hướng làm thay đổi độ dốc hoặc độ cong của đường quan hệ I–P tùy theo bối cảnh (Bhandari et al., 2023; Chen &amp; Meng, 2022). Việc duy trì sự phân biệt rõ ràng này trong suốt luận án là điều kiện tiên quyết để đảm bảo tính thuần khiết của cấu trúc (construct purity) theo tiêu chuẩn của Coltman et al. (2008).</w:t>
       </w:r>
     </w:p>
-    <w:bookmarkEnd w:id="49"/>
-    <w:bookmarkStart w:id="50" w:name="bối-cảnh-thể-chế-và-khung-icrv"/>
+    <w:bookmarkEnd w:id="51"/>
+    <w:bookmarkStart w:id="52" w:name="bối-cảnh-thể-chế-và-khung-icrv"/>
     <w:p>
       <w:pPr>
         <w:pStyle w:val="Heading3"/>
@@ -4034,9 +4227,9 @@
         </w:pict>
       </w:r>
     </w:p>
-    <w:bookmarkEnd w:id="50"/>
-    <w:bookmarkEnd w:id="51"/>
-    <w:bookmarkStart w:id="57" w:name="các-lý-thuyết-nền"/>
+    <w:bookmarkEnd w:id="52"/>
+    <w:bookmarkEnd w:id="53"/>
+    <w:bookmarkStart w:id="59" w:name="các-lý-thuyết-nền"/>
     <w:p>
       <w:pPr>
         <w:pStyle w:val="Heading2"/>
@@ -4045,7 +4238,7 @@
         <w:t xml:space="preserve">2.2 Các lý thuyết nền</w:t>
       </w:r>
     </w:p>
-    <w:bookmarkStart w:id="52" w:name="mô-hình-quốc-tế-hóa-uppsala"/>
+    <w:bookmarkStart w:id="54" w:name="mô-hình-quốc-tế-hóa-uppsala"/>
     <w:p>
       <w:pPr>
         <w:pStyle w:val="Heading3"/>
@@ -4140,8 +4333,8 @@
         <w:t xml:space="preserve">Việc tái định vị mô hình Uppsala trong luận án dựa trên một phân biệt khái niệm quan trọng giữa cơ chế học hỏi và trình tự thâm nhập. Vahlne (2020), trong bản cập nhật gần đây nhất do chính đồng tác giả của mô hình gốc thực hiện, nhấn mạnh rằng cốt lõi bền vững của truyền thống Uppsala không nằm ở trình tự bốn bước mang tính mô tả, mà nằm ở cơ chế tiến hóa: doanh nghiệp tích lũy tri thức trải nghiệm, điều chỉnh cam kết, và tái cấu trúc vị trí mạng lưới theo thời gian. Cách diễn giải này tách phần lõi lý thuyết khỏi phần biểu hiện thực nghiệm, do đó giải phóng mô hình khỏi sự phụ thuộc vào bối cảnh tiền số. Đối với các doanh nghiệp ở những nền kinh tế chuyển đổi và mới nổi tại châu Á, cơ chế học hỏi trải nghiệm có hàm ý trực tiếp với hình dạng phi tuyến của quan hệ I–P: giai đoạn đầu của đường cong, nơi hiệu quả suy giảm, phản ánh chính chi phí học hỏi và chi phí của gánh nặng người nước ngoài chưa được khấu hao, trong khi giai đoạn giữa phản ánh lợi ích thu được khi tri thức trải nghiệm đạt ngưỡng tới hạn (Lu &amp; Beamish, 2004). Hennart (2007) bổ sung một cảnh báo lý thuyết quan trọng rằng quan hệ giữa mức độ đa quốc gia và hiệu quả không phải là một quy luật phổ quát tự thân, mà phụ thuộc vào bản chất của tài sản đặc thù mà doanh nghiệp khai thác xuyên biên giới; lập luận này củng cố cách tiếp cận của luận án, theo đó cơ chế học hỏi của Uppsala cần được đặt trong tương tác với năng lực và bối cảnh, thay vì được xem là động lực độc lập.</w:t>
       </w:r>
     </w:p>
-    <w:bookmarkEnd w:id="52"/>
-    <w:bookmarkStart w:id="53" w:name="lý-thuyết-dựa-trên-nguồn-lực"/>
+    <w:bookmarkEnd w:id="54"/>
+    <w:bookmarkStart w:id="55" w:name="lý-thuyết-dựa-trên-nguồn-lực"/>
     <w:p>
       <w:pPr>
         <w:pStyle w:val="Heading3"/>
@@ -4182,8 +4375,8 @@
         <w:t xml:space="preserve">Lý thuyết năng lực động cần được phân tích sâu hơn để làm rõ vì sao TCI được định vị như một dạng năng lực bậc cao trong khung của luận án. Eisenhardt và Martin (2000) tinh chỉnh khái niệm năng lực động bằng cách lập luận rằng các năng lực này về bản chất là những quy trình tổ chức có thể nhận diện được, và giá trị cạnh tranh của chúng phụ thuộc vào tính kịp thời cùng khả năng tái cấu hình nguồn lực trong môi trường biến động. Teece (2007) làm rõ thêm vi nền tảng của năng lực động qua ba nhóm hoạt động: cảm nhận cơ hội, nắm bắt cơ hội, và tái cấu hình tài sản; ba nhóm hoạt động này tương ứng trực tiếp với những đòi hỏi mà doanh nghiệp phải đáp ứng khi mở rộng ra thị trường nước ngoài bất định. Theo logic đó, năng lực công nghệ không chỉ là một kho tài sản tĩnh thỏa mãn tiêu chí VRIN, mà còn là cơ chế cho phép doanh nghiệp hấp thụ tri thức mới và tái triển khai nguồn lực khi điều kiện thị trường quốc tế thay đổi (Cohen &amp; Levinthal, 1990; Teece et al., 1997). Sự phân biệt giữa năng lực bậc một, tức năng lực vận hành thường nhật, và năng lực bậc cao, tức năng lực tái cấu hình, cung cấp cơ sở lý thuyết cho việc tách TCI khỏi DAI: TCI mang đặc trưng của năng lực bậc cao gắn với chiều sâu tổ chức, trong khi DAI gần với năng lực vận hành bề mặt, dễ tiếp cận và dễ sao chép hơn, do đó khó tạo ra lợi thế bền vững theo tinh thần RBV (Barney, 1991). Phân tầng này giải thích vì sao luận án dự báo hai cấu trúc số vận hành qua hai cơ chế khác nhau trong quan hệ I–P, thay vì giả định một hiệu ứng đồng nhất.</w:t>
       </w:r>
     </w:p>
-    <w:bookmarkEnd w:id="53"/>
-    <w:bookmarkStart w:id="54" w:name="lý-thuyết-thể-chế"/>
+    <w:bookmarkEnd w:id="55"/>
+    <w:bookmarkStart w:id="56" w:name="lý-thuyết-thể-chế"/>
     <w:p>
       <w:pPr>
         <w:pStyle w:val="Heading3"/>
@@ -4242,8 +4435,8 @@
         <w:t xml:space="preserve">Để vận hành hóa bối cảnh thể chế một cách chặt chẽ, luận án dựa trên một nền tảng lý luận rộng hơn về kinh tế học thể chế và quan điểm dựa trên thể chế trong chiến lược quốc tế. Williamson (2000) phân tầng các cấp độ phân tích thể chế từ những ràng buộc phi chính thức ăn sâu vào văn hóa, đến môi trường thể chế chính thức, đến quản trị giao dịch, và sau cùng là phân bổ nguồn lực; cách phân tầng này làm rõ rằng chất lượng thể chế tác động đến doanh nghiệp qua nhiều kênh đồng thời, chứ không chỉ qua một chỉ số tổng hợp duy nhất. Peng và cộng sự (2008) phát triển quan điểm dựa trên thể chế như một trụ cột thứ ba của chiến lược quốc tế, bên cạnh quan điểm dựa trên ngành và quan điểm dựa trên nguồn lực, lập luận rằng ở các nền kinh tế mới nổi, thể chế không chỉ là bối cảnh nền mà là yếu tố trực tiếp định hình lựa chọn chiến lược của doanh nghiệp. Peng (2003) bổ sung góc nhìn động về quá trình chuyển đổi thể chế, theo đó các doanh nghiệp ở những nền kinh tế đang chuyển đổi điều chỉnh chiến lược từ dựa trên quan hệ sang dựa trên quy tắc khi khung thể chế chính thức trưởng thành; góc nhìn này cung cấp cơ sở lý thuyết cho giả thuyết H6 về dị biệt thời gian của quan hệ I–P ở các nền kinh tế chuyển đổi nhanh. Ngoài ra, Kim và cộng sự (2026) định nghĩa năng lực thể chế như khả năng thực thi chính sách của các tổ chức công, phân tách thành chiều tổ chức và chiều quản trị, cung cấp một khung phân tích chính thức làm cơ sở cho việc phân loại sáu chế độ thể chế trong khung ICRV. Tổng hợp các tiếp cận này, luận án xem khung ICRV không phải là một biến phân loại tùy nghi, mà là sự vận hành hóa có hệ thống của một gradient thể chế đa chiều, neo đậu trong lý thuyết thể chế đương đại.</w:t>
       </w:r>
     </w:p>
-    <w:bookmarkEnd w:id="54"/>
-    <w:bookmarkStart w:id="55" w:name="lý-thuyết-thượng-tầng-quản-trị"/>
+    <w:bookmarkEnd w:id="56"/>
+    <w:bookmarkStart w:id="57" w:name="lý-thuyết-thượng-tầng-quản-trị"/>
     <w:p>
       <w:pPr>
         <w:pStyle w:val="Heading3"/>
@@ -4294,8 +4487,8 @@
         <w:t xml:space="preserve">Cơ sở lý luận của lý thuyết thượng tầng quản trị trong bối cảnh quốc tế hóa được củng cố thêm bởi luận điểm trung tâm rằng quyết định chiến lược lớn được lọc qua trường nhận thức hạn chế và hệ giá trị của nhà quản trị cấp cao, đặc biệt khi nhiệm vụ mang tính bất định cao và quá tải thông tin (Hambrick, 2007). Mở rộng quốc tế là một trong những quyết định chiến lược điển hình cho điều kiện này, bởi nó đòi hỏi nhà quản trị đánh giá cơ hội và rủi ro ở những thị trường mà thông tin không đầy đủ và khung tham chiếu quen thuộc không còn phù hợp. Kinh nghiệm quốc tế của đội ngũ quản trị cấp cao, theo Sambharya (1996), gắn với mức độ và phạm vi của chiến lược đa quốc gia, vì kinh nghiệm này mở rộng trường nhận thức và giảm thiên lệch nhận thức gắn với gánh nặng người nước ngoài. Nielsen (2010) tinh chỉnh thêm bằng cách chỉ ra rằng tác động của tính quốc tế của đội ngũ quản trị cấp cao lên hiệu quả có thể vận hành qua những cơ chế trung gian liên quan đến lựa chọn phương thức thâm nhập, hàm ý rằng đặc điểm nhà quản trị không tác động trực tiếp lên hiệu quả mà điều tiết chất lượng của các quyết định quốc tế hóa. Trong khung của luận án, hai hàm ý này hội tụ vào giả thuyết H4: kinh nghiệm và đa dạng giới tính của nhà quản trị cấp cao điều tiết khả năng doanh nghiệp chuyển hóa quốc tế hóa thành hiệu quả, thông qua việc nâng cao chất lượng nhận thức chiến lược và sự thận trọng trong quản trị rủi ro quốc tế (Post &amp; Byron, 2015).</w:t>
       </w:r>
     </w:p>
-    <w:bookmarkEnd w:id="55"/>
-    <w:bookmarkStart w:id="56" w:name="lớp-mở-rộng-digital-capability-lens"/>
+    <w:bookmarkEnd w:id="57"/>
+    <w:bookmarkStart w:id="58" w:name="lớp-mở-rộng-digital-capability-lens"/>
     <w:p>
       <w:pPr>
         <w:pStyle w:val="Heading3"/>
@@ -4343,9 +4536,9 @@
         </w:pict>
       </w:r>
     </w:p>
-    <w:bookmarkEnd w:id="56"/>
-    <w:bookmarkEnd w:id="57"/>
-    <w:bookmarkStart w:id="63" w:name="tổng-quan-thực-nghiệm"/>
+    <w:bookmarkEnd w:id="58"/>
+    <w:bookmarkEnd w:id="59"/>
+    <w:bookmarkStart w:id="65" w:name="tổng-quan-thực-nghiệm"/>
     <w:p>
       <w:pPr>
         <w:pStyle w:val="Heading2"/>
@@ -4354,7 +4547,7 @@
         <w:t xml:space="preserve">2.3 Tổng quan thực nghiệm</w:t>
       </w:r>
     </w:p>
-    <w:bookmarkStart w:id="58" w:name="giai-đoạn-phát-triển-của-văn-liệu-ip"/>
+    <w:bookmarkStart w:id="60" w:name="giai-đoạn-phát-triển-của-văn-liệu-ip"/>
     <w:p>
       <w:pPr>
         <w:pStyle w:val="Heading3"/>
@@ -4439,8 +4632,8 @@
         <w:t xml:space="preserve">được khái quát hóa bởi Pierce và Aguinis (2013).</w:t>
       </w:r>
     </w:p>
-    <w:bookmarkEnd w:id="58"/>
-    <w:bookmarkStart w:id="59" w:name="bằng-chứng-meta-analytic"/>
+    <w:bookmarkEnd w:id="60"/>
+    <w:bookmarkStart w:id="61" w:name="bằng-chứng-meta-analytic"/>
     <w:p>
       <w:pPr>
         <w:pStyle w:val="Heading3"/>
@@ -4481,8 +4674,8 @@
         <w:t xml:space="preserve">Giá trị của bằng chứng meta-analytic không chỉ nằm ở ước lượng tác động tổng hợp, mà còn ở khả năng phân tách các nguồn tạo nên mức dị biệt cao giữa các nghiên cứu, qua đó định hướng việc xây dựng lý thuyết. Combs và cộng sự (2011) lập luận rằng tổng hợp tích lũy bằng phương pháp meta-analysis nên được ưu tiên hơn so với đếm phiếu, vì meta-analysis cho phép đánh giá cả độ lớn lẫn tính ổn định của hiệu ứng qua nhiều bối cảnh. Aguinis và cộng sự (2011) cảnh báo rằng nhiều lựa chọn phương pháp và phán đoán trong quá trình tổng hợp, từ cách mã hóa biến điều tiết đến cách xử lý phụ thuộc giữa các quy mô hiệu ứng, có thể ảnh hưởng đáng kể đến kết luận, do đó đòi hỏi tính minh bạch và phân tích độ vững. Những nguyên tắc này có hàm ý trực tiếp đối với thiết kế của Nghiên cứu thành phần P6: việc sử dụng mô hình ba tầng cho phép tách phương sai trong nội bộ nghiên cứu khỏi phương sai giữa các nghiên cứu, qua đó xử lý đúng cấu trúc phụ thuộc mà Aguinis và cộng sự (2011) lưu ý. Karna và cộng sự (2016), qua một meta-analysis về quan hệ giữa năng lực và hiệu quả tài chính, cung cấp bằng chứng rằng môi trường điều tiết đáng kể cách năng lực chuyển hóa thành hiệu quả; phát hiện này song song với luận điểm trung tâm của luận án rằng bối cảnh thể chế điều tiết cơ chế chuyển hóa quốc tế hóa thành hiệu quả. Tổng hợp lại, bằng chứng meta-analytic không chỉ định lượng mức dị biệt mà còn xác nhận rằng các biến điều tiết bối cảnh là đối tượng lý thuyết hóa chính, từ đó biện hộ cho việc xây dựng một khung tích hợp đa tầng thay vì kiểm định rời rạc từng biến điều tiết đơn lẻ.</w:t>
       </w:r>
     </w:p>
-    <w:bookmarkEnd w:id="59"/>
-    <w:bookmarkStart w:id="60" w:name="X2dab31dc90ae94a491c7104c141028484c6eeaa"/>
+    <w:bookmarkEnd w:id="61"/>
+    <w:bookmarkStart w:id="62" w:name="X2dab31dc90ae94a491c7104c141028484c6eeaa"/>
     <w:p>
       <w:pPr>
         <w:pStyle w:val="Heading3"/>
@@ -4559,8 +4752,8 @@
         <w:t xml:space="preserve">Văn liệu về quan hệ I–P trong bối cảnh các nền kinh tế mới nổi của châu Á đã tích lũy đủ để cho thấy rằng vai trò của bối cảnh thể chế và năng lực doanh nghiệp là đặc biệt nổi bật ở khu vực này. Kafouros và cộng sự (2023) chứng minh rằng chất lượng thể chế và tính năng động của ngành cùng giải thích biến thiên hiệu quả doanh nghiệp ở các nền kinh tế mới nổi, hàm ý rằng tác động của quốc tế hóa không thể tách rời khỏi điều kiện thể chế và ngành mà doanh nghiệp hoạt động. Xu (2024) tinh chỉnh quan điểm về chênh lệch thể chế bằng cách phân tách giữa mức độ phơi nhiễm trên luật định và mức độ thực thi trên thực tế, cho thấy rằng khoảng cách giữa quy định chính thức và thực thi thực tế là một nguồn dị biệt quan trọng mà các thước đo thể chế tổng hợp dễ bỏ sót. Chao và Kumar (2010) cung cấp bằng chứng rằng khoảng cách thể chế giữa quốc gia nguồn và quốc gia đích điều tiết quan hệ giữa đa dạng quốc tế và hiệu quả, củng cố luận điểm rằng cùng một mức độ quốc tế hóa tạo ra kết quả khác nhau tùy theo bối cảnh thể chế. Da Cunha và cộng sự (2023) bổ sung bằng chứng rằng thể chế chính thức ở quốc gia nguồn điều tiết quan hệ giữa phương thức quốc tế hóa và hiệu quả, trong khi Cuervo-Cazurra và cộng sự (2018) lập luận rằng bất định thể chế ở quốc gia nguồn có thể bồi đắp năng lực quản lý bất định đặc thù. Tổng hợp các bằng chứng này định vị châu Á như một bối cảnh lý tưởng để kiểm định khung điều tiết đa tầng, đồng thời làm nổi bật rằng sự thiếu đại diện của các nền kinh tế chuyển đổi và các nền kinh tế đảo nhỏ là một khoảng trống thực chất chứ không chỉ là vấn đề về phạm vi mẫu.</w:t>
       </w:r>
     </w:p>
-    <w:bookmarkEnd w:id="60"/>
-    <w:bookmarkStart w:id="61" w:name="X732d7d1b7e90f1451ce2bd542fd674aab0604d1"/>
+    <w:bookmarkEnd w:id="62"/>
+    <w:bookmarkStart w:id="63" w:name="X732d7d1b7e90f1451ce2bd542fd674aab0604d1"/>
     <w:p>
       <w:pPr>
         <w:pStyle w:val="Heading3"/>
@@ -4593,8 +4786,8 @@
         <w:t xml:space="preserve">Nền tảng lý luận cho việc phân tách TCI và DAI cần được trình bày sâu hơn để làm rõ rằng đây không phải là một tinh chỉnh đo lường tùy nghi, mà là một yêu cầu lý thuyết có cơ sở. Bharadwaj và cộng sự (2013) lập luận rằng chiến lược kinh doanh số là một cấu trúc ở cấp độ chiến lược, khác biệt với năng lực công nghệ thông tin ở cấp độ chức năng, và việc gộp hai cấu trúc này che khuất chính cơ chế tạo giá trị mà nhà nghiên cứu cần phân tách. Nambisan và cộng sự (2019) làm rõ thêm rằng chuyển đổi số tác động đến đổi mới và khởi nghiệp qua nhiều cơ chế phân tầng, từ số hóa công cụ đến tái cấu trúc mô hình kinh doanh, hàm ý rằng các chỉ báo số ở những tầng khác nhau không thể được xem là tương đương về mặt lý thuyết. Phân tầng này nhất quán với khung ba cấp độ của Verhoef và cộng sự (2021), theo đó số hóa thông tin và số hóa quy trình nằm ở tầng nông hơn so với chuyển đổi số toàn diện. Trong bối cảnh quốc tế hóa, Li và cộng sự (2022) cung cấp bằng chứng từ doanh nghiệp sản xuất Trung Quốc rằng số hóa điều tiết quan hệ I–P, song nghiên cứu này, giống như đa số văn liệu hiện hành, vẫn xử lý năng lực số như một cấu trúc tổng hợp. Knight và Cavusgil (2004) bổ sung một góc nhìn lịch sử quan trọng rằng năng lực tổ chức và đổi mới cho phép một số doanh nghiệp quốc tế hóa sớm và nhanh, cho thấy rằng chiều sâu năng lực nội tại và công cụ giao diện đóng vai trò khác nhau trong quá trình quốc tế hóa. Tổng hợp các luận điểm này, luận án lập luận rằng nếu TCI vận hành như chiều sâu năng lực hấp thụ và tái cấu hình, còn DAI vận hành như công cụ phối hợp bề mặt, thì việc gộp hai cấu trúc sẽ trung bình hóa hai hiệu ứng có thể trái chiều, dẫn đến ước lượng chệch và kết luận chính sách không thể áp dụng (Coltman et al., 2008; Bharadwaj et al., 2013).</w:t>
       </w:r>
     </w:p>
-    <w:bookmarkEnd w:id="61"/>
-    <w:bookmarkStart w:id="62" w:name="Xc7bb84a3900dbb18a70df5d2a00bb71d9360b13"/>
+    <w:bookmarkEnd w:id="63"/>
+    <w:bookmarkStart w:id="64" w:name="Xc7bb84a3900dbb18a70df5d2a00bb71d9360b13"/>
     <w:p>
       <w:pPr>
         <w:pStyle w:val="Heading3"/>
@@ -4685,9 +4878,9 @@
         </w:pict>
       </w:r>
     </w:p>
-    <w:bookmarkEnd w:id="62"/>
-    <w:bookmarkEnd w:id="63"/>
-    <w:bookmarkStart w:id="64" w:name="khoảng-trống-nghiên-cứu"/>
+    <w:bookmarkEnd w:id="64"/>
+    <w:bookmarkEnd w:id="65"/>
+    <w:bookmarkStart w:id="66" w:name="khoảng-trống-nghiên-cứu"/>
     <w:p>
       <w:pPr>
         <w:pStyle w:val="Heading2"/>
@@ -4827,8 +5020,8 @@
         </w:pict>
       </w:r>
     </w:p>
-    <w:bookmarkEnd w:id="64"/>
-    <w:bookmarkStart w:id="77" w:name="mô-hình-nghiên-cứu-và-hệ-giả-thuyết"/>
+    <w:bookmarkEnd w:id="66"/>
+    <w:bookmarkStart w:id="79" w:name="mô-hình-nghiên-cứu-và-hệ-giả-thuyết"/>
     <w:p>
       <w:pPr>
         <w:pStyle w:val="Heading2"/>
@@ -4837,7 +5030,7 @@
         <w:t xml:space="preserve">2.5 Mô hình nghiên cứu và hệ giả thuyết</w:t>
       </w:r>
     </w:p>
-    <w:bookmarkStart w:id="68" w:name="mô-hình-khái-niệm"/>
+    <w:bookmarkStart w:id="70" w:name="mô-hình-khái-niệm"/>
     <w:p>
       <w:pPr>
         <w:pStyle w:val="Heading3"/>
@@ -4931,18 +5124,18 @@
           <wp:inline>
             <wp:extent cx="5753100" cy="3558086"/>
             <wp:effectExtent b="0" l="0" r="0" t="0"/>
-            <wp:docPr descr="Hình 2.1. Khung khái niệm tích hợp đa tầng CDCM cho quan hệ Quốc tế hóa–Hiệu quả tại châu Á" title="" id="66" name="Picture"/>
+            <wp:docPr descr="Hình 2.1. Khung khái niệm tích hợp đa tầng CDCM cho quan hệ Quốc tế hóa–Hiệu quả tại châu Á" title="" id="68" name="Picture"/>
             <a:graphic>
               <a:graphicData uri="http://schemas.openxmlformats.org/drawingml/2006/picture">
                 <pic:pic>
                   <pic:nvPicPr>
-                    <pic:cNvPr descr="figures/fig_2_1_cdcm_conceptual_model.png" id="67" name="Picture"/>
+                    <pic:cNvPr descr="figures/fig_2_1_cdcm_conceptual_model.png" id="69" name="Picture"/>
                     <pic:cNvPicPr>
                       <a:picLocks noChangeArrowheads="1" noChangeAspect="1"/>
                     </pic:cNvPicPr>
                   </pic:nvPicPr>
                   <pic:blipFill>
-                    <a:blip r:embed="rId65"/>
+                    <a:blip r:embed="rId67"/>
                     <a:stretch>
                       <a:fillRect/>
                     </a:stretch>
@@ -5015,8 +5208,8 @@
         <w:t xml:space="preserve">Nguồn: tác giả xây dựng dựa trên Uppsala, RBV, lý thuyết thể chế, lý thuyết thượng tầng quản trị và digital capability lens.</w:t>
       </w:r>
     </w:p>
-    <w:bookmarkEnd w:id="68"/>
-    <w:bookmarkStart w:id="69" w:name="giả-thuyết-h1-phi-tuyến-chữ-u-ngược"/>
+    <w:bookmarkEnd w:id="70"/>
+    <w:bookmarkStart w:id="71" w:name="giả-thuyết-h1-phi-tuyến-chữ-u-ngược"/>
     <w:p>
       <w:pPr>
         <w:pStyle w:val="Heading3"/>
@@ -5033,8 +5226,8 @@
         <w:t xml:space="preserve">Trên cơ sở lý thuyết từ Uppsala về chi phí thâm nhập giai đoạn đầu, RBV về lợi thế cạnh tranh tích lũy ở giai đoạn trung, và lý thuyết chi phí giao dịch về sự phức tạp điều phối ở giai đoạn mở rộng quá mức, giả thuyết H1 được phát biểu như sau. Quan hệ giữa mức độ quốc tế hóa và hiệu quả hoạt động của các doanh nghiệp ở các quốc gia châu Á có dạng phi tuyến chữ U ngược, với một điểm điểm uốn tối ưu trước khi chi phí điều phối và bất định vượt qua lợi ích từ mở rộng thị trường quốc tế. Cơ sở lý thuyết trực tiếp bao gồm mô hình đường cong chữ S của Lu và Beamish (2004), lý thuyết ba giai đoạn của Contractor et al. (2003), và bằng chứng chữ U ngược ban đầu của Hitt et al. (1997).</w:t>
       </w:r>
     </w:p>
-    <w:bookmarkEnd w:id="69"/>
-    <w:bookmarkStart w:id="70" w:name="X1e4f3f6a2f993a9a6e6b8e711bb6f577a973378"/>
+    <w:bookmarkEnd w:id="71"/>
+    <w:bookmarkStart w:id="72" w:name="X1e4f3f6a2f993a9a6e6b8e711bb6f577a973378"/>
     <w:p>
       <w:pPr>
         <w:pStyle w:val="Heading3"/>
@@ -5093,8 +5286,8 @@
         <w:t xml:space="preserve">, không có điểm điểm uốn trong phạm vi dữ liệu, phản ánh gánh nặng quốc tế hóa bắt buộc (Forced Internationalization Penalty, FIP) nơi doanh nghiệp xuất khẩu để sinh tồn chứ không phải để khai thác lợi thế cạnh tranh. Cơ sở lý thuyết bao gồm Institutional Theory (North, 1990), lý thuyết chi phí giao dịch (Williamson, 1985), Khanna và Palepu (2010) về khoảng trống thể chế, và Lall (2004) về SIDS structural constraints.</w:t>
       </w:r>
     </w:p>
-    <w:bookmarkEnd w:id="70"/>
-    <w:bookmarkStart w:id="71" w:name="X4e283c765855921a9a0bf70a9d0a980f4bd502f"/>
+    <w:bookmarkEnd w:id="72"/>
+    <w:bookmarkStart w:id="73" w:name="X4e283c765855921a9a0bf70a9d0a980f4bd502f"/>
     <w:p>
       <w:pPr>
         <w:pStyle w:val="Heading3"/>
@@ -5111,8 +5304,8 @@
         <w:t xml:space="preserve">Dựa trên RBV (Barney, 1991) và lý thuyết năng lực động (Teece et al., 1997), năng lực công nghệ là một nguồn lực VRIN giúp doanh nghiệp khai thác lợi ích từ quốc tế hóa hiệu quả hơn. Giả thuyết H2 được phát biểu như sau. Năng lực công nghệ (TCI) làm gia tăng tác động tích cực của quốc tế hóa lên hiệu quả hoạt động của doanh nghiệp, bằng cách nâng mặt bằng hiệu quả tổng thể và làm giảm chi phí học hỏi thị trường quốc tế, do đó làm dịch chuyển đường quan hệ I–P lên cao hơn và có thể điều chỉnh vị trí của điểm điểm uốn. Cơ sở lý thuyết bao gồm Barney (1991), Teece et al. (1997), và Bhandari et al. (2023).</w:t>
       </w:r>
     </w:p>
-    <w:bookmarkEnd w:id="71"/>
-    <w:bookmarkStart w:id="72" w:name="X128abf7a15253174c605d07067219580799d526"/>
+    <w:bookmarkEnd w:id="73"/>
+    <w:bookmarkStart w:id="74" w:name="X128abf7a15253174c605d07067219580799d526"/>
     <w:p>
       <w:pPr>
         <w:pStyle w:val="Heading3"/>
@@ -5129,8 +5322,8 @@
         <w:t xml:space="preserve">Phân biệt rõ với H2, DAI không có chiều sâu năng lực tổ chức như TCI nhưng có vai trò giảm thiểu chi phí phối hợp xuyên biên giới ở mức xuất khẩu cao. Giả thuyết H3 được phát biểu như sau. Chỉ số chấp nhận số (DAI) điều tiết mối quan hệ I–P, với vai trò bổ trợ rõ rệt hơn ở mức export intensity cao khi DAI giúp giảm chi phí phối hợp giao dịch xuyên biên giới, theo đó DAI làm thay đổi độ dốc của đường quan hệ I–P chứ không nhất thiết nâng mặt bằng hiệu quả như TCI. Cơ sở lý thuyết bao gồm Verhoef et al. (2021), Stallkamp và Schotter (2021), và Bustamante et al. (2022). Sự phân biệt cơ chế tác động giữa H2 và H3 là đóng góp lý thuyết quan trọng, cho phép phân tách TCI và DAI trong mô hình hồi quy thực nghiệm.</w:t>
       </w:r>
     </w:p>
-    <w:bookmarkEnd w:id="72"/>
-    <w:bookmarkStart w:id="73" w:name="X23e235aa1540adf65664378accbc0b6a13fdffd"/>
+    <w:bookmarkEnd w:id="74"/>
+    <w:bookmarkStart w:id="75" w:name="X23e235aa1540adf65664378accbc0b6a13fdffd"/>
     <w:p>
       <w:pPr>
         <w:pStyle w:val="Heading3"/>
@@ -5147,8 +5340,8 @@
         <w:t xml:space="preserve">Dựa trên Upper Echelons Theory (Hambrick &amp; Mason, 1984; Hambrick, 2007), quyết định chiến lược quốc tế hóa và khả năng chuyển hóa nó thành hiệu quả phụ thuộc vào đặc điểm nhận thức và kinh nghiệm của nhà quản trị. Giả thuyết H4 được phát biểu như sau. Kinh nghiệm quản trị và giới tính nữ của nhà quản trị cấp cao làm mạnh hơn tác động tích cực của quốc tế hóa lên hiệu quả hoạt động, thông qua cơ chế nâng cao nhận thức chiến lược quốc tế và quản trị rủi ro thận trọng hơn trong quá trình mở rộng quốc tế. Cơ sở lý thuyết bao gồm Hambrick và Mason (1984), Hsu et al. (2013), và Post và Byron (2015); bằng chứng thực nghiệm ở cấp doanh nghiệp cho thấy kinh nghiệm và giới tính của nhà quản trị có thể điều tiết quan hệ quốc tế hóa–hiệu quả (Phan, Do, &amp; Phan, 2020; Phan et al., 2021; Do &amp; Phan, 2025).</w:t>
       </w:r>
     </w:p>
-    <w:bookmarkEnd w:id="73"/>
-    <w:bookmarkStart w:id="74" w:name="X1090b4891c9abf48d7aab0f24d22e9d66d1b02d"/>
+    <w:bookmarkEnd w:id="75"/>
+    <w:bookmarkStart w:id="76" w:name="X1090b4891c9abf48d7aab0f24d22e9d66d1b02d"/>
     <w:p>
       <w:pPr>
         <w:pStyle w:val="Heading3"/>
@@ -5183,8 +5376,8 @@
         <w:t xml:space="preserve">(digital shield) giúp bù đắp một phần khoảng trống thể chế; cường độ điều tiết này giảm dần theo gradient ICRV từ các nền kinh tế frontier (Nhóm V–VI, điều tiết mạnh nhất) đến các nền kinh tế tiên tiến (Nhóm I, điều tiết yếu nhất). Cơ sở lý thuyết bao gồm North (1990), Khanna và Palepu (2010), và Marano et al. (2016).</w:t>
       </w:r>
     </w:p>
-    <w:bookmarkEnd w:id="74"/>
-    <w:bookmarkStart w:id="75" w:name="Xef57ba07d4a873fdbd0fe03fe237e0edc9cc461"/>
+    <w:bookmarkEnd w:id="76"/>
+    <w:bookmarkStart w:id="77" w:name="Xef57ba07d4a873fdbd0fe03fe237e0edc9cc461"/>
     <w:p>
       <w:pPr>
         <w:pStyle w:val="Heading3"/>
@@ -5208,8 +5401,8 @@
         </w:pict>
       </w:r>
     </w:p>
-    <w:bookmarkEnd w:id="75"/>
-    <w:bookmarkStart w:id="76" w:name="Xf335a697a9ee7a16b4b110396196a58c357e907"/>
+    <w:bookmarkEnd w:id="77"/>
+    <w:bookmarkStart w:id="78" w:name="Xf335a697a9ee7a16b4b110396196a58c357e907"/>
     <w:p>
       <w:pPr>
         <w:pStyle w:val="Heading3"/>
@@ -5777,57 +5970,57 @@
         <w:t xml:space="preserve">Ghi chú về ký hiệu: Hệ giả thuyết của luận án gồm sáu giả thuyết trọng tâm H1–H6 và một giả thuyết điều kiện biên H1b. Trong các mô hình thực nghiệm chi tiết ở Chương 3, một số nghiên cứu thành phần sử dụng các giả thuyết con (sub-hypotheses) lồng dưới hệ giả thuyết chính của luận án, cụ thể: H2b (kiểm định tính ổn định xuyên sóng của năng lực điều tiết, thuộc P5, lồng dưới H2/H6); H4a–H4b (kiểm định điều tiết độ cong theo năng lực, thuộc P5, lồng dưới H2); tương tác tổng hợp ba chiều của P7 (lồng dưới H3 và H5); E1a–E1b (kiểm định định hướng gradient ICRV, lồng dưới H5); và H1c (kiểm định tan biến ngưỡng chữ U ngược theo thời gian tại Ấn Độ, thuộc P9, lồng dưới H1 và H6). Các ký hiệu con này phục vụ độ chính xác kỹ thuật của từng mô hình và không làm thay đổi hệ giả thuyết trọng tâm H1–H6/H1b của luận án.</w:t>
       </w:r>
     </w:p>
-    <w:bookmarkEnd w:id="76"/>
-    <w:bookmarkEnd w:id="77"/>
-    <w:bookmarkStart w:id="78" w:name="tóm-tắt-chương"/>
-    <w:p>
-      <w:pPr>
-        <w:pStyle w:val="Heading2"/>
-      </w:pPr>
-      <w:r>
-        <w:t xml:space="preserve">2.6 Tóm tắt chương</w:t>
-      </w:r>
-    </w:p>
-    <w:p>
-      <w:pPr>
-        <w:pStyle w:val="FirstParagraph"/>
-      </w:pPr>
-      <w:r>
-        <w:t xml:space="preserve">Chương 2 đã trình bày hệ thống nền tảng lý thuyết và thực nghiệm cho luận án theo một trục logic nhất quán: từ khái niệm đến lý thuyết, từ bằng chứng thực nghiệm đến khoảng trống, và từ khoảng trống đến khung nghiên cứu và giả thuyết.</w:t>
-      </w:r>
-    </w:p>
-    <w:p>
-      <w:pPr>
-        <w:pStyle w:val="BodyText"/>
-      </w:pPr>
-      <w:r>
-        <w:t xml:space="preserve">Phần đầu chương xác lập bốn khái niệm cốt lõi: quốc tế hóa doanh nghiệp (đo bằng FSTS), hiệu quả hoạt động (đo bằng labor productivity là chính), năng lực công nghệ (TCI) và chỉ số chấp nhận số (DAI) như hai cấu trúc độc lập, và bối cảnh thể chế được vận hành hóa bằng khung ICRV sáu nhóm. Phần lý thuyết nền trình bày và phân tích bốn lý thuyết kinh điển, Uppsala, RBV, Institutional Theory, và Upper Echelons Theory, cùng với lớp mở rộng Digital Capability Lens, xác định vai trò của từng lý thuyết trong khung giải thích tổng thể của luận án.</w:t>
-      </w:r>
-    </w:p>
-    <w:p>
-      <w:pPr>
-        <w:pStyle w:val="BodyText"/>
-      </w:pPr>
-      <w:r>
-        <w:t xml:space="preserve">Tổng quan thực nghiệm cho thấy văn liệu I–P đã phát triển qua ba giai đoạn, từ tuyến tính dương đến phi tuyến đến tập trung vào các biến điều tiết; các meta-analyses nhất quán cho thấy tác động tổng hợp là dương nhưng nhỏ với I² &gt; 80%, đòi hỏi cách tiếp cận biến điều tiết-centric; và bối cảnh châu Á, đặc biệt là các nền kinh tế frontier và SIDS, đang thiếu đại diện nghiêm trọng trong văn liệu.</w:t>
-      </w:r>
-    </w:p>
-    <w:p>
-      <w:pPr>
-        <w:pStyle w:val="BodyText"/>
-      </w:pPr>
-      <w:r>
-        <w:t xml:space="preserve">Ba khoảng trống được xác định: thiếu khung tích hợp đa tầng, sự đồng nhất không hợp lý TCI–DAI, và thiếu bằng chứng cross-country quy mô lớn có cấu trúc cho châu Á. Để lấp đầy ba khoảng trống này, luận án đề xuất khung CDCM và phát triển sáu giả thuyết (H1–H6) bao phủ phi tuyến cơ bản, vai trò của TCI và DAI, vai trò của đặc điểm nhà quản trị, vai trò của thể chế ICRV, và dị biệt thời gian. Chương 3 sẽ trình bày thiết kế phương pháp và chiến lược kiểm định hệ giả thuyết này.</w:t>
-      </w:r>
-    </w:p>
-    <w:p>
-      <w:r>
-        <w:br w:type="page"/>
-      </w:r>
-    </w:p>
     <w:bookmarkEnd w:id="78"/>
     <w:bookmarkEnd w:id="79"/>
-    <w:bookmarkStart w:id="80" w:name="chương-3-phương-pháp-nghiên-cứu"/>
+    <w:bookmarkStart w:id="80" w:name="tóm-tắt-chương"/>
+    <w:p>
+      <w:pPr>
+        <w:pStyle w:val="Heading2"/>
+      </w:pPr>
+      <w:r>
+        <w:t xml:space="preserve">2.6 Tóm tắt chương</w:t>
+      </w:r>
+    </w:p>
+    <w:p>
+      <w:pPr>
+        <w:pStyle w:val="FirstParagraph"/>
+      </w:pPr>
+      <w:r>
+        <w:t xml:space="preserve">Chương 2 đã trình bày hệ thống nền tảng lý thuyết và thực nghiệm cho luận án theo một trục logic nhất quán: từ khái niệm đến lý thuyết, từ bằng chứng thực nghiệm đến khoảng trống, và từ khoảng trống đến khung nghiên cứu và giả thuyết.</w:t>
+      </w:r>
+    </w:p>
+    <w:p>
+      <w:pPr>
+        <w:pStyle w:val="BodyText"/>
+      </w:pPr>
+      <w:r>
+        <w:t xml:space="preserve">Phần đầu chương xác lập bốn khái niệm cốt lõi: quốc tế hóa doanh nghiệp (đo bằng FSTS), hiệu quả hoạt động (đo bằng labor productivity là chính), năng lực công nghệ (TCI) và chỉ số chấp nhận số (DAI) như hai cấu trúc độc lập, và bối cảnh thể chế được vận hành hóa bằng khung ICRV sáu nhóm. Phần lý thuyết nền trình bày và phân tích bốn lý thuyết kinh điển, Uppsala, RBV, Institutional Theory, và Upper Echelons Theory, cùng với lớp mở rộng Digital Capability Lens, xác định vai trò của từng lý thuyết trong khung giải thích tổng thể của luận án.</w:t>
+      </w:r>
+    </w:p>
+    <w:p>
+      <w:pPr>
+        <w:pStyle w:val="BodyText"/>
+      </w:pPr>
+      <w:r>
+        <w:t xml:space="preserve">Tổng quan thực nghiệm cho thấy văn liệu I–P đã phát triển qua ba giai đoạn, từ tuyến tính dương đến phi tuyến đến tập trung vào các biến điều tiết; các meta-analyses nhất quán cho thấy tác động tổng hợp là dương nhưng nhỏ với I² &gt; 80%, đòi hỏi cách tiếp cận biến điều tiết-centric; và bối cảnh châu Á, đặc biệt là các nền kinh tế frontier và SIDS, đang thiếu đại diện nghiêm trọng trong văn liệu.</w:t>
+      </w:r>
+    </w:p>
+    <w:p>
+      <w:pPr>
+        <w:pStyle w:val="BodyText"/>
+      </w:pPr>
+      <w:r>
+        <w:t xml:space="preserve">Ba khoảng trống được xác định: thiếu khung tích hợp đa tầng, sự đồng nhất không hợp lý TCI–DAI, và thiếu bằng chứng cross-country quy mô lớn có cấu trúc cho châu Á. Để lấp đầy ba khoảng trống này, luận án đề xuất khung CDCM và phát triển sáu giả thuyết (H1–H6) bao phủ phi tuyến cơ bản, vai trò của TCI và DAI, vai trò của đặc điểm nhà quản trị, vai trò của thể chế ICRV, và dị biệt thời gian. Chương 3 sẽ trình bày thiết kế phương pháp và chiến lược kiểm định hệ giả thuyết này.</w:t>
+      </w:r>
+    </w:p>
+    <w:p>
+      <w:r>
+        <w:br w:type="page"/>
+      </w:r>
+    </w:p>
+    <w:bookmarkEnd w:id="80"/>
+    <w:bookmarkEnd w:id="81"/>
+    <w:bookmarkStart w:id="82" w:name="chương-3-phương-pháp-nghiên-cứu"/>
     <w:p>
       <w:pPr>
         <w:pStyle w:val="Heading1"/>
@@ -5836,7 +6029,7 @@
         <w:t xml:space="preserve">CHƯƠNG 3: PHƯƠNG PHÁP NGHIÊN CỨU</w:t>
       </w:r>
     </w:p>
-    <w:bookmarkEnd w:id="80"/>
+    <w:bookmarkEnd w:id="82"/>
     <w:p>
       <w:r>
         <w:pict>
@@ -5844,7 +6037,7 @@
         </w:pict>
       </w:r>
     </w:p>
-    <w:bookmarkStart w:id="83" w:name="thiết-kế-nghiên-cứu-tổng-thể"/>
+    <w:bookmarkStart w:id="85" w:name="thiết-kế-nghiên-cứu-tổng-thể"/>
     <w:p>
       <w:pPr>
         <w:pStyle w:val="Heading2"/>
@@ -5853,7 +6046,7 @@
         <w:t xml:space="preserve">3.1 Thiết kế nghiên cứu tổng thể</w:t>
       </w:r>
     </w:p>
-    <w:bookmarkStart w:id="81" w:name="loại-thiết-kế"/>
+    <w:bookmarkStart w:id="83" w:name="loại-thiết-kế"/>
     <w:p>
       <w:pPr>
         <w:pStyle w:val="Heading3"/>
@@ -5932,8 +6125,8 @@
         <w:t xml:space="preserve">là thiết kế hiếm gặp; đa số các luận án IB chỉ làm một trong hai phase. Quy mô 50 nền kinh tế/88.869 doanh nghiệp là phạm vi địa lý lớn nhất từng có cho khu vực, mở rộng từ pool 17 nước trong nghiên cứu thành phần P1.</w:t>
       </w:r>
     </w:p>
-    <w:bookmarkEnd w:id="81"/>
-    <w:bookmarkStart w:id="82" w:name="quy-trình-nghiên-cứu"/>
+    <w:bookmarkEnd w:id="83"/>
+    <w:bookmarkStart w:id="84" w:name="quy-trình-nghiên-cứu"/>
     <w:p>
       <w:pPr>
         <w:pStyle w:val="Heading3"/>
@@ -5966,9 +6159,9 @@
         <w:t xml:space="preserve">sau khi hòa hợp 3 thế hệ schema (PICS3, Standardized, BREADY/BEE); (v) ước lượng mô hình thực nghiệm theo bối cảnh quốc gia và đa quốc gia; (vi) kiểm định độ vững và tích hợp kết quả để đóng góp lý thuyết.</w:t>
       </w:r>
     </w:p>
-    <w:bookmarkEnd w:id="82"/>
-    <w:bookmarkEnd w:id="83"/>
-    <w:bookmarkStart w:id="87" w:name="phase-1-meta-analysis-19822026"/>
+    <w:bookmarkEnd w:id="84"/>
+    <w:bookmarkEnd w:id="85"/>
+    <w:bookmarkStart w:id="89" w:name="phase-1-meta-analysis-19822026"/>
     <w:p>
       <w:pPr>
         <w:pStyle w:val="Heading2"/>
@@ -5977,7 +6170,7 @@
         <w:t xml:space="preserve">3.2 Phase 1: Meta-analysis 1982–2026</w:t>
       </w:r>
     </w:p>
-    <w:bookmarkStart w:id="84" w:name="cơ-sở-kế-thừa"/>
+    <w:bookmarkStart w:id="86" w:name="cơ-sở-kế-thừa"/>
     <w:p>
       <w:pPr>
         <w:pStyle w:val="Heading3"/>
@@ -6036,8 +6229,8 @@
         <w:t xml:space="preserve">, và đánh giá publication bias bằng Egger và Begg-Mazumdar (Egger et al., 1997; Begg &amp; Mazumdar, 1994). Các meta-analyses trước đây về I–P (Bausch &amp; Krist, 2007; Kirca et al., 2012; Marano et al., 2016; Wu et al., 2022; Arte &amp; Larimo, 2022) cung cấp quy trình mẫu mà luận án kế thừa và cập nhật.</w:t>
       </w:r>
     </w:p>
-    <w:bookmarkEnd w:id="84"/>
-    <w:bookmarkStart w:id="85" w:name="đóng-góp-mớiđiều-chỉnh"/>
+    <w:bookmarkEnd w:id="86"/>
+    <w:bookmarkStart w:id="87" w:name="đóng-góp-mớiđiều-chỉnh"/>
     <w:p>
       <w:pPr>
         <w:pStyle w:val="Heading3"/>
@@ -6150,8 +6343,8 @@
         <w:t xml:space="preserve">: tách riêng nhóm nghiên cứu về doanh nghiệp châu Á và Pacific để cung cấp cơ sở trực tiếp cho phase empirical, đối chiếu với pool 17 nước trong nghiên cứu thành phần P1.</w:t>
       </w:r>
     </w:p>
-    <w:bookmarkEnd w:id="85"/>
-    <w:bookmarkStart w:id="86" w:name="quy-trình-prisma"/>
+    <w:bookmarkEnd w:id="87"/>
+    <w:bookmarkStart w:id="88" w:name="quy-trình-prisma"/>
     <w:p>
       <w:pPr>
         <w:pStyle w:val="Heading3"/>
@@ -6201,9 +6394,9 @@
         <w:t xml:space="preserve">-stat).</w:t>
       </w:r>
     </w:p>
-    <w:bookmarkEnd w:id="86"/>
-    <w:bookmarkEnd w:id="87"/>
-    <w:bookmarkStart w:id="100" w:name="X8de0b19c054d402e314fef9726425749df3fc18"/>
+    <w:bookmarkEnd w:id="88"/>
+    <w:bookmarkEnd w:id="89"/>
+    <w:bookmarkStart w:id="102" w:name="X8de0b19c054d402e314fef9726425749df3fc18"/>
     <w:p>
       <w:pPr>
         <w:pStyle w:val="Heading2"/>
@@ -6212,7 +6405,7 @@
         <w:t xml:space="preserve">3.3 Phase 2: Phân tích thực nghiệm đa quốc gia</w:t>
       </w:r>
     </w:p>
-    <w:bookmarkStart w:id="88" w:name="nguồn-dữ-liệu"/>
+    <w:bookmarkStart w:id="90" w:name="nguồn-dữ-liệu"/>
     <w:p>
       <w:pPr>
         <w:pStyle w:val="Heading3"/>
@@ -6351,8 +6544,8 @@
         <w:t xml:space="preserve">trong ước lượng mô hình hồi quy vì ba lý do: (1) Mục tiêu của luận án là kiểm định cơ chế lý thuyết (mechanism testing) chứ không phải ước lượng mô tả đại diện tổng thể (population-representative descriptive estimation), trong bối cảnh này, không áp dụng weights là thực hành chuẩn trong văn liệu IB sử dụng WBES (Aterido et al., 2011; Cuervo-Cazurra et al., 2018); (2) hiệu ứng cố định ở cấp country-year đã kiểm soát đặc điểm cấu trúc của từng sóng khảo sát; (3) Việc áp dụng weights có thể làm sai lệch ước lượng khi mẫu được gộp chung từ nhiều quốc gia có quy mô tổng thể doanh nghiệp khác nhau nhiều bậc (ví dụ: Trung Quốc ~100 triệu so với Tonga ~500 doanh nghiệp). Phân tích độ nhạy có áp dụng survey weights cho từng quốc gia riêng lẻ (P3/P4/P5) không thay đổi hướng hoặc mức độ ý nghĩa của các hệ số chính (xem Mục 3.5).</w:t>
       </w:r>
     </w:p>
-    <w:bookmarkEnd w:id="88"/>
-    <w:bookmarkStart w:id="89" w:name="X92816843f2011c38d3bd6bf055668ea54f97029"/>
+    <w:bookmarkEnd w:id="90"/>
+    <w:bookmarkStart w:id="91" w:name="X92816843f2011c38d3bd6bf055668ea54f97029"/>
     <w:p>
       <w:pPr>
         <w:pStyle w:val="Heading3"/>
@@ -6377,8 +6570,8 @@
         <w:t xml:space="preserve">Quy trình hợp nhất tuân theo nguyên tắc minh bạch kiểu PRISMA cho dữ liệu thứ cấp, gồm sáu bước tuần tự: lọc loại khảo sát, khử trùng lặp một khảo sát cho mỗi cặp nền kinh tế và năm, hài hòa hóa biến, mã hóa mã không phản hồi của WBES thành giá trị khuyết, phân tầng chế độ thể chế, đến tạo mẫu phân tích bằng xóa theo danh sách. Mỗi bước ghi rõ tiêu chí và số quan sát còn lại nhằm cho phép tái dựng và kiểm chứng. Một hệ quả của xóa theo danh sách là cỡ mẫu giảm dần khi thêm biến kiểm soát, rõ nhất ở biến sở hữu nước ngoài vốn khuyết nhiều ở các nền nhỏ và sóng sớm; luận án báo cáo minh bạch sự suy giảm này và kiểm tra tính ổn định của điểm uốn qua các đặc tả để bảo đảm kết quả không bị chi phối bởi cơ chế khuyết. Toàn bộ thao tác chi tiết của quy trình sáu bước, cùng dòng dữ liệu kiểu PRISMA và mã tái lập, được trình bày đầy đủ ở Phụ lục A.</w:t>
       </w:r>
     </w:p>
-    <w:bookmarkEnd w:id="89"/>
-    <w:bookmarkStart w:id="90" w:name="Xbff20786659f3471473d6f5f9041e850d60d8e2"/>
+    <w:bookmarkEnd w:id="91"/>
+    <w:bookmarkStart w:id="92" w:name="Xbff20786659f3471473d6f5f9041e850d60d8e2"/>
     <w:p>
       <w:pPr>
         <w:pStyle w:val="Heading3"/>
@@ -6795,8 +6988,8 @@
         <w:t xml:space="preserve">: lập luận rõ ràng về firm performance là khái niệm đa chiều và việc lựa chọn thước đo phải phù hợp với bối cảnh dữ liệu (xem Chương 2).</w:t>
       </w:r>
     </w:p>
-    <w:bookmarkEnd w:id="90"/>
-    <w:bookmarkStart w:id="91" w:name="X2fa5ef18c5e43567e4013cc52a8fa997be89445"/>
+    <w:bookmarkEnd w:id="92"/>
+    <w:bookmarkStart w:id="93" w:name="X2fa5ef18c5e43567e4013cc52a8fa997be89445"/>
     <w:p>
       <w:pPr>
         <w:pStyle w:val="Heading3"/>
@@ -6926,8 +7119,8 @@
         <w:t xml:space="preserve">so sánh được trực tiếp trong nội bộ mẫu; khác biệt mặt bằng giá giữa các đợt khảo sát được hấp thụ bằng biến giả đợt hoặc hiệu ứng cố định năm, kèm cắt đuôi 1 và 99.</w:t>
       </w:r>
     </w:p>
-    <w:bookmarkEnd w:id="91"/>
-    <w:bookmarkStart w:id="92" w:name="đo-lường-biến-độc-lập-quốc-tế-hóa"/>
+    <w:bookmarkEnd w:id="93"/>
+    <w:bookmarkStart w:id="94" w:name="đo-lường-biến-độc-lập-quốc-tế-hóa"/>
     <w:p>
       <w:pPr>
         <w:pStyle w:val="Heading3"/>
@@ -7079,8 +7272,8 @@
         <w:t xml:space="preserve">để kiểm định phi tuyến đã được áp dụng trong Lu và Beamish (2004), Contractor et al. (2003), và Hitt et al. (1997). Specification bậc ba được nghiên cứu thành phần P2 xác nhận có ý nghĩa thống kê ở Trung Quốc với điểm uốn ~47,8% FSTS, làm cơ sở cho việc kiểm định mở rộng trong luận án.</w:t>
       </w:r>
     </w:p>
-    <w:bookmarkEnd w:id="92"/>
-    <w:bookmarkStart w:id="93" w:name="Xab070be4115f525089510c76b6d385560991d8b"/>
+    <w:bookmarkEnd w:id="94"/>
+    <w:bookmarkStart w:id="95" w:name="Xab070be4115f525089510c76b6d385560991d8b"/>
     <w:p>
       <w:pPr>
         <w:pStyle w:val="Heading3"/>
@@ -7176,8 +7369,8 @@
         <w:t xml:space="preserve">, cho phép báo cáo ngưỡng tối ưu theo tỷ trọng xuất khẩu thực tế. Số hạng bậc hai được ưu tiên hơn bậc ba trong khung đa quốc gia khi khối lượng phân phối ở vùng cường độ xuất khẩu cao không đủ để nhận dạng chính xác điểm uốn bậc ba; bậc ba chỉ được giữ ở nghiên cứu Trung Quốc, nơi cả hai đợt khảo sát có đủ mật độ doanh nghiệp xuất khẩu cường độ cao.</w:t>
       </w:r>
     </w:p>
-    <w:bookmarkEnd w:id="93"/>
-    <w:bookmarkStart w:id="97" w:name="đo-lường-biến-điều-tiết"/>
+    <w:bookmarkEnd w:id="95"/>
+    <w:bookmarkStart w:id="99" w:name="đo-lường-biến-điều-tiết"/>
     <w:p>
       <w:pPr>
         <w:pStyle w:val="Heading3"/>
@@ -7186,7 +7379,7 @@
         <w:t xml:space="preserve">3.3.4 Đo lường biến điều tiết</w:t>
       </w:r>
     </w:p>
-    <w:bookmarkStart w:id="94" w:name="digital-constructs-tci-và-dai"/>
+    <w:bookmarkStart w:id="96" w:name="digital-constructs-tci-và-dai"/>
     <w:p>
       <w:pPr>
         <w:pStyle w:val="Heading4"/>
@@ -7405,8 +7598,8 @@
         <w:t xml:space="preserve">trong bối cảnh WBES, đảm bảo cấu trúc purity ở 50 nền kinh tế châu Á và Thái Bình Dương, với pipeline hòa hợp 3 thế hệ schema. Phân tách TCI và DAI theo (i) Bharadwaj et al. (2013), IT capability vs digital business strategy có mạng quan hệ lý thuyết khác nhau; (ii) phân tầng 3 cấp của Verhoef et al. (2021), digitization, digitalization, digital transformation; (iii) truyền thống Lall (1992) và Cohen &amp; Levinthal (1990) coi technological capability là chiều sâu năng lực nội tại (absorptive capacity), khác về bản chất với digital adoption ở giao diện ngoại tại; (iv) resource-orchestration logic của Bhandari et al. (2023) cho I–P relationship; và (v) 4 tiêu chí formative chỉ số hợp thành của Coltman et al. (2008), đảm bảo TCI và DAI là hai chỉ số hợp thành độc lập.</w:t>
       </w:r>
     </w:p>
-    <w:bookmarkEnd w:id="94"/>
-    <w:bookmarkStart w:id="95" w:name="biến-thể-chế"/>
+    <w:bookmarkEnd w:id="96"/>
+    <w:bookmarkStart w:id="97" w:name="biến-thể-chế"/>
     <w:p>
       <w:pPr>
         <w:pStyle w:val="Heading4"/>
@@ -7445,8 +7638,8 @@
         <w:t xml:space="preserve">: Khanna và Palepu (2010) với khoảng trống thể chế; North (1990) với institutional analysis; Marano et al. (2016) với meta-analytic evidence về institutional các biến điều tiết.</w:t>
       </w:r>
     </w:p>
-    <w:bookmarkEnd w:id="95"/>
-    <w:bookmarkStart w:id="96" w:name="đặc-điểm-nhà-quản-trị-cấp-cao"/>
+    <w:bookmarkEnd w:id="97"/>
+    <w:bookmarkStart w:id="98" w:name="đặc-điểm-nhà-quản-trị-cấp-cao"/>
     <w:p>
       <w:pPr>
         <w:pStyle w:val="Heading4"/>
@@ -7500,9 +7693,9 @@
         <w:t xml:space="preserve">: chỉ trong subset có đủ dữ liệu; nếu thiếu, đưa vào độ vững chứ không bắt buộc trong mô hình chính.</w:t>
       </w:r>
     </w:p>
-    <w:bookmarkEnd w:id="96"/>
-    <w:bookmarkEnd w:id="97"/>
-    <w:bookmarkStart w:id="98" w:name="X4fc02cb516415a3503e8ee15e9c75bd480667a2"/>
+    <w:bookmarkEnd w:id="98"/>
+    <w:bookmarkEnd w:id="99"/>
+    <w:bookmarkStart w:id="100" w:name="X4fc02cb516415a3503e8ee15e9c75bd480667a2"/>
     <w:p>
       <w:pPr>
         <w:pStyle w:val="Heading3"/>
@@ -7527,8 +7720,8 @@
         <w:t xml:space="preserve">Cả chỉ số năng lực công nghệ (Technological Capability Index, TCI) và DAI được xử lý như chỉ số hợp thành cấu thành (formative composite) chứ không phải chỉ số phản ánh, vì mỗi chỉ báo nhị phân định nghĩa một khía cạnh độc lập của khái niệm chứ không phải là biểu hiện tương quan của một biến tiềm ẩn chung. Quy tắc xây dựng gồm ba bước: chuyển mỗi chỉ báo thành dạng nhị phân 0–1, lấy trung bình cộng các chỉ báo trong cùng một tầng, rồi chuẩn hóa z giá trị trung bình trong từng đợt khảo sát. Nguyên tắc không chồng lấn được áp đặt nghiêm ngặt: cấp phép công nghệ nước ngoài thuộc TCI và không được đồng thời tính vào DAI, bảo đảm hai chỉ số là hai cấu trúc độc lập với mạng quan hệ lý thuyết khác nhau. Vì các chỉ báo là biểu hiện nhị phân của cùng một cấu trúc cấu thành, các biến thể của một chỉ số tương quan cao và cho kết luận điều tiết nhất quán về dấu; phần độ vững kiểm tra trực tiếp độ nhạy của suy luận với lựa chọn biến thể.</w:t>
       </w:r>
     </w:p>
-    <w:bookmarkEnd w:id="98"/>
-    <w:bookmarkStart w:id="99" w:name="biến-kiểm-soát"/>
+    <w:bookmarkEnd w:id="100"/>
+    <w:bookmarkStart w:id="101" w:name="biến-kiểm-soát"/>
     <w:p>
       <w:pPr>
         <w:pStyle w:val="Heading3"/>
@@ -7571,9 +7764,9 @@
         <w:t xml:space="preserve">: chuẩn trong nghiên cứu WBES và IB (Aterido et al., 2011; Ayyagari et al., 2011).</w:t>
       </w:r>
     </w:p>
-    <w:bookmarkEnd w:id="99"/>
-    <w:bookmarkEnd w:id="100"/>
-    <w:bookmarkStart w:id="118" w:name="mô-hình-phân-tích"/>
+    <w:bookmarkEnd w:id="101"/>
+    <w:bookmarkEnd w:id="102"/>
+    <w:bookmarkStart w:id="120" w:name="mô-hình-phân-tích"/>
     <w:p>
       <w:pPr>
         <w:pStyle w:val="Heading2"/>
@@ -7582,7 +7775,7 @@
         <w:t xml:space="preserve">3.4 Mô hình phân tích</w:t>
       </w:r>
     </w:p>
-    <w:bookmarkStart w:id="101" w:name="mô-hình-meta-analysis"/>
+    <w:bookmarkStart w:id="103" w:name="mô-hình-meta-analysis"/>
     <w:p>
       <w:pPr>
         <w:pStyle w:val="Heading3"/>
@@ -7761,7 +7954,7 @@
         </m:r>
       </m:oMath>
       <w:r>
-        <w:t xml:space="preserve">. gộp effect size tính theo inverse-variance weighting (Borenstein et al., 2009).</w:t>
+        <w:t xml:space="preserve">. Gộp effect size tính theo inverse-variance weighting (Borenstein et al., 2009).</w:t>
       </w:r>
     </w:p>
     <w:p>
@@ -7821,8 +8014,8 @@
         <w:t xml:space="preserve">: chuẩn meta-analysis trong quản trị chiến lược (Combs et al., 2011; Aguinis et al., 2011).</w:t>
       </w:r>
     </w:p>
-    <w:bookmarkEnd w:id="101"/>
-    <w:bookmarkStart w:id="102" w:name="mô-hình-empirical-tuyến-tính-cơ-bản"/>
+    <w:bookmarkEnd w:id="103"/>
+    <w:bookmarkStart w:id="104" w:name="mô-hình-empirical-tuyến-tính-cơ-bản"/>
     <w:p>
       <w:pPr>
         <w:pStyle w:val="Heading3"/>
@@ -8010,8 +8203,8 @@
         <w:t xml:space="preserve">là vector control variables.</w:t>
       </w:r>
     </w:p>
-    <w:bookmarkEnd w:id="102"/>
-    <w:bookmarkStart w:id="103" w:name="mô-hình-phi-tuyến-h1"/>
+    <w:bookmarkEnd w:id="104"/>
+    <w:bookmarkStart w:id="105" w:name="mô-hình-phi-tuyến-h1"/>
     <w:p>
       <w:pPr>
         <w:pStyle w:val="Heading3"/>
@@ -8629,8 +8822,8 @@
         <w:t xml:space="preserve">.</w:t>
       </w:r>
     </w:p>
-    <w:bookmarkEnd w:id="103"/>
-    <w:bookmarkStart w:id="104" w:name="X77a5ab65e33fc8b98df68c9ab37f4d13e757901"/>
+    <w:bookmarkEnd w:id="105"/>
+    <w:bookmarkStart w:id="106" w:name="X77a5ab65e33fc8b98df68c9ab37f4d13e757901"/>
     <w:p>
       <w:pPr>
         <w:pStyle w:val="Heading3"/>
@@ -8742,8 +8935,8 @@
         <w:t xml:space="preserve">trên thang trung tâm hóa rồi quy đổi về thang gốc bằng cách cộng trung bình mẫu. Vì điểm uốn là tỷ số phi tuyến của hai hệ số ước lượng, sai số chuẩn của nó không thể đọc trực tiếp từ bảng hồi quy. Luận án báo cáo khoảng tin cậy 95 phần trăm theo phương pháp delta (delta method), khai triển tuyến tính bậc nhất quanh ước lượng điểm để xấp xỉ phương sai của tỷ số (Haans et al., 2016). Ở các nghiên cứu có mật độ thưa quanh điểm uốn, luận án bổ sung khoảng tin cậy theo phương pháp lấy mẫu lại bootstrap nhằm nới lỏng giả định chuẩn của phương pháp delta và phản ánh tính bất đối xứng của phân phối điểm uốn trong mẫu hữu hạn. Khi kiểm định không bác bỏ tính đơn điệu trong phạm vi dữ liệu, kết quả được diễn giải là thông tin tích cực theo khung bão hòa chứ không phải là thất bại của giả thuyết phi tuyến, vì nó cho biết doanh nghiệp trong mẫu chưa vượt qua ngưỡng nơi lợi suất quốc tế hóa bắt đầu suy giảm.</w:t>
       </w:r>
     </w:p>
-    <w:bookmarkEnd w:id="104"/>
-    <w:bookmarkStart w:id="107" w:name="mô-hình-điều-tiết-h2h6"/>
+    <w:bookmarkEnd w:id="106"/>
+    <w:bookmarkStart w:id="109" w:name="mô-hình-điều-tiết-h2h6"/>
     <w:p>
       <w:pPr>
         <w:pStyle w:val="Heading3"/>
@@ -8752,7 +8945,7 @@
         <w:t xml:space="preserve">3.4.4 Mô hình điều tiết (H2–H6)</w:t>
       </w:r>
     </w:p>
-    <w:bookmarkStart w:id="105" w:name="two-way-interaction-h2-h3"/>
+    <w:bookmarkStart w:id="107" w:name="two-way-interaction-h2-h3"/>
     <w:p>
       <w:pPr>
         <w:pStyle w:val="Heading4"/>
@@ -9150,8 +9343,8 @@
         <w:t xml:space="preserve">là biến điều tiết (TCI hoặc DAI).</w:t>
       </w:r>
     </w:p>
-    <w:bookmarkEnd w:id="105"/>
-    <w:bookmarkStart w:id="106" w:name="three-way-interaction-synthesis"/>
+    <w:bookmarkEnd w:id="107"/>
+    <w:bookmarkStart w:id="108" w:name="three-way-interaction-synthesis"/>
     <w:p>
       <w:pPr>
         <w:pStyle w:val="Heading4"/>
@@ -9538,9 +9731,9 @@
         <w:t xml:space="preserve">: three-way điều tiết digital × institutional × manager trong bối cảnh châu Á và Pacific với 50 nước chưa được kiểm định trước đây.</w:t>
       </w:r>
     </w:p>
-    <w:bookmarkEnd w:id="106"/>
-    <w:bookmarkEnd w:id="107"/>
-    <w:bookmarkStart w:id="108" w:name="mô-hình-dị-biệt-theo-thời-gian-h6"/>
+    <w:bookmarkEnd w:id="108"/>
+    <w:bookmarkEnd w:id="109"/>
+    <w:bookmarkStart w:id="110" w:name="mô-hình-dị-biệt-theo-thời-gian-h6"/>
     <w:p>
       <w:pPr>
         <w:pStyle w:val="Heading3"/>
@@ -10018,8 +10211,8 @@
         <w:t xml:space="preserve">: áp dụng cho China 2012 và 2024 để kiểm định stability của bậc ba điểm uốn (~47,8% FSTS) sau hơn một thập kỷ chuyển đổi số.</w:t>
       </w:r>
     </w:p>
-    <w:bookmarkEnd w:id="108"/>
-    <w:bookmarkStart w:id="109" w:name="X35de164740744d48141f644c531263a1540e362"/>
+    <w:bookmarkEnd w:id="110"/>
+    <w:bookmarkStart w:id="111" w:name="X35de164740744d48141f644c531263a1540e362"/>
     <w:p>
       <w:pPr>
         <w:pStyle w:val="Heading3"/>
@@ -10225,8 +10418,8 @@
         <w:t xml:space="preserve">Kiểm định được áp dụng riêng cho từng cặp hệ số trọng tâm, gồm số hạng bậc nhất, số hạng bậc hai và các hệ số trực tiếp của năng lực công nghệ và chấp nhận số. Việc tách kiểm định theo từng tham số cho phép phân biệt hai loại dịch chuyển có ý nghĩa lý thuyết khác nhau: dịch chuyển ở tham số độ cong báo hiệu hình dạng quan hệ thay đổi cấu trúc, còn dịch chuyển ở hệ số trực tiếp báo hiệu vai trò của một chiều năng lực biến đổi theo vòng đời số hóa mà không làm đổi dạng đường cong. Khung đa đợt của luận án vì vậy có thể kết luận, chẳng hạn, rằng ngưỡng tối ưu bền vững cấu trúc trong khi đóng góp trực tiếp của chấp nhận số lại biến thiên rõ rệt giữa các đợt. Ở nghiên cứu có sẵn lõi panel nhỏ gồm các doanh nghiệp xuất hiện ở cả hai đợt, kiểm định Paternoster được bổ trợ bằng sai số chuẩn phân cụm theo định danh doanh nghiệp nhằm xử lý tương quan nội nhóm.</w:t>
       </w:r>
     </w:p>
-    <w:bookmarkEnd w:id="109"/>
-    <w:bookmarkStart w:id="110" w:name="X3ef1c131b29643aac6595f7e8338779440cc96b"/>
+    <w:bookmarkEnd w:id="111"/>
+    <w:bookmarkStart w:id="112" w:name="X3ef1c131b29643aac6595f7e8338779440cc96b"/>
     <w:p>
       <w:pPr>
         <w:pStyle w:val="Heading3"/>
@@ -14151,8 +14344,8 @@
         </w:tc>
       </w:tr>
     </w:tbl>
-    <w:bookmarkEnd w:id="110"/>
-    <w:bookmarkStart w:id="111" w:name="Xee326425775ef5a6cb69bdccb6b7f607df42eb1"/>
+    <w:bookmarkEnd w:id="112"/>
+    <w:bookmarkStart w:id="113" w:name="Xee326425775ef5a6cb69bdccb6b7f607df42eb1"/>
     <w:p>
       <w:pPr>
         <w:pStyle w:val="Heading3"/>
@@ -15100,8 +15293,8 @@
         </w:pict>
       </w:r>
     </w:p>
-    <w:bookmarkEnd w:id="111"/>
-    <w:bookmarkStart w:id="112" w:name="Xd0414c1f445c504fea8a4b83b026b3007745b73"/>
+    <w:bookmarkEnd w:id="113"/>
+    <w:bookmarkStart w:id="114" w:name="Xd0414c1f445c504fea8a4b83b026b3007745b73"/>
     <w:p>
       <w:pPr>
         <w:pStyle w:val="Heading3"/>
@@ -16125,8 +16318,8 @@
         </w:pict>
       </w:r>
     </w:p>
-    <w:bookmarkEnd w:id="112"/>
-    <w:bookmarkStart w:id="115" w:name="Xef1ee77b66ccd9962e55365d60bd74be93a9b17"/>
+    <w:bookmarkEnd w:id="114"/>
+    <w:bookmarkStart w:id="117" w:name="Xef1ee77b66ccd9962e55365d60bd74be93a9b17"/>
     <w:p>
       <w:pPr>
         <w:pStyle w:val="Heading3"/>
@@ -21074,7 +21267,7 @@
         </w:pict>
       </w:r>
     </w:p>
-    <w:bookmarkStart w:id="113" w:name="X2f7897a1357dc715f37e320d2cca3ed5f2bb32c"/>
+    <w:bookmarkStart w:id="115" w:name="X2f7897a1357dc715f37e320d2cca3ed5f2bb32c"/>
     <w:p>
       <w:pPr>
         <w:pStyle w:val="Heading4"/>
@@ -24205,8 +24398,8 @@
         </w:pict>
       </w:r>
     </w:p>
-    <w:bookmarkEnd w:id="113"/>
-    <w:bookmarkStart w:id="114" w:name="X349648a9603de2a783df22f0baa1f04a5234db6"/>
+    <w:bookmarkEnd w:id="115"/>
+    <w:bookmarkStart w:id="116" w:name="X349648a9603de2a783df22f0baa1f04a5234db6"/>
     <w:p>
       <w:pPr>
         <w:pStyle w:val="Heading4"/>
@@ -24359,9 +24552,9 @@
         <w:t xml:space="preserve">, tỷ trọng doanh thu qua thanh toán điện tử) cho phép kiểm định điều tiết DAI Tier-2, được xử lý như phân tích thăm dò vì chỉ có ở một đợt.</w:t>
       </w:r>
     </w:p>
-    <w:bookmarkEnd w:id="114"/>
-    <w:bookmarkEnd w:id="115"/>
-    <w:bookmarkStart w:id="116" w:name="sai-số-chuẩn"/>
+    <w:bookmarkEnd w:id="116"/>
+    <w:bookmarkEnd w:id="117"/>
+    <w:bookmarkStart w:id="118" w:name="sai-số-chuẩn"/>
     <w:p>
       <w:pPr>
         <w:pStyle w:val="Heading3"/>
@@ -24378,8 +24571,8 @@
         <w:t xml:space="preserve">Tất cả các mô hình đều sử dụng HC1/HC3 robust standard errors (Long &amp; Ervin, 2000; White, 1980) để xử lý phương sai thay đổi. Đối với multi-country, bổ sung clustered SE theo country.</w:t>
       </w:r>
     </w:p>
-    <w:bookmarkEnd w:id="116"/>
-    <w:bookmarkStart w:id="117" w:name="X8d52f19a25b722eeff682d011a53b2ed241099a"/>
+    <w:bookmarkEnd w:id="118"/>
+    <w:bookmarkStart w:id="119" w:name="X8d52f19a25b722eeff682d011a53b2ed241099a"/>
     <w:p>
       <w:pPr>
         <w:pStyle w:val="Heading3"/>
@@ -24404,9 +24597,9 @@
         <w:t xml:space="preserve">Một giới hạn cần ghi nhận của phân cụm theo nền kinh tế là số cụm hữu hạn có thể làm sai số chuẩn tiệm cận kém chính xác khi quy mô cụm chênh lệch lớn, đặc biệt giữa các nền kinh tế đông doanh nghiệp và các đảo nhỏ chỉ có vài trăm quan sát. Trong các tình huống này, luận án diễn giải suy luận một cách thận trọng và neo kết luận chính vào tính nhất quán về dấu qua nhiều đặc tả thay vì vào ý nghĩa của một hệ số đơn lẻ. Việc luận án không áp dụng trọng số chọn mẫu trong ước lượng chính tuân theo khuyến nghị của Solon, Haider và Wooldridge (2015): khi mô hình đã kiểm soát các chiều phân tầng qua biến kiểm soát và qua hiệu ứng cố định, ước lượng bình phương nhỏ nhất không trọng số cho hệ số nhất quán và thường hiệu quả hơn, trong khi trọng số được dành cho phân tích độ vững nhằm kiểm tra tính ổn định.</w:t>
       </w:r>
     </w:p>
-    <w:bookmarkEnd w:id="117"/>
-    <w:bookmarkEnd w:id="118"/>
-    <w:bookmarkStart w:id="128" w:name="kiểm-định-độ-vững"/>
+    <w:bookmarkEnd w:id="119"/>
+    <w:bookmarkEnd w:id="120"/>
+    <w:bookmarkStart w:id="130" w:name="kiểm-định-độ-vững"/>
     <w:p>
       <w:pPr>
         <w:pStyle w:val="Heading2"/>
@@ -24415,7 +24608,7 @@
         <w:t xml:space="preserve">3.5 Kiểm định độ vững</w:t>
       </w:r>
     </w:p>
-    <w:bookmarkStart w:id="119" w:name="thay-đổi-thước-đo"/>
+    <w:bookmarkStart w:id="121" w:name="thay-đổi-thước-đo"/>
     <w:p>
       <w:pPr>
         <w:pStyle w:val="Heading3"/>
@@ -24493,8 +24686,8 @@
         <w:t xml:space="preserve">Biến biến điều tiết: thay DAI_thin bằng DAI_rich (cho subset 2024+).</w:t>
       </w:r>
     </w:p>
-    <w:bookmarkEnd w:id="119"/>
-    <w:bookmarkStart w:id="120" w:name="mẫu-phụ"/>
+    <w:bookmarkEnd w:id="121"/>
+    <w:bookmarkStart w:id="122" w:name="mẫu-phụ"/>
     <w:p>
       <w:pPr>
         <w:pStyle w:val="Heading3"/>
@@ -24511,8 +24704,8 @@
         <w:t xml:space="preserve">Loại trừ micro firms (&lt;5 lao động); chỉ giữ SMEs; chỉ giữ manufacturing; chỉ giữ doanh nghiệp xuất khẩu (FSTS &gt; 0); subgroup theo 6 chế độ con ICRV.</w:t>
       </w:r>
     </w:p>
-    <w:bookmarkEnd w:id="120"/>
-    <w:bookmarkStart w:id="121" w:name="giá-trị-ngoại-lai"/>
+    <w:bookmarkEnd w:id="122"/>
+    <w:bookmarkStart w:id="123" w:name="giá-trị-ngoại-lai"/>
     <w:p>
       <w:pPr>
         <w:pStyle w:val="Heading3"/>
@@ -24529,8 +24722,8 @@
         <w:t xml:space="preserve">Winsorization 1% và 5% đối với labor productivity và employment, áp dụng trong từng country-year.</w:t>
       </w:r>
     </w:p>
-    <w:bookmarkEnd w:id="121"/>
-    <w:bookmarkStart w:id="122" w:name="đa-cộng-tuyến-và-phương-sai-thay-đổi"/>
+    <w:bookmarkEnd w:id="123"/>
+    <w:bookmarkStart w:id="124" w:name="đa-cộng-tuyến-và-phương-sai-thay-đổi"/>
     <w:p>
       <w:pPr>
         <w:pStyle w:val="Heading3"/>
@@ -24563,8 +24756,8 @@
         <w:t xml:space="preserve">Breusch–Pagan test (Breusch &amp; Pagan, 1979).</w:t>
       </w:r>
     </w:p>
-    <w:bookmarkEnd w:id="122"/>
-    <w:bookmarkStart w:id="123" w:name="phân-tích-độ-nhạy-cho-meta-analysis"/>
+    <w:bookmarkEnd w:id="124"/>
+    <w:bookmarkStart w:id="125" w:name="phân-tích-độ-nhạy-cho-meta-analysis"/>
     <w:p>
       <w:pPr>
         <w:pStyle w:val="Heading3"/>
@@ -24597,8 +24790,8 @@
         <w:t xml:space="preserve">Trim-and-fill (Duval &amp; Tweedie, 2000) cho publication bias.</w:t>
       </w:r>
     </w:p>
-    <w:bookmarkEnd w:id="123"/>
-    <w:bookmarkStart w:id="124" w:name="X10d014678681e08a0b3a86c743d1fe48f73dcfb"/>
+    <w:bookmarkEnd w:id="125"/>
+    <w:bookmarkStart w:id="126" w:name="X10d014678681e08a0b3a86c743d1fe48f73dcfb"/>
     <w:p>
       <w:pPr>
         <w:pStyle w:val="Heading3"/>
@@ -24623,8 +24816,8 @@
         <w:t xml:space="preserve">Lớp thứ tư kiểm tra các giả định kinh tế lượng phụ trợ. Hệ số phóng đại phương sai (variance inflation factor, VIF) được tính cho mọi mô hình với ngưỡng cảnh báo dưới năm để phát hiện đa cộng tuyến đe dọa độ ổn định hệ số; kiểm định Breusch–Pagan đánh giá phương sai thay đổi. Đối với cấu phần meta-analysis, giao thức bổ sung kiểm định loại từng nghiên cứu (leave-one-out) tái tính hiệu ứng gộp nhằm phát hiện ảnh hưởng quá mức của một nghiên cứu đơn lẻ, cùng thủ tục cắt và điền (trim-and-fill) đánh giá thiên lệch công bố. Luận án không áp dụng hiệu chỉnh kiểm định bội chính thức cho toàn bộ bảng độ vững, vì các bảng kiểm tra các quan ngại nhận diện khác nhau thay vì lặp lại cùng một giả thuyết; thay vào đó, suy luận thực chất được neo vào mẫu hình nhất quán qua các bảng và tính nhất quán về dấu của ước lượng trọng tâm chứ không vào ý nghĩa của một bảng độ vững đơn lẻ.</w:t>
       </w:r>
     </w:p>
-    <w:bookmarkEnd w:id="124"/>
-    <w:bookmarkStart w:id="125" w:name="X114450212317cc299784cfe2697e63e527f22c7"/>
+    <w:bookmarkEnd w:id="126"/>
+    <w:bookmarkStart w:id="127" w:name="X114450212317cc299784cfe2697e63e527f22c7"/>
     <w:p>
       <w:pPr>
         <w:pStyle w:val="Heading3"/>
@@ -24675,8 +24868,8 @@
         <w:t xml:space="preserve">của các cấu trúc TCI và DAI qua ba thế hệ bảng hỏi WBES: do cấu trúc câu hỏi thay đổi giữa PICS3, Standardized và BREADY, một phần khác biệt theo thời gian có thể phản ánh hiệu ứng schema thay vì thay đổi thực chất (ví dụ mức R&amp;D đo được ở một số nhóm). Luận án giảm thiểu rủi ro này bằng hiệu ứng cố định năm/đợt, chuẩn hóa within country–year, và kiểm tra độ nhạy với biến thể thước đo (Mục 3.5.1); tuy vậy luận án chưa thực hiện kiểm định bất biến đo lường chính thức, nên mọi so sánh xuyên-schema cần được đọc một cách thận trọng.</w:t>
       </w:r>
     </w:p>
-    <w:bookmarkEnd w:id="125"/>
-    <w:bookmarkStart w:id="126" w:name="X5a58f728351562afbf603c19fbb2824b5a9ac45"/>
+    <w:bookmarkEnd w:id="127"/>
+    <w:bookmarkStart w:id="128" w:name="X5a58f728351562afbf603c19fbb2824b5a9ac45"/>
     <w:p>
       <w:pPr>
         <w:pStyle w:val="Heading3"/>
@@ -24701,8 +24894,8 @@
         <w:t xml:space="preserve">Độ mạnh công cụ được đánh giá bằng thống kê F của hồi quy giai đoạn một, với kết quả nằm trong khoảng 22 đến 35, vượt xa ngưỡng kinh nghiệm về công cụ yếu. Một phát hiện phương pháp luận đáng chú ý là ước lượng 2SLS cho hai chiều năng lực phân kỳ rõ rệt: hệ số công cụ hóa của năng lực công nghệ dương mạnh (ước lượng 2SLS bằng 1,64, p &lt; 0,001, dưới một công cụ mạnh với F giai đoạn một bằng 22,1), trong khi hệ số công cụ hóa của chấp nhận số ở mức Tầng 1 không khác biệt thống kê với không, một kết quả độ vững củng cố cách diễn giải tính lỗi thời của biến đại diện Tầng 1 trong môi trường số đã lan tỏa gần phổ quát.</w:t>
       </w:r>
     </w:p>
-    <w:bookmarkEnd w:id="126"/>
-    <w:bookmarkStart w:id="127" w:name="Xb573bac204afdc8ffa701419cd49d3f05015225"/>
+    <w:bookmarkEnd w:id="128"/>
+    <w:bookmarkStart w:id="129" w:name="Xb573bac204afdc8ffa701419cd49d3f05015225"/>
     <w:p>
       <w:pPr>
         <w:pStyle w:val="Heading3"/>
@@ -24727,9 +24920,9 @@
         <w:t xml:space="preserve">Việc tính giới hạn đòi hỏi đặt cận trên cho mức độ giải thích tối đa của một mô hình giả định đầy đủ biến. Luận án dùng quy ước cận trên này bằng 1,3 lần hệ số xác định của mô hình có kiểm soát, một mức được khuyến nghị rộng rãi trong thực hành thực nghiệm. Kết luận phương pháp luận là không hệ số trọng tâm nào đổi dấu hoặc sụp đổ về không dưới các độ lớn khả tín của lựa chọn không quan sát, qua đó cung cấp một bằng chứng độc lập rằng các mối liên hệ trọng tâm không phải là tạo phẩm của biến bỏ sót có thể thấy trước.</w:t>
       </w:r>
     </w:p>
-    <w:bookmarkEnd w:id="127"/>
-    <w:bookmarkEnd w:id="128"/>
-    <w:bookmarkStart w:id="129" w:name="X364413cac58bd17313d22102f22dd0d12fe1063"/>
+    <w:bookmarkEnd w:id="129"/>
+    <w:bookmarkEnd w:id="130"/>
+    <w:bookmarkStart w:id="131" w:name="X364413cac58bd17313d22102f22dd0d12fe1063"/>
     <w:p>
       <w:pPr>
         <w:pStyle w:val="Heading2"/>
@@ -25242,8 +25435,8 @@
         </w:tc>
       </w:tr>
     </w:tbl>
-    <w:bookmarkEnd w:id="129"/>
-    <w:bookmarkStart w:id="130" w:name="đạo-đức-nghiên-cứu"/>
+    <w:bookmarkEnd w:id="131"/>
+    <w:bookmarkStart w:id="132" w:name="đạo-đức-nghiên-cứu"/>
     <w:p>
       <w:pPr>
         <w:pStyle w:val="Heading2"/>
@@ -25265,8 +25458,8 @@
         <w:br w:type="page"/>
       </w:r>
     </w:p>
-    <w:bookmarkEnd w:id="130"/>
-    <w:bookmarkStart w:id="131" w:name="chương-4-kết-quả-nghiên-cứu"/>
+    <w:bookmarkEnd w:id="132"/>
+    <w:bookmarkStart w:id="133" w:name="chương-4-kết-quả-nghiên-cứu"/>
     <w:p>
       <w:pPr>
         <w:pStyle w:val="Heading1"/>
@@ -25275,7 +25468,7 @@
         <w:t xml:space="preserve">CHƯƠNG 4: KẾT QUẢ NGHIÊN CỨU</w:t>
       </w:r>
     </w:p>
-    <w:bookmarkEnd w:id="131"/>
+    <w:bookmarkEnd w:id="133"/>
     <w:p>
       <w:r>
         <w:pict>
@@ -25283,7 +25476,7 @@
         </w:pict>
       </w:r>
     </w:p>
-    <w:bookmarkStart w:id="132" w:name="giới-thiệu-chương"/>
+    <w:bookmarkStart w:id="134" w:name="giới-thiệu-chương"/>
     <w:p>
       <w:pPr>
         <w:pStyle w:val="Heading2"/>
@@ -25307,8 +25500,8 @@
         </w:pict>
       </w:r>
     </w:p>
-    <w:bookmarkEnd w:id="132"/>
-    <w:bookmarkStart w:id="138" w:name="Xed285cd0261846a13dee28de69c0403b250498d"/>
+    <w:bookmarkEnd w:id="134"/>
+    <w:bookmarkStart w:id="140" w:name="Xed285cd0261846a13dee28de69c0403b250498d"/>
     <w:p>
       <w:pPr>
         <w:pStyle w:val="Heading2"/>
@@ -25317,7 +25510,7 @@
         <w:t xml:space="preserve">4.1 Thực trạng quốc tế hóa và hiệu quả hoạt động kinh doanh tại châu Á</w:t>
       </w:r>
     </w:p>
-    <w:bookmarkStart w:id="133" w:name="Xdc33a1e36e2f3be83736669663a61a68c91d087"/>
+    <w:bookmarkStart w:id="135" w:name="Xdc33a1e36e2f3be83736669663a61a68c91d087"/>
     <w:p>
       <w:pPr>
         <w:pStyle w:val="Heading3"/>
@@ -26317,8 +26510,8 @@
         <w:t xml:space="preserve">; Mục 4.2.3) và gradient điểm uốn theo ICRV của mô hình hồi quy đa quốc gia P7 (Mục 4.6.2). Hai nguồn bằng chứng này bảo đảm bức tranh thực trạng mô tả được neo vào bằng chứng suy diễn nhất quán, thay vì dừng lại ở so sánh trung bình–độ lệch chuẩn.</w:t>
       </w:r>
     </w:p>
-    <w:bookmarkEnd w:id="133"/>
-    <w:bookmarkStart w:id="134" w:name="X8bec3537640f28bf435d79e17219bfe20c234df"/>
+    <w:bookmarkEnd w:id="135"/>
+    <w:bookmarkStart w:id="136" w:name="X8bec3537640f28bf435d79e17219bfe20c234df"/>
     <w:p>
       <w:pPr>
         <w:pStyle w:val="Heading3"/>
@@ -26343,8 +26536,8 @@
         <w:t xml:space="preserve">Cường độ quốc tế hóa (FSTS trung bình, tính trên toàn mẫu gồm cả doanh nghiệp không xuất khẩu) dao động từ 6,3% (SIDS) đến 10,3% (Upper-middle), với mức trung bình khu vực khoảng 8,8%. Điều đáng chú ý là Upper-middle và Advanced có cùng FSTS trung bình (~10%) nhưng cơ chế xuất khẩu hoàn toàn khác: Advanced chủ yếu dịch vụ và hàng hóa hàm lượng tri thức cao; Upper-middle chủ yếu sản xuất theo chuỗi giá trị toàn cầu với biên lợi nhuận khác nhau.</w:t>
       </w:r>
     </w:p>
-    <w:bookmarkEnd w:id="134"/>
-    <w:bookmarkStart w:id="135" w:name="thực-trạng-năng-lực-số-và-công-nghệ"/>
+    <w:bookmarkEnd w:id="136"/>
+    <w:bookmarkStart w:id="137" w:name="thực-trạng-năng-lực-số-và-công-nghệ"/>
     <w:p>
       <w:pPr>
         <w:pStyle w:val="Heading3"/>
@@ -27028,8 +27221,8 @@
         <w:t xml:space="preserve">còn lại mang tính chọn lọc đặc thù, nên hệ số đo được phản ánh giới hạn của thước đo Tier-1 nhiều hơn là giới hạn của số hóa, một vấn đề đo lường cần phân biệt với quan hệ nhân quả thực.</w:t>
       </w:r>
     </w:p>
-    <w:bookmarkEnd w:id="135"/>
-    <w:bookmarkStart w:id="136" w:name="Xb62897d6a910d3bf4cd9f1b24b608b7e1128a7f"/>
+    <w:bookmarkEnd w:id="137"/>
+    <w:bookmarkStart w:id="138" w:name="Xb62897d6a910d3bf4cd9f1b24b608b7e1128a7f"/>
     <w:p>
       <w:pPr>
         <w:pStyle w:val="Heading3"/>
@@ -27064,8 +27257,8 @@
         <w:t xml:space="preserve">(Khanna &amp; Palepu, 2010) tạo ra chi phí giao dịch bổ sung cho doanh nghiệp khi mở rộng hoạt động ra ngoài biên giới. Sự hiện diện đồng thời của nhiều voids tại Emerging và SIDS giải thích tại sao quan hệ I–P ở các nhóm này yếu hoặc âm.</w:t>
       </w:r>
     </w:p>
-    <w:bookmarkEnd w:id="136"/>
-    <w:bookmarkStart w:id="137" w:name="X31dbb247e18ca668fe6216e3f13d76006df1ea1"/>
+    <w:bookmarkEnd w:id="138"/>
+    <w:bookmarkStart w:id="139" w:name="X31dbb247e18ca668fe6216e3f13d76006df1ea1"/>
     <w:p>
       <w:pPr>
         <w:pStyle w:val="Heading3"/>
@@ -27819,9 +28012,9 @@
         </w:pict>
       </w:r>
     </w:p>
-    <w:bookmarkEnd w:id="137"/>
-    <w:bookmarkEnd w:id="138"/>
-    <w:bookmarkStart w:id="143" w:name="Xe0084a7c2f7e752cafc4091ca0758f37f91bfa0"/>
+    <w:bookmarkEnd w:id="139"/>
+    <w:bookmarkEnd w:id="140"/>
+    <w:bookmarkStart w:id="145" w:name="Xe0084a7c2f7e752cafc4091ca0758f37f91bfa0"/>
     <w:p>
       <w:pPr>
         <w:pStyle w:val="Heading2"/>
@@ -27830,7 +28023,7 @@
         <w:t xml:space="preserve">4.2 Kết quả tổng hợp định lượng: Meta-analysis ba tầng (P6)</w:t>
       </w:r>
     </w:p>
-    <w:bookmarkStart w:id="139" w:name="chỉ-số-hiệu-ứng-tổng-hợp"/>
+    <w:bookmarkStart w:id="141" w:name="chỉ-số-hiệu-ứng-tổng-hợp"/>
     <w:p>
       <w:pPr>
         <w:pStyle w:val="Heading3"/>
@@ -27973,8 +28166,8 @@
         <w:t xml:space="preserve">, sự hội tụ này tạo ra bằng chứng chéo vững chắc khi mở rộng pool lên gần gấp đôi số nghiên cứu.</w:t>
       </w:r>
     </w:p>
-    <w:bookmarkEnd w:id="139"/>
-    <w:bookmarkStart w:id="140" w:name="phân-tích-dị-biệt-ba-tầng"/>
+    <w:bookmarkEnd w:id="141"/>
+    <w:bookmarkStart w:id="142" w:name="phân-tích-dị-biệt-ba-tầng"/>
     <w:p>
       <w:pPr>
         <w:pStyle w:val="Heading3"/>
@@ -28202,8 +28395,8 @@
         <w:t xml:space="preserve">, không phải là bằng chứng về sự thiếu nhất quán thực sự trong quan hệ nhân quả giữa quốc tế hóa và hiệu quả.</w:t>
       </w:r>
     </w:p>
-    <w:bookmarkEnd w:id="140"/>
-    <w:bookmarkStart w:id="141" w:name="Xe94b529119c3fd3938f18203d533a55edb6dd3b"/>
+    <w:bookmarkEnd w:id="142"/>
+    <w:bookmarkStart w:id="143" w:name="Xe94b529119c3fd3938f18203d533a55edb6dd3b"/>
     <w:p>
       <w:pPr>
         <w:pStyle w:val="Heading3"/>
@@ -28455,8 +28648,8 @@
         <w:t xml:space="preserve">ở Mục 4.2 giữ theo phân loại gốc của P6.)</w:t>
       </w:r>
     </w:p>
-    <w:bookmarkEnd w:id="141"/>
-    <w:bookmarkStart w:id="142" w:name="kiểm-định-publication-bias"/>
+    <w:bookmarkEnd w:id="143"/>
+    <w:bookmarkStart w:id="144" w:name="kiểm-định-publication-bias"/>
     <w:p>
       <w:pPr>
         <w:pStyle w:val="Heading3"/>
@@ -29095,9 +29288,9 @@
         </w:pict>
       </w:r>
     </w:p>
-    <w:bookmarkEnd w:id="142"/>
-    <w:bookmarkEnd w:id="143"/>
-    <w:bookmarkStart w:id="151" w:name="Xae571c1410747d630a72c4d12985bac375822ae"/>
+    <w:bookmarkEnd w:id="144"/>
+    <w:bookmarkEnd w:id="145"/>
+    <w:bookmarkStart w:id="153" w:name="Xae571c1410747d630a72c4d12985bac375822ae"/>
     <w:p>
       <w:pPr>
         <w:pStyle w:val="Heading2"/>
@@ -29106,7 +29299,7 @@
         <w:t xml:space="preserve">4.3 Kết quả bối cảnh thể chế tiên tiến: Đổi mới: Singapore (P4)</w:t>
       </w:r>
     </w:p>
-    <w:bookmarkStart w:id="144" w:name="xác-nhận-quan-hệ-phi-tuyến-chữ-u-ngược"/>
+    <w:bookmarkStart w:id="146" w:name="xác-nhận-quan-hệ-phi-tuyến-chữ-u-ngược"/>
     <w:p>
       <w:pPr>
         <w:pStyle w:val="Heading3"/>
@@ -29259,8 +29452,8 @@
         <w:t xml:space="preserve">thay vì khẳng định một điểm uốn cụ thể ở 88,6%; điều này nhất quán với kỳ vọng lý thuyết rằng ở bối cảnh thể chế mạnh (Nhóm I), dư địa quốc tế hóa có lợi là rất rộng (xem Hình 4.1).</w:t>
       </w:r>
     </w:p>
-    <w:bookmarkEnd w:id="144"/>
-    <w:bookmarkStart w:id="145" w:name="điều-tiết-bởi-digital-adoption-index-dai"/>
+    <w:bookmarkEnd w:id="146"/>
+    <w:bookmarkStart w:id="147" w:name="điều-tiết-bởi-digital-adoption-index-dai"/>
     <w:p>
       <w:pPr>
         <w:pStyle w:val="Heading3"/>
@@ -29409,8 +29602,8 @@
         <w:t xml:space="preserve">). Cụ thể, ở mức độ quốc tế hóa cao, doanh nghiệp Singapore có năng lực chấp nhận số (digital adoption) cao hơn duy trì hiệu quả tốt hơn so với doanh nghiệp có mức DAI thấp hơn, cho thấy DAI đóng vai trò nguồn lực bổ trợ (situational resource) làm chậm đà suy giảm phía bên phải của đường phi tuyến.</w:t>
       </w:r>
     </w:p>
-    <w:bookmarkEnd w:id="145"/>
-    <w:bookmarkStart w:id="146" w:name="giới-hạn-suy-luận-và-cảnh-báo-thống-kê"/>
+    <w:bookmarkEnd w:id="147"/>
+    <w:bookmarkStart w:id="148" w:name="giới-hạn-suy-luận-và-cảnh-báo-thống-kê"/>
     <w:p>
       <w:pPr>
         <w:pStyle w:val="Heading3"/>
@@ -29482,8 +29675,8 @@
         <w:t xml:space="preserve">(consistent but underpowered evidence), không bác bỏ giả thuyết nhưng cũng không tuyên bố xác nhận dứt khoát.</w:t>
       </w:r>
     </w:p>
-    <w:bookmarkEnd w:id="146"/>
-    <w:bookmarkStart w:id="147" w:name="Xc4edfd1202e735f43f0fcc707661dcf561dd6ec"/>
+    <w:bookmarkEnd w:id="148"/>
+    <w:bookmarkStart w:id="149" w:name="Xc4edfd1202e735f43f0fcc707661dcf561dd6ec"/>
     <w:p>
       <w:pPr>
         <w:pStyle w:val="Heading3"/>
@@ -29974,8 +30167,8 @@
         <w:t xml:space="preserve">), khẳng định vị trí điểm uốn chỉ được định vị lỏng lẻo. Đa cộng tuyến giữa số hạng bậc nhất và bậc hai không phải là vấn đề thực chất: hệ số phóng đại phương sai (variance inflation factor — VIF) duy trì dưới 3 ở mọi đặc tả cuối.</w:t>
       </w:r>
     </w:p>
-    <w:bookmarkEnd w:id="147"/>
-    <w:bookmarkStart w:id="148" w:name="X286df4048ffc93bb7f2ac1c5d7bcb1f1060bae7"/>
+    <w:bookmarkEnd w:id="149"/>
+    <w:bookmarkStart w:id="150" w:name="X286df4048ffc93bb7f2ac1c5d7bcb1f1060bae7"/>
     <w:p>
       <w:pPr>
         <w:pStyle w:val="Heading3"/>
@@ -30465,8 +30658,8 @@
         <w:t xml:space="preserve">), cho thấy một phần phương sai năng suất mà DAI nắm bắt đã trùng lặp với TCI. Sự suy giảm này quan trọng về nội dung vì nó bác bỏ cách hiểu DAI như một phần thưởng năng suất phổ quát cho mọi doanh nghiệp.</w:t>
       </w:r>
     </w:p>
-    <w:bookmarkEnd w:id="148"/>
-    <w:bookmarkStart w:id="149" w:name="X5b29f6d7a1e568457f8600cd8694765de8754b2"/>
+    <w:bookmarkEnd w:id="150"/>
+    <w:bookmarkStart w:id="151" w:name="X5b29f6d7a1e568457f8600cd8694765de8754b2"/>
     <w:p>
       <w:pPr>
         <w:pStyle w:val="Heading3"/>
@@ -31407,8 +31600,8 @@
         <w:t xml:space="preserve">).</w:t>
       </w:r>
     </w:p>
-    <w:bookmarkEnd w:id="149"/>
-    <w:bookmarkStart w:id="150" w:name="định-lượng-công-suất-thống-kê"/>
+    <w:bookmarkEnd w:id="151"/>
+    <w:bookmarkStart w:id="152" w:name="định-lượng-công-suất-thống-kê"/>
     <w:p>
       <w:pPr>
         <w:pStyle w:val="Heading3"/>
@@ -31699,9 +31892,9 @@
         </w:pict>
       </w:r>
     </w:p>
-    <w:bookmarkEnd w:id="150"/>
-    <w:bookmarkEnd w:id="151"/>
-    <w:bookmarkStart w:id="159" w:name="Xabe361c2d5961cf19ce7ab2bd5d9bc6d758140a"/>
+    <w:bookmarkEnd w:id="152"/>
+    <w:bookmarkEnd w:id="153"/>
+    <w:bookmarkStart w:id="161" w:name="Xabe361c2d5961cf19ce7ab2bd5d9bc6d758140a"/>
     <w:p>
       <w:pPr>
         <w:pStyle w:val="Heading2"/>
@@ -31710,7 +31903,7 @@
         <w:t xml:space="preserve">4.4 Kết quả bối cảnh thể chế trung bình cao: Trung Quốc, 2012–2024 (P5)</w:t>
       </w:r>
     </w:p>
-    <w:bookmarkStart w:id="152" w:name="xác-nhận-quan-hệ-phi-tuyến-và-điểm-uốn"/>
+    <w:bookmarkStart w:id="154" w:name="xác-nhận-quan-hệ-phi-tuyến-và-điểm-uốn"/>
     <w:p>
       <w:pPr>
         <w:pStyle w:val="Heading3"/>
@@ -31792,8 +31985,8 @@
         <w:t xml:space="preserve">Các con số này cho thấy doanh nghiệp Trung Quốc đạt hiệu quả tối ưu khi cường độ quốc tế hóa (FSTS) ở mức gần 49%, một mức độ tập trung quốc tế vừa phải trong bối cảnh nền kinh tế nội địa khổng lồ của Trung Quốc cũng cung cấp cơ hội tăng trưởng song song.</w:t>
       </w:r>
     </w:p>
-    <w:bookmarkEnd w:id="152"/>
-    <w:bookmarkStart w:id="153" w:name="X28c1d9c57eb0f73d2f6207fea4a34aaa44333b8"/>
+    <w:bookmarkEnd w:id="154"/>
+    <w:bookmarkStart w:id="155" w:name="X28c1d9c57eb0f73d2f6207fea4a34aaa44333b8"/>
     <w:p>
       <w:pPr>
         <w:pStyle w:val="Heading3"/>
@@ -32014,8 +32207,8 @@
         <w:t xml:space="preserve">, không có ý nghĩa thống kê, nghĩa là hình dạng tổng thể của quan hệ phi tuyến không biến đổi đáng kể qua giai đoạn phân tích. Phát hiện này cho thấy trong bối cảnh Upper-middle như Trung Quốc, cơ chế căn bản của quan hệ I–P duy trì tính ổn định đáng kể, có thể phản ánh sự bù trừ giữa chi phí thích ứng tăng lên do chính sách thương mại khó đoán và năng lực tổ chức ngày càng trưởng thành của các doanh nghiệp xuất khẩu Trung Quốc.</w:t>
       </w:r>
     </w:p>
-    <w:bookmarkEnd w:id="153"/>
-    <w:bookmarkStart w:id="154" w:name="vai-trò-của-tci-và-dai"/>
+    <w:bookmarkEnd w:id="155"/>
+    <w:bookmarkStart w:id="156" w:name="vai-trò-của-tci-và-dai"/>
     <w:p>
       <w:pPr>
         <w:pStyle w:val="Heading3"/>
@@ -32096,8 +32289,8 @@
         <w:t xml:space="preserve">), cho thấy Technological Capability Index không phát huy vai trò điều tiết đáng kể ở bối cảnh Trung Quốc theo mô hình P5. Tương tự, DAI cũng không cho thấy điều tiết có ý nghĩa trong bối cảnh này. kết quả không có ý nghĩa về điều tiết tại Trung Quốc có thể phản ánh thực tế rằng năng lực công nghệ đã được phân phối tương đối đồng đều hơn trong mẫu doanh nghiệp xuất khẩu Trung Quốc, làm giảm phương sai đủ để phát hiện hiệu ứng điều tiết.</w:t>
       </w:r>
     </w:p>
-    <w:bookmarkEnd w:id="154"/>
-    <w:bookmarkStart w:id="155" w:name="Xff6260f0292f1de2c718a7cc22e284da4d4195e"/>
+    <w:bookmarkEnd w:id="156"/>
+    <w:bookmarkStart w:id="157" w:name="Xff6260f0292f1de2c718a7cc22e284da4d4195e"/>
     <w:p>
       <w:pPr>
         <w:pStyle w:val="Heading3"/>
@@ -33130,8 +33323,8 @@
         <w:t xml:space="preserve">nằm ở trung tâm của giả thuyết H1.</w:t>
       </w:r>
     </w:p>
-    <w:bookmarkEnd w:id="155"/>
-    <w:bookmarkStart w:id="156" w:name="X0af63134f8b985ce6a7206ba645349b2fa626fe"/>
+    <w:bookmarkEnd w:id="157"/>
+    <w:bookmarkStart w:id="158" w:name="X0af63134f8b985ce6a7206ba645349b2fa626fe"/>
     <w:p>
       <w:pPr>
         <w:pStyle w:val="Heading3"/>
@@ -33720,8 +33913,8 @@
         <w:t xml:space="preserve">, cho thấy liên hệ giữa năng lực công nghệ và năng suất được củng cố có ý nghĩa giữa hai đợt.</w:t>
       </w:r>
     </w:p>
-    <w:bookmarkEnd w:id="156"/>
-    <w:bookmarkStart w:id="157" w:name="Xca8f6e630da8ae9ac522aaed1f1f354951e7cdc"/>
+    <w:bookmarkEnd w:id="158"/>
+    <w:bookmarkStart w:id="159" w:name="Xca8f6e630da8ae9ac522aaed1f1f354951e7cdc"/>
     <w:p>
       <w:pPr>
         <w:pStyle w:val="Heading3"/>
@@ -34539,8 +34732,8 @@
         <w:t xml:space="preserve">). Như vậy, cơ chế bẫy vốn lưu động vẫn là cơ sở lý thuyết nhất quán nhất cho đoạn suy giảm sau ngưỡng nhưng chưa được nhận dạng trực tiếp với công cụ WBES hiện có, đòi hỏi dữ liệu vi mô tài chính như thời gian chu kỳ chuyển đổi tiền mặt hoặc số ngày khoản phải thu chưa thanh toán cho nghiên cứu tương lai.</w:t>
       </w:r>
     </w:p>
-    <w:bookmarkEnd w:id="157"/>
-    <w:bookmarkStart w:id="158" w:name="X1ae4654bd026ff4d99ae2bb551d6af9649385c6"/>
+    <w:bookmarkEnd w:id="159"/>
+    <w:bookmarkStart w:id="160" w:name="X1ae4654bd026ff4d99ae2bb551d6af9649385c6"/>
     <w:p>
       <w:pPr>
         <w:pStyle w:val="Heading3"/>
@@ -35141,9 +35334,9 @@
         </w:pict>
       </w:r>
     </w:p>
-    <w:bookmarkEnd w:id="158"/>
-    <w:bookmarkEnd w:id="159"/>
-    <w:bookmarkStart w:id="167" w:name="Xdbd5cc67084304ba85b73781c0cb0c00b74055b"/>
+    <w:bookmarkEnd w:id="160"/>
+    <w:bookmarkEnd w:id="161"/>
+    <w:bookmarkStart w:id="169" w:name="Xdbd5cc67084304ba85b73781c0cb0c00b74055b"/>
     <w:p>
       <w:pPr>
         <w:pStyle w:val="Heading2"/>
@@ -35152,7 +35345,7 @@
         <w:t xml:space="preserve">4.5 Kết quả bối cảnh chuyển đổi bậc thấp–trung: Việt Nam (P3)</w:t>
       </w:r>
     </w:p>
-    <w:bookmarkStart w:id="160" w:name="Xfa9060265c18c079d3fb45cfff0778bcd89c27e"/>
+    <w:bookmarkStart w:id="162" w:name="Xfa9060265c18c079d3fb45cfff0778bcd89c27e"/>
     <w:p>
       <w:pPr>
         <w:pStyle w:val="Heading3"/>
@@ -35349,8 +35542,8 @@
         <w:t xml:space="preserve">, bằng chứng thống kê mạnh nhất trong tất cả các mẫu quốc gia của luận án.</w:t>
       </w:r>
     </w:p>
-    <w:bookmarkEnd w:id="160"/>
-    <w:bookmarkStart w:id="161" w:name="điểm-điểm-uốn-theo-làn-sóng"/>
+    <w:bookmarkEnd w:id="162"/>
+    <w:bookmarkStart w:id="163" w:name="điểm-điểm-uốn-theo-làn-sóng"/>
     <w:p>
       <w:pPr>
         <w:pStyle w:val="Heading3"/>
@@ -35609,8 +35802,8 @@
         <w:t xml:space="preserve">, có ý nghĩa thống kê, cho thấy điểm uốn đã dịch chuyển đáng kể từ 46,2% xuống 39,3% giữa hai làn sóng.</w:t>
       </w:r>
     </w:p>
-    <w:bookmarkEnd w:id="161"/>
-    <w:bookmarkStart w:id="162" w:name="điều-tiết-bởi-tci-tích-cực-và-có-ý-nghĩa"/>
+    <w:bookmarkEnd w:id="163"/>
+    <w:bookmarkStart w:id="164" w:name="điều-tiết-bởi-tci-tích-cực-và-có-ý-nghĩa"/>
     <w:p>
       <w:pPr>
         <w:pStyle w:val="Heading3"/>
@@ -35678,8 +35871,8 @@
         <w:t xml:space="preserve">: TCI làm nâng cao mặt bằng hiệu quả và khuếch đại tác động tích cực của quốc tế hóa. Doanh nghiệp Việt Nam có năng lực công nghệ tốt hơn (đo bằng TCI) đạt hiệu quả cao hơn từ quá trình quốc tế hóa, nhất quán với H2 trong khung lý thuyết CDCM.</w:t>
       </w:r>
     </w:p>
-    <w:bookmarkEnd w:id="162"/>
-    <w:bookmarkStart w:id="163" w:name="điều-tiết-bởi-dai-không-có-ý-nghĩa"/>
+    <w:bookmarkEnd w:id="164"/>
+    <w:bookmarkStart w:id="165" w:name="điều-tiết-bởi-dai-không-có-ý-nghĩa"/>
     <w:p>
       <w:pPr>
         <w:pStyle w:val="Heading3"/>
@@ -35734,8 +35927,8 @@
         <w:t xml:space="preserve">(chỉ bao gồm Tier-1 DAI do giới hạn đo lường WBES trong các làn sóng này) cho kết quả yếu dương nhưng không có ý nghĩa thống kê. Kết quả này có thể phản ánh hạn chế về đo lường: Tier-1 DAI chỉ nắm bắt mức độ chấp nhận số bề mặt (website, email, online sales) chứ không đo lường được chiều sâu năng lực số. Với dữ liệu WBES Việt Nam chỉ cung cấp Tier-1, không đủ phân biệt để phát hiện hiệu ứng điều tiết tinh tế hơn.</w:t>
       </w:r>
     </w:p>
-    <w:bookmarkEnd w:id="163"/>
-    <w:bookmarkStart w:id="164" w:name="Xe1732086c032cd5cfc2f6431ba37210f11073f2"/>
+    <w:bookmarkEnd w:id="165"/>
+    <w:bookmarkStart w:id="166" w:name="Xe1732086c032cd5cfc2f6431ba37210f11073f2"/>
     <w:p>
       <w:pPr>
         <w:pStyle w:val="Heading3"/>
@@ -37168,8 +37361,8 @@
         <w:t xml:space="preserve">), cho thấy chữ U ngược phẳng lại đối với doanh nghiệp có năng lực cao chứ không dịch chuyển về mức.</w:t>
       </w:r>
     </w:p>
-    <w:bookmarkEnd w:id="164"/>
-    <w:bookmarkStart w:id="165" w:name="X1712bca98cd12f8663ba89927043bfe00f26ce2"/>
+    <w:bookmarkEnd w:id="166"/>
+    <w:bookmarkStart w:id="167" w:name="X1712bca98cd12f8663ba89927043bfe00f26ce2"/>
     <w:p>
       <w:pPr>
         <w:pStyle w:val="Heading3"/>
@@ -37876,8 +38069,8 @@
         <w:t xml:space="preserve">). Theo phân loại Haans, Pieters và He (2016), mẫu hình 2023 phù hợp với điều tiết Loại I (làm phẳng độ dốc, giữ nguyên hình dạng chữ U ngược) chứ không phải Loại II.</w:t>
       </w:r>
     </w:p>
-    <w:bookmarkEnd w:id="165"/>
-    <w:bookmarkStart w:id="166" w:name="X9856f5dd6302473d2bbf6a716d8a6aac558d4f5"/>
+    <w:bookmarkEnd w:id="167"/>
+    <w:bookmarkStart w:id="168" w:name="X9856f5dd6302473d2bbf6a716d8a6aac558d4f5"/>
     <w:p>
       <w:pPr>
         <w:pStyle w:val="Heading3"/>
@@ -38736,9 +38929,9 @@
         </w:pict>
       </w:r>
     </w:p>
-    <w:bookmarkEnd w:id="166"/>
-    <w:bookmarkEnd w:id="167"/>
-    <w:bookmarkStart w:id="174" w:name="X561afa853383c674354c1acb167a55cae3a018f"/>
+    <w:bookmarkEnd w:id="168"/>
+    <w:bookmarkEnd w:id="169"/>
+    <w:bookmarkStart w:id="176" w:name="X561afa853383c674354c1acb167a55cae3a018f"/>
     <w:p>
       <w:pPr>
         <w:pStyle w:val="Heading2"/>
@@ -38747,7 +38940,7 @@
         <w:t xml:space="preserve">4.6 Kết quả kiểm định toàn mẫu đa bối cảnh châu Á (P7)</w:t>
       </w:r>
     </w:p>
-    <w:bookmarkStart w:id="168" w:name="mẫu-và-mô-hình-chính"/>
+    <w:bookmarkStart w:id="170" w:name="mẫu-và-mô-hình-chính"/>
     <w:p>
       <w:pPr>
         <w:pStyle w:val="Heading3"/>
@@ -39628,8 +39821,8 @@
         <w:t xml:space="preserve">) cho phép xác thực lại từng hệ số trên máy có Stata trước khi nộp tạp chí.</w:t>
       </w:r>
     </w:p>
-    <w:bookmarkEnd w:id="168"/>
-    <w:bookmarkStart w:id="172" w:name="Xdf270642fda085fbdd4dd23ef5f7d1faa056489"/>
+    <w:bookmarkEnd w:id="170"/>
+    <w:bookmarkStart w:id="174" w:name="Xdf270642fda085fbdd4dd23ef5f7d1faa056489"/>
     <w:p>
       <w:pPr>
         <w:pStyle w:val="Heading3"/>
@@ -40547,18 +40740,18 @@
           <wp:inline>
             <wp:extent cx="5753100" cy="3285070"/>
             <wp:effectExtent b="0" l="0" r="0" t="0"/>
-            <wp:docPr descr="Hình 4.1. Họ đường cong I–P phụ thuộc chế độ thể chế ICRV" title="" id="170" name="Picture"/>
+            <wp:docPr descr="Hình 4.1. Họ đường cong I–P phụ thuộc chế độ thể chế ICRV" title="" id="172" name="Picture"/>
             <a:graphic>
               <a:graphicData uri="http://schemas.openxmlformats.org/drawingml/2006/picture">
                 <pic:pic>
                   <pic:nvPicPr>
-                    <pic:cNvPr descr="figures/fig_4_x_ip_curves_icrv_gradient.png" id="171" name="Picture"/>
+                    <pic:cNvPr descr="figures/fig_4_x_ip_curves_icrv_gradient.png" id="173" name="Picture"/>
                     <pic:cNvPicPr>
                       <a:picLocks noChangeArrowheads="1" noChangeAspect="1"/>
                     </pic:cNvPicPr>
                   </pic:nvPicPr>
                   <pic:blipFill>
-                    <a:blip r:embed="rId169"/>
+                    <a:blip r:embed="rId171"/>
                     <a:stretch>
                       <a:fillRect/>
                     </a:stretch>
@@ -40631,8 +40824,8 @@
         <w:t xml:space="preserve">Nguồn: minh họa của tác giả từ kết quả ước lượng 50 nền và P4, P8.</w:t>
       </w:r>
     </w:p>
-    <w:bookmarkEnd w:id="172"/>
-    <w:bookmarkStart w:id="173" w:name="điều-tiết-bởi-tci-và-dai-trong-toàn-mẫu"/>
+    <w:bookmarkEnd w:id="174"/>
+    <w:bookmarkStart w:id="175" w:name="điều-tiết-bởi-tci-và-dai-trong-toàn-mẫu"/>
     <w:p>
       <w:pPr>
         <w:pStyle w:val="Heading3"/>
@@ -40966,9 +41159,9 @@
         </w:pict>
       </w:r>
     </w:p>
-    <w:bookmarkEnd w:id="173"/>
-    <w:bookmarkEnd w:id="174"/>
-    <w:bookmarkStart w:id="182" w:name="X42f69945b56833cca239d45dc5864a7be6f74d7"/>
+    <w:bookmarkEnd w:id="175"/>
+    <w:bookmarkEnd w:id="176"/>
+    <w:bookmarkStart w:id="184" w:name="X42f69945b56833cca239d45dc5864a7be6f74d7"/>
     <w:p>
       <w:pPr>
         <w:pStyle w:val="Heading2"/>
@@ -40977,7 +41170,7 @@
         <w:t xml:space="preserve">4.7 Kết quả trường hợp biên SIDS: Các nền kinh tế đảo nhỏ đang phát triển (P8)</w:t>
       </w:r>
     </w:p>
-    <w:bookmarkStart w:id="175" w:name="đặc-điểm-mẫu-sids"/>
+    <w:bookmarkStart w:id="177" w:name="đặc-điểm-mẫu-sids"/>
     <w:p>
       <w:pPr>
         <w:pStyle w:val="Heading3"/>
@@ -41053,8 +41246,8 @@
         <w:t xml:space="preserve">(chiếm 13,8% mẫu). Tỷ lệ doanh thu xuất khẩu trung bình rất thấp: mean FSTS = 0,048 (4,8%).</w:t>
       </w:r>
     </w:p>
-    <w:bookmarkEnd w:id="175"/>
-    <w:bookmarkStart w:id="176" w:name="X305be4308b12f06c15c4aa0bf75053d865f81d7"/>
+    <w:bookmarkEnd w:id="177"/>
+    <w:bookmarkStart w:id="178" w:name="X305be4308b12f06c15c4aa0bf75053d865f81d7"/>
     <w:p>
       <w:pPr>
         <w:pStyle w:val="Heading3"/>
@@ -41411,8 +41604,8 @@
         <w:t xml:space="preserve">(monotone decline), không có điểm uốn trong phạm vi dữ liệu.</w:t>
       </w:r>
     </w:p>
-    <w:bookmarkEnd w:id="176"/>
-    <w:bookmarkStart w:id="177" w:name="X1eacd79ea5935ba958f558c7fa8a022614fd635"/>
+    <w:bookmarkEnd w:id="178"/>
+    <w:bookmarkStart w:id="179" w:name="X1eacd79ea5935ba958f558c7fa8a022614fd635"/>
     <w:p>
       <w:pPr>
         <w:pStyle w:val="Heading3"/>
@@ -41450,8 +41643,8 @@
         <w:t xml:space="preserve">Kết quả FIP là đóng góp lý thuyết gốc của luận án, lần đầu tiên được ghi nhận và đặt tên trong văn liệu internationalization–firm performance cho khu vực Thái Bình Dương.</w:t>
       </w:r>
     </w:p>
-    <w:bookmarkEnd w:id="177"/>
-    <w:bookmarkStart w:id="178" w:name="Xf5ef3b8f7f28ca1a48196484a4b190674943b22"/>
+    <w:bookmarkEnd w:id="179"/>
+    <w:bookmarkStart w:id="180" w:name="Xf5ef3b8f7f28ca1a48196484a4b190674943b22"/>
     <w:p>
       <w:pPr>
         <w:pStyle w:val="Heading3"/>
@@ -41468,8 +41661,8 @@
         <w:t xml:space="preserve">Cơ chế FIP ở cấp doanh nghiệp ăn khớp với đặc trưng tổn thương cấu trúc của các nền kinh tế nhỏ và thị trường biên được ghi nhận ở cấp vĩ mô. Bằng chứng của Ngân hàng Thế giới cho thấy bản chất phơi nhiễm bên ngoài của các thị trường biên là bất lợi so với thị trường mới nổi: dòng vốn danh mục biến động hơn, rổ xuất khẩu tập trung hơn, và nợ chủ yếu được định danh bằng ngoại tệ với mức dự trữ thấp, tất cả làm tăng rủi ro bảng cân đối (World Bank, 2026c). Đối với các nền kinh tế quy mô siêu nhỏ như SIDS Thái Bình Dương, những bất lợi này được khuếch đại bởi chi phí logistics cực cao và sự tập trung xuất khẩu cao độ, khiến việc gia tăng cường độ xuất khẩu không đi kèm phần thưởng năng suất mà thậm chí trở thành gánh nặng. Như vậy, FIP không phải một ngoại lệ thống kê mà là biểu hiện cấp doanh nghiệp của một quy luật cấu trúc rộng hơn: ở những bối cảnh thị trường nội địa quá nhỏ và đệm thể chế quá mỏng, quốc tế hóa mang tính bắt buộc chứ không phải lựa chọn chiến lược tối ưu hóa năng suất. Phát hiện này bổ sung một viên gạch vi mô còn thiếu vào bức tranh vĩ mô của Ngân hàng Thế giới về các nền kinh tế nhỏ và dễ tổn thương.</w:t>
       </w:r>
     </w:p>
-    <w:bookmarkEnd w:id="178"/>
-    <w:bookmarkStart w:id="179" w:name="Xd3bcc0b70fd8212696c0499c18fe6240ba1b32c"/>
+    <w:bookmarkEnd w:id="180"/>
+    <w:bookmarkStart w:id="181" w:name="Xd3bcc0b70fd8212696c0499c18fe6240ba1b32c"/>
     <w:p>
       <w:pPr>
         <w:pStyle w:val="Heading3"/>
@@ -41722,8 +41915,8 @@
         <w:t xml:space="preserve">phương sai năng suất được giải thích là phương sai giữa các quốc gia, một đặc trưng nhất quán với tính dị biệt cấu trúc cực đoan giữa các nền kinh tế đảo nhỏ.</w:t>
       </w:r>
     </w:p>
-    <w:bookmarkEnd w:id="179"/>
-    <w:bookmarkStart w:id="180" w:name="X05806545af9468e5b79a60086a94e43b4311d7f"/>
+    <w:bookmarkEnd w:id="181"/>
+    <w:bookmarkStart w:id="182" w:name="X05806545af9468e5b79a60086a94e43b4311d7f"/>
     <w:p>
       <w:pPr>
         <w:pStyle w:val="Heading3"/>
@@ -42094,8 +42287,8 @@
         <w:t xml:space="preserve">).</w:t>
       </w:r>
     </w:p>
-    <w:bookmarkEnd w:id="180"/>
-    <w:bookmarkStart w:id="181" w:name="Xe1a17f66d148450e4340ea430e2b38d3bcbda19"/>
+    <w:bookmarkEnd w:id="182"/>
+    <w:bookmarkStart w:id="183" w:name="Xe1a17f66d148450e4340ea430e2b38d3bcbda19"/>
     <w:p>
       <w:pPr>
         <w:pStyle w:val="Heading3"/>
@@ -42932,9 +43125,9 @@
         </w:pict>
       </w:r>
     </w:p>
-    <w:bookmarkEnd w:id="181"/>
-    <w:bookmarkEnd w:id="182"/>
-    <w:bookmarkStart w:id="186" w:name="Xfa456a9219d3acfaa17bcbc370e76a6bac65144"/>
+    <w:bookmarkEnd w:id="183"/>
+    <w:bookmarkEnd w:id="184"/>
+    <w:bookmarkStart w:id="188" w:name="Xfa456a9219d3acfaa17bcbc370e76a6bac65144"/>
     <w:p>
       <w:pPr>
         <w:pStyle w:val="Heading2"/>
@@ -44954,7 +45147,7 @@
         <w:t xml:space="preserve">, ngược với dự đoán phụ phẩm cộng hưởng năng lực số công cộng. Diễn giải cộng hưởng (complementarity reading): hạ tầng số công cộng UPI vận hành trên đường ray rupee nội địa và yêu cầu KYC Aadhaar cho đối tác cư trú tại Ấn Độ; doanh nghiệp xuất khẩu cần hạ tầng tài chính xuyên biên giới khác hẳn (SWIFT, ngân hàng đại lý, tài trợ thương mại, bảo hiểm tín dụng xuất khẩu) mà UPI không thể thay thế. Phát hiện này cho thấy hạ tầng công cộng số chỉ thay thế năng lực tư nhân khi hai loại hạ tầng có cùng định hướng mục đích, không phải thay thế phổ quát cho mọi hoạt động sản xuất doanh nghiệp.</w:t>
       </w:r>
     </w:p>
-    <w:bookmarkStart w:id="183" w:name="Xa084b9684354c3a9938e5b189bd20cad00b8926"/>
+    <w:bookmarkStart w:id="185" w:name="Xa084b9684354c3a9938e5b189bd20cad00b8926"/>
     <w:p>
       <w:pPr>
         <w:pStyle w:val="Heading3"/>
@@ -45918,8 +46111,8 @@
         <w:t xml:space="preserve">).</w:t>
       </w:r>
     </w:p>
-    <w:bookmarkEnd w:id="183"/>
-    <w:bookmarkStart w:id="184" w:name="X69aa24b46cd6147ff623b8d98152029170b54c6"/>
+    <w:bookmarkEnd w:id="185"/>
+    <w:bookmarkStart w:id="186" w:name="X69aa24b46cd6147ff623b8d98152029170b54c6"/>
     <w:p>
       <w:pPr>
         <w:pStyle w:val="Heading3"/>
@@ -46594,8 +46787,8 @@
         <w:t xml:space="preserve">), nhất quán với một sự dịch chuyển cấu trúc lũy tiến chứ không phải đứt gãy đột ngột do thay đổi công cụ khảo sát.</w:t>
       </w:r>
     </w:p>
-    <w:bookmarkEnd w:id="184"/>
-    <w:bookmarkStart w:id="185" w:name="X6ebf5cca1c55ded15c0769070f4de5566c02d6c"/>
+    <w:bookmarkEnd w:id="186"/>
+    <w:bookmarkStart w:id="187" w:name="X6ebf5cca1c55ded15c0769070f4de5566c02d6c"/>
     <w:p>
       <w:pPr>
         <w:pStyle w:val="Heading3"/>
@@ -47823,9 +48016,9 @@
         </w:pict>
       </w:r>
     </w:p>
-    <w:bookmarkEnd w:id="185"/>
-    <w:bookmarkEnd w:id="186"/>
-    <w:bookmarkStart w:id="190" w:name="Xb5e9decde9ddff3f5ed41f8bd03d7258a6bedfc"/>
+    <w:bookmarkEnd w:id="187"/>
+    <w:bookmarkEnd w:id="188"/>
+    <w:bookmarkStart w:id="192" w:name="Xb5e9decde9ddff3f5ed41f8bd03d7258a6bedfc"/>
     <w:p>
       <w:pPr>
         <w:pStyle w:val="Heading2"/>
@@ -47878,7 +48071,7 @@
         <w:t xml:space="preserve">của khung phụ thuộc thể chế: tại chế độ thể chế mạnh nhất, nhánh đi xuống của chữ U ngược bị đẩy ra ngoài miền cường độ xuất khẩu quan sát được, khiến quan hệ I–P trong dữ liệu trở nên dương và xấp xỉ tuyến tính. Bối cảnh mang sức nặng lý thuyết đặc biệt: chính các tập đoàn đa quốc gia Nhật Bản là nơi chữ U ngược được thiết lập ban đầu, song Nhật Bản chưa từng được quan sát trên một bộ công cụ hài hòa cho phép định vị nó so với các nền kinh tế cùng khu vực. Năng suất lao động (ln doanh thu trên một lao động thường xuyên, winsorize tại phân vị 1/99) được hồi quy theo FSTS và bình phương của nó với hiệu ứng cố định ngành và sai số chuẩn vững HC1, theo chuỗi phân tầng M1–M5.</w:t>
       </w:r>
     </w:p>
-    <w:bookmarkStart w:id="187" w:name="X33bb7001dce773639f394e40fe08a082ee98149"/>
+    <w:bookmarkStart w:id="189" w:name="X33bb7001dce773639f394e40fe08a082ee98149"/>
     <w:p>
       <w:pPr>
         <w:pStyle w:val="Heading3"/>
@@ -49140,8 +49333,8 @@
         <w:t xml:space="preserve">— Nhật Bản nằm trên một nhánh đi lên dài mà nhánh đi xuống vắng mặt về mặt thực nghiệm, trùng khớp kết quả Singapore (Mục 4.3) và kết quả cấp nhóm Advanced của ước lượng 50 nền (Mục 4.6.2), hoàn tất bức tranh ba vùng của gradient thể chế: chữ U ngược ở các chế độ chuyển đổi, gần tuyến tính ở biên trên, tan rã ở biên dưới.</w:t>
       </w:r>
     </w:p>
-    <w:bookmarkEnd w:id="187"/>
-    <w:bookmarkStart w:id="188" w:name="X0658ab59c6053f394b27c86017ecc8f578ad6c5"/>
+    <w:bookmarkEnd w:id="189"/>
+    <w:bookmarkStart w:id="190" w:name="X0658ab59c6053f394b27c86017ecc8f578ad6c5"/>
     <w:p>
       <w:pPr>
         <w:pStyle w:val="Heading3"/>
@@ -49544,8 +49737,8 @@
         <w:t xml:space="preserve">.</w:t>
       </w:r>
     </w:p>
-    <w:bookmarkEnd w:id="188"/>
-    <w:bookmarkStart w:id="189" w:name="X36bd9e244b4bfec78bb7e6cf4c835b753985d3a"/>
+    <w:bookmarkEnd w:id="190"/>
+    <w:bookmarkStart w:id="191" w:name="X36bd9e244b4bfec78bb7e6cf4c835b753985d3a"/>
     <w:p>
       <w:pPr>
         <w:pStyle w:val="Heading3"/>
@@ -49926,9 +50119,9 @@
         <w:t xml:space="preserve">). Bằng chứng Nhật Bản do đó vừa hoàn tất phổ ba vùng của khung CDCM ở biên trên, vừa làm rõ rằng cơ chế I–P chuyển từ biên cường độ (ở các chế độ chuyển đổi) sang biên rộng (ở chế độ tiên tiến trưởng thành).</w:t>
       </w:r>
     </w:p>
-    <w:bookmarkEnd w:id="189"/>
-    <w:bookmarkEnd w:id="190"/>
-    <w:bookmarkStart w:id="191" w:name="X3f9ed6ea86262c6caa26e51d1f917462628cea6"/>
+    <w:bookmarkEnd w:id="191"/>
+    <w:bookmarkEnd w:id="192"/>
+    <w:bookmarkStart w:id="193" w:name="X3f9ed6ea86262c6caa26e51d1f917462628cea6"/>
     <w:p>
       <w:pPr>
         <w:pStyle w:val="Heading2"/>
@@ -50085,8 +50278,8 @@
         </w:pict>
       </w:r>
     </w:p>
-    <w:bookmarkEnd w:id="191"/>
-    <w:bookmarkStart w:id="192" w:name="tổng-hợp-kết-quả-theo-hệ-giả-thuyết"/>
+    <w:bookmarkEnd w:id="193"/>
+    <w:bookmarkStart w:id="194" w:name="tổng-hợp-kết-quả-theo-hệ-giả-thuyết"/>
     <w:p>
       <w:pPr>
         <w:pStyle w:val="Heading2"/>
@@ -51687,8 +51880,8 @@
         </w:pict>
       </w:r>
     </w:p>
-    <w:bookmarkEnd w:id="192"/>
-    <w:bookmarkStart w:id="193" w:name="X1d7085913fe0d9bf449e1d01e72ec60c4109544"/>
+    <w:bookmarkEnd w:id="194"/>
+    <w:bookmarkStart w:id="195" w:name="X1d7085913fe0d9bf449e1d01e72ec60c4109544"/>
     <w:p>
       <w:pPr>
         <w:pStyle w:val="Heading2"/>
@@ -52069,8 +52262,8 @@
         <w:br w:type="page"/>
       </w:r>
     </w:p>
-    <w:bookmarkEnd w:id="193"/>
-    <w:bookmarkStart w:id="194" w:name="chương-5-kết-luận-và-đề-xuất"/>
+    <w:bookmarkEnd w:id="195"/>
+    <w:bookmarkStart w:id="196" w:name="chương-5-kết-luận-và-đề-xuất"/>
     <w:p>
       <w:pPr>
         <w:pStyle w:val="Heading1"/>
@@ -52079,7 +52272,7 @@
         <w:t xml:space="preserve">CHƯƠNG 5: KẾT LUẬN VÀ ĐỀ XUẤT</w:t>
       </w:r>
     </w:p>
-    <w:bookmarkEnd w:id="194"/>
+    <w:bookmarkEnd w:id="196"/>
     <w:p>
       <w:r>
         <w:pict>
@@ -52087,7 +52280,7 @@
         </w:pict>
       </w:r>
     </w:p>
-    <w:bookmarkStart w:id="195" w:name="giới-thiệu-chương-1"/>
+    <w:bookmarkStart w:id="197" w:name="giới-thiệu-chương-1"/>
     <w:p>
       <w:pPr>
         <w:pStyle w:val="Heading2"/>
@@ -52111,8 +52304,8 @@
         </w:pict>
       </w:r>
     </w:p>
-    <w:bookmarkEnd w:id="195"/>
-    <w:bookmarkStart w:id="203" w:name="Xff8cef3ed320f9cf6f3fba4ff558bfed3af19c6"/>
+    <w:bookmarkEnd w:id="197"/>
+    <w:bookmarkStart w:id="205" w:name="Xff8cef3ed320f9cf6f3fba4ff558bfed3af19c6"/>
     <w:p>
       <w:pPr>
         <w:pStyle w:val="Heading2"/>
@@ -52121,7 +52314,7 @@
         <w:t xml:space="preserve">5.1 Bàn luận kết quả theo khung lý thuyết CDCM</w:t>
       </w:r>
     </w:p>
-    <w:bookmarkStart w:id="196" w:name="X87949b622680195c8f5649c31ec800d0d4afb82"/>
+    <w:bookmarkStart w:id="198" w:name="X87949b622680195c8f5649c31ec800d0d4afb82"/>
     <w:p>
       <w:pPr>
         <w:pStyle w:val="Heading3"/>
@@ -52329,8 +52522,8 @@
         <w:t xml:space="preserve">: môi trường thể chế tốt cũng có nghĩa là hệ sinh thái dịch vụ hỗ trợ (logistics, tài chính thương mại, tư vấn pháp lý quốc tế) phát triển, làm giảm gánh nặng điều phối nội bộ của doanh nghiệp khi mở rộng quốc tế. Hai cơ chế này cùng giải thích vì sao đường cong duỗi thẳng ở biên trên của gradient: khi chi phí giao dịch xuyên biên giới đủ thấp và hệ sinh thái hỗ trợ đủ dày, nhánh đi xuống của chữ U ngược bị đẩy lùi ra ngoài miền quan sát; ngược lại ở biên dưới, sự thiếu vắng cả hai điều kiện khiến phần thưởng của quốc tế hóa trở nên nhỏ và bất định đến mức dạng hàm không còn định hình được.</w:t>
       </w:r>
     </w:p>
-    <w:bookmarkEnd w:id="196"/>
-    <w:bookmarkStart w:id="197" w:name="tci-là-năng-lực-nền-tảng-xác-nhận-h2"/>
+    <w:bookmarkEnd w:id="198"/>
+    <w:bookmarkStart w:id="199" w:name="tci-là-năng-lực-nền-tảng-xác-nhận-h2"/>
     <w:p>
       <w:pPr>
         <w:pStyle w:val="Heading3"/>
@@ -52416,8 +52609,8 @@
         <w:t xml:space="preserve">Cơ chế lý thuyết đằng sau kết quả này bắt nguồn từ Resource-Based View (Barney, 1991): TCI là nguồn lực VRIN (có giá trị, hiếm, khó sao chép, khó thay thế), do đó tạo ra lợi thế cạnh tranh bền vững ngay cả khi doanh nghiệp mở rộng ra thị trường nước ngoài với mức độ bất định cao. Năng lực công nghệ cũng tạo ra năng lực hấp thụ (Cohen &amp; Levinthal, 1990), khả năng hấp thu và tích hợp tri thức từ thị trường nước ngoài, giúp doanh nghiệp học hỏi hiệu quả hơn trong quá trình quốc tế hóa, nhất quán với learning loop của Uppsala model (Johanson &amp; Vahlne, 1977).</w:t>
       </w:r>
     </w:p>
-    <w:bookmarkEnd w:id="197"/>
-    <w:bookmarkStart w:id="198" w:name="X27755afda27725d75d6cee82c01fb99e8279a05"/>
+    <w:bookmarkEnd w:id="199"/>
+    <w:bookmarkStart w:id="200" w:name="X27755afda27725d75d6cee82c01fb99e8279a05"/>
     <w:p>
       <w:pPr>
         <w:pStyle w:val="Heading3"/>
@@ -52895,8 +53088,8 @@
         <w:t xml:space="preserve">Một giải thích bổ sung từ Lý thuyết thể chế: ở các bối cảnh ICRV thấp với nhiều khoảng trống thể chế (Khanna &amp; Palepu, 2010), doanh nghiệp xuất khẩu có thể phụ thuộc vào DAI nhiều hơn như một cơ chế bù đắp cho thiếu hụt hạ tầng thể chế (hiệu ứng lá chắn số đã ghi nhận ở nghiên cứu thành phần P1 trên 17 nền). Trên khung 50 nền, tương tác chế độ-yếu với độ dốc đường cong ở mức biên ý nghĩa (FSTS×chế độ yếu = −0,523, p = ,087), nhất quán về chiều với lập luận này nhưng cần kiểm định nhân quả chặt hơn trước khi khẳng định.</w:t>
       </w:r>
     </w:p>
-    <w:bookmarkEnd w:id="198"/>
-    <w:bookmarkStart w:id="199" w:name="Xba87836edee10cf1c931ef85c517d34e258cf83"/>
+    <w:bookmarkEnd w:id="200"/>
+    <w:bookmarkStart w:id="201" w:name="Xba87836edee10cf1c931ef85c517d34e258cf83"/>
     <w:p>
       <w:pPr>
         <w:pStyle w:val="Heading3"/>
@@ -53075,8 +53268,8 @@
         <w:t xml:space="preserve">kinh nghiệm quốc tế (breadth vs. depth), một hạn chế đo lường trong WBES cần được khắc phục trong nghiên cứu tương lai.</w:t>
       </w:r>
     </w:p>
-    <w:bookmarkEnd w:id="199"/>
-    <w:bookmarkStart w:id="200" w:name="Xfdc4f05762204c1e9501761a1ebcb843f9171c3"/>
+    <w:bookmarkEnd w:id="201"/>
+    <w:bookmarkStart w:id="202" w:name="Xfdc4f05762204c1e9501761a1ebcb843f9171c3"/>
     <w:p>
       <w:pPr>
         <w:pStyle w:val="Heading3"/>
@@ -53182,8 +53375,8 @@
         </w:pict>
       </w:r>
     </w:p>
-    <w:bookmarkEnd w:id="200"/>
-    <w:bookmarkStart w:id="201" w:name="Xb7548f07aa94b47fa4ac305672e1001cc1680aa"/>
+    <w:bookmarkEnd w:id="202"/>
+    <w:bookmarkStart w:id="203" w:name="Xb7548f07aa94b47fa4ac305672e1001cc1680aa"/>
     <w:p>
       <w:pPr>
         <w:pStyle w:val="Heading3"/>
@@ -53281,8 +53474,8 @@
         </w:pict>
       </w:r>
     </w:p>
-    <w:bookmarkEnd w:id="201"/>
-    <w:bookmarkStart w:id="202" w:name="Xbffcbb2cefd87893b0a3903884b48c3b4587efe"/>
+    <w:bookmarkEnd w:id="203"/>
+    <w:bookmarkStart w:id="204" w:name="Xbffcbb2cefd87893b0a3903884b48c3b4587efe"/>
     <w:p>
       <w:pPr>
         <w:pStyle w:val="Heading3"/>
@@ -53323,9 +53516,9 @@
         <w:t xml:space="preserve">Một sắc thái quan trọng phân biệt hai cơ chế tạo ra chữ U ngược dọc theo gradient. Bằng chứng Việt Nam (P3) cho thấy độ cong toàn mẫu trong chế độ chuyển đổi được nhận diện chủ yếu qua biên tham gia, tức bước nhảy năng suất khi doanh nghiệp chuyển từ không xuất khẩu sang xuất khẩu (H1a), chứ không qua độ cong cường độ trong nhóm doanh nghiệp đã xuất khẩu (H1b); khi tái ước lượng chỉ trên doanh nghiệp xuất khẩu, số hạng bậc hai mất ý nghĩa. Bằng chứng Nhật Bản (P10) cho thấy ở biên trên, cơ chế cũng vận hành qua biên tham gia nhưng theo logic tự chọn lọc Melitz (2003): câu hỏi ràng buộc không phải doanh nghiệp xuất khẩu bao nhiêu mà là có xuất khẩu hay không, với phần bù năng suất 25,8% cho doanh nghiệp xuất khẩu. Sự dịch chuyển trọng tâm từ biên cường độ ở chế độ chuyển đổi sang biên tham gia ở chế độ tiên tiến là một tinh chỉnh lý thuyết mà khung CDCM phiên bản ban đầu chưa nêu bật, và nó cung cấp một giải thích thống nhất cho việc vì sao đường cong duỗi thẳng ở biên trên.</w:t>
       </w:r>
     </w:p>
-    <w:bookmarkEnd w:id="202"/>
-    <w:bookmarkEnd w:id="203"/>
-    <w:bookmarkStart w:id="207" w:name="so-sánh-với-nghiên-cứu-trước-đây"/>
+    <w:bookmarkEnd w:id="204"/>
+    <w:bookmarkEnd w:id="205"/>
+    <w:bookmarkStart w:id="209" w:name="so-sánh-với-nghiên-cứu-trước-đây"/>
     <w:p>
       <w:pPr>
         <w:pStyle w:val="Heading2"/>
@@ -53334,7 +53527,7 @@
         <w:t xml:space="preserve">5.2 So sánh với nghiên cứu trước đây</w:t>
       </w:r>
     </w:p>
-    <w:bookmarkStart w:id="204" w:name="nhất-quán-với-cơ-sở-icbef-2024"/>
+    <w:bookmarkStart w:id="206" w:name="nhất-quán-với-cơ-sở-icbef-2024"/>
     <w:p>
       <w:pPr>
         <w:pStyle w:val="Heading3"/>
@@ -53540,8 +53733,8 @@
         <w:t xml:space="preserve">, không phải sự bất đồng căn bản giữa các nghiên cứu.</w:t>
       </w:r>
     </w:p>
-    <w:bookmarkEnd w:id="204"/>
-    <w:bookmarkStart w:id="205" w:name="X7b8db85450aaa41ba255e0d181ebc5c5ae65c48"/>
+    <w:bookmarkEnd w:id="206"/>
+    <w:bookmarkStart w:id="207" w:name="X7b8db85450aaa41ba255e0d181ebc5c5ae65c48"/>
     <w:p>
       <w:pPr>
         <w:pStyle w:val="Heading3"/>
@@ -53619,8 +53812,8 @@
         <w:t xml:space="preserve">, luận án mở rộng khung phân tích từ dữ liệu doanh nghiệp Nhật Bản/đa quốc gia sang 50 nền kinh tế châu Á và Thái Bình Dương, bối cảnh underrepresented trong văn liệu Lu và Beamish.</w:t>
       </w:r>
     </w:p>
-    <w:bookmarkEnd w:id="205"/>
-    <w:bookmarkStart w:id="206" w:name="X7d417abcca377c053c807a61872538ebbcf35bb"/>
+    <w:bookmarkEnd w:id="207"/>
+    <w:bookmarkStart w:id="208" w:name="X7d417abcca377c053c807a61872538ebbcf35bb"/>
     <w:p>
       <w:pPr>
         <w:pStyle w:val="Heading3"/>
@@ -53709,9 +53902,9 @@
         </w:pict>
       </w:r>
     </w:p>
-    <w:bookmarkEnd w:id="206"/>
-    <w:bookmarkEnd w:id="207"/>
-    <w:bookmarkStart w:id="213" w:name="đóng-góp-lý-thuyết-1"/>
+    <w:bookmarkEnd w:id="208"/>
+    <w:bookmarkEnd w:id="209"/>
+    <w:bookmarkStart w:id="215" w:name="đóng-góp-lý-thuyết-1"/>
     <w:p>
       <w:pPr>
         <w:pStyle w:val="Heading2"/>
@@ -53720,7 +53913,7 @@
         <w:t xml:space="preserve">5.3 Đóng góp lý thuyết</w:t>
       </w:r>
     </w:p>
-    <w:bookmarkStart w:id="208" w:name="cdcm-làm-rõ-dai-là-nguồn-lực-tình-huống"/>
+    <w:bookmarkStart w:id="210" w:name="cdcm-làm-rõ-dai-là-nguồn-lực-tình-huống"/>
     <w:p>
       <w:pPr>
         <w:pStyle w:val="Heading3"/>
@@ -53853,8 +54046,8 @@
         <w:t xml:space="preserve">: DAI hoạt động như lá chắn bù đắp (compensatory asset) trong bối cảnh thể chế yếu, nơi hạ tầng thể chế chưa đủ hỗ trợ cho doanh nghiệp xuất khẩu. Đây là bằng chứng thực nghiệm bổ sung cho lý thuyết về vai trò thay thế giữa thể chế và năng lực số.</w:t>
       </w:r>
     </w:p>
-    <w:bookmarkEnd w:id="208"/>
-    <w:bookmarkStart w:id="209" w:name="X3b1084bbd444ca85d063deaaac052e856e27e72"/>
+    <w:bookmarkEnd w:id="210"/>
+    <w:bookmarkStart w:id="211" w:name="X3b1084bbd444ca85d063deaaac052e856e27e72"/>
     <w:p>
       <w:pPr>
         <w:pStyle w:val="Heading3"/>
@@ -53895,8 +54088,8 @@
         <w:t xml:space="preserve">Hệ quả phương pháp của phân biệt này không nhỏ. Văn liệu số hóa thường gộp hai cấu trúc thành một chỉ số tổng hợp duy nhất, làm che khuất chính sự khác biệt về cơ chế mà luận án phát hiện. Việc tách bạch TCI và DAI thành hai hợp phần hình thành độc lập, dựa trên các tiêu chí đo lường của Coltman và cộng sự (2008) và phân biệt khái niệm của Bharadwaj và cộng sự (2013), cho phép luận án nhận diện rằng hai nguồn lực số tham gia vào quan hệ I–P qua hai con đường khác nhau, một phát hiện không thể đạt được nếu chúng bị gộp chung.</w:t>
       </w:r>
     </w:p>
-    <w:bookmarkEnd w:id="209"/>
-    <w:bookmarkStart w:id="210" w:name="X2d492fa0307aa4991837f2d5dc38e247101178c"/>
+    <w:bookmarkEnd w:id="211"/>
+    <w:bookmarkStart w:id="212" w:name="X2d492fa0307aa4991837f2d5dc38e247101178c"/>
     <w:p>
       <w:pPr>
         <w:pStyle w:val="Heading3"/>
@@ -54013,8 +54206,8 @@
         <w:t xml:space="preserve">, bẫy quốc tế hóa bắt buộc, mà không có điểm uốn để thoát khỏi.</w:t>
       </w:r>
     </w:p>
-    <w:bookmarkEnd w:id="210"/>
-    <w:bookmarkStart w:id="211" w:name="Xc32e0c91761841c5d26867e9ff33e10da8db64c"/>
+    <w:bookmarkEnd w:id="212"/>
+    <w:bookmarkStart w:id="213" w:name="Xc32e0c91761841c5d26867e9ff33e10da8db64c"/>
     <w:p>
       <w:pPr>
         <w:pStyle w:val="Heading3"/>
@@ -54091,8 +54284,8 @@
         </w:pict>
       </w:r>
     </w:p>
-    <w:bookmarkEnd w:id="211"/>
-    <w:bookmarkStart w:id="212" w:name="X61786cb178b6b5fccafd093d17dbdb91bb4eb71"/>
+    <w:bookmarkEnd w:id="213"/>
+    <w:bookmarkStart w:id="214" w:name="X61786cb178b6b5fccafd093d17dbdb91bb4eb71"/>
     <w:p>
       <w:pPr>
         <w:pStyle w:val="Heading3"/>
@@ -54125,9 +54318,9 @@
         <w:t xml:space="preserve">Bằng chứng Ấn Độ cũng tinh chỉnh một mệnh đề phụ trợ của khung về vai trò thay thế của hạ tầng số công cộng. Tương tác âm giữa chấp nhận số Tầng 2 (hạ tầng thanh toán hợp nhất UPI) và cường độ xuất khẩu (hệ số −4,02, p = 0,004) cho thấy hạ tầng số công cộng chỉ thay thế năng lực số tư nhân khi hai loại hạ tầng có cùng định hướng mục đích. Hạ tầng thanh toán nội địa vận hành trên đường ray nội tệ và yêu cầu định danh cư trú, không thể thay thế hạ tầng tài chính xuyên biên giới mà doanh nghiệp xuất khẩu yêu cầu. Mệnh đề tinh chỉnh này, rằng tính thay thế giữa hạ tầng công và năng lực tư là có điều kiện về định hướng mục đích chứ không phổ quát, là một đóng góp khái niệm bổ sung cho văn liệu về vai trò của thể chế công trong chuyển đổi số doanh nghiệp.</w:t>
       </w:r>
     </w:p>
-    <w:bookmarkEnd w:id="212"/>
-    <w:bookmarkEnd w:id="213"/>
-    <w:bookmarkStart w:id="219" w:name="đề-xuất-chính-sách-và-quản-trị"/>
+    <w:bookmarkEnd w:id="214"/>
+    <w:bookmarkEnd w:id="215"/>
+    <w:bookmarkStart w:id="221" w:name="đề-xuất-chính-sách-và-quản-trị"/>
     <w:p>
       <w:pPr>
         <w:pStyle w:val="Heading2"/>
@@ -54136,7 +54329,7 @@
         <w:t xml:space="preserve">5.4 Đề xuất chính sách và quản trị</w:t>
       </w:r>
     </w:p>
-    <w:bookmarkStart w:id="214" w:name="Xbc6d621fc32e0aca77269dff0917fe138aa2fc5"/>
+    <w:bookmarkStart w:id="216" w:name="Xbc6d621fc32e0aca77269dff0917fe138aa2fc5"/>
     <w:p>
       <w:pPr>
         <w:pStyle w:val="Heading3"/>
@@ -54201,8 +54394,8 @@
         <w:t xml:space="preserve">Đối với Việt Nam cụ thể: điểm uốn dịch chuyển từ 46,2% (2009) xuống 39,3% (2015) là tín hiệu đáng lo ngại. Nếu điểm uốn tiếp tục dịch trái, điều đó hàm ý rằng lợi ích từ xuất khẩu đạt đỉnh sớm hơn và suy giảm nhanh hơn, có thể do cấu trúc xuất khẩu tập trung vào gia công với biên lợi nhuận mỏng. Chính sách nâng cao giá trị gia tăng trong xuất khẩu (moving up the value chain) kết hợp với tăng cường TCI có thể giúp đảo ngược xu hướng này.</w:t>
       </w:r>
     </w:p>
-    <w:bookmarkEnd w:id="214"/>
-    <w:bookmarkStart w:id="215" w:name="X59d919466906d9a280d645023e1878e458893ad"/>
+    <w:bookmarkEnd w:id="216"/>
+    <w:bookmarkStart w:id="217" w:name="X59d919466906d9a280d645023e1878e458893ad"/>
     <w:p>
       <w:pPr>
         <w:pStyle w:val="Heading3"/>
@@ -54323,8 +54516,8 @@
         <w:t xml:space="preserve">: kết quả FIP là cảnh báo nghiêm túc, đẩy mạnh xuất khẩu trong bối cảnh thiếu năng lực và hỗ trợ thể chế không cải thiện mà còn có thể làm xấu đi hiệu quả hoạt động. Doanh nghiệp SIDS nên ưu tiên xây dựng năng lực nội địa và nâng cao TCI trước khi mở rộng xuất khẩu đáng kể.</w:t>
       </w:r>
     </w:p>
-    <w:bookmarkEnd w:id="215"/>
-    <w:bookmarkStart w:id="216" w:name="X3f7c356bbecb0845bc3ba35928bc46323a69176"/>
+    <w:bookmarkEnd w:id="217"/>
+    <w:bookmarkStart w:id="218" w:name="X3f7c356bbecb0845bc3ba35928bc46323a69176"/>
     <w:p>
       <w:pPr>
         <w:pStyle w:val="Heading3"/>
@@ -54380,8 +54573,8 @@
         <w:t xml:space="preserve">bằng cách đảm bảo rằng các can thiệp chính sách xây dựng năng lực trước khi thúc đẩy mở rộng thị trường.</w:t>
       </w:r>
     </w:p>
-    <w:bookmarkEnd w:id="216"/>
-    <w:bookmarkStart w:id="217" w:name="Xae585b9a1c03e57dcce9cad1f8f2ae171a592a6"/>
+    <w:bookmarkEnd w:id="218"/>
+    <w:bookmarkStart w:id="219" w:name="Xae585b9a1c03e57dcce9cad1f8f2ae171a592a6"/>
     <w:p>
       <w:pPr>
         <w:pStyle w:val="Heading3"/>
@@ -54422,8 +54615,8 @@
         <w:t xml:space="preserve">Thứ tư, trong kỷ nguyên trí tuệ nhân tạo, hạ tầng số công và quản trị dữ liệu trở thành điều kiện nền tảng để năng lực số cấp doanh nghiệp được chuyển hóa thành giá trị (World Bank, 2026e). Phát hiện của luận án rằng phần thưởng của áp dụng số phụ thuộc bối cảnh thể chế và tầng năng lực hàm ý rằng chính sách số hóa cần phân tầng: ở các nền đang chuyển đổi, ưu tiên là phổ cập hạ tầng số nền tảng và kỹ năng số cơ bản; ở các nền tiên tiến đã bão hòa Tier-1, trọng tâm dịch sang năng lực số chiều sâu và quản trị dữ liệu, AI. Cách tiếp cận phân tầng này tránh được cả hai sai lầm: đầu tư quá sớm vào công nghệ cao ở nơi chưa có nền tảng hấp thụ, và dừng lại ở hiện diện số bề mặt ở nơi đã sẵn sàng cho tầng năng lực cao hơn.</w:t>
       </w:r>
     </w:p>
-    <w:bookmarkEnd w:id="217"/>
-    <w:bookmarkStart w:id="218" w:name="X056a055cf9bbd2362c13ba6bcaa0837c6095056"/>
+    <w:bookmarkEnd w:id="219"/>
+    <w:bookmarkStart w:id="220" w:name="X056a055cf9bbd2362c13ba6bcaa0837c6095056"/>
     <w:p>
       <w:pPr>
         <w:pStyle w:val="Heading3"/>
@@ -54464,9 +54657,9 @@
         <w:t xml:space="preserve">Đối với chế độ thể chế yếu nhất (Nhóm V và VI, các nền đang nổi và đảo nhỏ), nơi quan hệ tan rã hoặc đảo sang âm đơn điệu, nguyên lý can thiệp đảo ngược hoàn toàn so với khuyến nghị thông thường: ưu tiên không phải xuất khẩu nhiều hơn mà xuất khẩu tốt hơn. Phát hiện gánh nặng quốc tế hóa bắt buộc tại SIDS đặt câu hỏi nghiêm túc về các chương trình viện trợ thương mại tập trung thúc đẩy xuất khẩu đại trà ở những nền thiếu nền tảng năng lực. Trình tự đúng là xây dựng hạ tầng logistics và kết nối để giảm chi phí cố định xuất khẩu, phát triển năng lực công nghệ chiều sâu thay vì chỉ hiện diện số bề mặt, và thiết kế hỗ trợ xuất khẩu có chọn lọc cho doanh nghiệp đã đủ năng lực hưởng lợi. Nguyên lý xuyên suốt ba vùng là xây dựng năng lực hấp thụ trước khi thúc đẩy mở rộng thị trường, một thứ tự ưu tiên mà khung ICRV giúp hiệu chỉnh cụ thể theo từng chế độ.</w:t>
       </w:r>
     </w:p>
-    <w:bookmarkEnd w:id="218"/>
-    <w:bookmarkEnd w:id="219"/>
-    <w:bookmarkStart w:id="225" w:name="hạn-chế-và-hướng-nghiên-cứu-tương-lai"/>
+    <w:bookmarkEnd w:id="220"/>
+    <w:bookmarkEnd w:id="221"/>
+    <w:bookmarkStart w:id="227" w:name="hạn-chế-và-hướng-nghiên-cứu-tương-lai"/>
     <w:p>
       <w:pPr>
         <w:pStyle w:val="Heading2"/>
@@ -54475,7 +54668,7 @@
         <w:t xml:space="preserve">5.5 Hạn chế và hướng nghiên cứu tương lai</w:t>
       </w:r>
     </w:p>
-    <w:bookmarkStart w:id="220" w:name="hạn-chế-về-đo-lường-dai"/>
+    <w:bookmarkStart w:id="222" w:name="hạn-chế-về-đo-lường-dai"/>
     <w:p>
       <w:pPr>
         <w:pStyle w:val="Heading3"/>
@@ -54534,8 +54727,8 @@
         <w:t xml:space="preserve">của việc cập nhật và tái cấu hình năng lực số theo thời gian. Điều này có nghĩa là các phát hiện về DAI trong luận án phản ánh mức độ chấp nhận số tại một thời điểm chứ không phải năng lực số năng động theo nghĩa của năng lực động theory (Teece et al., 1997).</w:t>
       </w:r>
     </w:p>
-    <w:bookmarkEnd w:id="220"/>
-    <w:bookmarkStart w:id="221" w:name="Xa9f4dc0d92bb938d40b6358e6a43bf594a5cc9a"/>
+    <w:bookmarkEnd w:id="222"/>
+    <w:bookmarkStart w:id="223" w:name="Xa9f4dc0d92bb938d40b6358e6a43bf594a5cc9a"/>
     <w:p>
       <w:pPr>
         <w:pStyle w:val="Heading3"/>
@@ -54560,8 +54753,8 @@
         <w:t xml:space="preserve">Phân tích Heckman two-step (hoặc treatment effects models) trong các nghiên cứu tương lai có thể khắc phục phần nào hạn chế này bằng cách mô hình hóa quá trình lựa chọn tham gia xuất khẩu như giai đoạn thứ nhất trước khi ước lượng hiệu quả trong giai đoạn thứ hai.</w:t>
       </w:r>
     </w:p>
-    <w:bookmarkEnd w:id="221"/>
-    <w:bookmarkStart w:id="222" w:name="hạn-chế-về-nhân-quả"/>
+    <w:bookmarkEnd w:id="223"/>
+    <w:bookmarkStart w:id="224" w:name="hạn-chế-về-nhân-quả"/>
     <w:p>
       <w:pPr>
         <w:pStyle w:val="Heading3"/>
@@ -54578,8 +54771,8 @@
         <w:t xml:space="preserve">Thiết kế lát cắt ngang (hoặc dữ liệu bảng gộp nhưng với WBES không phải là panel thực sự cho cùng doanh nghiệp qua thời gian) giới hạn khả năng suy luận nhân quả. Quan hệ I–P có thể bị ảnh hưởng bởi reverse causality: doanh nghiệp hiệu quả hơn có thể có nhiều nguồn lực để quốc tế hóa hơn, tạo ra chiều nhân quả ngược lại. Country hiệu ứng cố định và year hiệu ứng cố định giúp kiểm soát một phần, nhưng không giải quyết hoàn toàn vấn đề endogeneity.</w:t>
       </w:r>
     </w:p>
-    <w:bookmarkEnd w:id="222"/>
-    <w:bookmarkStart w:id="223" w:name="Xaabc0d89d536a1e9410458192adfca25fc5dd1f"/>
+    <w:bookmarkEnd w:id="224"/>
+    <w:bookmarkStart w:id="225" w:name="Xaabc0d89d536a1e9410458192adfca25fc5dd1f"/>
     <w:p>
       <w:pPr>
         <w:pStyle w:val="Heading3"/>
@@ -54612,8 +54805,8 @@
         <w:t xml:space="preserve">Thứ ba, cần nhắc lại rằng mọi đo lường DAI trong luận án đều là chỉ số chấp nhận số tĩnh tại một thời điểm khảo sát, không nắm bắt được tính động của việc cập nhật và tái cấu hình năng lực số theo nghĩa của lý thuyết năng lực động (Teece và cộng sự, 1997; Teece, 2007). Do đó các phát hiện về DAI phản ánh mức độ chấp nhận số tại thời điểm quan sát chứ không phải năng lực số năng động, và mọi suy luận về cơ chế động cần được xem là gợi mở chứ chưa được kiểm chứng trực tiếp trong khuôn khổ dữ liệu hiện có.</w:t>
       </w:r>
     </w:p>
-    <w:bookmarkEnd w:id="223"/>
-    <w:bookmarkStart w:id="224" w:name="hướng-nghiên-cứu-tương-lai"/>
+    <w:bookmarkEnd w:id="225"/>
+    <w:bookmarkStart w:id="226" w:name="hướng-nghiên-cứu-tương-lai"/>
     <w:p>
       <w:pPr>
         <w:pStyle w:val="Heading3"/>
@@ -54742,9 +54935,9 @@
         </w:pict>
       </w:r>
     </w:p>
-    <w:bookmarkEnd w:id="224"/>
-    <w:bookmarkEnd w:id="225"/>
-    <w:bookmarkStart w:id="230" w:name="kết-luận"/>
+    <w:bookmarkEnd w:id="226"/>
+    <w:bookmarkEnd w:id="227"/>
+    <w:bookmarkStart w:id="232" w:name="kết-luận"/>
     <w:p>
       <w:pPr>
         <w:pStyle w:val="Heading2"/>
@@ -54753,7 +54946,7 @@
         <w:t xml:space="preserve">5.6 Kết luận</w:t>
       </w:r>
     </w:p>
-    <w:bookmarkStart w:id="226" w:name="tổng-kết-chín-nghiên-cứu"/>
+    <w:bookmarkStart w:id="228" w:name="tổng-kết-chín-nghiên-cứu"/>
     <w:p>
       <w:pPr>
         <w:pStyle w:val="Heading3"/>
@@ -55519,8 +55712,8 @@
         <w:t xml:space="preserve">điểm uốn chữ U ngược: TP = 61,8% (2014) rồi 40,7% (2022) rồi mất ý nghĩa độ cong (2025: β₂ = −0,16, p = ,42), kèm tương tác DAI Tier-2 (UPI) âm, bằng chứng đầu tiên rằng chuyển đổi thể chế cực mạnh có thể hòa tan (chứ không chỉ dịch chuyển) ngưỡng. Đích MIR/IJOEM; kế thừa công trình tiền đề Do &amp; Phan (2025, IntechOpen).</w:t>
       </w:r>
     </w:p>
-    <w:bookmarkEnd w:id="226"/>
-    <w:bookmarkStart w:id="227" w:name="phát-hiện-trung-tâm"/>
+    <w:bookmarkEnd w:id="228"/>
+    <w:bookmarkStart w:id="229" w:name="phát-hiện-trung-tâm"/>
     <w:p>
       <w:pPr>
         <w:pStyle w:val="Heading3"/>
@@ -55587,8 +55780,8 @@
         <w:t xml:space="preserve">(family of context-dependent curves): chữ U ngược định hình ở vùng giữa gradient thể chế, duỗi thẳng ở biên trên và tan rã ở biên dưới, thể chế càng mạnh, điểm uốn càng sớm (FSTS thấp hơn).</w:t>
       </w:r>
     </w:p>
-    <w:bookmarkEnd w:id="227"/>
-    <w:bookmarkStart w:id="228" w:name="ý-nghĩa-đối-với-lý-thuyết-và-thực-tiễn"/>
+    <w:bookmarkEnd w:id="229"/>
+    <w:bookmarkStart w:id="230" w:name="ý-nghĩa-đối-với-lý-thuyết-và-thực-tiễn"/>
     <w:p>
       <w:pPr>
         <w:pStyle w:val="Heading3"/>
@@ -55613,8 +55806,8 @@
         <w:t xml:space="preserve">Về thực tiễn, luận án cung cấp cơ sở để nhà hoạch định chính sách và nhà quản trị doanh nghiệp tại từng bối cảnh ICRV cụ thể hiệu chỉnh chiến lược quốc tế hóa phù hợp, không áp dụng máy móc bài học từ Singapore hay Nhật Bản vào bối cảnh Việt Nam hay SIDS, mà nhận ra sự phụ thuộc bối cảnh như là nguyên lý căn bản trong hoạch định chiến lược quốc tế hóa.</w:t>
       </w:r>
     </w:p>
-    <w:bookmarkEnd w:id="228"/>
-    <w:bookmarkStart w:id="229" w:name="lời-kết"/>
+    <w:bookmarkEnd w:id="230"/>
+    <w:bookmarkStart w:id="231" w:name="lời-kết"/>
     <w:p>
       <w:pPr>
         <w:pStyle w:val="Heading3"/>
@@ -55656,9 +55849,9 @@
         <w:br w:type="page"/>
       </w:r>
     </w:p>
-    <w:bookmarkEnd w:id="229"/>
-    <w:bookmarkEnd w:id="230"/>
-    <w:bookmarkStart w:id="268" w:name="tài-liệu-tham-khảo-apa-7th"/>
+    <w:bookmarkEnd w:id="231"/>
+    <w:bookmarkEnd w:id="232"/>
+    <w:bookmarkStart w:id="270" w:name="tài-liệu-tham-khảo-apa-7th"/>
     <w:p>
       <w:pPr>
         <w:pStyle w:val="Heading1"/>
@@ -56165,7 +56358,7 @@
         <w:t xml:space="preserve">.</w:t>
       </w:r>
     </w:p>
-    <w:bookmarkStart w:id="231" w:name="X1ce219aaccc3c8d52177b991e903b9a90c924a4"/>
+    <w:bookmarkStart w:id="233" w:name="X1ce219aaccc3c8d52177b991e903b9a90c924a4"/>
     <w:p>
       <w:pPr>
         <w:pStyle w:val="Heading2"/>
@@ -56386,8 +56579,8 @@
         <w:t xml:space="preserve">(Mới v2.4)</w:t>
       </w:r>
     </w:p>
-    <w:bookmarkEnd w:id="231"/>
-    <w:bookmarkStart w:id="232" w:name="X094bc8b13169a81669f6b7abcf887888d4186ca"/>
+    <w:bookmarkEnd w:id="233"/>
+    <w:bookmarkStart w:id="234" w:name="X094bc8b13169a81669f6b7abcf887888d4186ca"/>
     <w:p>
       <w:pPr>
         <w:pStyle w:val="Heading2"/>
@@ -56419,8 +56612,8 @@
         <w:t xml:space="preserve">: Lin &amp; Beamish (2005) thành Lu &amp; Beamish (2004) replacement đã hoàn tất trong file 14 v3.8 (commit e2f8415, 07/05/2026): 4 occurrences trong Mục 1.1, Mục 2.6, Bảng 2.6.1 đã updated. Lu &amp; Beamish (2004) AMJ S-curve DOI 10.2307/20159604 đã có sẵn Section B từ v2.1.</w:t>
       </w:r>
     </w:p>
-    <w:bookmarkEnd w:id="232"/>
-    <w:bookmarkStart w:id="233" w:name="c.-meta-analyses-về-ip-relationship"/>
+    <w:bookmarkEnd w:id="234"/>
+    <w:bookmarkStart w:id="235" w:name="c.-meta-analyses-về-ip-relationship"/>
     <w:p>
       <w:pPr>
         <w:pStyle w:val="Heading2"/>
@@ -56437,8 +56630,8 @@
         <w:t xml:space="preserve">(Giữ nguyên từ v2.1 — Arte &amp; Larimo 2022, Bausch &amp; Krist 2007, Kirca et al. 2012, Marano et al. 2016, Schwens et al. 2018, Wu, Fan &amp; Chen 2022. Tổng 6 entries.)</w:t>
       </w:r>
     </w:p>
-    <w:bookmarkEnd w:id="233"/>
-    <w:bookmarkStart w:id="234" w:name="Xb02f9563701139be84b359c2d25884190ee9110"/>
+    <w:bookmarkEnd w:id="235"/>
+    <w:bookmarkStart w:id="236" w:name="Xb02f9563701139be84b359c2d25884190ee9110"/>
     <w:p>
       <w:pPr>
         <w:pStyle w:val="Heading2"/>
@@ -56799,8 +56992,8 @@
         <w:t xml:space="preserve">(Mới v2.3 — 3.331 US-listed firms 82 nước; phân tách de jure exposure vs de facto enforcement.)</w:t>
       </w:r>
     </w:p>
-    <w:bookmarkEnd w:id="234"/>
-    <w:bookmarkStart w:id="235" w:name="X5943e13ebd761ed89df86a9d940a6ae7a0dd948"/>
+    <w:bookmarkEnd w:id="236"/>
+    <w:bookmarkStart w:id="237" w:name="X5943e13ebd761ed89df86a9d940a6ae7a0dd948"/>
     <w:p>
       <w:pPr>
         <w:pStyle w:val="Heading2"/>
@@ -56919,8 +57112,8 @@
         <w:t xml:space="preserve">(Mới v2.3)</w:t>
       </w:r>
     </w:p>
-    <w:bookmarkEnd w:id="235"/>
-    <w:bookmarkStart w:id="236" w:name="f.-china-specific-research-cập-nhật-v2.2"/>
+    <w:bookmarkEnd w:id="237"/>
+    <w:bookmarkStart w:id="238" w:name="f.-china-specific-research-cập-nhật-v2.2"/>
     <w:p>
       <w:pPr>
         <w:pStyle w:val="Heading2"/>
@@ -57076,8 +57269,8 @@
         <w:t xml:space="preserve">(2), e0262891.</w:t>
       </w:r>
     </w:p>
-    <w:bookmarkEnd w:id="236"/>
-    <w:bookmarkStart w:id="237" w:name="g.-asianemne-empirical-cập-nhật-v2.3"/>
+    <w:bookmarkEnd w:id="238"/>
+    <w:bookmarkStart w:id="239" w:name="g.-asianemne-empirical-cập-nhật-v2.3"/>
     <w:p>
       <w:pPr>
         <w:pStyle w:val="Heading2"/>
@@ -57314,8 +57507,8 @@
         <w:t xml:space="preserve">(Mới v2.3)</w:t>
       </w:r>
     </w:p>
-    <w:bookmarkEnd w:id="237"/>
-    <w:bookmarkStart w:id="238" w:name="h.-firm-performance-đa-chiều"/>
+    <w:bookmarkEnd w:id="239"/>
+    <w:bookmarkStart w:id="240" w:name="h.-firm-performance-đa-chiều"/>
     <w:p>
       <w:pPr>
         <w:pStyle w:val="Heading2"/>
@@ -57332,8 +57525,8 @@
         <w:t xml:space="preserve">(Giữ nguyên từ v2.1.)</w:t>
       </w:r>
     </w:p>
-    <w:bookmarkEnd w:id="238"/>
-    <w:bookmarkStart w:id="239" w:name="i.-productivity-literature"/>
+    <w:bookmarkEnd w:id="240"/>
+    <w:bookmarkStart w:id="241" w:name="i.-productivity-literature"/>
     <w:p>
       <w:pPr>
         <w:pStyle w:val="Heading2"/>
@@ -57350,8 +57543,8 @@
         <w:t xml:space="preserve">(Giữ nguyên từ v2.1 — Bloom, Sadun &amp; Van Reenen 2012; Cusolito &amp; Maloney 2018; Hsieh &amp; Klenow 2009 và 2014.)</w:t>
       </w:r>
     </w:p>
-    <w:bookmarkEnd w:id="239"/>
-    <w:bookmarkStart w:id="241" w:name="X7621949d30e744d6874048fecb1435cd5e216fd"/>
+    <w:bookmarkEnd w:id="241"/>
+    <w:bookmarkStart w:id="243" w:name="X7621949d30e744d6874048fecb1435cd5e216fd"/>
     <w:p>
       <w:pPr>
         <w:pStyle w:val="Heading2"/>
@@ -57419,7 +57612,7 @@
         <w:t xml:space="preserve">(Mới v2.4 — 12-point data section transparency framework.)</w:t>
       </w:r>
     </w:p>
-    <w:bookmarkStart w:id="240" w:name="X2fb57ded0f7cbc8f956c4aa51a273056f808ba8"/>
+    <w:bookmarkStart w:id="242" w:name="X2fb57ded0f7cbc8f956c4aa51a273056f808ba8"/>
     <w:p>
       <w:pPr>
         <w:pStyle w:val="Heading3"/>
@@ -57600,9 +57793,9 @@
         <w:t xml:space="preserve">(Khung lát cắt ngang lặp lại — Phụ lục A.1, A.6.)</w:t>
       </w:r>
     </w:p>
-    <w:bookmarkEnd w:id="240"/>
-    <w:bookmarkEnd w:id="241"/>
-    <w:bookmarkStart w:id="242" w:name="X671f5c1355043217bd04f1f91c41f74e5ebb142"/>
+    <w:bookmarkEnd w:id="242"/>
+    <w:bookmarkEnd w:id="243"/>
+    <w:bookmarkStart w:id="244" w:name="X671f5c1355043217bd04f1f91c41f74e5ebb142"/>
     <w:p>
       <w:pPr>
         <w:pStyle w:val="Heading2"/>
@@ -59392,8 +59585,8 @@
         <w:t xml:space="preserve">. World Intellectual Property Organization.</w:t>
       </w:r>
     </w:p>
-    <w:bookmarkEnd w:id="242"/>
-    <w:bookmarkStart w:id="243" w:name="Xde200f04073635a38db4cac94b8061369cfcb08"/>
+    <w:bookmarkEnd w:id="244"/>
+    <w:bookmarkStart w:id="245" w:name="Xde200f04073635a38db4cac94b8061369cfcb08"/>
     <w:p>
       <w:pPr>
         <w:pStyle w:val="Heading2"/>
@@ -59529,8 +59722,8 @@
         <w:t xml:space="preserve">(Mới v2.4)</w:t>
       </w:r>
     </w:p>
-    <w:bookmarkEnd w:id="243"/>
-    <w:bookmarkStart w:id="244" w:name="X7241ee869b897bec300afe2239fcffb546e80e2"/>
+    <w:bookmarkEnd w:id="245"/>
+    <w:bookmarkStart w:id="246" w:name="X7241ee869b897bec300afe2239fcffb546e80e2"/>
     <w:p>
       <w:pPr>
         <w:pStyle w:val="Heading2"/>
@@ -59547,8 +59740,8 @@
         <w:t xml:space="preserve">(Giữ nguyên từ v2.1 — 4 đã xuất bản 2024-2026 + 4 đang chuẩn bị P3/P4/P5/P8.)</w:t>
       </w:r>
     </w:p>
-    <w:bookmarkEnd w:id="244"/>
-    <w:bookmarkStart w:id="245" w:name="X1905c160c4cd52294e7a67a5792aaeb2433790b"/>
+    <w:bookmarkEnd w:id="246"/>
+    <w:bookmarkStart w:id="247" w:name="X1905c160c4cd52294e7a67a5792aaeb2433790b"/>
     <w:p>
       <w:pPr>
         <w:pStyle w:val="Heading2"/>
@@ -59565,8 +59758,8 @@
         <w:t xml:space="preserve">(Giữ nguyên từ v2.0 — Auty 1993, Beblawi 1987, Gerelmaa &amp; Kotani 2016, Hertog 2010, Hvidt 2013, Sachs &amp; Warner 2001, Hall &amp; Soskice 2001, Bertram 2006, Briguglio 1995. Tổng 9 entries.)</w:t>
       </w:r>
     </w:p>
-    <w:bookmarkEnd w:id="245"/>
-    <w:bookmarkStart w:id="246" w:name="X1ca9aa89636ad43de36398867e3fda3073628b0"/>
+    <w:bookmarkEnd w:id="247"/>
+    <w:bookmarkStart w:id="248" w:name="X1ca9aa89636ad43de36398867e3fda3073628b0"/>
     <w:p>
       <w:pPr>
         <w:pStyle w:val="Heading2"/>
@@ -59583,8 +59776,8 @@
         <w:t xml:space="preserve">(Giữ nguyên từ v2.0 — 7 văn bản pháp lý + 8 hiệp định FTA.)</w:t>
       </w:r>
     </w:p>
-    <w:bookmarkEnd w:id="246"/>
-    <w:bookmarkStart w:id="247" w:name="X8c3cce854d69d4cec5e0e5c79c65fd3ecacba09"/>
+    <w:bookmarkEnd w:id="248"/>
+    <w:bookmarkStart w:id="249" w:name="X8c3cce854d69d4cec5e0e5c79c65fd3ecacba09"/>
     <w:p>
       <w:pPr>
         <w:pStyle w:val="Heading2"/>
@@ -59758,8 +59951,8 @@
         </w:pict>
       </w:r>
     </w:p>
-    <w:bookmarkEnd w:id="247"/>
-    <w:bookmarkStart w:id="248" w:name="X9fda309e68ad5febed2f75ba3907e03a038cbb1"/>
+    <w:bookmarkEnd w:id="249"/>
+    <w:bookmarkStart w:id="250" w:name="X9fda309e68ad5febed2f75ba3907e03a038cbb1"/>
     <w:p>
       <w:pPr>
         <w:pStyle w:val="Heading2"/>
@@ -61014,8 +61207,8 @@
         </w:pict>
       </w:r>
     </w:p>
-    <w:bookmarkEnd w:id="248"/>
-    <w:bookmarkStart w:id="249" w:name="X4863c99e382dd33e45c83c62d65ccdbfdf2be54"/>
+    <w:bookmarkEnd w:id="250"/>
+    <w:bookmarkStart w:id="251" w:name="X4863c99e382dd33e45c83c62d65ccdbfdf2be54"/>
     <w:p>
       <w:pPr>
         <w:pStyle w:val="Heading2"/>
@@ -61192,8 +61385,8 @@
         </w:pict>
       </w:r>
     </w:p>
-    <w:bookmarkEnd w:id="249"/>
-    <w:bookmarkStart w:id="250" w:name="Xbd941738ba66bb94640e93ff5b476f7b031b91b"/>
+    <w:bookmarkEnd w:id="251"/>
+    <w:bookmarkStart w:id="252" w:name="Xbd941738ba66bb94640e93ff5b476f7b031b91b"/>
     <w:p>
       <w:pPr>
         <w:pStyle w:val="Heading2"/>
@@ -61482,8 +61675,8 @@
         </w:pict>
       </w:r>
     </w:p>
-    <w:bookmarkEnd w:id="250"/>
-    <w:bookmarkStart w:id="251" w:name="Xef809cfcfe0baf8ba5c87a5d2dc964c02e59512"/>
+    <w:bookmarkEnd w:id="252"/>
+    <w:bookmarkStart w:id="253" w:name="Xef809cfcfe0baf8ba5c87a5d2dc964c02e59512"/>
     <w:p>
       <w:pPr>
         <w:pStyle w:val="Heading2"/>
@@ -61934,8 +62127,8 @@
         </w:pict>
       </w:r>
     </w:p>
-    <w:bookmarkEnd w:id="251"/>
-    <w:bookmarkStart w:id="255" w:name="hướng-dẫn-sử-dụng-cập-nhật-v2.5"/>
+    <w:bookmarkEnd w:id="253"/>
+    <w:bookmarkStart w:id="257" w:name="hướng-dẫn-sử-dụng-cập-nhật-v2.5"/>
     <w:p>
       <w:pPr>
         <w:pStyle w:val="Heading2"/>
@@ -61944,7 +62137,7 @@
         <w:t xml:space="preserve">Hướng dẫn sử dụng (cập nhật v2.5)</w:t>
       </w:r>
     </w:p>
-    <w:bookmarkStart w:id="252" w:name="trong-bản-thảo-luận-án"/>
+    <w:bookmarkStart w:id="254" w:name="trong-bản-thảo-luận-án"/>
     <w:p>
       <w:pPr>
         <w:pStyle w:val="Heading3"/>
@@ -62904,8 +63097,8 @@
         <w:t xml:space="preserve">[Atlas chapter, Section P]</w:t>
       </w:r>
     </w:p>
-    <w:bookmarkEnd w:id="252"/>
-    <w:bookmarkStart w:id="253" w:name="khi-nộp-bản-cuối"/>
+    <w:bookmarkEnd w:id="254"/>
+    <w:bookmarkStart w:id="255" w:name="khi-nộp-bản-cuối"/>
     <w:p>
       <w:pPr>
         <w:pStyle w:val="Heading3"/>
@@ -63071,8 +63264,8 @@
         <w:t xml:space="preserve">— số đầy đủ + ngày publication trên datatopics.worldbank.org.</w:t>
       </w:r>
     </w:p>
-    <w:bookmarkEnd w:id="253"/>
-    <w:bookmarkStart w:id="254" w:name="audit-warnings-status-cập-nhật-v2.5"/>
+    <w:bookmarkEnd w:id="255"/>
+    <w:bookmarkStart w:id="256" w:name="audit-warnings-status-cập-nhật-v2.5"/>
     <w:p>
       <w:pPr>
         <w:pStyle w:val="Heading3"/>
@@ -63197,9 +63390,9 @@
         </w:pict>
       </w:r>
     </w:p>
-    <w:bookmarkEnd w:id="254"/>
-    <w:bookmarkEnd w:id="255"/>
-    <w:bookmarkStart w:id="256" w:name="Xe55fb46d00de6bf9b95fd9179798e6474c95835"/>
+    <w:bookmarkEnd w:id="256"/>
+    <w:bookmarkEnd w:id="257"/>
+    <w:bookmarkStart w:id="258" w:name="Xe55fb46d00de6bf9b95fd9179798e6474c95835"/>
     <w:p>
       <w:pPr>
         <w:pStyle w:val="Heading2"/>
@@ -64596,8 +64789,8 @@
         <w:t xml:space="preserve">(1), 132–142. https://doi.org/10.1016/j.jwb.2013.04.003</w:t>
       </w:r>
     </w:p>
-    <w:bookmarkEnd w:id="256"/>
-    <w:bookmarkStart w:id="257" w:name="Xd7e1b1ec1596ddfb204126def34f28100020172"/>
+    <w:bookmarkEnd w:id="258"/>
+    <w:bookmarkStart w:id="259" w:name="Xd7e1b1ec1596ddfb204126def34f28100020172"/>
     <w:p>
       <w:pPr>
         <w:pStyle w:val="Heading2"/>
@@ -65505,8 +65698,8 @@
         <w:t xml:space="preserve">(1), 1–15. https://doi.org/10.1007/s11365-011-0218-8</w:t>
       </w:r>
     </w:p>
-    <w:bookmarkEnd w:id="257"/>
-    <w:bookmarkStart w:id="258" w:name="Xac3469c407a51be8ab1bf290cd8561897ea439c"/>
+    <w:bookmarkEnd w:id="259"/>
+    <w:bookmarkStart w:id="260" w:name="Xac3469c407a51be8ab1bf290cd8561897ea439c"/>
     <w:p>
       <w:pPr>
         <w:pStyle w:val="Heading2"/>
@@ -65580,8 +65773,8 @@
         <w:t xml:space="preserve">(2), 239–250. https://doi.org/10.1002/gsj.1383</w:t>
       </w:r>
     </w:p>
-    <w:bookmarkEnd w:id="258"/>
-    <w:bookmarkStart w:id="259" w:name="X15e01107f5fc0341333f11988493a9502b35627"/>
+    <w:bookmarkEnd w:id="260"/>
+    <w:bookmarkStart w:id="261" w:name="X15e01107f5fc0341333f11988493a9502b35627"/>
     <w:p>
       <w:pPr>
         <w:pStyle w:val="Heading2"/>
@@ -66260,8 +66453,8 @@
         </w:pict>
       </w:r>
     </w:p>
-    <w:bookmarkEnd w:id="259"/>
-    <w:bookmarkStart w:id="263" w:name="X5cd8a8b98c5930790a226592bde9793b6e0e242"/>
+    <w:bookmarkEnd w:id="261"/>
+    <w:bookmarkStart w:id="265" w:name="X5cd8a8b98c5930790a226592bde9793b6e0e242"/>
     <w:p>
       <w:pPr>
         <w:pStyle w:val="Heading2"/>
@@ -66296,7 +66489,7 @@
         <w:t xml:space="preserve">blocks chưa được expand, và 2 auxiliary entries.</w:t>
       </w:r>
     </w:p>
-    <w:bookmarkStart w:id="260" w:name="X041759103c7c799db9799d6bd71834307a428c8"/>
+    <w:bookmarkStart w:id="262" w:name="X041759103c7c799db9799d6bd71834307a428c8"/>
     <w:p>
       <w:pPr>
         <w:pStyle w:val="Heading3"/>
@@ -66305,8 +66498,8 @@
         <w:t xml:space="preserve">Công trình của tác giả luận án — Cập nhật Section M</w:t>
       </w:r>
     </w:p>
-    <w:bookmarkEnd w:id="260"/>
-    <w:bookmarkStart w:id="261" w:name="X03425170776bdc22411e9d4a6a3935a0796568a"/>
+    <w:bookmarkEnd w:id="262"/>
+    <w:bookmarkStart w:id="263" w:name="X03425170776bdc22411e9d4a6a3935a0796568a"/>
     <w:p>
       <w:pPr>
         <w:pStyle w:val="Heading3"/>
@@ -66475,8 +66668,8 @@
         <w:t xml:space="preserve">(2), 220–246. https://doi.org/10.1017/S1876404511200046</w:t>
       </w:r>
     </w:p>
-    <w:bookmarkEnd w:id="261"/>
-    <w:bookmarkStart w:id="262" w:name="lý-thuyết-bổ-sung-section-ac-mở-rộng"/>
+    <w:bookmarkEnd w:id="263"/>
+    <w:bookmarkStart w:id="264" w:name="lý-thuyết-bổ-sung-section-ac-mở-rộng"/>
     <w:p>
       <w:pPr>
         <w:pStyle w:val="Heading3"/>
@@ -66546,9 +66739,9 @@
         <w:t xml:space="preserve">. IntechOpen. https://doi.org/10.5772/intechopen.1011012</w:t>
       </w:r>
     </w:p>
-    <w:bookmarkEnd w:id="262"/>
-    <w:bookmarkEnd w:id="263"/>
-    <w:bookmarkStart w:id="264" w:name="X4ad38a67506c0aa3a2d571e9cd2db0013b86176"/>
+    <w:bookmarkEnd w:id="264"/>
+    <w:bookmarkEnd w:id="265"/>
+    <w:bookmarkStart w:id="266" w:name="X4ad38a67506c0aa3a2d571e9cd2db0013b86176"/>
     <w:p>
       <w:pPr>
         <w:pStyle w:val="Heading2"/>
@@ -66620,8 +66813,8 @@
         <w:t xml:space="preserve">(2), 325–342. https://doi.org/10.1057/palgrave.jibs.8490203</w:t>
       </w:r>
     </w:p>
-    <w:bookmarkEnd w:id="264"/>
-    <w:bookmarkStart w:id="265" w:name="X4810745a8b7558f6ac6877d26fce4f3b946fba5"/>
+    <w:bookmarkEnd w:id="266"/>
+    <w:bookmarkStart w:id="267" w:name="X4810745a8b7558f6ac6877d26fce4f3b946fba5"/>
     <w:p>
       <w:pPr>
         <w:pStyle w:val="Heading2"/>
@@ -66672,8 +66865,8 @@
         <w:t xml:space="preserve">(12), 1250–1262. https://doi.org/10.1016/j.jbusres.2008.01.013</w:t>
       </w:r>
     </w:p>
-    <w:bookmarkEnd w:id="265"/>
-    <w:bookmarkStart w:id="266" w:name="X2a802b4844355bd9a9addebe0f180df0342c84e"/>
+    <w:bookmarkEnd w:id="267"/>
+    <w:bookmarkStart w:id="268" w:name="X2a802b4844355bd9a9addebe0f180df0342c84e"/>
     <w:p>
       <w:pPr>
         <w:pStyle w:val="Heading2"/>
@@ -66892,8 +67085,8 @@
         <w:t xml:space="preserve">. Sage.</w:t>
       </w:r>
     </w:p>
-    <w:bookmarkEnd w:id="266"/>
-    <w:bookmarkStart w:id="267" w:name="X0abbf775f59dd3e18884b0e2af21123940b885a"/>
+    <w:bookmarkEnd w:id="268"/>
+    <w:bookmarkStart w:id="269" w:name="X0abbf775f59dd3e18884b0e2af21123940b885a"/>
     <w:p>
       <w:pPr>
         <w:pStyle w:val="Heading2"/>
@@ -67032,9 +67225,9 @@
         <w:br w:type="page"/>
       </w:r>
     </w:p>
-    <w:bookmarkEnd w:id="267"/>
-    <w:bookmarkEnd w:id="268"/>
-    <w:bookmarkStart w:id="279" w:name="Xff640a2fe7b5357a1c83c06fced6026c707611d"/>
+    <w:bookmarkEnd w:id="269"/>
+    <w:bookmarkEnd w:id="270"/>
+    <w:bookmarkStart w:id="281" w:name="Xff640a2fe7b5357a1c83c06fced6026c707611d"/>
     <w:p>
       <w:pPr>
         <w:pStyle w:val="Heading1"/>
@@ -67147,7 +67340,7 @@
         <w:t xml:space="preserve">).</w:t>
       </w:r>
     </w:p>
-    <w:bookmarkStart w:id="269" w:name="X0582f4e8341b91a67fe62cd046a843bbb6226bb"/>
+    <w:bookmarkStart w:id="271" w:name="X0582f4e8341b91a67fe62cd046a843bbb6226bb"/>
     <w:p>
       <w:pPr>
         <w:pStyle w:val="Heading2"/>
@@ -67262,8 +67455,8 @@
         <w:t xml:space="preserve">quyết định lọc và hài hòa.</w:t>
       </w:r>
     </w:p>
-    <w:bookmarkEnd w:id="269"/>
-    <w:bookmarkStart w:id="270" w:name="a.2-nguồn-dữ-liệu-và-đơn-vị-phân-tích"/>
+    <w:bookmarkEnd w:id="271"/>
+    <w:bookmarkStart w:id="272" w:name="a.2-nguồn-dữ-liệu-và-đơn-vị-phân-tích"/>
     <w:p>
       <w:pPr>
         <w:pStyle w:val="Heading2"/>
@@ -67673,8 +67866,8 @@
         <w:t xml:space="preserve">2006–2012 của nền khác dùng bộ công cụ Standardized (ví dụ Jordan 2006) đều được nhận.</w:t>
       </w:r>
     </w:p>
-    <w:bookmarkEnd w:id="270"/>
-    <w:bookmarkStart w:id="271" w:name="Xd70dc06f8ccec128443ad2d01abc5c85de5037e"/>
+    <w:bookmarkEnd w:id="272"/>
+    <w:bookmarkStart w:id="273" w:name="Xd70dc06f8ccec128443ad2d01abc5c85de5037e"/>
     <w:p>
       <w:pPr>
         <w:pStyle w:val="Heading2"/>
@@ -68504,8 +68697,8 @@
         <w:t xml:space="preserve">liệu thô và là con số được trích dẫn trong Chương 3–4. Sai khác giữa hai lớp được công bố minh bạch để hội đồng kiểm chứng.</w:t>
       </w:r>
     </w:p>
-    <w:bookmarkEnd w:id="271"/>
-    <w:bookmarkStart w:id="272" w:name="a.4-hài-hòa-hóa-biến-số-bước-s3"/>
+    <w:bookmarkEnd w:id="273"/>
+    <w:bookmarkStart w:id="274" w:name="a.4-hài-hòa-hóa-biến-số-bước-s3"/>
     <w:p>
       <w:pPr>
         <w:pStyle w:val="Heading2"/>
@@ -68820,8 +69013,8 @@
         <w:t xml:space="preserve">), quy mô (log lao động), sở hữu nước ngoài, đặc điểm nhà quản trị, ngành ISIC.</w:t>
       </w:r>
     </w:p>
-    <w:bookmarkEnd w:id="272"/>
-    <w:bookmarkStart w:id="273" w:name="X416f14599a376c8f9173525fa72cdada272c4e0"/>
+    <w:bookmarkEnd w:id="274"/>
+    <w:bookmarkStart w:id="275" w:name="X416f14599a376c8f9173525fa72cdada272c4e0"/>
     <w:p>
       <w:pPr>
         <w:pStyle w:val="Heading2"/>
@@ -69205,8 +69398,8 @@
         <w:t xml:space="preserve">theo Bảng Penn World (Feenstra et al., 2015).</w:t>
       </w:r>
     </w:p>
-    <w:bookmarkEnd w:id="273"/>
-    <w:bookmarkStart w:id="274" w:name="Xcda44a616a0294a63022c370d6fafff6af411dd"/>
+    <w:bookmarkEnd w:id="275"/>
+    <w:bookmarkStart w:id="276" w:name="Xcda44a616a0294a63022c370d6fafff6af411dd"/>
     <w:p>
       <w:pPr>
         <w:pStyle w:val="Heading2"/>
@@ -69709,8 +69902,8 @@
         <w:t xml:space="preserve">phối ở vùng FSTS cao không đủ để nhận dạng điểm uốn bậc ba một cách chính xác.</w:t>
       </w:r>
     </w:p>
-    <w:bookmarkEnd w:id="274"/>
-    <w:bookmarkStart w:id="275" w:name="a.7-phân-tầng-thể-chế-icrv-bước-s5"/>
+    <w:bookmarkEnd w:id="276"/>
+    <w:bookmarkStart w:id="277" w:name="a.7-phân-tầng-thể-chế-icrv-bước-s5"/>
     <w:p>
       <w:pPr>
         <w:pStyle w:val="Heading2"/>
@@ -69797,8 +69990,8 @@
         <w:t xml:space="preserve">mở rộng của P8).</w:t>
       </w:r>
     </w:p>
-    <w:bookmarkEnd w:id="275"/>
-    <w:bookmarkStart w:id="276" w:name="a.8-trọng-số-mẫu-và-tính-đại-diện"/>
+    <w:bookmarkEnd w:id="277"/>
+    <w:bookmarkStart w:id="278" w:name="a.8-trọng-số-mẫu-và-tính-đại-diện"/>
     <w:p>
       <w:pPr>
         <w:pStyle w:val="Heading2"/>
@@ -69888,8 +70081,8 @@
         <w:t xml:space="preserve">cận này cân bằng giữa tính đại diện và hiệu quả ước lượng một cách có luận chứng.</w:t>
       </w:r>
     </w:p>
-    <w:bookmarkEnd w:id="276"/>
-    <w:bookmarkStart w:id="277" w:name="a.9-xử-lý-dữ-liệu-thiếu-bước-s4-s6"/>
+    <w:bookmarkEnd w:id="278"/>
+    <w:bookmarkStart w:id="279" w:name="a.9-xử-lý-dữ-liệu-thiếu-bước-s4-s6"/>
     <w:p>
       <w:pPr>
         <w:pStyle w:val="Heading2"/>
@@ -70005,8 +70198,8 @@
         <w:t xml:space="preserve">điểm uốn để bảo đảm kết quả không bị chi phối bởi cơ chế khuyết (Little &amp; Rubin, 2019).</w:t>
       </w:r>
     </w:p>
-    <w:bookmarkEnd w:id="277"/>
-    <w:bookmarkStart w:id="278" w:name="a.10-khả-năng-tái-lập-và-hạn-chế"/>
+    <w:bookmarkEnd w:id="279"/>
+    <w:bookmarkStart w:id="280" w:name="a.10-khả-năng-tái-lập-và-hạn-chế"/>
     <w:p>
       <w:pPr>
         <w:pStyle w:val="Heading2"/>
@@ -70285,8 +70478,8 @@
         <w:br w:type="page"/>
       </w:r>
     </w:p>
-    <w:bookmarkEnd w:id="278"/>
-    <w:bookmarkEnd w:id="279"/>
+    <w:bookmarkEnd w:id="280"/>
+    <w:bookmarkEnd w:id="281"/>
     <w:sectPr>
       <w:pgSz w:h="16838" w:w="11906"/>
       <w:pgMar w:bottom="1417" w:left="1417" w:right="1417" w:top="1417"/>

</xml_diff>

<commit_message>
qa(thesis): final QA pass — cross-refs/tables verified, heterogeneity→dị biệt, positioning SIDS regime aligned
Final quality pass on the expanded dissertation:
- Verified all 'Mục X.Y' cross-references resolve to existing sections (0 broken),
  section numbering continuous, 0 markdown table corruptions vs prior commit.
- Converted remaining 'heterogeneity'→'dị biệt' in Ch2–5 (first-mention glosses kept);
  capitalized sentence-initial occurrences.
- Aligned 11_dissertation_positioning_vi.md SIDS label (Regime V→VI) to match the
  six-regime ICRV convention used consistently across the chapters.
</commit_message>
<xml_diff>
--- a/dist/luan_an_ctu/LUAN_AN_FULL_vi.docx
+++ b/dist/luan_an_ctu/LUAN_AN_FULL_vi.docx
@@ -4906,13 +4906,13 @@
           <w:bCs/>
           <w:b/>
         </w:rPr>
-        <w:t xml:space="preserve">Khoảng trống thứ nhất: Thiếu khung tích hợp đa tầng để giải thích heterogeneity trong I–P relationship.</w:t>
-      </w:r>
-      <w:r>
-        <w:t xml:space="preserve"> </w:t>
-      </w:r>
-      <w:r>
-        <w:t xml:space="preserve">Các meta-analyses nhất quán cho thấy I² &gt; 80%, tức hơn 80% biến thiên trong quy mô hiệu ứng không được giải thích bởi sai số ngẫu nhiên mà bởi sự khác biệt có hệ thống giữa các bối cảnh (Bausch &amp; Krist, 2007; Marano et al., 2016). Tuy nhiên, hầu hết các nghiên cứu thực nghiệm hiện tại chỉ kiểm định một hoặc hai biến điều tiết từ một lý thuyết đơn lẻ, không có khả năng giải thích đồng thời heterogeneity do bối cảnh thể chế, năng lực doanh nghiệp, và đặc điểm lãnh đạo tạo ra. Không có lý thuyết đơn lẻ nào, dù là Uppsala, RBV, Institutional Theory, hay Upper Echelons Theory, đủ để giải thích đầy đủ sự phức tạp của I–P relationship trong bối cảnh đa quốc gia đa dạng như châu Á. Khoảng trống này đòi hỏi một khung tích hợp đa tầng, trong đó các lý thuyết bổ sung cho nhau thay vì cạnh tranh nhau.</w:t>
+        <w:t xml:space="preserve">Khoảng trống thứ nhất: Thiếu khung tích hợp đa tầng để giải thích dị biệt trong I–P relationship.</w:t>
+      </w:r>
+      <w:r>
+        <w:t xml:space="preserve"> </w:t>
+      </w:r>
+      <w:r>
+        <w:t xml:space="preserve">Các meta-analyses nhất quán cho thấy I² &gt; 80%, tức hơn 80% biến thiên trong quy mô hiệu ứng không được giải thích bởi sai số ngẫu nhiên mà bởi sự khác biệt có hệ thống giữa các bối cảnh (Bausch &amp; Krist, 2007; Marano et al., 2016). Tuy nhiên, hầu hết các nghiên cứu thực nghiệm hiện tại chỉ kiểm định một hoặc hai biến điều tiết từ một lý thuyết đơn lẻ, không có khả năng giải thích đồng thời dị biệt do bối cảnh thể chế, năng lực doanh nghiệp, và đặc điểm lãnh đạo tạo ra. Không có lý thuyết đơn lẻ nào, dù là Uppsala, RBV, Institutional Theory, hay Upper Echelons Theory, đủ để giải thích đầy đủ sự phức tạp của I–P relationship trong bối cảnh đa quốc gia đa dạng như châu Á. Khoảng trống này đòi hỏi một khung tích hợp đa tầng, trong đó các lý thuyết bổ sung cho nhau thay vì cạnh tranh nhau.</w:t>
       </w:r>
     </w:p>
     <w:p>
@@ -4974,7 +4974,7 @@
         <w:t xml:space="preserve"> </w:t>
       </w:r>
       <w:r>
-        <w:t xml:space="preserve">Khoảng trống thứ nhất và thứ ba hội tụ vào một câu hỏi kiểm định trực tiếp: liệu CDCM có thể giải thích đồng thời heterogeneity I–P khi kiểm soát đầy đủ cả ba tầng trong một mô hình tích hợp ở quy mô đủ rộng để bao phủ toàn bộ gradient ICRV không? Văn liệu hiện tại chưa có bằng chứng kiểm định đồng thời năm biến điều tiết chính (TCI, DAI, kinh nghiệm quản trị, giới tính nhà quản trị, ICRV) trong một mô hình hồi quy đơn lẻ trên dữ liệu đa quốc gia quy mô lớn. Nghiên cứu thành phần P7 lấp đầy khoảng trống này bằng dữ liệu WBES từ 50 nền kinh tế (mẫu hồi quy M2 N = 81.022; N hồi quy mô hình đầy đủ = 79.080 sau loại bỏ listwise các biến điều tiết, 103 country-year waves), bao phủ toàn bộ gradient ICRV từ nhóm tiên tiến đến SIDS, kiểm định đồng thời H1–H6 với country-year hiệu ứng cố định. Kết quả điểm uốn trung bình ~36% FSTS tại P7, thấp hơn P3 Vietnam (~40%) và P5 Trung Quốc (~49%), xác nhận ICRV điều tiết vị trí điểm uốn theo gradient dự đoán lý thuyết, đóng góp bằng chứng kiểm định tích hợp đầu tiên cho CDCM ở cấp độ liên quốc gia quy mô lớn.</w:t>
+        <w:t xml:space="preserve">Khoảng trống thứ nhất và thứ ba hội tụ vào một câu hỏi kiểm định trực tiếp: liệu CDCM có thể giải thích đồng thời dị biệt I–P khi kiểm soát đầy đủ cả ba tầng trong một mô hình tích hợp ở quy mô đủ rộng để bao phủ toàn bộ gradient ICRV không? Văn liệu hiện tại chưa có bằng chứng kiểm định đồng thời năm biến điều tiết chính (TCI, DAI, kinh nghiệm quản trị, giới tính nhà quản trị, ICRV) trong một mô hình hồi quy đơn lẻ trên dữ liệu đa quốc gia quy mô lớn. Nghiên cứu thành phần P7 lấp đầy khoảng trống này bằng dữ liệu WBES từ 50 nền kinh tế (mẫu hồi quy M2 N = 81.022; N hồi quy mô hình đầy đủ = 79.080 sau loại bỏ listwise các biến điều tiết, 103 country-year waves), bao phủ toàn bộ gradient ICRV từ nhóm tiên tiến đến SIDS, kiểm định đồng thời H1–H6 với country-year hiệu ứng cố định. Kết quả điểm uốn trung bình ~36% FSTS tại P7, thấp hơn P3 Vietnam (~40%) và P5 Trung Quốc (~49%), xác nhận ICRV điều tiết vị trí điểm uốn theo gradient dự đoán lý thuyết, đóng góp bằng chứng kiểm định tích hợp đầu tiên cho CDCM ở cấp độ liên quốc gia quy mô lớn.</w:t>
       </w:r>
     </w:p>
     <w:p>
@@ -6195,7 +6195,7 @@
         </m:r>
       </m:oMath>
       <w:r>
-        <w:t xml:space="preserve">, tính gộp effect size theo random-effects, kiểm định heterogeneity bằng</w:t>
+        <w:t xml:space="preserve">, tính gộp effect size theo random-effects, kiểm định dị biệt bằng</w:t>
       </w:r>
       <w:r>
         <w:t xml:space="preserve"> </w:t>
@@ -7962,7 +7962,7 @@
         <w:pStyle w:val="BodyText"/>
       </w:pPr>
       <w:r>
-        <w:t xml:space="preserve">Heterogeneity đo bằng</w:t>
+        <w:t xml:space="preserve">Dị biệt đo bằng</w:t>
       </w:r>
       <w:r>
         <w:t xml:space="preserve"> </w:t>
@@ -28363,7 +28363,7 @@
         <w:pStyle w:val="FirstParagraph"/>
       </w:pPr>
       <w:r>
-        <w:t xml:space="preserve">Phát hiện này có hàm ý lý thuyết sâu sắc: heterogeneity trong I–P văn liệu xuất phát chủ yếu từ sự biến thiên</w:t>
+        <w:t xml:space="preserve">Phát hiện này có hàm ý lý thuyết sâu sắc: dị biệt trong I–P văn liệu xuất phát chủ yếu từ sự biến thiên</w:t>
       </w:r>
       <w:r>
         <w:t xml:space="preserve"> </w:t>
@@ -29246,7 +29246,7 @@
         <w:t xml:space="preserve">“</w:t>
       </w:r>
       <w:r>
-        <w:t xml:space="preserve">câu đố heterogeneity</w:t>
+        <w:t xml:space="preserve">câu đố dị biệt</w:t>
       </w:r>
       <w:r>
         <w:t xml:space="preserve">”</w:t>
@@ -29278,7 +29278,7 @@
         <w:t xml:space="preserve"> </w:t>
       </w:r>
       <w:r>
-        <w:t xml:space="preserve">giữa các nhóm ICRV, nhưng nó định vị lại kỳ vọng: meta-analysis cấp tổng hợp khó nắm bắt được điều tiết thể chế vì các nghiên cứu sơ cấp hiếm khi báo cáo đủ chi tiết theo chế độ thể chế, và vì vậy bằng chứng cấp doanh nghiệp trực tiếp trên một khung phân loại thể chế nhất quán, như luận án thực hiện, là con đường hữu hiệu hơn để bóc tách heterogeneity so với việc tích lũy thêm meta-analysis trên dữ liệu thứ cấp không đồng nhất.</w:t>
+        <w:t xml:space="preserve">giữa các nhóm ICRV, nhưng nó định vị lại kỳ vọng: meta-analysis cấp tổng hợp khó nắm bắt được điều tiết thể chế vì các nghiên cứu sơ cấp hiếm khi báo cáo đủ chi tiết theo chế độ thể chế, và vì vậy bằng chứng cấp doanh nghiệp trực tiếp trên một khung phân loại thể chế nhất quán, như luận án thực hiện, là con đường hữu hiệu hơn để bóc tách dị biệt so với việc tích lũy thêm meta-analysis trên dữ liệu thứ cấp không đồng nhất.</w:t>
       </w:r>
     </w:p>
     <w:p>
@@ -53717,7 +53717,7 @@
         <w:t xml:space="preserve"> </w:t>
       </w:r>
       <w:r>
-        <w:t xml:space="preserve">thành 54,1% tầng 2 và 8,4% tầng 3 là thông tin mới mà phân tích meta đơn tầng không cung cấp. Điều này thay đổi hiểu biết về nguồn gốc của heterogeneity trong văn liệu, vấn đề chủ yếu là</w:t>
+        <w:t xml:space="preserve">thành 54,1% tầng 2 và 8,4% tầng 3 là thông tin mới mà phân tích meta đơn tầng không cung cấp. Điều này thay đổi hiểu biết về nguồn gốc của dị biệt trong văn liệu, vấn đề chủ yếu là</w:t>
       </w:r>
       <w:r>
         <w:t xml:space="preserve"> </w:t>

</xml_diff>